<commit_message>
docs: refine trajectory defense narrative
Clarifies the Vida Software to openTrends transition as a move from deep lab/product work toward communication, junior mentoring, and collaborative consulting.

Explains the La Salle to TecnoCampus bridge through conversations with the La Salle coordinator and director, leading to Ester Bernado as a concrete academic connection.

Replaces the harder-to-pronounce internationalization wording with consultancy and international training, and regenerates trajectory DOCX/PDF derivatives.
</commit_message>
<xml_diff>
--- a/doc/presentations/defensa-placa-permanent-dsi-ports-sortida-hexagonal/output/REMARKABLE_materials-orals-canonics-10-minuts-trajectoria.docx
+++ b/doc/presentations/defensa-placa-permanent-dsi-ports-sortida-hexagonal/output/REMARKABLE_materials-orals-canonics-10-minuts-trajectoria.docx
@@ -280,7 +280,7 @@
         <w:pStyle w:val="Textoindependiente"/>
       </w:pPr>
       <w:r>
-        <w:t xml:space="preserve">Aquest és el recorregut que presentaré: primer, la base professional en enginyeria i consultoria; després, el descobriment clar de la vocació docent; a continuació, el pas a la universitat i al TecnoCampus; i finalment, la internacionalització, el doctorat i el projecte de futur que voldria consolidar.</w:t>
+        <w:t xml:space="preserve">Aquest és el recorregut que presentaré: primer, la base professional en enginyeria i consultoria; després, el descobriment clar de la vocació docent; a continuació, el pas a la universitat i al TecnoCampus; i finalment, la consultoria i la formació internacional, el doctorat i el projecte de futur que voldria consolidar.</w:t>
       </w:r>
     </w:p>
     <w:bookmarkEnd w:id="9"/>
@@ -306,7 +306,7 @@
         <w:pStyle w:val="Textoindependiente"/>
       </w:pPr>
       <w:r>
-        <w:t xml:space="preserve">A Vida Software vaig treballar en un component del sistema operatiu Symbian orientat a incorporar interacció per veu en aplicacions mòbils. És a dir, no era una aplicació final, sinó un component que permetia que aplicacions Nokia/Symbian poguessin utilitzar funcionalitats de veu.</w:t>
+        <w:t xml:space="preserve">A Vida Software vaig viure una etapa tècnicament molt profunda, molt de laboratori i producte. Treballava en un component del sistema operatiu Symbian orientat a incorporar interacció per veu en aplicacions mòbils. És a dir, no era una aplicació final, sinó una peça que permetia que aplicacions Nokia/Symbian poguessin utilitzar funcionalitats de veu.</w:t>
       </w:r>
     </w:p>
     <w:p>
@@ -322,7 +322,7 @@
         <w:pStyle w:val="Textoindependiente"/>
       </w:pPr>
       <w:r>
-        <w:t xml:space="preserve">No cal entrar ara en el detall tècnic. El que és important és que va ser una etapa molt formativa: producte, sistema operatiu, restriccions tècniques fortes i innovació aplicada.</w:t>
+        <w:t xml:space="preserve">Aquesta etapa em va confirmar una cosa important: tècnicament podia treballar en entorns exigents. Però també em va fer prendre consciència d’una altra necessitat. Era una feina molt centrada en laboratori, producte i resolució tècnica, i jo trobava a faltar una dimensió més comunicativa, més relacional, més vinculada a explicar, compartir coneixement i treballar amb persones.</w:t>
       </w:r>
     </w:p>
     <w:p>
@@ -330,7 +330,7 @@
         <w:pStyle w:val="Textoindependiente"/>
       </w:pPr>
       <w:r>
-        <w:t xml:space="preserve">Després, a openTrends, vaig fer un pas cap a la consultoria, Java, els sistemes d’informació, els clients i els equips. Allà el repte ja no era només resoldre bé un problema tècnic, sinó entendre una necessitat, comunicar-la, documentar-la i treballar amb altres perfils. [pausa breu]</w:t>
+        <w:t xml:space="preserve">El pas a openTrends va néixer d’aquesta presa de consciència. Una persona amb qui havia treballat a Vida Software i que coneixia bé aquesta inquietud em va obrir la porta a un entorn més orientat a consultoria, clients, equips i sistemes d’informació. Va ser una evolució natural: mantenir la base tècnica, però començar a desenvolupar amb més força la comunicació i el treball col·laboratiu. [pausa breu]</w:t>
       </w:r>
     </w:p>
     <w:p>
@@ -338,7 +338,7 @@
         <w:pStyle w:val="Textoindependiente"/>
       </w:pPr>
       <w:r>
-        <w:t xml:space="preserve">Amb el temps, vaig anar veient que una part del meu treball que m’interessava especialment era formar persones més joves, acompanyar perfils més junior i ajudar a fer comprensible allò que, al principi, sembla complex.</w:t>
+        <w:t xml:space="preserve">En aquell entorn em vaig sentir més a prop d’aquesta dimensió comunicativa: entendre necessitats, explicar decisions tècniques, parlar amb clients i treballar amb altres perfils. Però el punt més clar va aparèixer quan tenia l’oportunitat de formar perfils més junior.</w:t>
       </w:r>
     </w:p>
     <w:p>
@@ -346,7 +346,23 @@
         <w:pStyle w:val="Textoindependiente"/>
       </w:pPr>
       <w:r>
-        <w:t xml:space="preserve">Aquesta intuïció és la que obriria la porta a la següent etapa.</w:t>
+        <w:t xml:space="preserve">Aquells moments eren els que més gaudia: compartir coneixement tècnic, ordenar-lo perquè fos comprensible, acompanyar algú que començava i veure com guanyava autonomia. Aquí la comunicació ja no era només una eina professional; començava a convertir-se en una pràctica docent.</w:t>
+      </w:r>
+    </w:p>
+    <w:p>
+      <w:pPr>
+        <w:pStyle w:val="Textoindependiente"/>
+      </w:pPr>
+      <w:r>
+        <w:t xml:space="preserve">Mirat amb perspectiva, aquest patró s’ha repetit en altres moments de la meva trajectòria: els canvis importants han estat possibles gràcies a relacions professionals de confiança.</w:t>
+      </w:r>
+    </w:p>
+    <w:p>
+      <w:pPr>
+        <w:pStyle w:val="Textoindependiente"/>
+      </w:pPr>
+      <w:r>
+        <w:t xml:space="preserve">Aquesta presa de consciència és la que em va portar a estudiar el Màster de Formació del Professorat i, després, a exercir com a docent en l’àmbit de la Formació Professional.</w:t>
       </w:r>
     </w:p>
     <w:bookmarkEnd w:id="10"/>
@@ -364,7 +380,7 @@
         <w:pStyle w:val="FirstParagraph"/>
       </w:pPr>
       <w:r>
-        <w:t xml:space="preserve">El pas a la docència no va ser improvisat. Va venir acompanyat del Màster de Formació del Professorat i d’una decisió vocacional. [pausa breu]</w:t>
+        <w:t xml:space="preserve">Per això, el pas a la docència no va ser improvisat. Va venir d’una inquietud que ja havia anat apareixent dins la indústria: explicar millor, compartir coneixement i acompanyar persones en el seu procés d’aprenentatge. [pausa breu]</w:t>
       </w:r>
     </w:p>
     <w:p>
@@ -430,7 +446,7 @@
         <w:pStyle w:val="Textoindependiente"/>
       </w:pPr>
       <w:r>
-        <w:t xml:space="preserve">Al mateix temps, també es va obrir una necessitat de coherència vital i professional. Amb el trasllat familiar a Llavaneres i amb dos fills, la conciliació va passar a ser un element molt rellevant. No ho plantejo com una queixa, sinó com una realitat: una trajectòria acadèmica sostenible també ha de poder encaixar amb la vida familiar. [mirada al tribunal]</w:t>
+        <w:t xml:space="preserve">Al cap d’un temps, també es va obrir una necessitat de coherència vital i professional. Amb el trasllat familiar a Llavaneres i amb dos fills, era important poder construir una trajectòria acadèmica sostenible i, alhora, cuidar una bona conciliació familiar. [mirada al tribunal]</w:t>
       </w:r>
     </w:p>
     <w:p>
@@ -438,7 +454,15 @@
         <w:pStyle w:val="Textoindependiente"/>
       </w:pPr>
       <w:r>
-        <w:t xml:space="preserve">En aquest context, el contacte amb l’Ester Bernadó va ser un pont acadèmic molt important cap al TecnoCampus. Ester representava una figura de referència per la seva trajectòria acadèmica a La Salle i pel seu paper de direcció acadèmica al TecnoCampus.</w:t>
+        <w:t xml:space="preserve">Ho vaig parlar amb el meu coordinador i amb el meu director a La Salle. Els vaig plantejar aquesta necessitat: continuar creixent acadèmicament, però en un entorn que també fos sostenible des del punt de vista vital i familiar.</w:t>
+      </w:r>
+    </w:p>
+    <w:p>
+      <w:pPr>
+        <w:pStyle w:val="Textoindependiente"/>
+      </w:pPr>
+      <w:r>
+        <w:t xml:space="preserve">Va ser en aquestes converses que em van parlar de l’Ester Bernadó. En aquell moment era directora acadèmica de l’Escola Politècnica del TecnoCampus, i me’n van destacar tant la trajectòria acadèmica com la feina que havia fet a La Salle. Per això, el contacte amb l’Ester no apareix de manera casual: va ser un pont acadèmic molt concret cap al TecnoCampus.</w:t>
       </w:r>
     </w:p>
     <w:p>
@@ -524,13 +548,13 @@
       </w:r>
     </w:p>
     <w:bookmarkEnd w:id="13"/>
-    <w:bookmarkStart w:id="14" w:name="X3843af26767ae4787c5e8f42f64cdd21e77f9a4"/>
+    <w:bookmarkStart w:id="14" w:name="X77b948eb5b88b9411aa9e9ac95be04d08c18873"/>
     <w:p>
       <w:pPr>
         <w:pStyle w:val="Ttulo3"/>
       </w:pPr>
       <w:r>
-        <w:t xml:space="preserve">Diapositiva 6. Internacionalització, recerca doctoral i projecte de futur - 2:05</w:t>
+        <w:t xml:space="preserve">Diapositiva 6. Consultoria i formació internacional, recerca doctoral i projecte de futur - 2:05</w:t>
       </w:r>
     </w:p>
     <w:p>
@@ -538,7 +562,7 @@
         <w:pStyle w:val="FirstParagraph"/>
       </w:pPr>
       <w:r>
-        <w:t xml:space="preserve">En paral·lel, Neueda ha obert una etapa d’internacionalització professional. [transició]</w:t>
+        <w:t xml:space="preserve">En paral·lel, Neueda ha obert una etapa de consultoria i formació internacional. [transició]</w:t>
       </w:r>
     </w:p>
     <w:p>
@@ -759,7 +783,7 @@
         </w:numPr>
       </w:pPr>
       <w:r>
-        <w:t xml:space="preserve">openTrends: Java, sistemes d’informació, clients, equips.</w:t>
+        <w:t xml:space="preserve">openTrends: consultoria, clients, equips i sistemes d’informació.</w:t>
       </w:r>
     </w:p>
     <w:p>
@@ -771,7 +795,7 @@
         </w:numPr>
       </w:pPr>
       <w:r>
-        <w:t xml:space="preserve">Idea clau: de competència tècnica a comunicació i acompanyament.</w:t>
+        <w:t xml:space="preserve">Punt clau: el que més gaudia era formar perfils més junior.</w:t>
       </w:r>
     </w:p>
     <w:p>
@@ -783,7 +807,19 @@
         </w:numPr>
       </w:pPr>
       <w:r>
-        <w:t xml:space="preserve">Transició: aquesta intuïció porta a la docència.</w:t>
+        <w:t xml:space="preserve">La comunicació passa de ser eina professional a pràctica docent.</w:t>
+      </w:r>
+    </w:p>
+    <w:p>
+      <w:pPr>
+        <w:pStyle w:val="Compact"/>
+        <w:numPr>
+          <w:ilvl w:val="0"/>
+          <w:numId w:val="1004"/>
+        </w:numPr>
+      </w:pPr>
+      <w:r>
+        <w:t xml:space="preserve">Transició: Màster de Professorat i entrada a la Formació Professional.</w:t>
       </w:r>
     </w:p>
     <w:bookmarkEnd w:id="17"/>
@@ -887,7 +923,7 @@
         </w:numPr>
       </w:pPr>
       <w:r>
-        <w:t xml:space="preserve">Conciliació: Llavaneres, família, sostenibilitat vital.</w:t>
+        <w:t xml:space="preserve">Trajectòria acadèmica sostenible i bona conciliació familiar.</w:t>
       </w:r>
     </w:p>
     <w:p>
@@ -899,7 +935,31 @@
         </w:numPr>
       </w:pPr>
       <w:r>
-        <w:t xml:space="preserve">Ester Bernadó com a pont acadèmic.</w:t>
+        <w:t xml:space="preserve">Conversa amb coordinador i director a La Salle.</w:t>
+      </w:r>
+    </w:p>
+    <w:p>
+      <w:pPr>
+        <w:pStyle w:val="Compact"/>
+        <w:numPr>
+          <w:ilvl w:val="0"/>
+          <w:numId w:val="1006"/>
+        </w:numPr>
+      </w:pPr>
+      <w:r>
+        <w:t xml:space="preserve">Ester Bernadó: directora acadèmica de l’Escola Politècnica del TecnoCampus.</w:t>
+      </w:r>
+    </w:p>
+    <w:p>
+      <w:pPr>
+        <w:pStyle w:val="Compact"/>
+        <w:numPr>
+          <w:ilvl w:val="0"/>
+          <w:numId w:val="1006"/>
+        </w:numPr>
+      </w:pPr>
+      <w:r>
+        <w:t xml:space="preserve">Ester com a pont acadèmic concret, no com a aparició casual.</w:t>
       </w:r>
     </w:p>
     <w:p>
@@ -1027,7 +1087,7 @@
         </w:numPr>
       </w:pPr>
       <w:r>
-        <w:t xml:space="preserve">Neueda: internacionalització, anglès, formació tècnica i indústria.</w:t>
+        <w:t xml:space="preserve">Neueda: consultoria i formació internacional, anglès tècnic i indústria.</w:t>
       </w:r>
     </w:p>
     <w:p>

</xml_diff>

<commit_message>
Update TecnoCampus defense materials
</commit_message>
<xml_diff>
--- a/doc/presentations/defensa-placa-permanent-dsi-ports-sortida-hexagonal/output/REMARKABLE_materials-orals-canonics-10-minuts-trajectoria.docx
+++ b/doc/presentations/defensa-placa-permanent-dsi-ports-sortida-hexagonal/output/REMARKABLE_materials-orals-canonics-10-minuts-trajectoria.docx
@@ -239,16 +239,16 @@
         <w:pStyle w:val="FirstParagraph"/>
       </w:pPr>
       <w:r>
-        <w:t xml:space="preserve">Temps total previst: 10:00 aproximadament.</w:t>
-      </w:r>
-    </w:p>
-    <w:bookmarkStart w:id="9" w:name="X35627632122e58e19bb41b77199dc5df2e97e61"/>
+        <w:t xml:space="preserve">Temps total previst d’assaig: 9:00-9:20 aproximadament, amb pauses reals.</w:t>
+      </w:r>
+    </w:p>
+    <w:bookmarkStart w:id="9" w:name="X955f66c7fc938677aca3c0234d4f82c1654e8a5"/>
     <w:p>
       <w:pPr>
         <w:pStyle w:val="Ttulo3"/>
       </w:pPr>
       <w:r>
-        <w:t xml:space="preserve">Diapositiva 1. Trajectòria professional, acadèmica i científica - 1:00</w:t>
+        <w:t xml:space="preserve">Diapositiva 1. Trajectòria professional, acadèmica i científica - 0:50</w:t>
       </w:r>
     </w:p>
     <w:p>
@@ -264,7 +264,7 @@
         <w:pStyle w:val="Textoindependiente"/>
       </w:pPr>
       <w:r>
-        <w:t xml:space="preserve">En aquests deu minuts no voldria fer una lectura cronològica del currículum. El que voldria és explicar el fil conductor d’una trajectòria que comença l’any 2004 i que, amb el temps, ha anat unint quatre dimensions: l’enginyeria de software, la docència, la recerca i el compromís amb el TecnoCampus. [pausa breu]</w:t>
+        <w:t xml:space="preserve">En aquests deu minuts no faré una lectura cronològica del currículum. Voldria explicar el fil conductor d’una trajectòria iniciada el 2004 i articulada al voltant de cinc dimensions: enginyeria del software, docència universitària, innovació educativa, transferència i recerca. [pausa breu]</w:t>
       </w:r>
     </w:p>
     <w:p>
@@ -272,7 +272,7 @@
         <w:pStyle w:val="Textoindependiente"/>
       </w:pPr>
       <w:r>
-        <w:t xml:space="preserve">La meva trajectòria neix en la indústria del software, creix a través de la docència i la formació, madura amb la recerca doctoral i troba al TecnoCampus un espai molt coherent per continuar desenvolupant-se.</w:t>
+        <w:t xml:space="preserve">La idea central és senzilla: la meva trajectòria neix en la indústria del software, s’amplia cap a la docència universitària en software i troba al TecnoCampus un espai coherent per consolidar un projecte acadèmic.</w:t>
       </w:r>
     </w:p>
     <w:p>
@@ -280,17 +280,17 @@
         <w:pStyle w:val="Textoindependiente"/>
       </w:pPr>
       <w:r>
-        <w:t xml:space="preserve">Aquest és el recorregut que presentaré: primer, la base professional en enginyeria i consultoria; després, el descobriment clar de la vocació docent; a continuació, el pas a la universitat i al TecnoCampus; i finalment, la consultoria i la formació internacional, el doctorat i el projecte de futur que voldria consolidar.</w:t>
+        <w:t xml:space="preserve">Aquest és el recorregut que presentaré: base professional, vocació docent, pas a la universitat, consolidació al TecnoCampus i projecte de futur.</w:t>
       </w:r>
     </w:p>
     <w:bookmarkEnd w:id="9"/>
-    <w:bookmarkStart w:id="10" w:name="Xff99530f37aea206cb03bd73a9e6d2de028515a"/>
+    <w:bookmarkStart w:id="10" w:name="X14a8b7aa807d9c5e07cea297e688b2b46d3c015"/>
     <w:p>
       <w:pPr>
         <w:pStyle w:val="Ttulo3"/>
       </w:pPr>
       <w:r>
-        <w:t xml:space="preserve">Diapositiva 2. Primera etapa: enginyeria de software i consultoria - 1:40</w:t>
+        <w:t xml:space="preserve">Diapositiva 2. Primera etapa: enginyeria del software i consultoria - 1:10</w:t>
       </w:r>
     </w:p>
     <w:p>
@@ -298,7 +298,7 @@
         <w:pStyle w:val="FirstParagraph"/>
       </w:pPr>
       <w:r>
-        <w:t xml:space="preserve">La primera etapa de la meva trajectòria és una etapa d’indústria del software. [to calmat]</w:t>
+        <w:t xml:space="preserve">La primera etapa és una etapa d’indústria del software. [to calmat]</w:t>
       </w:r>
     </w:p>
     <w:p>
@@ -306,7 +306,7 @@
         <w:pStyle w:val="Textoindependiente"/>
       </w:pPr>
       <w:r>
-        <w:t xml:space="preserve">A Vida Software vaig viure una etapa tècnicament molt profunda, molt de laboratori i producte. Treballava en un component del sistema operatiu Symbian orientat a incorporar interacció per veu en aplicacions mòbils. És a dir, no era una aplicació final, sinó una peça que permetia que aplicacions Nokia/Symbian poguessin utilitzar funcionalitats de veu.</w:t>
+        <w:t xml:space="preserve">A Vida Software vaig treballar en un component del sistema operatiu Symbian orientat a incorporar interacció per veu en aplicacions mòbils. Era una peça de plataforma en C/C++, amb restriccions fortes de rendiment i memòria, presentada en entorns com el 3GSM / Mobile World Congress i vinculada al context d’innovació d’una patent de Vida Software sobre interfícies d’usuari.</w:t>
       </w:r>
     </w:p>
     <w:p>
@@ -314,7 +314,7 @@
         <w:pStyle w:val="Textoindependiente"/>
       </w:pPr>
       <w:r>
-        <w:t xml:space="preserve">Era un context anterior a l’smartphone actual, desenvolupat en C/C++, amb restriccions fortes de rendiment, memòria i dispositiu. Aquesta tecnologia es va presentar en entorns internacionals com el 3GSM / Mobile World Congress, a Cannes i Barcelona, i formava part d’un context d’innovació vinculat també a una patent internacional de Vida Software sobre interfícies d’usuari.</w:t>
+        <w:t xml:space="preserve">El pas a openTrends va ampliar aquesta base cap a Java, Linux, Spring, sistemes d’informació, clients i equips. Allà la comunicació tècnica va guanyar pes: entendre necessitats, explicar decisions i formar enginyers júniors.</w:t>
       </w:r>
     </w:p>
     <w:p>
@@ -322,7 +322,7 @@
         <w:pStyle w:val="Textoindependiente"/>
       </w:pPr>
       <w:r>
-        <w:t xml:space="preserve">Aquesta etapa em va confirmar una cosa important: tècnicament podia treballar en entorns exigents. Però també em va fer prendre consciència d’una altra necessitat. Era una feina molt centrada en laboratori, producte i resolució tècnica, i jo trobava a faltar una dimensió més comunicativa, més relacional, més vinculada a explicar, compartir coneixement i treballar amb persones.</w:t>
+        <w:t xml:space="preserve">Mirat amb perspectiva, aquesta etapa em va donar dues coses: solvència tècnica en entorns exigents i la descoberta d’una inclinació clara cap a explicar, ordenar coneixement i acompanyar l’aprenentatge d’altres persones.</w:t>
       </w:r>
     </w:p>
     <w:p>
@@ -330,7 +330,25 @@
         <w:pStyle w:val="Textoindependiente"/>
       </w:pPr>
       <w:r>
-        <w:t xml:space="preserve">El pas a openTrends va néixer d’aquesta presa de consciència. Una persona amb qui havia treballat a Vida Software i que coneixia bé aquesta inquietud em va obrir la porta a un entorn més orientat a consultoria, clients, equips i sistemes d’informació. Va ser una evolució natural: mantenir la base tècnica, però començar a desenvolupar amb més força la comunicació i el treball col·laboratiu. [pausa breu]</w:t>
+        <w:t xml:space="preserve">Per això la transició cap a la docència no va ser una ruptura, sinó una evolució natural de la mateixa trajectòria professional.</w:t>
+      </w:r>
+    </w:p>
+    <w:bookmarkEnd w:id="10"/>
+    <w:bookmarkStart w:id="11" w:name="X8f1b53b5610d6a0c742d40bf35583d23a786a28"/>
+    <w:p>
+      <w:pPr>
+        <w:pStyle w:val="Ttulo3"/>
+      </w:pPr>
+      <w:r>
+        <w:t xml:space="preserve">Diapositiva 3. Formació Professional: el descobriment clar de la vocació docent - 1:10</w:t>
+      </w:r>
+    </w:p>
+    <w:p>
+      <w:pPr>
+        <w:pStyle w:val="FirstParagraph"/>
+      </w:pPr>
+      <w:r>
+        <w:t xml:space="preserve">Per donar consistència a aquesta decisió vaig cursar el màster en Formació del Professorat i vaig iniciar una etapa docent en Formació Professional, en l’àmbit de DAW i DAM. [pausa breu]</w:t>
       </w:r>
     </w:p>
     <w:p>
@@ -338,7 +356,7 @@
         <w:pStyle w:val="Textoindependiente"/>
       </w:pPr>
       <w:r>
-        <w:t xml:space="preserve">En aquell entorn em vaig sentir més a prop d’aquesta dimensió comunicativa: entendre necessitats, explicar decisions tècniques, parlar amb clients i treballar amb altres perfils. Però el punt més clar va aparèixer quan tenia l’oportunitat de formar perfils més junior.</w:t>
+        <w:t xml:space="preserve">A la Formació Professional vaig trobar una dimensió que buscava des de feia temps: l’aula, la relació directa amb l’alumnat i la responsabilitat d’acompanyar processos d’aprenentatge.</w:t>
       </w:r>
     </w:p>
     <w:p>
@@ -346,7 +364,7 @@
         <w:pStyle w:val="Textoindependiente"/>
       </w:pPr>
       <w:r>
-        <w:t xml:space="preserve">Aquells moments eren els que més gaudia: compartir coneixement tècnic, ordenar-lo perquè fos comprensible, acompanyar algú que començava i veure com guanyava autonomia. Aquí la comunicació ja no era només una eina professional; començava a convertir-se en una pràctica docent.</w:t>
+        <w:t xml:space="preserve">Va ser una etapa molt valuosa. Em va ajudar a aprendre a ensenyar, a escoltar millor i a entendre que la docència no és només transmetre contingut tècnic. També és crear condicions perquè l’estudiant pugui avançar, equivocar-se, recuperar confiança i construir criteri.</w:t>
       </w:r>
     </w:p>
     <w:p>
@@ -354,7 +372,7 @@
         <w:pStyle w:val="Textoindependiente"/>
       </w:pPr>
       <w:r>
-        <w:t xml:space="preserve">Mirat amb perspectiva, aquest patró s’ha repetit en altres moments de la meva trajectòria: els canvis importants han estat possibles gràcies a relacions professionals de confiança.</w:t>
+        <w:t xml:space="preserve">Amb el temps, aquesta etapa va evolucionar cap a continguts universitaris més avançats: enginyeria del software, arquitectura de software, disseny de sistemes d’informació i experiència professional aplicada.</w:t>
       </w:r>
     </w:p>
     <w:p>
@@ -362,57 +380,7 @@
         <w:pStyle w:val="Textoindependiente"/>
       </w:pPr>
       <w:r>
-        <w:t xml:space="preserve">Aquesta presa de consciència és la que em va portar a estudiar el Màster de Formació del Professorat i, després, a exercir com a docent en l’àmbit de la Formació Professional.</w:t>
-      </w:r>
-    </w:p>
-    <w:bookmarkEnd w:id="10"/>
-    <w:bookmarkStart w:id="11" w:name="Xc1b9dfbaef16c6230909513d9b21b762b0f9e2c"/>
-    <w:p>
-      <w:pPr>
-        <w:pStyle w:val="Ttulo3"/>
-      </w:pPr>
-      <w:r>
-        <w:t xml:space="preserve">Diapositiva 3. Formació Professional: el descobriment clar de la vocació docent - 1:30</w:t>
-      </w:r>
-    </w:p>
-    <w:p>
-      <w:pPr>
-        <w:pStyle w:val="FirstParagraph"/>
-      </w:pPr>
-      <w:r>
-        <w:t xml:space="preserve">Per això, el pas a la docència no va ser improvisat. Va venir d’una inquietud que ja havia anat apareixent dins la indústria: explicar millor, compartir coneixement i acompanyar persones en el seu procés d’aprenentatge. [pausa breu]</w:t>
-      </w:r>
-    </w:p>
-    <w:p>
-      <w:pPr>
-        <w:pStyle w:val="Textoindependiente"/>
-      </w:pPr>
-      <w:r>
-        <w:t xml:space="preserve">A la Formació Professional vaig trobar una dimensió que buscava des de feia temps: l’aula, la relació directa amb l’alumnat i la responsabilitat d’acompanyar processos d’aprenentatge.</w:t>
-      </w:r>
-    </w:p>
-    <w:p>
-      <w:pPr>
-        <w:pStyle w:val="Textoindependiente"/>
-      </w:pPr>
-      <w:r>
-        <w:t xml:space="preserve">Va ser una etapa important i molt agraïda. Em va ajudar a aprendre a ensenyar, a escoltar millor i a entendre que la docència no és només transmetre contingut tècnic. També és crear condicions perquè l’estudiant pugui avançar, equivocar-se, recuperar confiança i construir criteri.</w:t>
-      </w:r>
-    </w:p>
-    <w:p>
-      <w:pPr>
-        <w:pStyle w:val="Textoindependiente"/>
-      </w:pPr>
-      <w:r>
-        <w:t xml:space="preserve">Amb el temps, però, vaig percebre un límit natural de l’etapa. No un límit de valor de la Formació Professional, que per a mi va ser molt valuosa, sinó un límit en relació amb el tipus de continguts tècnics que jo volia desenvolupar: enginyeria de software, arquitectura, disseny de sistemes i experiència avançada d’indústria.</w:t>
-      </w:r>
-    </w:p>
-    <w:p>
-      <w:pPr>
-        <w:pStyle w:val="Textoindependiente"/>
-      </w:pPr>
-      <w:r>
-        <w:t xml:space="preserve">Això va orientar la mirada cap a la universitat.</w:t>
+        <w:t xml:space="preserve">Això va orientar la mirada cap a la universitat per poder situar aquesta experiència tècnica i docent en assignatures d’enginyeria amb més profunditat conceptual.</w:t>
       </w:r>
     </w:p>
     <w:bookmarkEnd w:id="11"/>
@@ -438,7 +406,7 @@
         <w:pStyle w:val="Textoindependiente"/>
       </w:pPr>
       <w:r>
-        <w:t xml:space="preserve">Allà vaig poder fer docència en assignatures vinculades a l’enginyeria de software, sistemes operatius i desenvolupament d’aplicacions. Va ser una etapa molt enriquidora, perquè em va permetre portar a l’aula coneixement tècnic avançat i experiència professional prèvia.</w:t>
+        <w:t xml:space="preserve">Allà vaig impartir assignatures vinculades a l’enginyeria del software, sistemes operatius i desenvolupament d’aplicacions. També vaig participar en una experiència ABP a Projectes de Programació II, vinculada a Sallefy. És una etapa que valoro molt: em va obrir la docència universitària i em va permetre portar a l’aula coneixement tècnic avançat.</w:t>
       </w:r>
     </w:p>
     <w:p>
@@ -446,7 +414,7 @@
         <w:pStyle w:val="Textoindependiente"/>
       </w:pPr>
       <w:r>
-        <w:t xml:space="preserve">Al cap d’un temps, també es va obrir una necessitat de coherència vital i professional. Amb el trasllat familiar a Llavaneres i amb dos fills, era important poder construir una trajectòria acadèmica sostenible i, alhora, cuidar una bona conciliació familiar. [mirada al tribunal]</w:t>
+        <w:t xml:space="preserve">El pas cap al TecnoCampus va ser una decisió reflexionada, valorada amb la direcció i la coordinació acadèmica. La Salle té una tradició d’enginyeria sòlida i una forta tradició específicament en l’enginyeria de telecomunicacions. Amb el temps, vaig considerar que la meva especialització en enginyeria del software, arquitectura d’aplicacions, backend i sistemes d’informació podia tenir un encaix més directe al TecnoCampus. [mirada al tribunal]</w:t>
       </w:r>
     </w:p>
     <w:p>
@@ -454,7 +422,7 @@
         <w:pStyle w:val="Textoindependiente"/>
       </w:pPr>
       <w:r>
-        <w:t xml:space="preserve">Ho vaig parlar amb el meu coordinador i amb el meu director a La Salle. Els vaig plantejar aquesta necessitat: continuar creixent acadèmicament, però en un entorn que també fos sostenible des del punt de vista vital i familiar.</w:t>
+        <w:t xml:space="preserve">La proximitat geogràfica va reforçar aquesta decisió, perquè facilitava una trajectòria acadèmica sostenible i compatible amb les responsabilitats familiars.</w:t>
       </w:r>
     </w:p>
     <w:p>
@@ -462,7 +430,7 @@
         <w:pStyle w:val="Textoindependiente"/>
       </w:pPr>
       <w:r>
-        <w:t xml:space="preserve">Va ser en aquestes converses que em van parlar de l’Ester Bernadó. En aquell moment era directora acadèmica de l’Escola Politècnica del TecnoCampus, i me’n van destacar tant la trajectòria acadèmica com la feina que havia fet a La Salle. Per això, el contacte amb l’Ester no apareix de manera casual: va ser un pont acadèmic molt concret cap al TecnoCampus.</w:t>
+        <w:t xml:space="preserve">En aquest procés, la Dra. Ester Bernadó va facilitar el contacte acadèmic amb el TecnoCampus i el coneixement mutu.</w:t>
       </w:r>
     </w:p>
     <w:p>
@@ -470,7 +438,7 @@
         <w:pStyle w:val="Textoindependiente"/>
       </w:pPr>
       <w:r>
-        <w:t xml:space="preserve">Després d’aquell contacte, al cap d’un temps vaig començar com a professor associat al TecnoCampus. I des del primer moment vaig percebre que allà podien confluir dimensions que fins aleshores havien avançat una mica separades: docència universitària, enginyeria de software, proximitat territorial i projecte vital.</w:t>
+        <w:t xml:space="preserve">Després d’aquell contacte vaig començar com a professor associat al TecnoCampus. I des del primer moment vaig percebre que hi podien confluir dimensions que fins aleshores havien avançat separades: docència universitària, enginyeria del software, sistemes d’informació i sostenibilitat personal.</w:t>
       </w:r>
     </w:p>
     <w:p>
@@ -482,13 +450,13 @@
       </w:r>
     </w:p>
     <w:bookmarkEnd w:id="12"/>
-    <w:bookmarkStart w:id="13" w:name="X8b6c150352bf3cc24aa352cdd18b5c6ca736de7"/>
+    <w:bookmarkStart w:id="13" w:name="X4c4c60172da25e687857902e325fc7dffe96a3f"/>
     <w:p>
       <w:pPr>
         <w:pStyle w:val="Ttulo3"/>
       </w:pPr>
       <w:r>
-        <w:t xml:space="preserve">Diapositiva 5. TecnoCampus: docència, equip i arquitectura de software - 2:00</w:t>
+        <w:t xml:space="preserve">Diapositiva 5. TecnoCampus: docència, equip i arquitectura de software - 2:05</w:t>
       </w:r>
     </w:p>
     <w:p>
@@ -504,7 +472,7 @@
         <w:pStyle w:val="Textoindependiente"/>
       </w:pPr>
       <w:r>
-        <w:t xml:space="preserve">Des de 2021 hi he desenvolupat docència universitària continuada en assignatures vinculades a programació, estructures de dades, aplicacions d’Internet, enginyeria de software i disseny de sistemes d’informació.</w:t>
+        <w:t xml:space="preserve">Des de 2021 hi he desenvolupat docència universitària continuada en assignatures vinculades a programació, estructures de dades, aplicacions d’Internet, enginyeria del software i disseny de sistemes d’informació.</w:t>
       </w:r>
     </w:p>
     <w:p>
@@ -512,7 +480,7 @@
         <w:pStyle w:val="Textoindependiente"/>
       </w:pPr>
       <w:r>
-        <w:t xml:space="preserve">Aquí he pogut unir tres coses que per a mi són essencials: el rigor tècnic de l’enginyeria de software, la proximitat docent amb l’alumnat i la possibilitat de construir projectes acadèmics amb sentit. En aquest sentit, puc dir, amb sobrietat però també amb sinceritat, que al TecnoCampus m’he sentit com a casa.</w:t>
+        <w:t xml:space="preserve">Aquesta continuïtat no és només temporal. El certificat institucional recull quinze registres oficials d’avaluació docent, entre els cursos 2021-2022 i 2025-2026, amb una mitjana aritmètica simple de 8,75 sobre 10. I els quatre registres dels dos darrers cursos presenten una mitjana aritmètica simple de 9,03 sobre 10.</w:t>
       </w:r>
     </w:p>
     <w:p>
@@ -520,6 +488,14 @@
         <w:pStyle w:val="Textoindependiente"/>
       </w:pPr>
       <w:r>
+        <w:t xml:space="preserve">Ho esmento no com una valoració personal, sinó com un indicador documentat de treball docent sostingut, capacitat d’adaptació i voluntat de millora. [pausa breu]</w:t>
+      </w:r>
+    </w:p>
+    <w:p>
+      <w:pPr>
+        <w:pStyle w:val="Textoindependiente"/>
+      </w:pPr>
+      <w:r>
         <w:t xml:space="preserve">També ha estat molt important el treball amb l’equip. Voldria destacar especialment el Dr. Josep Roure, amb qui he compartit docència i aprenentatge en arquitectura de software, Domain-Driven Design, Clean Architecture i arquitectura hexagonal.</w:t>
       </w:r>
     </w:p>
@@ -528,7 +504,7 @@
         <w:pStyle w:val="Textoindependiente"/>
       </w:pPr>
       <w:r>
-        <w:t xml:space="preserve">Aquesta línia no és només una línia docent. Té una connexió clara amb la transferència professional, perquè moltes empreses i institucions necessiten precisament millorar la manera com estructuren, mantenen i fan evolucionar els seus sistemes software.</w:t>
+        <w:t xml:space="preserve">La participació acreditada en el projecte SQAI d’Aprenentatge Basat en Projectes a Laboratori d’Aplicacions Internet, m’ha permès integrar docència, arquitectura de software i millora educativa.</w:t>
       </w:r>
     </w:p>
     <w:p>
@@ -536,7 +512,25 @@
         <w:pStyle w:val="Textoindependiente"/>
       </w:pPr>
       <w:r>
-        <w:t xml:space="preserve">Projectes com l’ABP a Laboratori d’Aplicacions d’Internet, el projecte SQAI o HexaStock m’han permès integrar docència, arquitectura, pràctica professional i millora educativa.</w:t>
+        <w:t xml:space="preserve">I això connecta directament amb la segona part de la defensa: la classe magistral sobre ports de sortida en arquitectura hexagonal no és una peça aïllada, sinó una mostra d’aquest punt de trobada entre docència universitària, enginyeria del software i transferència.</w:t>
+      </w:r>
+    </w:p>
+    <w:bookmarkEnd w:id="13"/>
+    <w:bookmarkStart w:id="14" w:name="X6f526021fd185638af6f7d611c2a3a910a439de"/>
+    <w:p>
+      <w:pPr>
+        <w:pStyle w:val="Ttulo3"/>
+      </w:pPr>
+      <w:r>
+        <w:t xml:space="preserve">Diapositiva 6. Consultoria i formació internacional, recerca doctoral i projecte de futur - 2:20</w:t>
+      </w:r>
+    </w:p>
+    <w:p>
+      <w:pPr>
+        <w:pStyle w:val="FirstParagraph"/>
+      </w:pPr>
+      <w:r>
+        <w:t xml:space="preserve">En paral·lel, he mantingut una línia de transferència universitat-empresa i formació internacional. [transició]</w:t>
       </w:r>
     </w:p>
     <w:p>
@@ -544,25 +538,7 @@
         <w:pStyle w:val="Textoindependiente"/>
       </w:pPr>
       <w:r>
-        <w:t xml:space="preserve">I això connecta directament amb la segona part de la defensa: la classe magistral sobre ports de sortida en arquitectura hexagonal no és una peça aïllada, sinó una mostra d’aquest punt de trobada entre docència universitària, enginyeria de software i transferència.</w:t>
-      </w:r>
-    </w:p>
-    <w:bookmarkEnd w:id="13"/>
-    <w:bookmarkStart w:id="14" w:name="X77b948eb5b88b9411aa9e9ac95be04d08c18873"/>
-    <w:p>
-      <w:pPr>
-        <w:pStyle w:val="Ttulo3"/>
-      </w:pPr>
-      <w:r>
-        <w:t xml:space="preserve">Diapositiva 6. Consultoria i formació internacional, recerca doctoral i projecte de futur - 2:05</w:t>
-      </w:r>
-    </w:p>
-    <w:p>
-      <w:pPr>
-        <w:pStyle w:val="FirstParagraph"/>
-      </w:pPr>
-      <w:r>
-        <w:t xml:space="preserve">En paral·lel, Neueda ha obert una etapa de consultoria i formació internacional. [transició]</w:t>
+        <w:t xml:space="preserve">Disposo del C1 Advanced de Cambridge, amb una puntuació global de 185, i l’anglès és una llengua de treball real. En el marc de Neueda he impartit formació internacional d’enginyeria del software en anglès, vinculada a Java, Spring, arquitectura i qualitat.</w:t>
       </w:r>
     </w:p>
     <w:p>
@@ -570,7 +546,7 @@
         <w:pStyle w:val="Textoindependiente"/>
       </w:pPr>
       <w:r>
-        <w:t xml:space="preserve">La formació tècnica en anglès, en programes vinculats a institucions financeres internacionals, m’ha ajudat a consolidar maduresa com a instructor, capacitat de comunicació tècnica i connexió amb necessitats reals de la indústria.</w:t>
+        <w:t xml:space="preserve">També he desenvolupat activitats de transferència, com les 60 hores acreditades amb AGAUR sobre serveis REST, arquitectura hexagonal i modernització de sistemes d’informació.</w:t>
       </w:r>
     </w:p>
     <w:p>
@@ -578,7 +554,7 @@
         <w:pStyle w:val="Textoindependiente"/>
       </w:pPr>
       <w:r>
-        <w:t xml:space="preserve">Aquesta experiència també ha reforçat una idea que per a mi és central: la universitat no pot quedar separada del món professional, però tampoc pot limitar-se a reproduir-lo. Ha d’ajudar l’estudiant a entendre’l críticament, amb fonaments, amb criteri i amb responsabilitat.</w:t>
+        <w:t xml:space="preserve">El doctorat a la UDIMA és la maduració científica d’aquest recorregut. Però no el presentaria com una recerca genèrica sobre empatia. La meva recerca s’inscriu en l’Educació en Enginyeria del Software. [pausa breu]</w:t>
       </w:r>
     </w:p>
     <w:p>
@@ -586,7 +562,7 @@
         <w:pStyle w:val="Textoindependiente"/>
       </w:pPr>
       <w:r>
-        <w:t xml:space="preserve">El doctorat a la UDIMA, en Educació i Tecnologia, és la maduració científica d’una inquietud que ja apareixia des de l’inici de la trajectòria: la dimensió humana de l’enginyeria de software. [pausa breu]</w:t>
+        <w:t xml:space="preserve">No parteix d’una intuïció aïllada. La literatura internacional recent identifica mancances en la integració curricular, la mesura i els estudis longitudinals d’aquestes competències dins la formació dels futurs enginyers i enginyeres del software.</w:t>
       </w:r>
     </w:p>
     <w:p>
@@ -594,7 +570,7 @@
         <w:pStyle w:val="Textoindependiente"/>
       </w:pPr>
       <w:r>
-        <w:t xml:space="preserve">La tesi estudia el cultiu de l’empatia, l’escolta activa i la comunicació assertiva en estudiants universitaris d’Enginyeria de Software mitjançant Aprenentatge Basat en Projectes.</w:t>
+        <w:t xml:space="preserve">La tesi se situa en aquest espai mitjançant un disseny mixt i quasiexperimental, integrat en dues assignatures reals amb ABP, amb pretest, posttest, seguiment diferit i component qualitatiu. No pretén substituir la formació tècnica; pretén estudiar com complementar-la amb competències vinculades a requisits, usuaris, parts interessades, col·laboració i disseny responsable.</w:t>
       </w:r>
     </w:p>
     <w:p>
@@ -602,15 +578,7 @@
         <w:pStyle w:val="Textoindependiente"/>
       </w:pPr>
       <w:r>
-        <w:t xml:space="preserve">Per tant, la recerca no se situa al marge de la docència ni de l’enginyeria. Respon a una pregunta molt concreta: com podem formar enginyers i enginyeres tècnicament solvents, però també capaços de comunicar, escoltar, col·laborar i assumir responsabilitat sobre el software que construeixen?</w:t>
-      </w:r>
-    </w:p>
-    <w:p>
-      <w:pPr>
-        <w:pStyle w:val="Textoindependiente"/>
-      </w:pPr>
-      <w:r>
-        <w:t xml:space="preserve">Per això, entenc aquesta plaça no només com una continuïtat contractual, sinó com la possibilitat de consolidar un projecte acadèmic que ja sento profundament vinculat al TecnoCampus: seguir aportant en docència, recerca, innovació educativa, transferència i acompanyament de l’alumnat. [mirada al tribunal]</w:t>
+        <w:t xml:space="preserve">Per això, entenc aquesta plaça com la possibilitat de consolidar un projecte acadèmic ja vinculat al TecnoCampus: docència rigorosa, innovació educativa, transferència, recerca viable i acompanyament de l’alumnat. [mirada al tribunal]</w:t>
       </w:r>
     </w:p>
     <w:p>
@@ -647,13 +615,13 @@
         <w:t xml:space="preserve">2. Notes del presentador per diapositiva</w:t>
       </w:r>
     </w:p>
-    <w:bookmarkStart w:id="16" w:name="trajectòria---100"/>
+    <w:bookmarkStart w:id="16" w:name="trajectòria---050"/>
     <w:p>
       <w:pPr>
         <w:pStyle w:val="Ttulo3"/>
       </w:pPr>
       <w:r>
-        <w:t xml:space="preserve">1. Trajectòria - 1:00</w:t>
+        <w:t xml:space="preserve">1. Trajectòria - 0:50</w:t>
       </w:r>
     </w:p>
     <w:p>
@@ -689,7 +657,7 @@
         </w:numPr>
       </w:pPr>
       <w:r>
-        <w:t xml:space="preserve">2004 -&gt; indústria, docència, recerca, TecnoCampus.</w:t>
+        <w:t xml:space="preserve">2004 -&gt; indústria, docència universitària, innovació, transferència, recerca i TecnoCampus.</w:t>
       </w:r>
     </w:p>
     <w:p>
@@ -717,13 +685,13 @@
       </w:r>
     </w:p>
     <w:bookmarkEnd w:id="16"/>
-    <w:bookmarkStart w:id="17" w:name="indústria-i-consultoria---140"/>
+    <w:bookmarkStart w:id="17" w:name="indústria-i-consultoria---110"/>
     <w:p>
       <w:pPr>
         <w:pStyle w:val="Ttulo3"/>
       </w:pPr>
       <w:r>
-        <w:t xml:space="preserve">2. Indústria i consultoria - 1:40</w:t>
+        <w:t xml:space="preserve">2. Indústria i consultoria - 1:10</w:t>
       </w:r>
     </w:p>
     <w:p>
@@ -771,7 +739,7 @@
         </w:numPr>
       </w:pPr>
       <w:r>
-        <w:t xml:space="preserve">3GSM / Mobile World Congress i patent com a context d’innovació.</w:t>
+        <w:t xml:space="preserve">3GSM / Mobile World Congress i patent com a context d’innovació; no presentar la patent com a pròpia.</w:t>
       </w:r>
     </w:p>
     <w:p>
@@ -795,7 +763,7 @@
         </w:numPr>
       </w:pPr>
       <w:r>
-        <w:t xml:space="preserve">Punt clau: el que més gaudia era formar perfils més junior.</w:t>
+        <w:t xml:space="preserve">Punt clau: el que més gaudia era formar perfils més júniors.</w:t>
       </w:r>
     </w:p>
     <w:p>
@@ -819,17 +787,17 @@
         </w:numPr>
       </w:pPr>
       <w:r>
-        <w:t xml:space="preserve">Transició: Màster de Professorat i entrada a la Formació Professional.</w:t>
+        <w:t xml:space="preserve">Transició: màster en Formació del Professorat i entrada a la Formació Professional.</w:t>
       </w:r>
     </w:p>
     <w:bookmarkEnd w:id="17"/>
-    <w:bookmarkStart w:id="18" w:name="stucom---130"/>
+    <w:bookmarkStart w:id="18" w:name="stucom---110"/>
     <w:p>
       <w:pPr>
         <w:pStyle w:val="Ttulo3"/>
       </w:pPr>
       <w:r>
-        <w:t xml:space="preserve">3. Stucom - 1:30</w:t>
+        <w:t xml:space="preserve">3. Stucom - 1:10</w:t>
       </w:r>
     </w:p>
     <w:p>
@@ -853,7 +821,7 @@
         </w:numPr>
       </w:pPr>
       <w:r>
-        <w:t xml:space="preserve">Màster de Professorat + FP DAW/DAM.</w:t>
+        <w:t xml:space="preserve">Màster en Formació del Professorat + FP DAW/DAM.</w:t>
       </w:r>
     </w:p>
     <w:p>
@@ -877,7 +845,7 @@
         </w:numPr>
       </w:pPr>
       <w:r>
-        <w:t xml:space="preserve">Agraïment a la FP; no minusvalorar-la.</w:t>
+        <w:t xml:space="preserve">Agraïment a l’FP; no menysvalorar-la.</w:t>
       </w:r>
     </w:p>
     <w:p>
@@ -889,7 +857,7 @@
         </w:numPr>
       </w:pPr>
       <w:r>
-        <w:t xml:space="preserve">Límit natural: voler desenvolupar continguts tècnics universitaris.</w:t>
+        <w:t xml:space="preserve">Evolució cap a continguts tècnics universitaris més avançats.</w:t>
       </w:r>
     </w:p>
     <w:bookmarkEnd w:id="18"/>
@@ -923,7 +891,7 @@
         </w:numPr>
       </w:pPr>
       <w:r>
-        <w:t xml:space="preserve">Trajectòria acadèmica sostenible i bona conciliació familiar.</w:t>
+        <w:t xml:space="preserve">La Salle és etapa valuosa; evitar comparacions jeràrquiques.</w:t>
       </w:r>
     </w:p>
     <w:p>
@@ -935,6 +903,30 @@
         </w:numPr>
       </w:pPr>
       <w:r>
+        <w:t xml:space="preserve">Motiu principal: encaix acadèmic més directe amb enginyeria del software i sistemes d’informació.</w:t>
+      </w:r>
+    </w:p>
+    <w:p>
+      <w:pPr>
+        <w:pStyle w:val="Compact"/>
+        <w:numPr>
+          <w:ilvl w:val="0"/>
+          <w:numId w:val="1006"/>
+        </w:numPr>
+      </w:pPr>
+      <w:r>
+        <w:t xml:space="preserve">Conciliació com a factor complementari de sostenibilitat.</w:t>
+      </w:r>
+    </w:p>
+    <w:p>
+      <w:pPr>
+        <w:pStyle w:val="Compact"/>
+        <w:numPr>
+          <w:ilvl w:val="0"/>
+          <w:numId w:val="1006"/>
+        </w:numPr>
+      </w:pPr>
+      <w:r>
         <w:t xml:space="preserve">Conversa amb coordinador i director a La Salle.</w:t>
       </w:r>
     </w:p>
@@ -947,7 +939,7 @@
         </w:numPr>
       </w:pPr>
       <w:r>
-        <w:t xml:space="preserve">Ester Bernadó: directora acadèmica de l’Escola Politècnica del TecnoCampus.</w:t>
+        <w:t xml:space="preserve">La Dra. Ester Bernadó va facilitar el contacte acadèmic amb el TecnoCampus.</w:t>
       </w:r>
     </w:p>
     <w:p>
@@ -959,7 +951,7 @@
         </w:numPr>
       </w:pPr>
       <w:r>
-        <w:t xml:space="preserve">Ester com a pont acadèmic concret, no com a aparició casual.</w:t>
+        <w:t xml:space="preserve">TecnoCampus: docència universitària, software, sistemes d’informació, transferència i projecte sostenible.</w:t>
       </w:r>
     </w:p>
     <w:p>
@@ -971,29 +963,17 @@
         </w:numPr>
       </w:pPr>
       <w:r>
-        <w:t xml:space="preserve">TecnoCampus: docència universitària, proximitat i projecte vital.</w:t>
-      </w:r>
-    </w:p>
-    <w:p>
-      <w:pPr>
-        <w:pStyle w:val="Compact"/>
-        <w:numPr>
-          <w:ilvl w:val="0"/>
-          <w:numId w:val="1006"/>
-        </w:numPr>
-      </w:pPr>
-      <w:r>
         <w:t xml:space="preserve">Frase clau: el desig de consolidar-se ve de lluny.</w:t>
       </w:r>
     </w:p>
     <w:bookmarkEnd w:id="19"/>
-    <w:bookmarkStart w:id="20" w:name="tecnocampus---200"/>
+    <w:bookmarkStart w:id="20" w:name="tecnocampus---205"/>
     <w:p>
       <w:pPr>
         <w:pStyle w:val="Ttulo3"/>
       </w:pPr>
       <w:r>
-        <w:t xml:space="preserve">5. TecnoCampus - 2:00</w:t>
+        <w:t xml:space="preserve">5. TecnoCampus - 2:05</w:t>
       </w:r>
     </w:p>
     <w:p>
@@ -1029,7 +1009,7 @@
         </w:numPr>
       </w:pPr>
       <w:r>
-        <w:t xml:space="preserve">Sentir-se com a casa, amb to sobri.</w:t>
+        <w:t xml:space="preserve">15 registres oficials d’avaluació docent: mitjana aritmètica simple de 8,75/10.</w:t>
       </w:r>
     </w:p>
     <w:p>
@@ -1041,6 +1021,30 @@
         </w:numPr>
       </w:pPr>
       <w:r>
+        <w:t xml:space="preserve">Quatre registres dels dos darrers cursos: mitjana aritmètica simple de 9,03/10.</w:t>
+      </w:r>
+    </w:p>
+    <w:p>
+      <w:pPr>
+        <w:pStyle w:val="Compact"/>
+        <w:numPr>
+          <w:ilvl w:val="0"/>
+          <w:numId w:val="1007"/>
+        </w:numPr>
+      </w:pPr>
+      <w:r>
+        <w:t xml:space="preserve">No dir mitjana ponderada ni percentatge de satisfacció.</w:t>
+      </w:r>
+    </w:p>
+    <w:p>
+      <w:pPr>
+        <w:pStyle w:val="Compact"/>
+        <w:numPr>
+          <w:ilvl w:val="0"/>
+          <w:numId w:val="1007"/>
+        </w:numPr>
+      </w:pPr>
+      <w:r>
         <w:t xml:space="preserve">Josep Roure: arquitectura, DDD, Clean Architecture, hexagonal.</w:t>
       </w:r>
     </w:p>
@@ -1053,7 +1057,7 @@
         </w:numPr>
       </w:pPr>
       <w:r>
-        <w:t xml:space="preserve">ABP, SQAI, HexaStock com a integració de docència, pràctica i transferència.</w:t>
+        <w:t xml:space="preserve">Participació acreditada al projecte SQAI d’ABP a Laboratori d’Aplicacions Internet.</w:t>
       </w:r>
     </w:p>
     <w:p>
@@ -1065,17 +1069,29 @@
         </w:numPr>
       </w:pPr>
       <w:r>
+        <w:t xml:space="preserve">HexaStock com a integració de docència, pràctica i transferència.</w:t>
+      </w:r>
+    </w:p>
+    <w:p>
+      <w:pPr>
+        <w:pStyle w:val="Compact"/>
+        <w:numPr>
+          <w:ilvl w:val="0"/>
+          <w:numId w:val="1007"/>
+        </w:numPr>
+      </w:pPr>
+      <w:r>
         <w:t xml:space="preserve">Transició explícita a la classe magistral.</w:t>
       </w:r>
     </w:p>
     <w:bookmarkEnd w:id="20"/>
-    <w:bookmarkStart w:id="21" w:name="neueda-doctorat-i-futur---205"/>
+    <w:bookmarkStart w:id="21" w:name="neueda-doctorat-i-futur---220"/>
     <w:p>
       <w:pPr>
         <w:pStyle w:val="Ttulo3"/>
       </w:pPr>
       <w:r>
-        <w:t xml:space="preserve">6. Neueda, doctorat i futur - 2:05</w:t>
+        <w:t xml:space="preserve">6. Neueda, doctorat i futur - 2:20</w:t>
       </w:r>
     </w:p>
     <w:p>
@@ -1087,7 +1103,7 @@
         </w:numPr>
       </w:pPr>
       <w:r>
-        <w:t xml:space="preserve">Neueda: consultoria i formació internacional, anglès tècnic i indústria.</w:t>
+        <w:t xml:space="preserve">Cambridge C1 Advanced: 185, Pass at Grade C, C1 MECR.</w:t>
       </w:r>
     </w:p>
     <w:p>
@@ -1099,7 +1115,7 @@
         </w:numPr>
       </w:pPr>
       <w:r>
-        <w:t xml:space="preserve">Doctorat UDIMA: Educació i Tecnologia.</w:t>
+        <w:t xml:space="preserve">Neueda: formació internacional en anglès en enginyeria del software.</w:t>
       </w:r>
     </w:p>
     <w:p>
@@ -1111,7 +1127,67 @@
         </w:numPr>
       </w:pPr>
       <w:r>
-        <w:t xml:space="preserve">Tesi: empatia, escolta activa i comunicació assertiva en Enginyeria de Software amb ABP.</w:t>
+        <w:t xml:space="preserve">AGAUR: 60 hores de formació i consultoria especialitzada en REST, arquitectura hexagonal i sistemes d’informació.</w:t>
+      </w:r>
+    </w:p>
+    <w:p>
+      <w:pPr>
+        <w:pStyle w:val="Compact"/>
+        <w:numPr>
+          <w:ilvl w:val="0"/>
+          <w:numId w:val="1008"/>
+        </w:numPr>
+      </w:pPr>
+      <w:r>
+        <w:t xml:space="preserve">HUB4T: Java Backend Web Developer, 120 h per curs durant tres cursos acadèmics.</w:t>
+      </w:r>
+    </w:p>
+    <w:p>
+      <w:pPr>
+        <w:pStyle w:val="Compact"/>
+        <w:numPr>
+          <w:ilvl w:val="0"/>
+          <w:numId w:val="1008"/>
+        </w:numPr>
+      </w:pPr>
+      <w:r>
+        <w:t xml:space="preserve">Doctorat UDIMA: Educació en Enginyeria del Software.</w:t>
+      </w:r>
+    </w:p>
+    <w:p>
+      <w:pPr>
+        <w:pStyle w:val="Compact"/>
+        <w:numPr>
+          <w:ilvl w:val="0"/>
+          <w:numId w:val="1008"/>
+        </w:numPr>
+      </w:pPr>
+      <w:r>
+        <w:t xml:space="preserve">No presentar-lo com a psicologia genèrica ni com a resultats ja assolits.</w:t>
+      </w:r>
+    </w:p>
+    <w:p>
+      <w:pPr>
+        <w:pStyle w:val="Compact"/>
+        <w:numPr>
+          <w:ilvl w:val="0"/>
+          <w:numId w:val="1008"/>
+        </w:numPr>
+      </w:pPr>
+      <w:r>
+        <w:t xml:space="preserve">Tesi: problema obert identificat per la literatura recent; integració curricular, mesura i estudis longitudinals.</w:t>
+      </w:r>
+    </w:p>
+    <w:p>
+      <w:pPr>
+        <w:pStyle w:val="Compact"/>
+        <w:numPr>
+          <w:ilvl w:val="0"/>
+          <w:numId w:val="1008"/>
+        </w:numPr>
+      </w:pPr>
+      <w:r>
+        <w:t xml:space="preserve">Disseny mixt i quasiexperimental, dues assignatures reals amb ABP, pretest, posttest, seguiment diferit i component qualitatiu.</w:t>
       </w:r>
     </w:p>
     <w:p>
@@ -1176,10 +1252,10 @@
         <w:tblLook w:firstRow="1" w:lastRow="0" w:firstColumn="0" w:lastColumn="0" w:noHBand="0" w:noVBand="0" w:val="0020"/>
       </w:tblPr>
       <w:tblGrid>
-        <w:gridCol w:w="609"/>
-        <w:gridCol w:w="3710"/>
-        <w:gridCol w:w="2713"/>
-        <w:gridCol w:w="886"/>
+        <w:gridCol w:w="600"/>
+        <w:gridCol w:w="3714"/>
+        <w:gridCol w:w="2731"/>
+        <w:gridCol w:w="873"/>
       </w:tblGrid>
       <w:tr>
         <w:trPr>
@@ -1260,7 +1336,7 @@
               <w:pStyle w:val="Compact"/>
             </w:pPr>
             <w:r>
-              <w:t xml:space="preserve">2004, enginyeria, docència, recerca, TecnoCampus</w:t>
+              <w:t xml:space="preserve">2004, software, docència, transferència, recerca</w:t>
             </w:r>
           </w:p>
         </w:tc>
@@ -1306,7 +1382,7 @@
               <w:pStyle w:val="Compact"/>
             </w:pPr>
             <w:r>
-              <w:t xml:space="preserve">Symbian, veu, C/C++, MWC, openTrends, Java</w:t>
+              <w:t xml:space="preserve">Symbian, C/C++, MWC, openTrends, Java</w:t>
             </w:r>
           </w:p>
         </w:tc>
@@ -1387,7 +1463,7 @@
               <w:pStyle w:val="Compact"/>
             </w:pPr>
             <w:r>
-              <w:t xml:space="preserve">La Salle obre la universitat i TecnoCampus dona coherència vital</w:t>
+              <w:t xml:space="preserve">La Salle obre la universitat i TecnoCampus dona alineació</w:t>
             </w:r>
           </w:p>
         </w:tc>
@@ -1398,7 +1474,7 @@
               <w:pStyle w:val="Compact"/>
             </w:pPr>
             <w:r>
-              <w:t xml:space="preserve">universitat, conciliació, Ester Bernadó</w:t>
+              <w:t xml:space="preserve">La Salle, software, sistemes, Ester Bernadó</w:t>
             </w:r>
           </w:p>
         </w:tc>
@@ -1433,7 +1509,7 @@
               <w:pStyle w:val="Compact"/>
             </w:pPr>
             <w:r>
-              <w:t xml:space="preserve">TecnoCampus integra docència, equip, arquitectura i transferència</w:t>
+              <w:t xml:space="preserve">TecnoCampus integra docència, evidència, equip i transferència</w:t>
             </w:r>
           </w:p>
         </w:tc>
@@ -1444,7 +1520,7 @@
               <w:pStyle w:val="Compact"/>
             </w:pPr>
             <w:r>
-              <w:t xml:space="preserve">Josep Roure, ABP, SQAI, HexaStock</w:t>
+              <w:t xml:space="preserve">2021, 15 registres, 8,75, 9,03, SQAI</w:t>
             </w:r>
           </w:p>
         </w:tc>
@@ -1479,7 +1555,7 @@
               <w:pStyle w:val="Compact"/>
             </w:pPr>
             <w:r>
-              <w:t xml:space="preserve">Doctorat i futur consoliden la dimensió humana de l’enginyeria</w:t>
+              <w:t xml:space="preserve">Doctorat i futur se situen en l’Educació en Enginyeria del Software</w:t>
             </w:r>
           </w:p>
         </w:tc>
@@ -1490,7 +1566,7 @@
               <w:pStyle w:val="Compact"/>
             </w:pPr>
             <w:r>
-              <w:t xml:space="preserve">Neueda, UDIMA, empatia, escolta, comunicació</w:t>
+              <w:t xml:space="preserve">C1, Neueda, AGAUR, HUB4T, buit de recerca</w:t>
             </w:r>
           </w:p>
         </w:tc>
@@ -1521,7 +1597,7 @@
         <w:rPr>
           <w:rStyle w:val="VerbatimChar"/>
         </w:rPr>
-        <w:t xml:space="preserve">indústria -&gt; docència -&gt; universitat -&gt; TecnoCampus -&gt; recerca -&gt; futur</w:t>
+        <w:t xml:space="preserve">indústria del software -&gt; docència universitària en software -&gt; TecnoCampus -&gt; recerca -&gt; futur</w:t>
       </w:r>
       <w:r>
         <w:t xml:space="preserve">.</w:t>
@@ -1540,7 +1616,7 @@
         <w:pStyle w:val="Textodebloque"/>
       </w:pPr>
       <w:r>
-        <w:t xml:space="preserve">formar bons enginyers i enginyeres, tècnicament solvents, però també capaços de comunicar, escoltar, col·laborar i assumir responsabilitat sobre el software que construeixen.</w:t>
+        <w:t xml:space="preserve">una recerca en Educació en Enginyeria del Software, integrada en assignatures reals, que vol contribuir a formar enginyers i enginyeres tècnicament solvents i professionalment responsables.</w:t>
       </w:r>
     </w:p>
     <w:p>
@@ -1574,7 +1650,7 @@
         <w:pStyle w:val="FirstParagraph"/>
       </w:pPr>
       <w:r>
-        <w:t xml:space="preserve">La presentació està pensada per a 10 minuts amb un ritme pausat. Les diapositives 5 i 6 són les més importants i poden ocupar una mica més de temps. Si cal retallar durant l’assaig, retalla detall tècnic de la diapositiva 2; no retallis el tancament final.</w:t>
+        <w:t xml:space="preserve">La presentació està pensada per a 9:00-9:20 amb un ritme pausat i marge real. Les diapositives 5 i 6 són les més importants i poden ocupar una mica més de temps. Si cal retallar durant l’assaig, retalla detall tècnic de la diapositiva 2 o una evidència de transferència de la diapositiva 6; no retallis les xifres docents del TecnoCampus.</w:t>
       </w:r>
     </w:p>
     <w:bookmarkEnd w:id="24"/>
@@ -1592,19 +1668,7 @@
         <w:pStyle w:val="FirstParagraph"/>
       </w:pPr>
       <w:r>
-        <w:t xml:space="preserve">Mantén un to acadèmic, però no burocràtic. Les frases personals han de sonar naturals i sobries:</w:t>
-      </w:r>
-      <w:r>
-        <w:t xml:space="preserve"> </w:t>
-      </w:r>
-      <w:r>
-        <w:rPr>
-          <w:rStyle w:val="VerbatimChar"/>
-        </w:rPr>
-        <w:t xml:space="preserve">m'he sentit com a casa</w:t>
-      </w:r>
-      <w:r>
-        <w:t xml:space="preserve">,</w:t>
+        <w:t xml:space="preserve">Mantén un to acadèmic, però no burocràtic. Les frases personals han de sonar naturals i sòbries:</w:t>
       </w:r>
       <w:r>
         <w:t xml:space="preserve"> </w:t>
@@ -1628,7 +1692,7 @@
         <w:t xml:space="preserve">projecte acadèmic vinculat al TecnoCampus</w:t>
       </w:r>
       <w:r>
-        <w:t xml:space="preserve">. No cal intensificar-les; la força està en dir-les amb calma.</w:t>
+        <w:t xml:space="preserve">. No cal intensificar-les; la força està a dir-les amb calma i amb evidència.</w:t>
       </w:r>
     </w:p>
     <w:bookmarkEnd w:id="25"/>
@@ -1646,7 +1710,7 @@
         <w:pStyle w:val="FirstParagraph"/>
       </w:pPr>
       <w:r>
-        <w:t xml:space="preserve">Mira el tribunal en tres moments: inici, explicació de la coherència TecnoCampus i tancament final. Mira la pantalla només quan la diapositiva ajudi a ordenar una etapa o una transició. A la diapositiva 5, atura’t una mica abans de mencionar Josep Roure i la connexió amb la classe magistral.</w:t>
+        <w:t xml:space="preserve">Mira el tribunal en tres moments: inici, explicació de l’alineació TecnoCampus i tancament final. Mira la pantalla només quan la diapositiva ajudi a ordenar una etapa o una transició. A la diapositiva 5, atura’t una mica abans de dir les xifres d’avaluació docent.</w:t>
       </w:r>
     </w:p>
     <w:bookmarkEnd w:id="26"/>
@@ -1668,7 +1732,7 @@
         </w:numPr>
       </w:pPr>
       <w:r>
-        <w:t xml:space="preserve">Diapositiva 1: no superar 1:10.</w:t>
+        <w:t xml:space="preserve">Diapositiva 1: no superar 0:55.</w:t>
       </w:r>
     </w:p>
     <w:p>
@@ -1680,7 +1744,7 @@
         </w:numPr>
       </w:pPr>
       <w:r>
-        <w:t xml:space="preserve">Diapositiva 2: no explicar massa Vida Software; màxim 35-40 segons.</w:t>
+        <w:t xml:space="preserve">Diapositiva 2: no explicar massa Vida Software; màxim 30 segons.</w:t>
       </w:r>
     </w:p>
     <w:p>
@@ -1704,7 +1768,7 @@
         </w:numPr>
       </w:pPr>
       <w:r>
-        <w:t xml:space="preserve">Diapositiva 4: conciliació amb naturalitat, sense dramatitzar.</w:t>
+        <w:t xml:space="preserve">Diapositiva 4: alineació acadèmica com a motiu principal; conciliació només com a sostenibilitat complementària.</w:t>
       </w:r>
     </w:p>
     <w:p>
@@ -1728,7 +1792,7 @@
         </w:numPr>
       </w:pPr>
       <w:r>
-        <w:t xml:space="preserve">Diapositiva 6: tancar amb seguretat i enllaçar amb la classe magistral.</w:t>
+        <w:t xml:space="preserve">Diapositiva 6: recerca com a Educació en Enginyeria del Software; tancar amb seguretat i enllaçar amb la classe magistral.</w:t>
       </w:r>
     </w:p>
     <w:bookmarkEnd w:id="27"/>
@@ -1758,7 +1822,7 @@
         </w:numPr>
       </w:pPr>
       <w:r>
-        <w:t xml:space="preserve">A la diapositiva 2, no enumeris protocols; digues només</w:t>
+        <w:t xml:space="preserve">A la diapositiva 2, digues només</w:t>
       </w:r>
       <w:r>
         <w:t xml:space="preserve"> </w:t>
@@ -1803,10 +1867,22 @@
         <w:rPr>
           <w:rStyle w:val="VerbatimChar"/>
         </w:rPr>
-        <w:t xml:space="preserve">calia una trajectòria acadèmica sostenible i coherent amb la vida familiar</w:t>
+        <w:t xml:space="preserve">la proximitat reforçava una trajectòria acadèmica sostenible</w:t>
       </w:r>
       <w:r>
         <w:t xml:space="preserve">.</w:t>
+      </w:r>
+    </w:p>
+    <w:p>
+      <w:pPr>
+        <w:pStyle w:val="Compact"/>
+        <w:numPr>
+          <w:ilvl w:val="0"/>
+          <w:numId w:val="1010"/>
+        </w:numPr>
+      </w:pPr>
+      <w:r>
+        <w:t xml:space="preserve">A la diapositiva 6, si vas tard, elimina HUB4T i deixa només Cambridge, Neueda, AGAUR i doctorat.</w:t>
       </w:r>
     </w:p>
     <w:p>

</xml_diff>

<commit_message>
Refine doctoral wording in trajectory defense materials
Replace "maduració científica" with "articulació científica" in slide 6
and the oral script, and rephrase the research framing as a direct
positive statement instead of the meta remark about how not to present
the thesis. Regenerate the trajectory derived exports.
</commit_message>
<xml_diff>
--- a/doc/presentations/defensa-placa-permanent-dsi-ports-sortida-hexagonal/output/REMARKABLE_materials-orals-canonics-10-minuts-trajectoria.docx
+++ b/doc/presentations/defensa-placa-permanent-dsi-ports-sortida-hexagonal/output/REMARKABLE_materials-orals-canonics-10-minuts-trajectoria.docx
@@ -554,15 +554,7 @@
         <w:pStyle w:val="Textoindependiente"/>
       </w:pPr>
       <w:r>
-        <w:t xml:space="preserve">El doctorat a la UDIMA és la maduració científica d’aquest recorregut. Però no el presentaria com una recerca genèrica sobre empatia. La meva recerca s’inscriu en l’Educació en Enginyeria del Software. [pausa breu]</w:t>
-      </w:r>
-    </w:p>
-    <w:p>
-      <w:pPr>
-        <w:pStyle w:val="Textoindependiente"/>
-      </w:pPr>
-      <w:r>
-        <w:t xml:space="preserve">No parteix d’una intuïció aïllada. La literatura internacional recent identifica mancances en la integració curricular, la mesura i els estudis longitudinals d’aquestes competències dins la formació dels futurs enginyers i enginyeres del software.</w:t>
+        <w:t xml:space="preserve">El doctorat a la UDIMA representa l’articulació científica d’aquest recorregut. La recerca s’inscriu en l’àmbit de l’Educació en Enginyeria del Software i no parteix d’una intuïció aïllada. La literatura internacional recent identifica mancances en la integració curricular, la mesura i els estudis longitudinals d’aquestes competències dins la formació dels futurs enginyers i enginyeres del software.</w:t>
       </w:r>
     </w:p>
     <w:p>

</xml_diff>

<commit_message>
Improve wording variety and slide alignment in defense oral scripts
Rework the trajectory opening to mirror the title slide's four blocks
(three axes converging on TecnoCampus) instead of enumerating five
dimensions, and remove the overused word "dimensió" across both oral
scripts: "allò que buscava" (FP slide), "camins que havien avançat
separats" (TecnoCampus slide), and "una trobada entre dos mons" in the
20-minute opening. Includes Alfredo's own touch-ups to the industry
slide. Regenerate all derived exports for both scripts.
</commit_message>
<xml_diff>
--- a/doc/presentations/defensa-placa-permanent-dsi-ports-sortida-hexagonal/output/REMARKABLE_materials-orals-canonics-10-minuts-trajectoria.docx
+++ b/doc/presentations/defensa-placa-permanent-dsi-ports-sortida-hexagonal/output/REMARKABLE_materials-orals-canonics-10-minuts-trajectoria.docx
@@ -264,7 +264,7 @@
         <w:pStyle w:val="Textoindependiente"/>
       </w:pPr>
       <w:r>
-        <w:t xml:space="preserve">En aquests deu minuts no faré una lectura cronològica del currículum. Voldria explicar el fil conductor d’una trajectòria iniciada el 2004 i articulada al voltant de cinc dimensions: enginyeria del software, docència universitària, innovació educativa, transferència i recerca. [pausa breu]</w:t>
+        <w:t xml:space="preserve">En aquests deu minuts explicaré el fil conductor d’una trajectòria iniciada el 2004: la indústria del software, la docència universitària i la recerca, tres eixos que convergeixen al TecnoCampus com a projecte docent i acadèmic. [pausa breu]</w:t>
       </w:r>
     </w:p>
     <w:p>
@@ -272,7 +272,7 @@
         <w:pStyle w:val="Textoindependiente"/>
       </w:pPr>
       <w:r>
-        <w:t xml:space="preserve">La idea central és senzilla: la meva trajectòria neix en la indústria del software, s’amplia cap a la docència universitària en software i troba al TecnoCampus un espai coherent per consolidar un projecte acadèmic.</w:t>
+        <w:t xml:space="preserve">La meva trajectòria neix en la indústria del software, s’amplia cap a la docència universitària en software i troba al TecnoCampus un espai coherent per consolidar un projecte acadèmic.</w:t>
       </w:r>
     </w:p>
     <w:p>
@@ -306,7 +306,7 @@
         <w:pStyle w:val="Textoindependiente"/>
       </w:pPr>
       <w:r>
-        <w:t xml:space="preserve">A Vida Software vaig treballar en un component del sistema operatiu Symbian orientat a incorporar interacció per veu en aplicacions mòbils. Era una peça de plataforma en C/C++, amb restriccions fortes de rendiment i memòria, presentada en entorns com el 3GSM / Mobile World Congress i vinculada al context d’innovació d’una patent de Vida Software sobre interfícies d’usuari.</w:t>
+        <w:t xml:space="preserve">A Vida Software vaig treballar en un component del sistema operatiu Symbian orientat a incorporar interacció per veu en aplicacions mòbils. Era una peça de plataforma en C/C++, amb restriccions fortes de memòria, cpu i xarxa. Es va presentar en entorns com el 3GSM / Mobile World Congress i vinculada al context d’innovació d’una patent de Vida Software sobre interfícies d’usuari.</w:t>
       </w:r>
     </w:p>
     <w:p>
@@ -314,7 +314,7 @@
         <w:pStyle w:val="Textoindependiente"/>
       </w:pPr>
       <w:r>
-        <w:t xml:space="preserve">El pas a openTrends va ampliar aquesta base cap a Java, Linux, Spring, sistemes d’informació, clients i equips. Allà la comunicació tècnica va guanyar pes: entendre necessitats, explicar decisions i formar enginyers júniors.</w:t>
+        <w:t xml:space="preserve">El pas a openTrends va ampliar aquesta base cap a Java, Linux, Spring, sistemes d’informació, clients i equips. Allà la comunicació tècnica va guanyar pes: entendre necessitats, explicar decisions i mentoria d´enginyers júniors.</w:t>
       </w:r>
     </w:p>
     <w:p>
@@ -322,7 +322,7 @@
         <w:pStyle w:val="Textoindependiente"/>
       </w:pPr>
       <w:r>
-        <w:t xml:space="preserve">Mirat amb perspectiva, aquesta etapa em va donar dues coses: solvència tècnica en entorns exigents i la descoberta d’una inclinació clara cap a explicar, ordenar coneixement i acompanyar l’aprenentatge d’altres persones.</w:t>
+        <w:t xml:space="preserve">Mirat amb perspectiva, aquesta etapa em va donar dues coses: solvència tècnica en entorns exigents i la descoberta d’una inclinació clara cap a la comunicació, compartir coneixement i acompanyar l’aprenentatge d’altres persones.</w:t>
       </w:r>
     </w:p>
     <w:p>
@@ -356,7 +356,7 @@
         <w:pStyle w:val="Textoindependiente"/>
       </w:pPr>
       <w:r>
-        <w:t xml:space="preserve">A la Formació Professional vaig trobar una dimensió que buscava des de feia temps: l’aula, la relació directa amb l’alumnat i la responsabilitat d’acompanyar processos d’aprenentatge.</w:t>
+        <w:t xml:space="preserve">A la Formació Professional vaig trobar allò que buscava des de feia temps: l’aula, la relació directa amb l’alumnat i la responsabilitat d’acompanyar processos d’aprenentatge.</w:t>
       </w:r>
     </w:p>
     <w:p>
@@ -438,7 +438,7 @@
         <w:pStyle w:val="Textoindependiente"/>
       </w:pPr>
       <w:r>
-        <w:t xml:space="preserve">Després d’aquell contacte vaig començar com a professor associat al TecnoCampus. I des del primer moment vaig percebre que hi podien confluir dimensions que fins aleshores havien avançat separades: docència universitària, enginyeria del software, sistemes d’informació i sostenibilitat personal.</w:t>
+        <w:t xml:space="preserve">Després d’aquell contacte vaig començar com a professor associat al TecnoCampus. I des del primer moment vaig percebre que hi podien confluir camins que fins aleshores havien avançat separats: docència universitària, enginyeria del software, sistemes d’informació i sostenibilitat personal.</w:t>
       </w:r>
     </w:p>
     <w:p>

</xml_diff>

<commit_message>
Rephrase La Salle transition with active voice in trajectory script
Replace "La Salle em va permetre entrar en un entorn universitari
tècnicament exigent" with "Em vaig incorporar a La Salle, un entorn
universitari d'alt nivell tècnic": the candidate becomes the agent,
the duplicated "em va permetre" disappears (keeping only the later
"portar a l'aula coneixement tècnic avançat"), and the descriptor
avoids echoing both "exigents" (slide 2) and "avançat" (slides 3-4).
Sync the presenter note and regenerate the trajectory exports.
</commit_message>
<xml_diff>
--- a/doc/presentations/defensa-placa-permanent-dsi-ports-sortida-hexagonal/output/REMARKABLE_materials-orals-canonics-10-minuts-trajectoria.docx
+++ b/doc/presentations/defensa-placa-permanent-dsi-ports-sortida-hexagonal/output/REMARKABLE_materials-orals-canonics-10-minuts-trajectoria.docx
@@ -398,7 +398,7 @@
         <w:pStyle w:val="FirstParagraph"/>
       </w:pPr>
       <w:r>
-        <w:t xml:space="preserve">La Salle em va permetre entrar en un entorn universitari tècnicament exigent. [transició]</w:t>
+        <w:t xml:space="preserve">Em vaig incorporar a La Salle, un entorn universitari d’alt nivell tècnic. [transició]</w:t>
       </w:r>
     </w:p>
     <w:p>
@@ -871,7 +871,7 @@
         </w:numPr>
       </w:pPr>
       <w:r>
-        <w:t xml:space="preserve">La Salle: universitat i exigència tècnica.</w:t>
+        <w:t xml:space="preserve">La Salle: incorporació a un entorn universitari d’alt nivell tècnic.</w:t>
       </w:r>
     </w:p>
     <w:p>

</xml_diff>

<commit_message>
Streamline trajectory script slides 5 and 6
Apply Alfredo's rehearsal trims: drop "enginyeria del software" from
the subject list, remove the meta remark about teaching averages,
expand "transferència" to "transferència universitat i empresa", drop
the Cambridge score detail, and simplify "recerca viable" to
"recerca". Fix the leftover comma before "i disseny" and regenerate
the trajectory exports.
</commit_message>
<xml_diff>
--- a/doc/presentations/defensa-placa-permanent-dsi-ports-sortida-hexagonal/output/REMARKABLE_materials-orals-canonics-10-minuts-trajectoria.docx
+++ b/doc/presentations/defensa-placa-permanent-dsi-ports-sortida-hexagonal/output/REMARKABLE_materials-orals-canonics-10-minuts-trajectoria.docx
@@ -472,7 +472,7 @@
         <w:pStyle w:val="Textoindependiente"/>
       </w:pPr>
       <w:r>
-        <w:t xml:space="preserve">Des de 2021 hi he desenvolupat docència universitària continuada en assignatures vinculades a programació, estructures de dades, aplicacions d’Internet, enginyeria del software i disseny de sistemes d’informació.</w:t>
+        <w:t xml:space="preserve">Des de 2021 hi he desenvolupat docència universitària continuada en assignatures vinculades a programació, estructures de dades, aplicacions d’Internet i disseny de sistemes d’informació.</w:t>
       </w:r>
     </w:p>
     <w:p>
@@ -488,7 +488,7 @@
         <w:pStyle w:val="Textoindependiente"/>
       </w:pPr>
       <w:r>
-        <w:t xml:space="preserve">Ho esmento no com una valoració personal, sinó com un indicador documentat de treball docent sostingut, capacitat d’adaptació i voluntat de millora. [pausa breu]</w:t>
+        <w:t xml:space="preserve">També ha estat molt important el treball amb l’equip. Voldria destacar especialment el Dr. Josep Roure, amb qui he compartit docència i aprenentatge en arquitectura de software, Domain-Driven Design, Clean Architecture i arquitectura hexagonal.</w:t>
       </w:r>
     </w:p>
     <w:p>
@@ -496,7 +496,7 @@
         <w:pStyle w:val="Textoindependiente"/>
       </w:pPr>
       <w:r>
-        <w:t xml:space="preserve">També ha estat molt important el treball amb l’equip. Voldria destacar especialment el Dr. Josep Roure, amb qui he compartit docència i aprenentatge en arquitectura de software, Domain-Driven Design, Clean Architecture i arquitectura hexagonal.</w:t>
+        <w:t xml:space="preserve">La participació acreditada en el projecte SQAI d’Aprenentatge Basat en Projectes a Laboratori d’Aplicacions Internet, m’ha permès integrar docència, arquitectura de software i millora educativa.</w:t>
       </w:r>
     </w:p>
     <w:p>
@@ -504,15 +504,7 @@
         <w:pStyle w:val="Textoindependiente"/>
       </w:pPr>
       <w:r>
-        <w:t xml:space="preserve">La participació acreditada en el projecte SQAI d’Aprenentatge Basat en Projectes a Laboratori d’Aplicacions Internet, m’ha permès integrar docència, arquitectura de software i millora educativa.</w:t>
-      </w:r>
-    </w:p>
-    <w:p>
-      <w:pPr>
-        <w:pStyle w:val="Textoindependiente"/>
-      </w:pPr>
-      <w:r>
-        <w:t xml:space="preserve">I això connecta directament amb la segona part de la defensa: la classe magistral sobre ports de sortida en arquitectura hexagonal no és una peça aïllada, sinó una mostra d’aquest punt de trobada entre docència universitària, enginyeria del software i transferència.</w:t>
+        <w:t xml:space="preserve">I això connecta directament amb la segona part de la defensa: la classe magistral sobre ports de sortida en arquitectura hexagonal no és una peça aïllada, sinó una mostra d’aquest punt de trobada entre docència universitària, enginyeria del software i transferència universitat i empresa.</w:t>
       </w:r>
     </w:p>
     <w:bookmarkEnd w:id="13"/>
@@ -538,7 +530,7 @@
         <w:pStyle w:val="Textoindependiente"/>
       </w:pPr>
       <w:r>
-        <w:t xml:space="preserve">Disposo del C1 Advanced de Cambridge, amb una puntuació global de 185, i l’anglès és una llengua de treball real. En el marc de Neueda he impartit formació internacional d’enginyeria del software en anglès, vinculada a Java, Spring, arquitectura i qualitat.</w:t>
+        <w:t xml:space="preserve">Disposo del C1 Advanced de Cambridge i l’anglès és una llengua de treball real. En el marc de Neueda he impartit formació internacional d’enginyeria del software en anglès, vinculada a Java, Spring, arquitectura i qualitat.</w:t>
       </w:r>
     </w:p>
     <w:p>
@@ -570,7 +562,7 @@
         <w:pStyle w:val="Textoindependiente"/>
       </w:pPr>
       <w:r>
-        <w:t xml:space="preserve">Per això, entenc aquesta plaça com la possibilitat de consolidar un projecte acadèmic ja vinculat al TecnoCampus: docència rigorosa, innovació educativa, transferència, recerca viable i acompanyament de l’alumnat. [mirada al tribunal]</w:t>
+        <w:t xml:space="preserve">Per això, entenc aquesta plaça com la possibilitat de consolidar un projecte acadèmic ja vinculat al TecnoCampus: docència rigorosa, innovació educativa, transferència, recerca i acompanyament de l’alumnat. [mirada al tribunal]</w:t>
       </w:r>
     </w:p>
     <w:p>

</xml_diff>

<commit_message>
Simplify trajectory opening with growing-role triad
Replace the dense single-sentence opening (enumeration, apposition,
convergence metaphor) with three short breathable statements built on
one constant: software engineering — first as engineer, then as
university teacher, today also as researcher into how it is taught.
Drop the second paragraph that repeated the same triad, and sync the
presenter note and memorization table. Regenerate trajectory exports.
</commit_message>
<xml_diff>
--- a/doc/presentations/defensa-placa-permanent-dsi-ports-sortida-hexagonal/output/REMARKABLE_materials-orals-canonics-10-minuts-trajectoria.docx
+++ b/doc/presentations/defensa-placa-permanent-dsi-ports-sortida-hexagonal/output/REMARKABLE_materials-orals-canonics-10-minuts-trajectoria.docx
@@ -264,15 +264,7 @@
         <w:pStyle w:val="Textoindependiente"/>
       </w:pPr>
       <w:r>
-        <w:t xml:space="preserve">En aquests deu minuts explicaré el fil conductor d’una trajectòria iniciada el 2004: la indústria del software, la docència universitària i la recerca, tres eixos que convergeixen al TecnoCampus com a projecte docent i acadèmic. [pausa breu]</w:t>
-      </w:r>
-    </w:p>
-    <w:p>
-      <w:pPr>
-        <w:pStyle w:val="Textoindependiente"/>
-      </w:pPr>
-      <w:r>
-        <w:t xml:space="preserve">La meva trajectòria neix en la indústria del software, s’amplia cap a la docència universitària en software i troba al TecnoCampus un espai coherent per consolidar un projecte acadèmic.</w:t>
+        <w:t xml:space="preserve">La meva trajectòria comença el 2004 i té un sol fil conductor: l’enginyeria del software. Primer, com a enginyer a la indústria. Després, com a professor universitari. I avui, també com a investigador: estudio com s’ensenya l’enginyeria del software. [pausa breu]</w:t>
       </w:r>
     </w:p>
     <w:p>
@@ -641,7 +633,7 @@
         </w:numPr>
       </w:pPr>
       <w:r>
-        <w:t xml:space="preserve">2004 -&gt; indústria, docència universitària, innovació, transferència, recerca i TecnoCampus.</w:t>
+        <w:t xml:space="preserve">2004 -&gt; un sol fil conductor: enginyer a la indústria, professor universitari, investigador en com s’ensenya l’enginyeria del software.</w:t>
       </w:r>
     </w:p>
     <w:p>
@@ -1309,7 +1301,7 @@
               <w:pStyle w:val="Compact"/>
             </w:pPr>
             <w:r>
-              <w:t xml:space="preserve">La trajectòria té un fil conductor</w:t>
+              <w:t xml:space="preserve">La trajectòria té un sol fil conductor</w:t>
             </w:r>
           </w:p>
         </w:tc>
@@ -1320,7 +1312,7 @@
               <w:pStyle w:val="Compact"/>
             </w:pPr>
             <w:r>
-              <w:t xml:space="preserve">2004, software, docència, transferència, recerca</w:t>
+              <w:t xml:space="preserve">2004, enginyer, professor, investigador</w:t>
             </w:r>
           </w:p>
         </w:tc>

</xml_diff>

<commit_message>
Regenera els materials derivats de trajectòria
</commit_message>
<xml_diff>
--- a/doc/presentations/defensa-placa-permanent-dsi-ports-sortida-hexagonal/output/REMARKABLE_materials-orals-canonics-10-minuts-trajectoria.docx
+++ b/doc/presentations/defensa-placa-permanent-dsi-ports-sortida-hexagonal/output/REMARKABLE_materials-orals-canonics-10-minuts-trajectoria.docx
@@ -239,7 +239,7 @@
         <w:pStyle w:val="FirstParagraph"/>
       </w:pPr>
       <w:r>
-        <w:t xml:space="preserve">Temps total previst d’assaig: 9:00-9:20 aproximadament, amb pauses reals.</w:t>
+        <w:t xml:space="preserve">Temps total previst d’assaig: 9:40-10:00 aproximadament, amb pauses reals.</w:t>
       </w:r>
     </w:p>
     <w:bookmarkStart w:id="9" w:name="X955f66c7fc938677aca3c0234d4f82c1654e8a5"/>
@@ -264,7 +264,7 @@
         <w:pStyle w:val="Textoindependiente"/>
       </w:pPr>
       <w:r>
-        <w:t xml:space="preserve">La meva trajectòria comença el 2004 i té un sol fil conductor: l’enginyeria del software. Primer, com a enginyer a la indústria. Després, com a professor universitari. I avui, també com a investigador: estudio com s’ensenya l’enginyeria del software. [pausa breu]</w:t>
+        <w:t xml:space="preserve">La meva trajectòria comença el 2004 i té un fil conductor: l’enginyeria del software. Primer, com a enginyer a la indústria. Després, com a professor universitari. I avui, també com a investigador: estudio com s’ensenya l’enginyeria del software. [pausa breu]</w:t>
       </w:r>
     </w:p>
     <w:p>
@@ -276,13 +276,13 @@
       </w:r>
     </w:p>
     <w:bookmarkEnd w:id="9"/>
-    <w:bookmarkStart w:id="10" w:name="X14a8b7aa807d9c5e07cea297e688b2b46d3c015"/>
+    <w:bookmarkStart w:id="10" w:name="X28ec358c6470ee361dd2550a98450420d78bfa6"/>
     <w:p>
       <w:pPr>
         <w:pStyle w:val="Ttulo3"/>
       </w:pPr>
       <w:r>
-        <w:t xml:space="preserve">Diapositiva 2. Primera etapa: enginyeria del software i consultoria - 1:10</w:t>
+        <w:t xml:space="preserve">Diapositiva 2. Primera etapa: enginyeria del software i consultoria - 1:50</w:t>
       </w:r>
     </w:p>
     <w:p>
@@ -298,7 +298,7 @@
         <w:pStyle w:val="Textoindependiente"/>
       </w:pPr>
       <w:r>
-        <w:t xml:space="preserve">A Vida Software vaig treballar en un component del sistema operatiu Symbian orientat a incorporar interacció per veu en aplicacions mòbils. Era una peça de plataforma en C/C++, amb restriccions fortes de memòria, cpu i xarxa. Es va presentar en entorns com el 3GSM / Mobile World Congress i vinculada al context d’innovació d’una patent de Vida Software sobre interfícies d’usuari.</w:t>
+        <w:t xml:space="preserve">A Vida Software vaig treballar en un component del sistema operatiu Symbian orientat a incorporar interacció per veu en aplicacions mòbils. Era una peça de plataforma desenvolupada a baix nivell en C++, amb restriccions fortes de memòria, CPU i xarxa. La feina tenia un caràcter molt proper a l’R+D de laboratori: treballàvem sobre la pila de comunicacions IP, amb senyalització SIP, transport de veu mitjançant RTP sobre UDP i còdecs com l’AMR. El component es va presentar en entorns com el 3GSM / Mobile World Congress i estava vinculat al context d’innovació d’una patent de Vida Software sobre interfícies d’usuari.</w:t>
       </w:r>
     </w:p>
     <w:p>
@@ -306,7 +306,7 @@
         <w:pStyle w:val="Textoindependiente"/>
       </w:pPr>
       <w:r>
-        <w:t xml:space="preserve">El pas a openTrends va ampliar aquesta base cap a Java, Linux, Spring, sistemes d’informació, clients i equips. Allà la comunicació tècnica va guanyar pes: entendre necessitats, explicar decisions i mentoria d´enginyers júniors.</w:t>
+        <w:t xml:space="preserve">Va ser una etapa tècnicament molt exigent i estimulant, que em va donar una base sòlida en sistemes i comunicacions. Al mateix temps, em va ajudar a identificar una altra dimensió que volia desenvolupar: el treball amb les persones, la comunicació i la construcció compartida de coneixement. Per tant, el pas a la consultoria no va representar una renúncia a la profunditat tècnica, sinó la voluntat d’ampliar-la amb una dimensió més relacional i col·laborativa, que amb el temps ha esdevingut un fil conductor de la meva trajectòria.</w:t>
       </w:r>
     </w:p>
     <w:p>
@@ -314,7 +314,15 @@
         <w:pStyle w:val="Textoindependiente"/>
       </w:pPr>
       <w:r>
-        <w:t xml:space="preserve">Mirat amb perspectiva, aquesta etapa em va donar dues coses: solvència tècnica en entorns exigents i la descoberta d’una inclinació clara cap a la comunicació, compartir coneixement i acompanyar l’aprenentatge d’altres persones.</w:t>
+        <w:t xml:space="preserve">El pas a openTrends va ampliar aquesta base cap a Java, Linux, Spring, sistemes d’informació, clients i equips. Allà la comunicació tècnica va guanyar pes: entendre necessitats, explicar decisions i fer mentoria a enginyers júniors.</w:t>
+      </w:r>
+    </w:p>
+    <w:p>
+      <w:pPr>
+        <w:pStyle w:val="Textoindependiente"/>
+      </w:pPr>
+      <w:r>
+        <w:t xml:space="preserve">Mirat amb perspectiva, la combinació de solvència tècnica, comunicació i acompanyament va acabar definint el meu perfil professional.</w:t>
       </w:r>
     </w:p>
     <w:p>

</xml_diff>

<commit_message>
Separa síntesi i agraïment i afegeix l'annex curricular
Classe magistral de 20 minuts: la diapositiva 10 queda com a
tancament conceptual amb les tres decisions i la frase clau amb
màxima jerarquia, i l'agraïment institucional passa a una
diapositiva 11 pròpia amb la frase literal i el tancament formal.
La demo continua com a annex fora dels 20 minuts. Sincronitza
guió, notes, esquema de memorització, mantra i taula temporal.

Trajectòria de 10 minuts: nova diapositiva Annex A de contrast
d'orientació curricular entre La Salle URL i el TecnoCampus,
només per al torn de preguntes, amb assignatures verificades als
plans oficials, formulacions qualitatives sense sumes d'ECTS no
estables, fonts datades i resposta oral de reserva a les notes.

Regenera tots els materials derivats amb els scripts del projecte.

Co-Authored-By: Claude Fable 5 <noreply@anthropic.com>
</commit_message>
<xml_diff>
--- a/doc/presentations/defensa-placa-permanent-dsi-ports-sortida-hexagonal/output/REMARKABLE_materials-orals-canonics-10-minuts-trajectoria.docx
+++ b/doc/presentations/defensa-placa-permanent-dsi-ports-sortida-hexagonal/output/REMARKABLE_materials-orals-canonics-10-minuts-trajectoria.docx
@@ -2,7 +2,7 @@
 <file path=word/document.xml><?xml version="1.0" encoding="utf-8"?>
 <w:document xmlns:w="http://schemas.openxmlformats.org/wordprocessingml/2006/main" xmlns:m="http://schemas.openxmlformats.org/officeDocument/2006/math" xmlns:r="http://schemas.openxmlformats.org/officeDocument/2006/relationships" xmlns:o="urn:schemas-microsoft-com:office:office" xmlns:v="urn:schemas-microsoft-com:vml" xmlns:w10="urn:schemas-microsoft-com:office:word" xmlns:a="http://schemas.openxmlformats.org/drawingml/2006/main" xmlns:pic="http://schemas.openxmlformats.org/drawingml/2006/picture" xmlns:wp="http://schemas.openxmlformats.org/drawingml/2006/wordprocessingDrawing">
   <w:body>
-    <w:bookmarkStart w:id="30" w:name="X0e91efcdfc21fc1542c629021a59166df219849"/>
+    <w:bookmarkStart w:id="33" w:name="X0e91efcdfc21fc1542c629021a59166df219849"/>
     <w:p>
       <w:pPr>
         <w:pStyle w:val="Ttulo1"/>
@@ -215,7 +215,19 @@
         <w:pStyle w:val="FirstParagraph"/>
       </w:pPr>
       <w:r>
-        <w:t xml:space="preserve">Nota de versió: aquests materials són independents de la classe magistral de 20 minuts. La seva funció és donar suport a la primera part de la defensa de la plaça: trajectòria professional, acadèmica i científica. La presentació està limitada a 6 diapositives i a una durada aproximada de 10 minuts.</w:t>
+        <w:t xml:space="preserve">Nota de versió: aquests materials són independents de la classe magistral de 20 minuts. La seva funció és donar suport a la primera part de la defensa de la plaça: trajectòria professional, acadèmica i científica. La presentació està limitada a 6 diapositives i a una durada aproximada de 10 minuts. Després del tancament hi ha una diapositiva d’annex,</w:t>
+      </w:r>
+      <w:r>
+        <w:t xml:space="preserve"> </w:t>
+      </w:r>
+      <w:r>
+        <w:rPr>
+          <w:rStyle w:val="VerbatimChar"/>
+        </w:rPr>
+        <w:t xml:space="preserve">Annex A. Contrast d'orientació curricular</w:t>
+      </w:r>
+      <w:r>
+        <w:t xml:space="preserve">, que no forma part de la numeració 1-6 ni del temps principal: és material de reserva exclusiu per al torn de preguntes.</w:t>
       </w:r>
     </w:p>
     <w:p>
@@ -239,7 +251,7 @@
         <w:pStyle w:val="FirstParagraph"/>
       </w:pPr>
       <w:r>
-        <w:t xml:space="preserve">Temps total previst d’assaig: 9:40-10:00 aproximadament, amb pauses reals.</w:t>
+        <w:t xml:space="preserve">Temps total previst d’assaig: 9:50-10:10 aproximadament, amb pauses reals. Si l’assaig supera els 10:00, aplica la versió curta d’emergència de la diapositiva 4.</w:t>
       </w:r>
     </w:p>
     <w:bookmarkStart w:id="9" w:name="X955f66c7fc938677aca3c0234d4f82c1654e8a5"/>
@@ -384,13 +396,13 @@
       </w:r>
     </w:p>
     <w:bookmarkEnd w:id="11"/>
-    <w:bookmarkStart w:id="12" w:name="X49d56bb52746b0bc970262def2624a673c15ab9"/>
+    <w:bookmarkStart w:id="12" w:name="X1f0d1a81b8dc9d315c00b42224fa0d18f0492d2"/>
     <w:p>
       <w:pPr>
         <w:pStyle w:val="Ttulo3"/>
       </w:pPr>
       <w:r>
-        <w:t xml:space="preserve">Diapositiva 4. La Salle i el pont cap al TecnoCampus - 1:45</w:t>
+        <w:t xml:space="preserve">Diapositiva 4. La Salle i el pont cap al TecnoCampus - 1:55</w:t>
       </w:r>
     </w:p>
     <w:p>
@@ -414,7 +426,7 @@
         <w:pStyle w:val="Textoindependiente"/>
       </w:pPr>
       <w:r>
-        <w:t xml:space="preserve">El pas cap al TecnoCampus va ser una decisió reflexionada, valorada amb la direcció i la coordinació acadèmica. La Salle té una tradició d’enginyeria sòlida i una forta tradició específicament en l’enginyeria de telecomunicacions. Amb el temps, vaig considerar que la meva especialització en enginyeria del software, arquitectura d’aplicacions, backend i sistemes d’informació podia tenir un encaix més directe al TecnoCampus. [mirada al tribunal]</w:t>
+        <w:t xml:space="preserve">El pas cap al TecnoCampus va ser una decisió reflexionada, valorada amb la direcció i la coordinació acadèmica. [pausa breu]</w:t>
       </w:r>
     </w:p>
     <w:p>
@@ -422,7 +434,7 @@
         <w:pStyle w:val="Textoindependiente"/>
       </w:pPr>
       <w:r>
-        <w:t xml:space="preserve">La proximitat geogràfica va reforçar aquesta decisió, perquè facilitava una trajectòria acadèmica sostenible i compatible amb les responsabilitats familiars.</w:t>
+        <w:t xml:space="preserve">La Salle té una tradició d’enginyeria sòlida, amb una identitat històrica molt forta en telecomunicacions, xarxes i electrònica. La meva docència allà se centrava en els fonaments: el disseny i la programació orientats a objectes, i el desenvolupament d’aplicacions mòbils. Són la llavor de l’enginyeria del software, i em va agradar molt ensenyar-los. Però el meu territori professional és el tram següent d’aquest mateix camí: l’arquitectura de software, el backend empresarial i els sistemes d’informació. [mirada al tribunal]</w:t>
       </w:r>
     </w:p>
     <w:p>
@@ -430,7 +442,7 @@
         <w:pStyle w:val="Textoindependiente"/>
       </w:pPr>
       <w:r>
-        <w:t xml:space="preserve">En aquest procés, la Dra. Ester Bernadó va facilitar el contacte acadèmic amb el TecnoCampus i el coneixement mutu.</w:t>
+        <w:t xml:space="preserve">I aquest tram tenia un encaix curricular directe al TecnoCampus: el grau porta la gestió i els sistemes d’informació al seu propi nom, amb una línia completa d’enginyeria del software i de disseny de sistemes d’informació. Era l’espai natural on la meva especialització podia créixer com a docència universitària.</w:t>
       </w:r>
     </w:p>
     <w:p>
@@ -438,7 +450,15 @@
         <w:pStyle w:val="Textoindependiente"/>
       </w:pPr>
       <w:r>
-        <w:t xml:space="preserve">Després d’aquell contacte vaig començar com a professor associat al TecnoCampus. I des del primer moment vaig percebre que hi podien confluir camins que fins aleshores havien avançat separats: docència universitària, enginyeria del software, sistemes d’informació i sostenibilitat personal.</w:t>
+        <w:t xml:space="preserve">La proximitat geogràfica va reforçar la decisió, perquè feia la trajectòria acadèmica sostenible i compatible amb les responsabilitats familiars.</w:t>
+      </w:r>
+    </w:p>
+    <w:p>
+      <w:pPr>
+        <w:pStyle w:val="Textoindependiente"/>
+      </w:pPr>
+      <w:r>
+        <w:t xml:space="preserve">Vaig establir contacte acadèmic amb el TecnoCampus i vaig començar-hi com a professor associat. I des del primer moment vaig percebre que hi podien confluir camins que fins aleshores havien avançat separats: docència universitària, enginyeria del software, sistemes d’informació i sostenibilitat personal.</w:t>
       </w:r>
     </w:p>
     <w:p>
@@ -590,624 +610,62 @@
     </w:p>
     <w:bookmarkEnd w:id="14"/>
     <w:bookmarkEnd w:id="15"/>
-    <w:bookmarkStart w:id="22" w:name="notes-del-presentador-per-diapositiva"/>
+    <w:bookmarkStart w:id="17" w:name="Xdd17a7567f75bc85227116ec496a3da3b46265c"/>
     <w:p>
       <w:pPr>
         <w:pStyle w:val="Ttulo2"/>
       </w:pPr>
       <w:r>
-        <w:t xml:space="preserve">2. Notes del presentador per diapositiva</w:t>
-      </w:r>
-    </w:p>
-    <w:bookmarkStart w:id="16" w:name="trajectòria---050"/>
+        <w:t xml:space="preserve">Annex A. Contrast d’orientació curricular (només per al torn de preguntes)</w:t>
+      </w:r>
+    </w:p>
+    <w:p>
+      <w:pPr>
+        <w:pStyle w:val="FirstParagraph"/>
+      </w:pPr>
+      <w:r>
+        <w:t xml:space="preserve">Aquest annex no forma part del cos principal de deu minuts ni de la numeració 1-6. Només s’ha de mostrar si el tribunal pregunta pel pas de La Salle al TecnoCampus, qüestiona l’encaix acadèmic o demana concretar la diferència d’orientació entre les titulacions. No s’ha de mostrar sense una pregunta o una necessitat clara, ni utilitzar-lo com a defensa preventiva.</w:t>
+      </w:r>
+    </w:p>
+    <w:bookmarkStart w:id="16" w:name="resposta-oral-de-reserva---30-45-segons"/>
     <w:p>
       <w:pPr>
         <w:pStyle w:val="Ttulo3"/>
       </w:pPr>
       <w:r>
-        <w:t xml:space="preserve">1. Trajectòria - 0:50</w:t>
-      </w:r>
-    </w:p>
-    <w:p>
-      <w:pPr>
-        <w:pStyle w:val="Compact"/>
-        <w:numPr>
-          <w:ilvl w:val="0"/>
-          <w:numId w:val="1003"/>
-        </w:numPr>
-      </w:pPr>
-      <w:r>
-        <w:t xml:space="preserve">Obrir amb agraïment breu.</w:t>
-      </w:r>
-    </w:p>
-    <w:p>
-      <w:pPr>
-        <w:pStyle w:val="Compact"/>
-        <w:numPr>
-          <w:ilvl w:val="0"/>
-          <w:numId w:val="1003"/>
-        </w:numPr>
-      </w:pPr>
-      <w:r>
-        <w:t xml:space="preserve">No llegir CV: explicar fil conductor.</w:t>
-      </w:r>
-    </w:p>
-    <w:p>
-      <w:pPr>
-        <w:pStyle w:val="Compact"/>
-        <w:numPr>
-          <w:ilvl w:val="0"/>
-          <w:numId w:val="1003"/>
-        </w:numPr>
-      </w:pPr>
-      <w:r>
-        <w:t xml:space="preserve">2004 -&gt; un sol fil conductor: enginyer a la indústria, professor universitari, investigador en com s’ensenya l’enginyeria del software.</w:t>
-      </w:r>
-    </w:p>
-    <w:p>
-      <w:pPr>
-        <w:pStyle w:val="Compact"/>
-        <w:numPr>
-          <w:ilvl w:val="0"/>
-          <w:numId w:val="1003"/>
-        </w:numPr>
-      </w:pPr>
-      <w:r>
-        <w:t xml:space="preserve">Missatge: trajectòria coherent amb la plaça.</w:t>
-      </w:r>
-    </w:p>
-    <w:p>
-      <w:pPr>
-        <w:pStyle w:val="Compact"/>
-        <w:numPr>
-          <w:ilvl w:val="0"/>
-          <w:numId w:val="1003"/>
-        </w:numPr>
-      </w:pPr>
-      <w:r>
-        <w:t xml:space="preserve">Transició: base professional en indústria.</w:t>
-      </w:r>
-    </w:p>
-    <w:bookmarkEnd w:id="16"/>
-    <w:bookmarkStart w:id="17" w:name="indústria-i-consultoria---110"/>
-    <w:p>
-      <w:pPr>
-        <w:pStyle w:val="Ttulo3"/>
-      </w:pPr>
-      <w:r>
-        <w:t xml:space="preserve">2. Indústria i consultoria - 1:10</w:t>
-      </w:r>
-    </w:p>
-    <w:p>
-      <w:pPr>
-        <w:pStyle w:val="Compact"/>
-        <w:numPr>
-          <w:ilvl w:val="0"/>
-          <w:numId w:val="1004"/>
-        </w:numPr>
-      </w:pPr>
-      <w:r>
-        <w:t xml:space="preserve">Vida Software: component del sistema operatiu Symbian per a interacció per veu.</w:t>
-      </w:r>
-    </w:p>
-    <w:p>
-      <w:pPr>
-        <w:pStyle w:val="Compact"/>
-        <w:numPr>
-          <w:ilvl w:val="0"/>
-          <w:numId w:val="1004"/>
-        </w:numPr>
-      </w:pPr>
-      <w:r>
-        <w:t xml:space="preserve">No era una app final: permetia que aplicacions Nokia/Symbian incorporessin veu.</w:t>
-      </w:r>
-    </w:p>
-    <w:p>
-      <w:pPr>
-        <w:pStyle w:val="Compact"/>
-        <w:numPr>
-          <w:ilvl w:val="0"/>
-          <w:numId w:val="1004"/>
-        </w:numPr>
-      </w:pPr>
-      <w:r>
-        <w:t xml:space="preserve">C/C++, rendiment, memòria i dispositiu com a senyals de profunditat tècnica.</w:t>
-      </w:r>
-    </w:p>
-    <w:p>
-      <w:pPr>
-        <w:pStyle w:val="Compact"/>
-        <w:numPr>
-          <w:ilvl w:val="0"/>
-          <w:numId w:val="1004"/>
-        </w:numPr>
-      </w:pPr>
-      <w:r>
-        <w:t xml:space="preserve">3GSM / Mobile World Congress i patent com a context d’innovació; no presentar la patent com a pròpia.</w:t>
-      </w:r>
-    </w:p>
-    <w:p>
-      <w:pPr>
-        <w:pStyle w:val="Compact"/>
-        <w:numPr>
-          <w:ilvl w:val="0"/>
-          <w:numId w:val="1004"/>
-        </w:numPr>
-      </w:pPr>
-      <w:r>
-        <w:t xml:space="preserve">openTrends: consultoria, clients, equips i sistemes d’informació.</w:t>
-      </w:r>
-    </w:p>
-    <w:p>
-      <w:pPr>
-        <w:pStyle w:val="Compact"/>
-        <w:numPr>
-          <w:ilvl w:val="0"/>
-          <w:numId w:val="1004"/>
-        </w:numPr>
-      </w:pPr>
-      <w:r>
-        <w:t xml:space="preserve">Punt clau: el que més gaudia era formar perfils més júniors.</w:t>
-      </w:r>
-    </w:p>
-    <w:p>
-      <w:pPr>
-        <w:pStyle w:val="Compact"/>
-        <w:numPr>
-          <w:ilvl w:val="0"/>
-          <w:numId w:val="1004"/>
-        </w:numPr>
-      </w:pPr>
-      <w:r>
-        <w:t xml:space="preserve">La comunicació passa de ser eina professional a pràctica docent.</w:t>
-      </w:r>
-    </w:p>
-    <w:p>
-      <w:pPr>
-        <w:pStyle w:val="Compact"/>
-        <w:numPr>
-          <w:ilvl w:val="0"/>
-          <w:numId w:val="1004"/>
-        </w:numPr>
-      </w:pPr>
-      <w:r>
-        <w:t xml:space="preserve">Transició: màster en Formació del Professorat i entrada a la Formació Professional.</w:t>
-      </w:r>
-    </w:p>
-    <w:bookmarkEnd w:id="17"/>
-    <w:bookmarkStart w:id="18" w:name="stucom---110"/>
-    <w:p>
-      <w:pPr>
-        <w:pStyle w:val="Ttulo3"/>
-      </w:pPr>
-      <w:r>
-        <w:t xml:space="preserve">3. Stucom - 1:10</w:t>
-      </w:r>
-    </w:p>
-    <w:p>
-      <w:pPr>
-        <w:pStyle w:val="Compact"/>
-        <w:numPr>
-          <w:ilvl w:val="0"/>
-          <w:numId w:val="1005"/>
-        </w:numPr>
-      </w:pPr>
-      <w:r>
-        <w:t xml:space="preserve">Decisió vocacional, no improvisació.</w:t>
-      </w:r>
-    </w:p>
-    <w:p>
-      <w:pPr>
-        <w:pStyle w:val="Compact"/>
-        <w:numPr>
-          <w:ilvl w:val="0"/>
-          <w:numId w:val="1005"/>
-        </w:numPr>
-      </w:pPr>
-      <w:r>
-        <w:t xml:space="preserve">Màster en Formació del Professorat + FP DAW/DAM.</w:t>
-      </w:r>
-    </w:p>
-    <w:p>
-      <w:pPr>
-        <w:pStyle w:val="Compact"/>
-        <w:numPr>
-          <w:ilvl w:val="0"/>
-          <w:numId w:val="1005"/>
-        </w:numPr>
-      </w:pPr>
-      <w:r>
-        <w:t xml:space="preserve">Aula, relació amb alumnat, escolta i acompanyament.</w:t>
-      </w:r>
-    </w:p>
-    <w:p>
-      <w:pPr>
-        <w:pStyle w:val="Compact"/>
-        <w:numPr>
-          <w:ilvl w:val="0"/>
-          <w:numId w:val="1005"/>
-        </w:numPr>
-      </w:pPr>
-      <w:r>
-        <w:t xml:space="preserve">Agraïment a l’FP; no menysvalorar-la.</w:t>
-      </w:r>
-    </w:p>
-    <w:p>
-      <w:pPr>
-        <w:pStyle w:val="Compact"/>
-        <w:numPr>
-          <w:ilvl w:val="0"/>
-          <w:numId w:val="1005"/>
-        </w:numPr>
-      </w:pPr>
-      <w:r>
-        <w:t xml:space="preserve">Evolució cap a continguts tècnics universitaris més avançats.</w:t>
-      </w:r>
-    </w:p>
-    <w:bookmarkEnd w:id="18"/>
-    <w:bookmarkStart w:id="19" w:name="la-salle-i-pont-cap-al-tecnocampus---145"/>
-    <w:p>
-      <w:pPr>
-        <w:pStyle w:val="Ttulo3"/>
-      </w:pPr>
-      <w:r>
-        <w:t xml:space="preserve">4. La Salle i pont cap al TecnoCampus - 1:45</w:t>
-      </w:r>
-    </w:p>
-    <w:p>
-      <w:pPr>
-        <w:pStyle w:val="Compact"/>
-        <w:numPr>
-          <w:ilvl w:val="0"/>
-          <w:numId w:val="1006"/>
-        </w:numPr>
-      </w:pPr>
-      <w:r>
-        <w:t xml:space="preserve">La Salle: incorporació a un entorn universitari d’alt nivell tècnic.</w:t>
-      </w:r>
-    </w:p>
-    <w:p>
-      <w:pPr>
-        <w:pStyle w:val="Compact"/>
-        <w:numPr>
-          <w:ilvl w:val="0"/>
-          <w:numId w:val="1006"/>
-        </w:numPr>
-      </w:pPr>
-      <w:r>
-        <w:t xml:space="preserve">La Salle és etapa valuosa; evitar comparacions jeràrquiques.</w:t>
-      </w:r>
-    </w:p>
-    <w:p>
-      <w:pPr>
-        <w:pStyle w:val="Compact"/>
-        <w:numPr>
-          <w:ilvl w:val="0"/>
-          <w:numId w:val="1006"/>
-        </w:numPr>
-      </w:pPr>
-      <w:r>
-        <w:t xml:space="preserve">Motiu principal: encaix acadèmic més directe amb enginyeria del software i sistemes d’informació.</w:t>
-      </w:r>
-    </w:p>
-    <w:p>
-      <w:pPr>
-        <w:pStyle w:val="Compact"/>
-        <w:numPr>
-          <w:ilvl w:val="0"/>
-          <w:numId w:val="1006"/>
-        </w:numPr>
-      </w:pPr>
-      <w:r>
-        <w:t xml:space="preserve">Conciliació com a factor complementari de sostenibilitat.</w:t>
-      </w:r>
-    </w:p>
-    <w:p>
-      <w:pPr>
-        <w:pStyle w:val="Compact"/>
-        <w:numPr>
-          <w:ilvl w:val="0"/>
-          <w:numId w:val="1006"/>
-        </w:numPr>
-      </w:pPr>
-      <w:r>
-        <w:t xml:space="preserve">Conversa amb coordinador i director a La Salle.</w:t>
-      </w:r>
-    </w:p>
-    <w:p>
-      <w:pPr>
-        <w:pStyle w:val="Compact"/>
-        <w:numPr>
-          <w:ilvl w:val="0"/>
-          <w:numId w:val="1006"/>
-        </w:numPr>
-      </w:pPr>
-      <w:r>
-        <w:t xml:space="preserve">La Dra. Ester Bernadó va facilitar el contacte acadèmic amb el TecnoCampus.</w:t>
-      </w:r>
-    </w:p>
-    <w:p>
-      <w:pPr>
-        <w:pStyle w:val="Compact"/>
-        <w:numPr>
-          <w:ilvl w:val="0"/>
-          <w:numId w:val="1006"/>
-        </w:numPr>
-      </w:pPr>
-      <w:r>
-        <w:t xml:space="preserve">TecnoCampus: docència universitària, software, sistemes d’informació, transferència i projecte sostenible.</w:t>
-      </w:r>
-    </w:p>
-    <w:p>
-      <w:pPr>
-        <w:pStyle w:val="Compact"/>
-        <w:numPr>
-          <w:ilvl w:val="0"/>
-          <w:numId w:val="1006"/>
-        </w:numPr>
-      </w:pPr>
-      <w:r>
-        <w:t xml:space="preserve">Frase clau: el desig de consolidar-se ve de lluny.</w:t>
-      </w:r>
-    </w:p>
-    <w:bookmarkEnd w:id="19"/>
-    <w:bookmarkStart w:id="20" w:name="tecnocampus---205"/>
-    <w:p>
-      <w:pPr>
-        <w:pStyle w:val="Ttulo3"/>
-      </w:pPr>
-      <w:r>
-        <w:t xml:space="preserve">5. TecnoCampus - 2:05</w:t>
-      </w:r>
-    </w:p>
-    <w:p>
-      <w:pPr>
-        <w:pStyle w:val="Compact"/>
-        <w:numPr>
-          <w:ilvl w:val="0"/>
-          <w:numId w:val="1007"/>
-        </w:numPr>
-      </w:pPr>
-      <w:r>
-        <w:t xml:space="preserve">Docència continuada des de 2021.</w:t>
-      </w:r>
-    </w:p>
-    <w:p>
-      <w:pPr>
-        <w:pStyle w:val="Compact"/>
-        <w:numPr>
-          <w:ilvl w:val="0"/>
-          <w:numId w:val="1007"/>
-        </w:numPr>
-      </w:pPr>
-      <w:r>
-        <w:t xml:space="preserve">Assignatures: programació, dades, Internet, enginyeria, DSI.</w:t>
-      </w:r>
-    </w:p>
-    <w:p>
-      <w:pPr>
-        <w:pStyle w:val="Compact"/>
-        <w:numPr>
-          <w:ilvl w:val="0"/>
-          <w:numId w:val="1007"/>
-        </w:numPr>
-      </w:pPr>
-      <w:r>
-        <w:t xml:space="preserve">15 registres oficials d’avaluació docent: mitjana aritmètica simple de 8,75/10.</w:t>
-      </w:r>
-    </w:p>
-    <w:p>
-      <w:pPr>
-        <w:pStyle w:val="Compact"/>
-        <w:numPr>
-          <w:ilvl w:val="0"/>
-          <w:numId w:val="1007"/>
-        </w:numPr>
-      </w:pPr>
-      <w:r>
-        <w:t xml:space="preserve">Quatre registres dels dos darrers cursos: mitjana aritmètica simple de 9,03/10.</w:t>
-      </w:r>
-    </w:p>
-    <w:p>
-      <w:pPr>
-        <w:pStyle w:val="Compact"/>
-        <w:numPr>
-          <w:ilvl w:val="0"/>
-          <w:numId w:val="1007"/>
-        </w:numPr>
-      </w:pPr>
-      <w:r>
-        <w:t xml:space="preserve">No dir mitjana ponderada ni percentatge de satisfacció.</w:t>
-      </w:r>
-    </w:p>
-    <w:p>
-      <w:pPr>
-        <w:pStyle w:val="Compact"/>
-        <w:numPr>
-          <w:ilvl w:val="0"/>
-          <w:numId w:val="1007"/>
-        </w:numPr>
-      </w:pPr>
-      <w:r>
-        <w:t xml:space="preserve">Josep Roure: arquitectura, DDD, Clean Architecture, hexagonal.</w:t>
-      </w:r>
-    </w:p>
-    <w:p>
-      <w:pPr>
-        <w:pStyle w:val="Compact"/>
-        <w:numPr>
-          <w:ilvl w:val="0"/>
-          <w:numId w:val="1007"/>
-        </w:numPr>
-      </w:pPr>
-      <w:r>
-        <w:t xml:space="preserve">Participació acreditada al projecte SQAI d’ABP a Laboratori d’Aplicacions Internet.</w:t>
-      </w:r>
-    </w:p>
-    <w:p>
-      <w:pPr>
-        <w:pStyle w:val="Compact"/>
-        <w:numPr>
-          <w:ilvl w:val="0"/>
-          <w:numId w:val="1007"/>
-        </w:numPr>
-      </w:pPr>
-      <w:r>
-        <w:t xml:space="preserve">HexaStock com a integració de docència, pràctica i transferència.</w:t>
-      </w:r>
-    </w:p>
-    <w:p>
-      <w:pPr>
-        <w:pStyle w:val="Compact"/>
-        <w:numPr>
-          <w:ilvl w:val="0"/>
-          <w:numId w:val="1007"/>
-        </w:numPr>
-      </w:pPr>
-      <w:r>
-        <w:t xml:space="preserve">Transició explícita a la classe magistral.</w:t>
-      </w:r>
-    </w:p>
-    <w:bookmarkEnd w:id="20"/>
-    <w:bookmarkStart w:id="21" w:name="neueda-doctorat-i-futur---220"/>
-    <w:p>
-      <w:pPr>
-        <w:pStyle w:val="Ttulo3"/>
-      </w:pPr>
-      <w:r>
-        <w:t xml:space="preserve">6. Neueda, doctorat i futur - 2:20</w:t>
-      </w:r>
-    </w:p>
-    <w:p>
-      <w:pPr>
-        <w:pStyle w:val="Compact"/>
-        <w:numPr>
-          <w:ilvl w:val="0"/>
-          <w:numId w:val="1008"/>
-        </w:numPr>
-      </w:pPr>
-      <w:r>
-        <w:t xml:space="preserve">Cambridge C1 Advanced: 185, Pass at Grade C, C1 MECR.</w:t>
-      </w:r>
-    </w:p>
-    <w:p>
-      <w:pPr>
-        <w:pStyle w:val="Compact"/>
-        <w:numPr>
-          <w:ilvl w:val="0"/>
-          <w:numId w:val="1008"/>
-        </w:numPr>
-      </w:pPr>
-      <w:r>
-        <w:t xml:space="preserve">Neueda: formació internacional en anglès en enginyeria del software.</w:t>
-      </w:r>
-    </w:p>
-    <w:p>
-      <w:pPr>
-        <w:pStyle w:val="Compact"/>
-        <w:numPr>
-          <w:ilvl w:val="0"/>
-          <w:numId w:val="1008"/>
-        </w:numPr>
-      </w:pPr>
-      <w:r>
-        <w:t xml:space="preserve">AGAUR: 60 hores de formació i consultoria especialitzada en REST, arquitectura hexagonal i sistemes d’informació.</w:t>
-      </w:r>
-    </w:p>
-    <w:p>
-      <w:pPr>
-        <w:pStyle w:val="Compact"/>
-        <w:numPr>
-          <w:ilvl w:val="0"/>
-          <w:numId w:val="1008"/>
-        </w:numPr>
-      </w:pPr>
-      <w:r>
-        <w:t xml:space="preserve">HUB4T: Java Backend Web Developer, 120 h per curs durant tres cursos acadèmics.</w:t>
-      </w:r>
-    </w:p>
-    <w:p>
-      <w:pPr>
-        <w:pStyle w:val="Compact"/>
-        <w:numPr>
-          <w:ilvl w:val="0"/>
-          <w:numId w:val="1008"/>
-        </w:numPr>
-      </w:pPr>
-      <w:r>
-        <w:t xml:space="preserve">Doctorat UDIMA: Educació en Enginyeria del Software.</w:t>
-      </w:r>
-    </w:p>
-    <w:p>
-      <w:pPr>
-        <w:pStyle w:val="Compact"/>
-        <w:numPr>
-          <w:ilvl w:val="0"/>
-          <w:numId w:val="1008"/>
-        </w:numPr>
-      </w:pPr>
-      <w:r>
-        <w:t xml:space="preserve">No presentar-lo com a psicologia genèrica ni com a resultats ja assolits.</w:t>
-      </w:r>
-    </w:p>
-    <w:p>
-      <w:pPr>
-        <w:pStyle w:val="Compact"/>
-        <w:numPr>
-          <w:ilvl w:val="0"/>
-          <w:numId w:val="1008"/>
-        </w:numPr>
-      </w:pPr>
-      <w:r>
-        <w:t xml:space="preserve">Tesi: problema obert identificat per la literatura recent; integració curricular, mesura i estudis longitudinals.</w:t>
-      </w:r>
-    </w:p>
-    <w:p>
-      <w:pPr>
-        <w:pStyle w:val="Compact"/>
-        <w:numPr>
-          <w:ilvl w:val="0"/>
-          <w:numId w:val="1008"/>
-        </w:numPr>
-      </w:pPr>
-      <w:r>
-        <w:t xml:space="preserve">Disseny mixt i quasiexperimental, dues assignatures reals amb ABP, pretest, posttest, seguiment diferit i component qualitatiu.</w:t>
-      </w:r>
-    </w:p>
-    <w:p>
-      <w:pPr>
-        <w:pStyle w:val="Compact"/>
-        <w:numPr>
-          <w:ilvl w:val="0"/>
-          <w:numId w:val="1008"/>
-        </w:numPr>
-      </w:pPr>
-      <w:r>
-        <w:t xml:space="preserve">Futur: docència, recerca, innovació, transferència i acompanyament.</w:t>
-      </w:r>
-    </w:p>
-    <w:p>
-      <w:pPr>
-        <w:pStyle w:val="Compact"/>
-        <w:numPr>
-          <w:ilvl w:val="0"/>
-          <w:numId w:val="1008"/>
-        </w:numPr>
-      </w:pPr>
-      <w:r>
-        <w:t xml:space="preserve">Tancar amb la plaça com a consolidació d’un projecte acadèmic.</w:t>
-      </w:r>
-    </w:p>
-    <w:p>
-      <w:pPr>
-        <w:pStyle w:val="Compact"/>
-        <w:numPr>
-          <w:ilvl w:val="0"/>
-          <w:numId w:val="1008"/>
-        </w:numPr>
-      </w:pPr>
-      <w:r>
-        <w:t xml:space="preserve">Enllaçar amb la classe magistral següent.</w:t>
+        <w:t xml:space="preserve">Resposta oral de reserva - 30-45 segons</w:t>
+      </w:r>
+    </w:p>
+    <w:p>
+      <w:pPr>
+        <w:pStyle w:val="FirstParagraph"/>
+      </w:pPr>
+      <w:r>
+        <w:t xml:space="preserve">El canvi no va respondre a una valoració jeràrquica entre institucions. La Salle em va permetre entrar en la docència universitària dins d’un entorn d’enginyeria molt sòlid, i hi vaig impartir assignatures directament vinculades a la informàtica i al software.</w:t>
+      </w:r>
+    </w:p>
+    <w:p>
+      <w:pPr>
+        <w:pStyle w:val="Textoindependiente"/>
+      </w:pPr>
+      <w:r>
+        <w:t xml:space="preserve">El contrast entre els plans mostra, però, orientacions curriculars diferents. La Salle manté un pes més marcat en telecomunicacions, electrònica, hardware i xarxes, coherent amb la seva tradició històrica. El grau del TecnoCampus concentra de manera més explícita l’Enginyeria del Software i els Sistemes d’Informació.</w:t>
+      </w:r>
+    </w:p>
+    <w:p>
+      <w:pPr>
+        <w:pStyle w:val="Textoindependiente"/>
+      </w:pPr>
+      <w:r>
+        <w:t xml:space="preserve">Per això vaig considerar que la meva experiència professional en arquitectura de software, backend, Java i sistemes d’informació podia tenir-hi un encaix més directe. No es tracta que una institució sigui millor que l’altra, sinó d’una major alineació entre especialització professional i projecte acadèmic.</w:t>
+      </w:r>
+    </w:p>
+    <w:p>
+      <w:pPr>
+        <w:pStyle w:val="Textoindependiente"/>
+      </w:pPr>
+      <w:r>
+        <w:t xml:space="preserve">Quan es mostri l’annex, no llegir tota la taula: assenyalar una diferència d’Enginyeria del Software o Sistemes d’Informació, una de hardware o xarxes, i concloure amb l’encaix acadèmic.</w:t>
       </w:r>
     </w:p>
     <w:p>
@@ -1217,9 +675,768 @@
         </w:pict>
       </w:r>
     </w:p>
+    <w:bookmarkEnd w:id="16"/>
+    <w:bookmarkEnd w:id="17"/>
+    <w:bookmarkStart w:id="25" w:name="notes-del-presentador-per-diapositiva"/>
+    <w:p>
+      <w:pPr>
+        <w:pStyle w:val="Ttulo2"/>
+      </w:pPr>
+      <w:r>
+        <w:t xml:space="preserve">2. Notes del presentador per diapositiva</w:t>
+      </w:r>
+    </w:p>
+    <w:bookmarkStart w:id="18" w:name="trajectòria---050"/>
+    <w:p>
+      <w:pPr>
+        <w:pStyle w:val="Ttulo3"/>
+      </w:pPr>
+      <w:r>
+        <w:t xml:space="preserve">1. Trajectòria - 0:50</w:t>
+      </w:r>
+    </w:p>
+    <w:p>
+      <w:pPr>
+        <w:pStyle w:val="Compact"/>
+        <w:numPr>
+          <w:ilvl w:val="0"/>
+          <w:numId w:val="1003"/>
+        </w:numPr>
+      </w:pPr>
+      <w:r>
+        <w:t xml:space="preserve">Obrir amb agraïment breu.</w:t>
+      </w:r>
+    </w:p>
+    <w:p>
+      <w:pPr>
+        <w:pStyle w:val="Compact"/>
+        <w:numPr>
+          <w:ilvl w:val="0"/>
+          <w:numId w:val="1003"/>
+        </w:numPr>
+      </w:pPr>
+      <w:r>
+        <w:t xml:space="preserve">No llegir CV: explicar fil conductor.</w:t>
+      </w:r>
+    </w:p>
+    <w:p>
+      <w:pPr>
+        <w:pStyle w:val="Compact"/>
+        <w:numPr>
+          <w:ilvl w:val="0"/>
+          <w:numId w:val="1003"/>
+        </w:numPr>
+      </w:pPr>
+      <w:r>
+        <w:t xml:space="preserve">2004 -&gt; un sol fil conductor: enginyer a la indústria, professor universitari, investigador en com s’ensenya l’enginyeria del software.</w:t>
+      </w:r>
+    </w:p>
+    <w:p>
+      <w:pPr>
+        <w:pStyle w:val="Compact"/>
+        <w:numPr>
+          <w:ilvl w:val="0"/>
+          <w:numId w:val="1003"/>
+        </w:numPr>
+      </w:pPr>
+      <w:r>
+        <w:t xml:space="preserve">Missatge: trajectòria coherent amb la plaça.</w:t>
+      </w:r>
+    </w:p>
+    <w:p>
+      <w:pPr>
+        <w:pStyle w:val="Compact"/>
+        <w:numPr>
+          <w:ilvl w:val="0"/>
+          <w:numId w:val="1003"/>
+        </w:numPr>
+      </w:pPr>
+      <w:r>
+        <w:t xml:space="preserve">Transició: base professional en indústria.</w:t>
+      </w:r>
+    </w:p>
+    <w:bookmarkEnd w:id="18"/>
+    <w:bookmarkStart w:id="19" w:name="indústria-i-consultoria---110"/>
+    <w:p>
+      <w:pPr>
+        <w:pStyle w:val="Ttulo3"/>
+      </w:pPr>
+      <w:r>
+        <w:t xml:space="preserve">2. Indústria i consultoria - 1:10</w:t>
+      </w:r>
+    </w:p>
+    <w:p>
+      <w:pPr>
+        <w:pStyle w:val="Compact"/>
+        <w:numPr>
+          <w:ilvl w:val="0"/>
+          <w:numId w:val="1004"/>
+        </w:numPr>
+      </w:pPr>
+      <w:r>
+        <w:t xml:space="preserve">Vida Software: component del sistema operatiu Symbian per a interacció per veu.</w:t>
+      </w:r>
+    </w:p>
+    <w:p>
+      <w:pPr>
+        <w:pStyle w:val="Compact"/>
+        <w:numPr>
+          <w:ilvl w:val="0"/>
+          <w:numId w:val="1004"/>
+        </w:numPr>
+      </w:pPr>
+      <w:r>
+        <w:t xml:space="preserve">No era una app final: permetia que aplicacions Nokia/Symbian incorporessin veu.</w:t>
+      </w:r>
+    </w:p>
+    <w:p>
+      <w:pPr>
+        <w:pStyle w:val="Compact"/>
+        <w:numPr>
+          <w:ilvl w:val="0"/>
+          <w:numId w:val="1004"/>
+        </w:numPr>
+      </w:pPr>
+      <w:r>
+        <w:t xml:space="preserve">C/C++, rendiment, memòria i dispositiu com a senyals de profunditat tècnica.</w:t>
+      </w:r>
+    </w:p>
+    <w:p>
+      <w:pPr>
+        <w:pStyle w:val="Compact"/>
+        <w:numPr>
+          <w:ilvl w:val="0"/>
+          <w:numId w:val="1004"/>
+        </w:numPr>
+      </w:pPr>
+      <w:r>
+        <w:t xml:space="preserve">3GSM / Mobile World Congress i patent com a context d’innovació; no presentar la patent com a pròpia.</w:t>
+      </w:r>
+    </w:p>
+    <w:p>
+      <w:pPr>
+        <w:pStyle w:val="Compact"/>
+        <w:numPr>
+          <w:ilvl w:val="0"/>
+          <w:numId w:val="1004"/>
+        </w:numPr>
+      </w:pPr>
+      <w:r>
+        <w:t xml:space="preserve">openTrends: consultoria, clients, equips i sistemes d’informació.</w:t>
+      </w:r>
+    </w:p>
+    <w:p>
+      <w:pPr>
+        <w:pStyle w:val="Compact"/>
+        <w:numPr>
+          <w:ilvl w:val="0"/>
+          <w:numId w:val="1004"/>
+        </w:numPr>
+      </w:pPr>
+      <w:r>
+        <w:t xml:space="preserve">Punt clau: el que més gaudia era formar perfils més júniors.</w:t>
+      </w:r>
+    </w:p>
+    <w:p>
+      <w:pPr>
+        <w:pStyle w:val="Compact"/>
+        <w:numPr>
+          <w:ilvl w:val="0"/>
+          <w:numId w:val="1004"/>
+        </w:numPr>
+      </w:pPr>
+      <w:r>
+        <w:t xml:space="preserve">La comunicació passa de ser eina professional a pràctica docent.</w:t>
+      </w:r>
+    </w:p>
+    <w:p>
+      <w:pPr>
+        <w:pStyle w:val="Compact"/>
+        <w:numPr>
+          <w:ilvl w:val="0"/>
+          <w:numId w:val="1004"/>
+        </w:numPr>
+      </w:pPr>
+      <w:r>
+        <w:t xml:space="preserve">Transició: màster en Formació del Professorat i entrada a la Formació Professional.</w:t>
+      </w:r>
+    </w:p>
+    <w:bookmarkEnd w:id="19"/>
+    <w:bookmarkStart w:id="20" w:name="stucom---110"/>
+    <w:p>
+      <w:pPr>
+        <w:pStyle w:val="Ttulo3"/>
+      </w:pPr>
+      <w:r>
+        <w:t xml:space="preserve">3. Stucom - 1:10</w:t>
+      </w:r>
+    </w:p>
+    <w:p>
+      <w:pPr>
+        <w:pStyle w:val="Compact"/>
+        <w:numPr>
+          <w:ilvl w:val="0"/>
+          <w:numId w:val="1005"/>
+        </w:numPr>
+      </w:pPr>
+      <w:r>
+        <w:t xml:space="preserve">Decisió vocacional, no improvisació.</w:t>
+      </w:r>
+    </w:p>
+    <w:p>
+      <w:pPr>
+        <w:pStyle w:val="Compact"/>
+        <w:numPr>
+          <w:ilvl w:val="0"/>
+          <w:numId w:val="1005"/>
+        </w:numPr>
+      </w:pPr>
+      <w:r>
+        <w:t xml:space="preserve">Màster en Formació del Professorat + FP DAW/DAM.</w:t>
+      </w:r>
+    </w:p>
+    <w:p>
+      <w:pPr>
+        <w:pStyle w:val="Compact"/>
+        <w:numPr>
+          <w:ilvl w:val="0"/>
+          <w:numId w:val="1005"/>
+        </w:numPr>
+      </w:pPr>
+      <w:r>
+        <w:t xml:space="preserve">Aula, relació amb alumnat, escolta i acompanyament.</w:t>
+      </w:r>
+    </w:p>
+    <w:p>
+      <w:pPr>
+        <w:pStyle w:val="Compact"/>
+        <w:numPr>
+          <w:ilvl w:val="0"/>
+          <w:numId w:val="1005"/>
+        </w:numPr>
+      </w:pPr>
+      <w:r>
+        <w:t xml:space="preserve">Agraïment a l’FP; no menysvalorar-la.</w:t>
+      </w:r>
+    </w:p>
+    <w:p>
+      <w:pPr>
+        <w:pStyle w:val="Compact"/>
+        <w:numPr>
+          <w:ilvl w:val="0"/>
+          <w:numId w:val="1005"/>
+        </w:numPr>
+      </w:pPr>
+      <w:r>
+        <w:t xml:space="preserve">Evolució cap a continguts tècnics universitaris més avançats.</w:t>
+      </w:r>
+    </w:p>
+    <w:bookmarkEnd w:id="20"/>
+    <w:bookmarkStart w:id="21" w:name="la-salle-i-pont-cap-al-tecnocampus---155"/>
+    <w:p>
+      <w:pPr>
+        <w:pStyle w:val="Ttulo3"/>
+      </w:pPr>
+      <w:r>
+        <w:t xml:space="preserve">4. La Salle i pont cap al TecnoCampus - 1:55</w:t>
+      </w:r>
+    </w:p>
+    <w:p>
+      <w:pPr>
+        <w:pStyle w:val="Compact"/>
+        <w:numPr>
+          <w:ilvl w:val="0"/>
+          <w:numId w:val="1006"/>
+        </w:numPr>
+      </w:pPr>
+      <w:r>
+        <w:t xml:space="preserve">La Salle: incorporació a un entorn universitari d’alt nivell tècnic.</w:t>
+      </w:r>
+    </w:p>
+    <w:p>
+      <w:pPr>
+        <w:pStyle w:val="Compact"/>
+        <w:numPr>
+          <w:ilvl w:val="0"/>
+          <w:numId w:val="1006"/>
+        </w:numPr>
+      </w:pPr>
+      <w:r>
+        <w:t xml:space="preserve">La Salle és etapa valuosa; evitar comparacions jeràrquiques.</w:t>
+      </w:r>
+    </w:p>
+    <w:p>
+      <w:pPr>
+        <w:pStyle w:val="Compact"/>
+        <w:numPr>
+          <w:ilvl w:val="0"/>
+          <w:numId w:val="1006"/>
+        </w:numPr>
+      </w:pPr>
+      <w:r>
+        <w:t xml:space="preserve">Motiu principal: encaix acadèmic més directe amb enginyeria del software i sistemes d’informació.</w:t>
+      </w:r>
+    </w:p>
+    <w:p>
+      <w:pPr>
+        <w:pStyle w:val="Compact"/>
+        <w:numPr>
+          <w:ilvl w:val="0"/>
+          <w:numId w:val="1006"/>
+        </w:numPr>
+      </w:pPr>
+      <w:r>
+        <w:t xml:space="preserve">Conciliació com a factor complementari de sostenibilitat.</w:t>
+      </w:r>
+    </w:p>
+    <w:p>
+      <w:pPr>
+        <w:pStyle w:val="Compact"/>
+        <w:numPr>
+          <w:ilvl w:val="0"/>
+          <w:numId w:val="1006"/>
+        </w:numPr>
+      </w:pPr>
+      <w:r>
+        <w:t xml:space="preserve">Conversa amb coordinador i director a La Salle.</w:t>
+      </w:r>
+    </w:p>
+    <w:p>
+      <w:pPr>
+        <w:pStyle w:val="Compact"/>
+        <w:numPr>
+          <w:ilvl w:val="0"/>
+          <w:numId w:val="1006"/>
+        </w:numPr>
+      </w:pPr>
+      <w:r>
+        <w:t xml:space="preserve">Fonaments a La Salle: disseny i programació orientats a objectes i aplicacions mòbils; la llavor de l’enginyeria del software.</w:t>
+      </w:r>
+    </w:p>
+    <w:p>
+      <w:pPr>
+        <w:pStyle w:val="Compact"/>
+        <w:numPr>
+          <w:ilvl w:val="0"/>
+          <w:numId w:val="1006"/>
+        </w:numPr>
+      </w:pPr>
+      <w:r>
+        <w:t xml:space="preserve">Territori professional propi: arquitectura de software, backend empresarial i sistemes d’informació; el tram següent del mateix camí.</w:t>
+      </w:r>
+    </w:p>
+    <w:p>
+      <w:pPr>
+        <w:pStyle w:val="Compact"/>
+        <w:numPr>
+          <w:ilvl w:val="0"/>
+          <w:numId w:val="1006"/>
+        </w:numPr>
+      </w:pPr>
+      <w:r>
+        <w:t xml:space="preserve">Encaix curricular al TecnoCampus: el grau porta la gestió i els sistemes d’informació al seu propi nom.</w:t>
+      </w:r>
+    </w:p>
+    <w:p>
+      <w:pPr>
+        <w:pStyle w:val="Compact"/>
+        <w:numPr>
+          <w:ilvl w:val="0"/>
+          <w:numId w:val="1006"/>
+        </w:numPr>
+      </w:pPr>
+      <w:r>
+        <w:t xml:space="preserve">No esmentar persones concretes; el contacte acadèmic es formula en genèric.</w:t>
+      </w:r>
+    </w:p>
+    <w:p>
+      <w:pPr>
+        <w:pStyle w:val="Compact"/>
+        <w:numPr>
+          <w:ilvl w:val="0"/>
+          <w:numId w:val="1006"/>
+        </w:numPr>
+      </w:pPr>
+      <w:r>
+        <w:t xml:space="preserve">TecnoCampus: docència universitària, software, sistemes d’informació, transferència i projecte sostenible.</w:t>
+      </w:r>
+    </w:p>
+    <w:p>
+      <w:pPr>
+        <w:pStyle w:val="Compact"/>
+        <w:numPr>
+          <w:ilvl w:val="0"/>
+          <w:numId w:val="1006"/>
+        </w:numPr>
+      </w:pPr>
+      <w:r>
+        <w:t xml:space="preserve">Frase clau: el desig de consolidar-se ve de lluny.</w:t>
+      </w:r>
+    </w:p>
     <w:bookmarkEnd w:id="21"/>
+    <w:bookmarkStart w:id="22" w:name="tecnocampus---205"/>
+    <w:p>
+      <w:pPr>
+        <w:pStyle w:val="Ttulo3"/>
+      </w:pPr>
+      <w:r>
+        <w:t xml:space="preserve">5. TecnoCampus - 2:05</w:t>
+      </w:r>
+    </w:p>
+    <w:p>
+      <w:pPr>
+        <w:pStyle w:val="Compact"/>
+        <w:numPr>
+          <w:ilvl w:val="0"/>
+          <w:numId w:val="1007"/>
+        </w:numPr>
+      </w:pPr>
+      <w:r>
+        <w:t xml:space="preserve">Docència continuada des de 2021.</w:t>
+      </w:r>
+    </w:p>
+    <w:p>
+      <w:pPr>
+        <w:pStyle w:val="Compact"/>
+        <w:numPr>
+          <w:ilvl w:val="0"/>
+          <w:numId w:val="1007"/>
+        </w:numPr>
+      </w:pPr>
+      <w:r>
+        <w:t xml:space="preserve">Assignatures: programació, dades, Internet, enginyeria, DSI.</w:t>
+      </w:r>
+    </w:p>
+    <w:p>
+      <w:pPr>
+        <w:pStyle w:val="Compact"/>
+        <w:numPr>
+          <w:ilvl w:val="0"/>
+          <w:numId w:val="1007"/>
+        </w:numPr>
+      </w:pPr>
+      <w:r>
+        <w:t xml:space="preserve">15 registres oficials d’avaluació docent: mitjana aritmètica simple de 8,75/10.</w:t>
+      </w:r>
+    </w:p>
+    <w:p>
+      <w:pPr>
+        <w:pStyle w:val="Compact"/>
+        <w:numPr>
+          <w:ilvl w:val="0"/>
+          <w:numId w:val="1007"/>
+        </w:numPr>
+      </w:pPr>
+      <w:r>
+        <w:t xml:space="preserve">Quatre registres dels dos darrers cursos: mitjana aritmètica simple de 9,03/10.</w:t>
+      </w:r>
+    </w:p>
+    <w:p>
+      <w:pPr>
+        <w:pStyle w:val="Compact"/>
+        <w:numPr>
+          <w:ilvl w:val="0"/>
+          <w:numId w:val="1007"/>
+        </w:numPr>
+      </w:pPr>
+      <w:r>
+        <w:t xml:space="preserve">No dir mitjana ponderada ni percentatge de satisfacció.</w:t>
+      </w:r>
+    </w:p>
+    <w:p>
+      <w:pPr>
+        <w:pStyle w:val="Compact"/>
+        <w:numPr>
+          <w:ilvl w:val="0"/>
+          <w:numId w:val="1007"/>
+        </w:numPr>
+      </w:pPr>
+      <w:r>
+        <w:t xml:space="preserve">Josep Roure: arquitectura, DDD, Clean Architecture, hexagonal.</w:t>
+      </w:r>
+    </w:p>
+    <w:p>
+      <w:pPr>
+        <w:pStyle w:val="Compact"/>
+        <w:numPr>
+          <w:ilvl w:val="0"/>
+          <w:numId w:val="1007"/>
+        </w:numPr>
+      </w:pPr>
+      <w:r>
+        <w:t xml:space="preserve">Participació acreditada al projecte SQAI d’ABP a Laboratori d’Aplicacions Internet.</w:t>
+      </w:r>
+    </w:p>
+    <w:p>
+      <w:pPr>
+        <w:pStyle w:val="Compact"/>
+        <w:numPr>
+          <w:ilvl w:val="0"/>
+          <w:numId w:val="1007"/>
+        </w:numPr>
+      </w:pPr>
+      <w:r>
+        <w:t xml:space="preserve">HexaStock com a integració de docència, pràctica i transferència.</w:t>
+      </w:r>
+    </w:p>
+    <w:p>
+      <w:pPr>
+        <w:pStyle w:val="Compact"/>
+        <w:numPr>
+          <w:ilvl w:val="0"/>
+          <w:numId w:val="1007"/>
+        </w:numPr>
+      </w:pPr>
+      <w:r>
+        <w:t xml:space="preserve">Transició explícita a la classe magistral.</w:t>
+      </w:r>
+    </w:p>
     <w:bookmarkEnd w:id="22"/>
-    <w:bookmarkStart w:id="23" w:name="esquema-de-memorització"/>
+    <w:bookmarkStart w:id="23" w:name="neueda-doctorat-i-futur---220"/>
+    <w:p>
+      <w:pPr>
+        <w:pStyle w:val="Ttulo3"/>
+      </w:pPr>
+      <w:r>
+        <w:t xml:space="preserve">6. Neueda, doctorat i futur - 2:20</w:t>
+      </w:r>
+    </w:p>
+    <w:p>
+      <w:pPr>
+        <w:pStyle w:val="Compact"/>
+        <w:numPr>
+          <w:ilvl w:val="0"/>
+          <w:numId w:val="1008"/>
+        </w:numPr>
+      </w:pPr>
+      <w:r>
+        <w:t xml:space="preserve">Cambridge C1 Advanced: 185, Pass at Grade C, C1 MECR.</w:t>
+      </w:r>
+    </w:p>
+    <w:p>
+      <w:pPr>
+        <w:pStyle w:val="Compact"/>
+        <w:numPr>
+          <w:ilvl w:val="0"/>
+          <w:numId w:val="1008"/>
+        </w:numPr>
+      </w:pPr>
+      <w:r>
+        <w:t xml:space="preserve">Neueda: formació internacional en anglès en enginyeria del software.</w:t>
+      </w:r>
+    </w:p>
+    <w:p>
+      <w:pPr>
+        <w:pStyle w:val="Compact"/>
+        <w:numPr>
+          <w:ilvl w:val="0"/>
+          <w:numId w:val="1008"/>
+        </w:numPr>
+      </w:pPr>
+      <w:r>
+        <w:t xml:space="preserve">AGAUR: 60 hores de formació i consultoria especialitzada en REST, arquitectura hexagonal i sistemes d’informació.</w:t>
+      </w:r>
+    </w:p>
+    <w:p>
+      <w:pPr>
+        <w:pStyle w:val="Compact"/>
+        <w:numPr>
+          <w:ilvl w:val="0"/>
+          <w:numId w:val="1008"/>
+        </w:numPr>
+      </w:pPr>
+      <w:r>
+        <w:t xml:space="preserve">HUB4T: Java Backend Web Developer, 120 h per curs durant tres cursos acadèmics.</w:t>
+      </w:r>
+    </w:p>
+    <w:p>
+      <w:pPr>
+        <w:pStyle w:val="Compact"/>
+        <w:numPr>
+          <w:ilvl w:val="0"/>
+          <w:numId w:val="1008"/>
+        </w:numPr>
+      </w:pPr>
+      <w:r>
+        <w:t xml:space="preserve">Doctorat UDIMA: Educació en Enginyeria del Software.</w:t>
+      </w:r>
+    </w:p>
+    <w:p>
+      <w:pPr>
+        <w:pStyle w:val="Compact"/>
+        <w:numPr>
+          <w:ilvl w:val="0"/>
+          <w:numId w:val="1008"/>
+        </w:numPr>
+      </w:pPr>
+      <w:r>
+        <w:t xml:space="preserve">No presentar-lo com a psicologia genèrica ni com a resultats ja assolits.</w:t>
+      </w:r>
+    </w:p>
+    <w:p>
+      <w:pPr>
+        <w:pStyle w:val="Compact"/>
+        <w:numPr>
+          <w:ilvl w:val="0"/>
+          <w:numId w:val="1008"/>
+        </w:numPr>
+      </w:pPr>
+      <w:r>
+        <w:t xml:space="preserve">Tesi: problema obert identificat per la literatura recent; integració curricular, mesura i estudis longitudinals.</w:t>
+      </w:r>
+    </w:p>
+    <w:p>
+      <w:pPr>
+        <w:pStyle w:val="Compact"/>
+        <w:numPr>
+          <w:ilvl w:val="0"/>
+          <w:numId w:val="1008"/>
+        </w:numPr>
+      </w:pPr>
+      <w:r>
+        <w:t xml:space="preserve">Disseny mixt i quasiexperimental, dues assignatures reals amb ABP, pretest, posttest, seguiment diferit i component qualitatiu.</w:t>
+      </w:r>
+    </w:p>
+    <w:p>
+      <w:pPr>
+        <w:pStyle w:val="Compact"/>
+        <w:numPr>
+          <w:ilvl w:val="0"/>
+          <w:numId w:val="1008"/>
+        </w:numPr>
+      </w:pPr>
+      <w:r>
+        <w:t xml:space="preserve">Futur: docència, recerca, innovació, transferència i acompanyament.</w:t>
+      </w:r>
+    </w:p>
+    <w:p>
+      <w:pPr>
+        <w:pStyle w:val="Compact"/>
+        <w:numPr>
+          <w:ilvl w:val="0"/>
+          <w:numId w:val="1008"/>
+        </w:numPr>
+      </w:pPr>
+      <w:r>
+        <w:t xml:space="preserve">Tancar amb la plaça com a consolidació d’un projecte acadèmic.</w:t>
+      </w:r>
+    </w:p>
+    <w:p>
+      <w:pPr>
+        <w:pStyle w:val="Compact"/>
+        <w:numPr>
+          <w:ilvl w:val="0"/>
+          <w:numId w:val="1008"/>
+        </w:numPr>
+      </w:pPr>
+      <w:r>
+        <w:t xml:space="preserve">Enllaçar amb la classe magistral següent.</w:t>
+      </w:r>
+    </w:p>
+    <w:bookmarkEnd w:id="23"/>
+    <w:bookmarkStart w:id="24" w:name="Xed3256c23068a18527438c32113db4e0c20a1ed"/>
+    <w:p>
+      <w:pPr>
+        <w:pStyle w:val="Ttulo3"/>
+      </w:pPr>
+      <w:r>
+        <w:t xml:space="preserve">Annex A. Contrast d’orientació curricular - només si el tribunal pregunta</w:t>
+      </w:r>
+    </w:p>
+    <w:p>
+      <w:pPr>
+        <w:pStyle w:val="Compact"/>
+        <w:numPr>
+          <w:ilvl w:val="0"/>
+          <w:numId w:val="1009"/>
+        </w:numPr>
+      </w:pPr>
+      <w:r>
+        <w:t xml:space="preserve">Fora dels deu minuts i de la numeració 1-6; no mostrar sense pregunta o necessitat clara.</w:t>
+      </w:r>
+    </w:p>
+    <w:p>
+      <w:pPr>
+        <w:pStyle w:val="Compact"/>
+        <w:numPr>
+          <w:ilvl w:val="0"/>
+          <w:numId w:val="1009"/>
+        </w:numPr>
+      </w:pPr>
+      <w:r>
+        <w:t xml:space="preserve">Missatge: diferències d’èmfasi i d’orientació curricular, mai de qualitat ni de jerarquia entre institucions.</w:t>
+      </w:r>
+    </w:p>
+    <w:p>
+      <w:pPr>
+        <w:pStyle w:val="Compact"/>
+        <w:numPr>
+          <w:ilvl w:val="0"/>
+          <w:numId w:val="1009"/>
+        </w:numPr>
+      </w:pPr>
+      <w:r>
+        <w:t xml:space="preserve">Taula: Enginyeria del Software, Sistemes d’Informació i arquitectura, electrònica i hardware, xarxes i telecomunicacions, identitat del grau.</w:t>
+      </w:r>
+    </w:p>
+    <w:p>
+      <w:pPr>
+        <w:pStyle w:val="Compact"/>
+        <w:numPr>
+          <w:ilvl w:val="0"/>
+          <w:numId w:val="1009"/>
+        </w:numPr>
+      </w:pPr>
+      <w:r>
+        <w:t xml:space="preserve">Sense noms de persones ni relacions personals; justificació estrictament acadèmica, curricular i institucional.</w:t>
+      </w:r>
+    </w:p>
+    <w:p>
+      <w:pPr>
+        <w:pStyle w:val="Compact"/>
+        <w:numPr>
+          <w:ilvl w:val="0"/>
+          <w:numId w:val="1009"/>
+        </w:numPr>
+      </w:pPr>
+      <w:r>
+        <w:t xml:space="preserve">Fonts (consulta: 13 de juliol de 2026): pla d’estudis del Grau en Enginyeria Informàtica de La Salle URL (https://www.salleurl.edu/ca/estudis/grau-en-enginyeria-informatica/pla-estudis) i Grau en Enginyeria Informàtica de Gestió i Sistemes d’Informació del TecnoCampus (https://www.tecnocampus.cat/grau/grau-en-enginyeria-informatica-de-gestio-i-sistemes-dinformacio).</w:t>
+      </w:r>
+    </w:p>
+    <w:p>
+      <w:pPr>
+        <w:pStyle w:val="Compact"/>
+        <w:numPr>
+          <w:ilvl w:val="0"/>
+          <w:numId w:val="1009"/>
+        </w:numPr>
+      </w:pPr>
+      <w:r>
+        <w:t xml:space="preserve">Criteri: només assignatures amb nom verificat als plans vigents, amb obligatòries i optatives diferenciades; no es projecten sumes agregades d’ECTS perquè la classificació obligatòria/optativa de La Salle no va resultar estable entre consultes, i per això la diapositiva usa formulacions qualitatives.</w:t>
+      </w:r>
+    </w:p>
+    <w:p>
+      <w:pPr>
+        <w:pStyle w:val="Compact"/>
+        <w:numPr>
+          <w:ilvl w:val="0"/>
+          <w:numId w:val="1009"/>
+        </w:numPr>
+      </w:pPr>
+      <w:r>
+        <w:t xml:space="preserve">Resposta oral de reserva: vegeu la secció Annex A del guió.</w:t>
+      </w:r>
+    </w:p>
+    <w:p>
+      <w:r>
+        <w:pict>
+          <v:rect style="width:0;height:1.5pt" o:hralign="center" o:hrstd="t" o:hr="t"/>
+        </w:pict>
+      </w:r>
+    </w:p>
+    <w:bookmarkEnd w:id="24"/>
+    <w:bookmarkEnd w:id="25"/>
+    <w:bookmarkStart w:id="26" w:name="esquema-de-memorització"/>
     <w:p>
       <w:pPr>
         <w:pStyle w:val="Ttulo2"/>
@@ -1447,7 +1664,7 @@
               <w:pStyle w:val="Compact"/>
             </w:pPr>
             <w:r>
-              <w:t xml:space="preserve">La Salle obre la universitat i TecnoCampus dona alineació</w:t>
+              <w:t xml:space="preserve">La Salle dona els fonaments; el TecnoCampus, l’encaix curricular</w:t>
             </w:r>
           </w:p>
         </w:tc>
@@ -1458,7 +1675,7 @@
               <w:pStyle w:val="Compact"/>
             </w:pPr>
             <w:r>
-              <w:t xml:space="preserve">La Salle, software, sistemes, Ester Bernadó</w:t>
+              <w:t xml:space="preserve">La Salle, fonaments, llavor, tram següent, encaix</w:t>
             </w:r>
           </w:p>
         </w:tc>
@@ -1566,6 +1783,52 @@
           </w:p>
         </w:tc>
       </w:tr>
+      <w:tr>
+        <w:tc>
+          <w:tcPr/>
+          <w:p>
+            <w:pPr>
+              <w:pStyle w:val="Compact"/>
+            </w:pPr>
+            <w:r>
+              <w:t xml:space="preserve">Annex A</w:t>
+            </w:r>
+          </w:p>
+        </w:tc>
+        <w:tc>
+          <w:tcPr/>
+          <w:p>
+            <w:pPr>
+              <w:pStyle w:val="Compact"/>
+            </w:pPr>
+            <w:r>
+              <w:t xml:space="preserve">Diferències d’èmfasi curricular, no de qualitat (només preguntes)</w:t>
+            </w:r>
+          </w:p>
+        </w:tc>
+        <w:tc>
+          <w:tcPr/>
+          <w:p>
+            <w:pPr>
+              <w:pStyle w:val="Compact"/>
+            </w:pPr>
+            <w:r>
+              <w:t xml:space="preserve">encaix, orientació, fonts oficials</w:t>
+            </w:r>
+          </w:p>
+        </w:tc>
+        <w:tc>
+          <w:tcPr/>
+          <w:p>
+            <w:pPr>
+              <w:pStyle w:val="Compact"/>
+            </w:pPr>
+            <w:r>
+              <w:t xml:space="preserve">Fora dels 10 min</w:t>
+            </w:r>
+          </w:p>
+        </w:tc>
+      </w:tr>
     </w:tbl>
     <w:p>
       <w:pPr>
@@ -1610,8 +1873,8 @@
         </w:pict>
       </w:r>
     </w:p>
-    <w:bookmarkEnd w:id="23"/>
-    <w:bookmarkStart w:id="29" w:name="recomanacions-dassaig-ritme-veu-i-cos"/>
+    <w:bookmarkEnd w:id="26"/>
+    <w:bookmarkStart w:id="32" w:name="recomanacions-dassaig-ritme-veu-i-cos"/>
     <w:p>
       <w:pPr>
         <w:pStyle w:val="Ttulo2"/>
@@ -1620,7 +1883,7 @@
         <w:t xml:space="preserve">4. Recomanacions d’assaig, ritme, veu i cos</w:t>
       </w:r>
     </w:p>
-    <w:bookmarkStart w:id="24" w:name="ritme"/>
+    <w:bookmarkStart w:id="27" w:name="ritme"/>
     <w:p>
       <w:pPr>
         <w:pStyle w:val="Ttulo3"/>
@@ -1637,8 +1900,8 @@
         <w:t xml:space="preserve">La presentació està pensada per a 9:00-9:20 amb un ritme pausat i marge real. Les diapositives 5 i 6 són les més importants i poden ocupar una mica més de temps. Si cal retallar durant l’assaig, retalla detall tècnic de la diapositiva 2 o una evidència de transferència de la diapositiva 6; no retallis les xifres docents del TecnoCampus.</w:t>
       </w:r>
     </w:p>
-    <w:bookmarkEnd w:id="24"/>
-    <w:bookmarkStart w:id="25" w:name="veu"/>
+    <w:bookmarkEnd w:id="27"/>
+    <w:bookmarkStart w:id="28" w:name="veu"/>
     <w:p>
       <w:pPr>
         <w:pStyle w:val="Ttulo3"/>
@@ -1679,8 +1942,8 @@
         <w:t xml:space="preserve">. No cal intensificar-les; la força està a dir-les amb calma i amb evidència.</w:t>
       </w:r>
     </w:p>
-    <w:bookmarkEnd w:id="25"/>
-    <w:bookmarkStart w:id="26" w:name="cos-i-mirada"/>
+    <w:bookmarkEnd w:id="28"/>
+    <w:bookmarkStart w:id="29" w:name="cos-i-mirada"/>
     <w:p>
       <w:pPr>
         <w:pStyle w:val="Ttulo3"/>
@@ -1697,8 +1960,8 @@
         <w:t xml:space="preserve">Mira el tribunal en tres moments: inici, explicació de l’alineació TecnoCampus i tancament final. Mira la pantalla només quan la diapositiva ajudi a ordenar una etapa o una transició. A la diapositiva 5, atura’t una mica abans de dir les xifres d’avaluació docent.</w:t>
       </w:r>
     </w:p>
-    <w:bookmarkEnd w:id="26"/>
-    <w:bookmarkStart w:id="27" w:name="control-del-temps"/>
+    <w:bookmarkEnd w:id="29"/>
+    <w:bookmarkStart w:id="30" w:name="control-del-temps"/>
     <w:p>
       <w:pPr>
         <w:pStyle w:val="Ttulo3"/>
@@ -1712,7 +1975,7 @@
         <w:pStyle w:val="Compact"/>
         <w:numPr>
           <w:ilvl w:val="0"/>
-          <w:numId w:val="1009"/>
+          <w:numId w:val="1010"/>
         </w:numPr>
       </w:pPr>
       <w:r>
@@ -1724,7 +1987,7 @@
         <w:pStyle w:val="Compact"/>
         <w:numPr>
           <w:ilvl w:val="0"/>
-          <w:numId w:val="1009"/>
+          <w:numId w:val="1010"/>
         </w:numPr>
       </w:pPr>
       <w:r>
@@ -1736,7 +1999,7 @@
         <w:pStyle w:val="Compact"/>
         <w:numPr>
           <w:ilvl w:val="0"/>
-          <w:numId w:val="1009"/>
+          <w:numId w:val="1010"/>
         </w:numPr>
       </w:pPr>
       <w:r>
@@ -1748,19 +2011,19 @@
         <w:pStyle w:val="Compact"/>
         <w:numPr>
           <w:ilvl w:val="0"/>
-          <w:numId w:val="1009"/>
-        </w:numPr>
-      </w:pPr>
-      <w:r>
-        <w:t xml:space="preserve">Diapositiva 4: alineació acadèmica com a motiu principal; conciliació només com a sostenibilitat complementària.</w:t>
-      </w:r>
-    </w:p>
-    <w:p>
-      <w:pPr>
-        <w:pStyle w:val="Compact"/>
-        <w:numPr>
-          <w:ilvl w:val="0"/>
-          <w:numId w:val="1009"/>
+          <w:numId w:val="1010"/>
+        </w:numPr>
+      </w:pPr>
+      <w:r>
+        <w:t xml:space="preserve">Diapositiva 4: encaix curricular com a motiu principal (fonaments a La Salle, tram següent al TecnoCampus); conciliació només com a sostenibilitat complementària; cap menció de persones concretes.</w:t>
+      </w:r>
+    </w:p>
+    <w:p>
+      <w:pPr>
+        <w:pStyle w:val="Compact"/>
+        <w:numPr>
+          <w:ilvl w:val="0"/>
+          <w:numId w:val="1010"/>
         </w:numPr>
       </w:pPr>
       <w:r>
@@ -1772,15 +2035,15 @@
         <w:pStyle w:val="Compact"/>
         <w:numPr>
           <w:ilvl w:val="0"/>
-          <w:numId w:val="1009"/>
+          <w:numId w:val="1010"/>
         </w:numPr>
       </w:pPr>
       <w:r>
         <w:t xml:space="preserve">Diapositiva 6: recerca com a Educació en Enginyeria del Software; tancar amb seguretat i enllaçar amb la classe magistral.</w:t>
       </w:r>
     </w:p>
-    <w:bookmarkEnd w:id="27"/>
-    <w:bookmarkStart w:id="28" w:name="versió-curta-demergència"/>
+    <w:bookmarkEnd w:id="30"/>
+    <w:bookmarkStart w:id="31" w:name="versió-curta-demergència"/>
     <w:p>
       <w:pPr>
         <w:pStyle w:val="Ttulo3"/>
@@ -1802,7 +2065,7 @@
         <w:pStyle w:val="Compact"/>
         <w:numPr>
           <w:ilvl w:val="0"/>
-          <w:numId w:val="1010"/>
+          <w:numId w:val="1011"/>
         </w:numPr>
       </w:pPr>
       <w:r>
@@ -1826,7 +2089,7 @@
         <w:pStyle w:val="Compact"/>
         <w:numPr>
           <w:ilvl w:val="0"/>
-          <w:numId w:val="1010"/>
+          <w:numId w:val="1011"/>
         </w:numPr>
       </w:pPr>
       <w:r>
@@ -1838,7 +2101,7 @@
         <w:pStyle w:val="Compact"/>
         <w:numPr>
           <w:ilvl w:val="0"/>
-          <w:numId w:val="1010"/>
+          <w:numId w:val="1011"/>
         </w:numPr>
       </w:pPr>
       <w:r>
@@ -1862,7 +2125,46 @@
         <w:pStyle w:val="Compact"/>
         <w:numPr>
           <w:ilvl w:val="0"/>
-          <w:numId w:val="1010"/>
+          <w:numId w:val="1011"/>
+        </w:numPr>
+      </w:pPr>
+      <w:r>
+        <w:t xml:space="preserve">A la diapositiva 4, si encara vas tard, redueix el bloc d’encaix a</w:t>
+      </w:r>
+      <w:r>
+        <w:t xml:space="preserve"> </w:t>
+      </w:r>
+      <w:r>
+        <w:rPr>
+          <w:rStyle w:val="VerbatimChar"/>
+        </w:rPr>
+        <w:t xml:space="preserve">la meva especialització tenia un encaix curricular directe al TecnoCampus</w:t>
+      </w:r>
+      <w:r>
+        <w:t xml:space="preserve"> </w:t>
+      </w:r>
+      <w:r>
+        <w:t xml:space="preserve">i elimina</w:t>
+      </w:r>
+      <w:r>
+        <w:t xml:space="preserve"> </w:t>
+      </w:r>
+      <w:r>
+        <w:rPr>
+          <w:rStyle w:val="VerbatimChar"/>
+        </w:rPr>
+        <w:t xml:space="preserve">i em va agradar molt ensenyar-los</w:t>
+      </w:r>
+      <w:r>
+        <w:t xml:space="preserve">.</w:t>
+      </w:r>
+    </w:p>
+    <w:p>
+      <w:pPr>
+        <w:pStyle w:val="Compact"/>
+        <w:numPr>
+          <w:ilvl w:val="0"/>
+          <w:numId w:val="1011"/>
         </w:numPr>
       </w:pPr>
       <w:r>
@@ -1877,9 +2179,9 @@
         <w:t xml:space="preserve">No eliminis la connexió final amb la classe magistral.</w:t>
       </w:r>
     </w:p>
-    <w:bookmarkEnd w:id="28"/>
-    <w:bookmarkEnd w:id="29"/>
-    <w:bookmarkEnd w:id="30"/>
+    <w:bookmarkEnd w:id="31"/>
+    <w:bookmarkEnd w:id="32"/>
+    <w:bookmarkEnd w:id="33"/>
     <w:sectPr>
       <w:footnotePr>
         <w:numRestart w:val="eachSect"/>
@@ -2410,6 +2712,9 @@
     <w:abstractNumId w:val="991"/>
   </w:num>
   <w:num w:numId="1010">
+    <w:abstractNumId w:val="991"/>
+  </w:num>
+  <w:num w:numId="1011">
     <w:abstractNumId w:val="991"/>
   </w:num>
 </w:numbering>

</xml_diff>

<commit_message>
Aplica l'auditoria lingüística a la trajectòria i regenera els derivats
Correccions a les diapositives 1-6 del deck de trajectòria (preposicions,
articles, denominacions oficials, Domain-Driven Design, títol «De La Salle
al TecnoCampus») i set esmenes al guió oral de 10 minuts (coma entre
subjecte i verb, universitat-empresa, formulacions més idiomàtiques).
Al deck de 20 minuts, el cas d'ús passa a «Venda d'accions» amb cometes
angulars. Es regeneren tots els materials derivats amb els scripts del
projecte.

Co-Authored-By: Claude Fable 5 <noreply@anthropic.com>
</commit_message>
<xml_diff>
--- a/doc/presentations/defensa-placa-permanent-dsi-ports-sortida-hexagonal/output/REMARKABLE_materials-orals-canonics-10-minuts-trajectoria.docx
+++ b/doc/presentations/defensa-placa-permanent-dsi-ports-sortida-hexagonal/output/REMARKABLE_materials-orals-canonics-10-minuts-trajectoria.docx
@@ -302,7 +302,7 @@
         <w:pStyle w:val="FirstParagraph"/>
       </w:pPr>
       <w:r>
-        <w:t xml:space="preserve">La primera etapa és una etapa d’indústria del software. [to calmat]</w:t>
+        <w:t xml:space="preserve">La primera etapa transcorre en la indústria del software. [to calmat]</w:t>
       </w:r>
     </w:p>
     <w:p>
@@ -396,13 +396,13 @@
       </w:r>
     </w:p>
     <w:bookmarkEnd w:id="11"/>
-    <w:bookmarkStart w:id="12" w:name="X1f0d1a81b8dc9d315c00b42224fa0d18f0492d2"/>
+    <w:bookmarkStart w:id="12" w:name="X81009d6c26c5fdd77402dc2b49454f763e8952d"/>
     <w:p>
       <w:pPr>
         <w:pStyle w:val="Ttulo3"/>
       </w:pPr>
       <w:r>
-        <w:t xml:space="preserve">Diapositiva 4. La Salle i el pont cap al TecnoCampus - 1:55</w:t>
+        <w:t xml:space="preserve">Diapositiva 4. De La Salle al TecnoCampus - 1:55</w:t>
       </w:r>
     </w:p>
     <w:p>
@@ -442,7 +442,7 @@
         <w:pStyle w:val="Textoindependiente"/>
       </w:pPr>
       <w:r>
-        <w:t xml:space="preserve">I aquest tram tenia un encaix curricular directe al TecnoCampus: el grau porta la gestió i els sistemes d’informació al seu propi nom, amb una línia completa d’enginyeria del software i de disseny de sistemes d’informació. Era l’espai natural on la meva especialització podia créixer com a docència universitària.</w:t>
+        <w:t xml:space="preserve">I aquest tram tenia un encaix curricular directe al TecnoCampus: la gestió i els sistemes d’informació formen part de la mateixa denominació del grau, amb una línia completa d’enginyeria del software i de disseny de sistemes d’informació. Era un entorn especialment alineat amb el desenvolupament de la meva especialització docent.</w:t>
       </w:r>
     </w:p>
     <w:p>
@@ -516,7 +516,7 @@
         <w:pStyle w:val="Textoindependiente"/>
       </w:pPr>
       <w:r>
-        <w:t xml:space="preserve">La participació acreditada en el projecte SQAI d’Aprenentatge Basat en Projectes a Laboratori d’Aplicacions Internet, m’ha permès integrar docència, arquitectura de software i millora educativa.</w:t>
+        <w:t xml:space="preserve">La participació acreditada en el projecte SQAI d’Aprenentatge Basat en Projectes a Laboratori d’Aplicacions Internet m’ha permès integrar docència, arquitectura de software i millora educativa.</w:t>
       </w:r>
     </w:p>
     <w:p>
@@ -524,7 +524,7 @@
         <w:pStyle w:val="Textoindependiente"/>
       </w:pPr>
       <w:r>
-        <w:t xml:space="preserve">I això connecta directament amb la segona part de la defensa: la classe magistral sobre ports de sortida en arquitectura hexagonal no és una peça aïllada, sinó una mostra d’aquest punt de trobada entre docència universitària, enginyeria del software i transferència universitat i empresa.</w:t>
+        <w:t xml:space="preserve">I això connecta directament amb la segona part de la defensa: la classe magistral sobre ports de sortida en arquitectura hexagonal no és una peça aïllada, sinó una mostra d’aquest punt de trobada entre docència universitària, enginyeria del software i transferència universitat-empresa.</w:t>
       </w:r>
     </w:p>
     <w:bookmarkEnd w:id="13"/>
@@ -550,7 +550,7 @@
         <w:pStyle w:val="Textoindependiente"/>
       </w:pPr>
       <w:r>
-        <w:t xml:space="preserve">Disposo del C1 Advanced de Cambridge i l’anglès és una llengua de treball real. En el marc de Neueda he impartit formació internacional d’enginyeria del software en anglès, vinculada a Java, Spring, arquitectura i qualitat.</w:t>
+        <w:t xml:space="preserve">Disposo del C1 Advanced de Cambridge i l’anglès és una llengua de treball real. En el marc de Neueda he impartit, en anglès, formació internacional sobre enginyeria del software, vinculada a Java, Spring, arquitectura i qualitat.</w:t>
       </w:r>
     </w:p>
     <w:p>
@@ -590,7 +590,7 @@
         <w:pStyle w:val="Textoindependiente"/>
       </w:pPr>
       <w:r>
-        <w:t xml:space="preserve">Des d’aquest recorregut, la classe magistral que presentaré a continuació se situa precisament en aquest punt de trobada entre docència universitària, arquitectura de software i transferència professional.</w:t>
+        <w:t xml:space="preserve">Com a continuació d’aquest recorregut, la classe magistral que presentaré a continuació se situa precisament en aquest punt de trobada entre docència universitària, arquitectura de software i transferència professional.</w:t>
       </w:r>
     </w:p>
     <w:p>
@@ -932,13 +932,13 @@
       </w:r>
     </w:p>
     <w:bookmarkEnd w:id="20"/>
-    <w:bookmarkStart w:id="21" w:name="la-salle-i-pont-cap-al-tecnocampus---155"/>
+    <w:bookmarkStart w:id="21" w:name="de-la-salle-al-tecnocampus---155"/>
     <w:p>
       <w:pPr>
         <w:pStyle w:val="Ttulo3"/>
       </w:pPr>
       <w:r>
-        <w:t xml:space="preserve">4. La Salle i pont cap al TecnoCampus - 1:55</w:t>
+        <w:t xml:space="preserve">4. De La Salle al TecnoCampus - 1:55</w:t>
       </w:r>
     </w:p>
     <w:p>
@@ -1034,7 +1034,7 @@
         </w:numPr>
       </w:pPr>
       <w:r>
-        <w:t xml:space="preserve">Encaix curricular al TecnoCampus: el grau porta la gestió i els sistemes d’informació al seu propi nom.</w:t>
+        <w:t xml:space="preserve">Encaix curricular al TecnoCampus: la gestió i els sistemes d’informació formen part de la mateixa denominació del grau.</w:t>
       </w:r>
     </w:p>
     <w:p>

</xml_diff>

<commit_message>
Retalla el guió de trajectòria a ~9 minuts i afegeix el script mestre de derivats
S'eliminen redundàncies del guió oral de 10 minuts (detall de protocols,
síntesis repetides, doble enumeració de La Salle i transició duplicada amb
la classe magistral) i es reformulen en afirmatiu els girs del tipus
«no X, sinó Y». El guió passa de 1.193 a ~1.020 paraules, amb temps de
capçalera actualitzats (total previst 8:45).

S'afegeix src/generate_ALL_derived_materials.sh, que executa els dos
scripts de derivats en seqüència i es nega a arrencar amb LibreOffice
obert, per evitar PDF a mig regenerar. S'actualitza AGENTS.md i
s'ignoren els fitxers de bloqueig d'Office. Inclou els derivats
regenerats.

Co-Authored-By: Claude Fable 5 <noreply@anthropic.com>
</commit_message>
<xml_diff>
--- a/doc/presentations/defensa-placa-permanent-dsi-ports-sortida-hexagonal/output/REMARKABLE_materials-orals-canonics-10-minuts-trajectoria.docx
+++ b/doc/presentations/defensa-placa-permanent-dsi-ports-sortida-hexagonal/output/REMARKABLE_materials-orals-canonics-10-minuts-trajectoria.docx
@@ -251,7 +251,7 @@
         <w:pStyle w:val="FirstParagraph"/>
       </w:pPr>
       <w:r>
-        <w:t xml:space="preserve">Temps total previst d’assaig: 9:50-10:10 aproximadament, amb pauses reals. Si l’assaig supera els 10:00, aplica la versió curta d’emergència de la diapositiva 4.</w:t>
+        <w:t xml:space="preserve">Temps total previst d’assaig: 9:00-9:20 aproximadament, amb pauses reals. Si l’assaig supera els 10:00, aplica la versió curta d’emergència de la diapositiva 4.</w:t>
       </w:r>
     </w:p>
     <w:bookmarkStart w:id="9" w:name="X955f66c7fc938677aca3c0234d4f82c1654e8a5"/>
@@ -288,13 +288,13 @@
       </w:r>
     </w:p>
     <w:bookmarkEnd w:id="9"/>
-    <w:bookmarkStart w:id="10" w:name="X28ec358c6470ee361dd2550a98450420d78bfa6"/>
+    <w:bookmarkStart w:id="10" w:name="Xd14c9db4fc52b05d6bd387f4cf590104a51d41a"/>
     <w:p>
       <w:pPr>
         <w:pStyle w:val="Ttulo3"/>
       </w:pPr>
       <w:r>
-        <w:t xml:space="preserve">Diapositiva 2. Primera etapa: enginyeria del software i consultoria - 1:50</w:t>
+        <w:t xml:space="preserve">Diapositiva 2. Primera etapa: enginyeria del software i consultoria - 1:30</w:t>
       </w:r>
     </w:p>
     <w:p>
@@ -310,7 +310,7 @@
         <w:pStyle w:val="Textoindependiente"/>
       </w:pPr>
       <w:r>
-        <w:t xml:space="preserve">A Vida Software vaig treballar en un component del sistema operatiu Symbian orientat a incorporar interacció per veu en aplicacions mòbils. Era una peça de plataforma desenvolupada a baix nivell en C++, amb restriccions fortes de memòria, CPU i xarxa. La feina tenia un caràcter molt proper a l’R+D de laboratori: treballàvem sobre la pila de comunicacions IP, amb senyalització SIP, transport de veu mitjançant RTP sobre UDP i còdecs com l’AMR. El component es va presentar en entorns com el 3GSM / Mobile World Congress i estava vinculat al context d’innovació d’una patent de Vida Software sobre interfícies d’usuari.</w:t>
+        <w:t xml:space="preserve">A Vida Software vaig treballar en un component del sistema operatiu Symbian orientat a incorporar interacció per veu en aplicacions mòbils. Era una peça de plataforma desenvolupada a baix nivell en C++, amb restriccions fortes de memòria, CPU i xarxa. El component es va presentar en entorns com el 3GSM/Mobile World Congress i estava vinculat al context d’innovació d’una patent de Vida Software sobre interfícies d’usuari.</w:t>
       </w:r>
     </w:p>
     <w:p>
@@ -318,7 +318,7 @@
         <w:pStyle w:val="Textoindependiente"/>
       </w:pPr>
       <w:r>
-        <w:t xml:space="preserve">Va ser una etapa tècnicament molt exigent i estimulant, que em va donar una base sòlida en sistemes i comunicacions. Al mateix temps, em va ajudar a identificar una altra dimensió que volia desenvolupar: el treball amb les persones, la comunicació i la construcció compartida de coneixement. Per tant, el pas a la consultoria no va representar una renúncia a la profunditat tècnica, sinó la voluntat d’ampliar-la amb una dimensió més relacional i col·laborativa, que amb el temps ha esdevingut un fil conductor de la meva trajectòria.</w:t>
+        <w:t xml:space="preserve">Va ser una etapa tècnicament molt exigent i estimulant, que em va donar una base sòlida en sistemes i comunicacions. Al mateix temps, em va ajudar a identificar una altra dimensió que volia desenvolupar: el treball amb les persones, la comunicació i la construcció compartida de coneixement.</w:t>
       </w:r>
     </w:p>
     <w:p>
@@ -326,7 +326,7 @@
         <w:pStyle w:val="Textoindependiente"/>
       </w:pPr>
       <w:r>
-        <w:t xml:space="preserve">El pas a openTrends va ampliar aquesta base cap a Java, Linux, Spring, sistemes d’informació, clients i equips. Allà la comunicació tècnica va guanyar pes: entendre necessitats, explicar decisions i fer mentoria a enginyers júniors.</w:t>
+        <w:t xml:space="preserve">Per això vaig fer el pas a la consultoria, a openTrends, on vaig ampliar aquesta base cap a Java, Linux, Spring, sistemes d’informació, clients i equips. Allà la comunicació tècnica va guanyar pes: entendre necessitats, explicar decisions i fer mentoria a enginyers júniors.</w:t>
       </w:r>
     </w:p>
     <w:p>
@@ -334,15 +334,7 @@
         <w:pStyle w:val="Textoindependiente"/>
       </w:pPr>
       <w:r>
-        <w:t xml:space="preserve">Mirat amb perspectiva, la combinació de solvència tècnica, comunicació i acompanyament va acabar definint el meu perfil professional.</w:t>
-      </w:r>
-    </w:p>
-    <w:p>
-      <w:pPr>
-        <w:pStyle w:val="Textoindependiente"/>
-      </w:pPr>
-      <w:r>
-        <w:t xml:space="preserve">Per això la transició cap a la docència no va ser una ruptura, sinó una evolució natural de la mateixa trajectòria professional.</w:t>
+        <w:t xml:space="preserve">La transició cap a la docència va ser, doncs, una evolució natural d’aquesta mateixa trajectòria professional.</w:t>
       </w:r>
     </w:p>
     <w:bookmarkEnd w:id="10"/>
@@ -418,7 +410,7 @@
         <w:pStyle w:val="Textoindependiente"/>
       </w:pPr>
       <w:r>
-        <w:t xml:space="preserve">Allà vaig impartir assignatures vinculades a l’enginyeria del software, sistemes operatius i desenvolupament d’aplicacions. També vaig participar en una experiència ABP a Projectes de Programació II, vinculada a Sallefy. És una etapa que valoro molt: em va obrir la docència universitària i em va permetre portar a l’aula coneixement tècnic avançat.</w:t>
+        <w:t xml:space="preserve">Allà vaig impartir assignatures de programació, sistemes operatius i vaig dissenyar una experiència ABP a Projectes de Programació II. És una etapa que valoro molt: em va obrir la docència universitària i em va permetre portar a l’aula coneixement tècnic avançat.</w:t>
       </w:r>
     </w:p>
     <w:p>
@@ -458,7 +450,7 @@
         <w:pStyle w:val="Textoindependiente"/>
       </w:pPr>
       <w:r>
-        <w:t xml:space="preserve">Vaig establir contacte acadèmic amb el TecnoCampus i vaig començar-hi com a professor associat. I des del primer moment vaig percebre que hi podien confluir camins que fins aleshores havien avançat separats: docència universitària, enginyeria del software, sistemes d’informació i sostenibilitat personal.</w:t>
+        <w:t xml:space="preserve">Vaig establir contacte acadèmic amb el TecnoCampus i vaig començar-hi com a professor associat.</w:t>
       </w:r>
     </w:p>
     <w:p>
@@ -470,13 +462,13 @@
       </w:r>
     </w:p>
     <w:bookmarkEnd w:id="12"/>
-    <w:bookmarkStart w:id="13" w:name="X4c4c60172da25e687857902e325fc7dffe96a3f"/>
+    <w:bookmarkStart w:id="13" w:name="X5d41084c58d6ec1395fdad0ba13ce409d532c19"/>
     <w:p>
       <w:pPr>
         <w:pStyle w:val="Ttulo3"/>
       </w:pPr>
       <w:r>
-        <w:t xml:space="preserve">Diapositiva 5. TecnoCampus: docència, equip i arquitectura de software - 2:05</w:t>
+        <w:t xml:space="preserve">Diapositiva 5. TecnoCampus: docència, equip i arquitectura de software - 1:20</w:t>
       </w:r>
     </w:p>
     <w:p>
@@ -524,17 +516,17 @@
         <w:pStyle w:val="Textoindependiente"/>
       </w:pPr>
       <w:r>
-        <w:t xml:space="preserve">I això connecta directament amb la segona part de la defensa: la classe magistral sobre ports de sortida en arquitectura hexagonal no és una peça aïllada, sinó una mostra d’aquest punt de trobada entre docència universitària, enginyeria del software i transferència universitat-empresa.</w:t>
+        <w:t xml:space="preserve">D’aquest punt de trobada neix precisament la classe magistral de la segona part.</w:t>
       </w:r>
     </w:p>
     <w:bookmarkEnd w:id="13"/>
-    <w:bookmarkStart w:id="14" w:name="X6f526021fd185638af6f7d611c2a3a910a439de"/>
+    <w:bookmarkStart w:id="14" w:name="Xe694bcf830e70299140e7858bd4177d134c259a"/>
     <w:p>
       <w:pPr>
         <w:pStyle w:val="Ttulo3"/>
       </w:pPr>
       <w:r>
-        <w:t xml:space="preserve">Diapositiva 6. Consultoria i formació internacional, recerca doctoral i projecte de futur - 2:20</w:t>
+        <w:t xml:space="preserve">Diapositiva 6. Consultoria i formació internacional, recerca doctoral i projecte de futur - 2:00</w:t>
       </w:r>
     </w:p>
     <w:p>
@@ -566,7 +558,7 @@
         <w:pStyle w:val="Textoindependiente"/>
       </w:pPr>
       <w:r>
-        <w:t xml:space="preserve">El doctorat a la UDIMA representa l’articulació científica d’aquest recorregut. La recerca s’inscriu en l’àmbit de l’Educació en Enginyeria del Software i no parteix d’una intuïció aïllada. La literatura internacional recent identifica mancances en la integració curricular, la mesura i els estudis longitudinals d’aquestes competències dins la formació dels futurs enginyers i enginyeres del software.</w:t>
+        <w:t xml:space="preserve">El doctorat a la UDIMA representa l’articulació científica d’aquest recorregut. La recerca s’inscriu en l’àmbit de l’Educació en Enginyeria del Software. La literatura internacional recent hi identifica un buit: la integració curricular, la mesura i els estudis longitudinals d’aquestes competències.</w:t>
       </w:r>
     </w:p>
     <w:p>
@@ -756,13 +748,13 @@
       </w:r>
     </w:p>
     <w:bookmarkEnd w:id="18"/>
-    <w:bookmarkStart w:id="19" w:name="indústria-i-consultoria---110"/>
+    <w:bookmarkStart w:id="19" w:name="indústria-i-consultoria---130"/>
     <w:p>
       <w:pPr>
         <w:pStyle w:val="Ttulo3"/>
       </w:pPr>
       <w:r>
-        <w:t xml:space="preserve">2. Indústria i consultoria - 1:10</w:t>
+        <w:t xml:space="preserve">2. Indústria i consultoria - 1:30</w:t>
       </w:r>
     </w:p>
     <w:p>
@@ -810,7 +802,7 @@
         </w:numPr>
       </w:pPr>
       <w:r>
-        <w:t xml:space="preserve">3GSM / Mobile World Congress i patent com a context d’innovació; no presentar la patent com a pròpia.</w:t>
+        <w:t xml:space="preserve">3GSM/Mobile World Congress i patent com a context d’innovació; no presentar la patent com a pròpia.</w:t>
       </w:r>
     </w:p>
     <w:p>
@@ -1074,13 +1066,13 @@
       </w:r>
     </w:p>
     <w:bookmarkEnd w:id="21"/>
-    <w:bookmarkStart w:id="22" w:name="tecnocampus---205"/>
+    <w:bookmarkStart w:id="22" w:name="tecnocampus---120"/>
     <w:p>
       <w:pPr>
         <w:pStyle w:val="Ttulo3"/>
       </w:pPr>
       <w:r>
-        <w:t xml:space="preserve">5. TecnoCampus - 2:05</w:t>
+        <w:t xml:space="preserve">5. TecnoCampus - 1:20</w:t>
       </w:r>
     </w:p>
     <w:p>
@@ -1192,13 +1184,13 @@
       </w:r>
     </w:p>
     <w:bookmarkEnd w:id="22"/>
-    <w:bookmarkStart w:id="23" w:name="neueda-doctorat-i-futur---220"/>
+    <w:bookmarkStart w:id="23" w:name="neueda-doctorat-i-futur---200"/>
     <w:p>
       <w:pPr>
         <w:pStyle w:val="Ttulo3"/>
       </w:pPr>
       <w:r>
-        <w:t xml:space="preserve">6. Neueda, doctorat i futur - 2:20</w:t>
+        <w:t xml:space="preserve">6. Neueda, doctorat i futur - 2:00</w:t>
       </w:r>
     </w:p>
     <w:p>
@@ -1897,7 +1889,7 @@
         <w:pStyle w:val="FirstParagraph"/>
       </w:pPr>
       <w:r>
-        <w:t xml:space="preserve">La presentació està pensada per a 9:00-9:20 amb un ritme pausat i marge real. Les diapositives 5 i 6 són les més importants i poden ocupar una mica més de temps. Si cal retallar durant l’assaig, retalla detall tècnic de la diapositiva 2 o una evidència de transferència de la diapositiva 6; no retallis les xifres docents del TecnoCampus.</w:t>
+        <w:t xml:space="preserve">La presentació està pensada per a 9:00-9:20 amb un ritme pausat i marge real. Les diapositives 5 i 6 són les més importants i poden ocupar una mica més de temps. Si cal retallar durant l’assaig, aplica la versió curta d’emergència; no retallis les xifres docents del TecnoCampus.</w:t>
       </w:r>
     </w:p>
     <w:bookmarkEnd w:id="27"/>

</xml_diff>

<commit_message>
Clarifica la transició de l'FP a la universitat al guió de trajectòria
La diapositiva 3 formula ara la voluntat de portar continguts avançats a
l'aula amb subjecte explícit i sense circularitat amb la mirada cap a la
universitat. S'incorporen retocs de les diapositives 3 i 4 i es corregeixen
dues errates. Inclou els materials derivats regenerats amb el script mestre.
</commit_message>
<xml_diff>
--- a/doc/presentations/defensa-placa-permanent-dsi-ports-sortida-hexagonal/output/REMARKABLE_materials-orals-canonics-10-minuts-trajectoria.docx
+++ b/doc/presentations/defensa-placa-permanent-dsi-ports-sortida-hexagonal/output/REMARKABLE_materials-orals-canonics-10-minuts-trajectoria.docx
@@ -368,7 +368,7 @@
         <w:pStyle w:val="Textoindependiente"/>
       </w:pPr>
       <w:r>
-        <w:t xml:space="preserve">Va ser una etapa molt valuosa. Em va ajudar a aprendre a ensenyar, a escoltar millor i a entendre que la docència no és només transmetre contingut tècnic. També és crear condicions perquè l’estudiant pugui avançar, equivocar-se, recuperar confiança i construir criteri.</w:t>
+        <w:t xml:space="preserve">Va ser una etapa molt valuosa. Em va ajudar a aprendre a ensenyar, a escoltar millor i a entendre que la docència no és només transmetre contingut tècnic. També és crear condicions perquè l’estudiant pugui avançar, equivocar-se, recuperar confiança i aprendre a treballar en equip.</w:t>
       </w:r>
     </w:p>
     <w:p>
@@ -376,15 +376,7 @@
         <w:pStyle w:val="Textoindependiente"/>
       </w:pPr>
       <w:r>
-        <w:t xml:space="preserve">Amb el temps, aquesta etapa va evolucionar cap a continguts universitaris més avançats: enginyeria del software, arquitectura de software, disseny de sistemes d’informació i experiència professional aplicada.</w:t>
-      </w:r>
-    </w:p>
-    <w:p>
-      <w:pPr>
-        <w:pStyle w:val="Textoindependiente"/>
-      </w:pPr>
-      <w:r>
-        <w:t xml:space="preserve">Això va orientar la mirada cap a la universitat per poder situar aquesta experiència tècnica i docent en assignatures d’enginyeria amb més profunditat conceptual.</w:t>
+        <w:t xml:space="preserve">Amb el temps, volia portar a l’aula continguts més avançats: enginyeria del software, arquitectura de software i disseny de sistemes d’informació, recolzats en la meva experiència professional. El lloc natural d’aquests continguts és la universitat, i cap allà vaig orientar la mirada.</w:t>
       </w:r>
     </w:p>
     <w:bookmarkEnd w:id="11"/>
@@ -426,7 +418,7 @@
         <w:pStyle w:val="Textoindependiente"/>
       </w:pPr>
       <w:r>
-        <w:t xml:space="preserve">La Salle té una tradició d’enginyeria sòlida, amb una identitat històrica molt forta en telecomunicacions, xarxes i electrònica. La meva docència allà se centrava en els fonaments: el disseny i la programació orientats a objectes, i el desenvolupament d’aplicacions mòbils. Són la llavor de l’enginyeria del software, i em va agradar molt ensenyar-los. Però el meu territori professional és el tram següent d’aquest mateix camí: l’arquitectura de software, el backend empresarial i els sistemes d’informació. [mirada al tribunal]</w:t>
+        <w:t xml:space="preserve">La Salle té una tradició d’enginyeria sòlida, amb una identitat històrica molt forta en telecomunicacions i electrònica. La meva docència allà se centrava en els fonaments: el disseny i la programació orientats a objectes, i el desenvolupament d’aplicacions mòbils. Són la llavor de l’enginyeria del software, i em va agradar molt ensenyar-los. Però el meu territori professional és el tram següent d’aquest mateix camí: l’arquitectura de software, el backend empresarial i els sistemes d’informació. [mirada al tribunal]</w:t>
       </w:r>
     </w:p>
     <w:p>
@@ -434,7 +426,7 @@
         <w:pStyle w:val="Textoindependiente"/>
       </w:pPr>
       <w:r>
-        <w:t xml:space="preserve">I aquest tram tenia un encaix curricular directe al TecnoCampus: la gestió i els sistemes d’informació formen part de la mateixa denominació del grau, amb una línia completa d’enginyeria del software i de disseny de sistemes d’informació. Era un entorn especialment alineat amb el desenvolupament de la meva especialització docent.</w:t>
+        <w:t xml:space="preserve">I aquest tram tenia un encaix curricular directe al TecnoCampus: la gestió i els sistemes d’informació formen part de la mateixa denominació del grau, amb una línia completa d’enginyeria del software i de disseny de sistemes d’informació. És un entorn especialment alineat amb el desenvolupament de la meva especialització docent.</w:t>
       </w:r>
     </w:p>
     <w:p>

</xml_diff>

<commit_message>
Incorpora els ajustos posteriors a l'assaig al guió de trajectòria
S'apliquen els retocs manuals de l'assaig (obertura, La Salle i equip),
es retira la frase de tancament de la diapositiva 4 amb les seves
referències a notes i veu, es restaura l'encapçalament de la diapositiva 5
i s'unifiquen les majúscules d'Educació en Enginyeria del Software.
Inclou els materials derivats regenerats.
</commit_message>
<xml_diff>
--- a/doc/presentations/defensa-placa-permanent-dsi-ports-sortida-hexagonal/output/REMARKABLE_materials-orals-canonics-10-minuts-trajectoria.docx
+++ b/doc/presentations/defensa-placa-permanent-dsi-ports-sortida-hexagonal/output/REMARKABLE_materials-orals-canonics-10-minuts-trajectoria.docx
@@ -276,7 +276,7 @@
         <w:pStyle w:val="Textoindependiente"/>
       </w:pPr>
       <w:r>
-        <w:t xml:space="preserve">La meva trajectòria comença el 2004 i té un fil conductor: l’enginyeria del software. Primer, com a enginyer a la indústria. Després, com a professor universitari. I avui, també com a investigador: estudio com s’ensenya l’enginyeria del software. [pausa breu]</w:t>
+        <w:t xml:space="preserve">La meva trajectòria comença el 2004 i té un fil conductor: l’enginyeria del software. Primer, com a enginyer a la indústria. Després, com a professor. I avui, també com a investigador: faig recerca en Educació en Enginyeria del Software. [pausa breu]</w:t>
       </w:r>
     </w:p>
     <w:p>
@@ -445,14 +445,6 @@
         <w:t xml:space="preserve">Vaig establir contacte acadèmic amb el TecnoCampus i vaig començar-hi com a professor associat.</w:t>
       </w:r>
     </w:p>
-    <w:p>
-      <w:pPr>
-        <w:pStyle w:val="Textoindependiente"/>
-      </w:pPr>
-      <w:r>
-        <w:t xml:space="preserve">El desig de consolidar una plaça al TecnoCampus, per tant, no neix ara. Ve de lluny.</w:t>
-      </w:r>
-    </w:p>
     <w:bookmarkEnd w:id="12"/>
     <w:bookmarkStart w:id="13" w:name="X5d41084c58d6ec1395fdad0ba13ce409d532c19"/>
     <w:p>
@@ -492,7 +484,7 @@
         <w:pStyle w:val="Textoindependiente"/>
       </w:pPr>
       <w:r>
-        <w:t xml:space="preserve">També ha estat molt important el treball amb l’equip. Voldria destacar especialment el Dr. Josep Roure, amb qui he compartit docència i aprenentatge en arquitectura de software, Domain-Driven Design, Clean Architecture i arquitectura hexagonal.</w:t>
+        <w:t xml:space="preserve">També ha estat molt important el treball amb l’equip. Voldria destacar especialment el Dr. Josep Roure, amb qui he compartit docència i aprenentatge en arquitectura de software.</w:t>
       </w:r>
     </w:p>
     <w:p>
@@ -1043,18 +1035,6 @@
       </w:pPr>
       <w:r>
         <w:t xml:space="preserve">TecnoCampus: docència universitària, software, sistemes d’informació, transferència i projecte sostenible.</w:t>
-      </w:r>
-    </w:p>
-    <w:p>
-      <w:pPr>
-        <w:pStyle w:val="Compact"/>
-        <w:numPr>
-          <w:ilvl w:val="0"/>
-          <w:numId w:val="1006"/>
-        </w:numPr>
-      </w:pPr>
-      <w:r>
-        <w:t xml:space="preserve">Frase clau: el desig de consolidar-se ve de lluny.</w:t>
       </w:r>
     </w:p>
     <w:bookmarkEnd w:id="21"/>
@@ -1908,18 +1888,6 @@
         <w:rPr>
           <w:rStyle w:val="VerbatimChar"/>
         </w:rPr>
-        <w:t xml:space="preserve">el desig de consolidar-me ve de lluny</w:t>
-      </w:r>
-      <w:r>
-        <w:t xml:space="preserve">,</w:t>
-      </w:r>
-      <w:r>
-        <w:t xml:space="preserve"> </w:t>
-      </w:r>
-      <w:r>
-        <w:rPr>
-          <w:rStyle w:val="VerbatimChar"/>
-        </w:rPr>
         <w:t xml:space="preserve">projecte acadèmic vinculat al TecnoCampus</w:t>
       </w:r>
       <w:r>

</xml_diff>

<commit_message>
Regenera materials derivats amb la redacció actualitzada de la introducció i la tesi
</commit_message>
<xml_diff>
--- a/doc/presentations/defensa-placa-permanent-dsi-ports-sortida-hexagonal/output/REMARKABLE_materials-orals-canonics-10-minuts-trajectoria.docx
+++ b/doc/presentations/defensa-placa-permanent-dsi-ports-sortida-hexagonal/output/REMARKABLE_materials-orals-canonics-10-minuts-trajectoria.docx
@@ -268,7 +268,7 @@
         <w:pStyle w:val="FirstParagraph"/>
       </w:pPr>
       <w:r>
-        <w:t xml:space="preserve">Bon dia, membres del tribunal. Moltes gràcies per l’oportunitat de presentar aquesta trajectòria. [mirada al tribunal]</w:t>
+        <w:t xml:space="preserve">Bon dia, membres del tribunal. Moltes gràcies per l’oportunitat de oferir aquesta presentació. [mirada al tribunal]</w:t>
       </w:r>
     </w:p>
     <w:p>
@@ -542,7 +542,7 @@
         <w:pStyle w:val="Textoindependiente"/>
       </w:pPr>
       <w:r>
-        <w:t xml:space="preserve">El doctorat a la UDIMA representa l’articulació científica d’aquest recorregut. La recerca s’inscriu en l’àmbit de l’Educació en Enginyeria del Software. La literatura internacional recent hi identifica un buit: la integració curricular, la mesura i els estudis longitudinals d’aquestes competències.</w:t>
+        <w:t xml:space="preserve">El doctorat a la UDIMA representa l’articulació científica d’aquest recorregut. La recerca s’inscriu en l’àmbit de l’Educació en Enginyeria del Software. La literatura internacional recent hi identifica un buit: la integració curricular, la mesura i els estudis longitudinals de les competències socioemocionals.</w:t>
       </w:r>
     </w:p>
     <w:p>
@@ -550,7 +550,7 @@
         <w:pStyle w:val="Textoindependiente"/>
       </w:pPr>
       <w:r>
-        <w:t xml:space="preserve">La tesi se situa en aquest espai mitjançant un disseny mixt i quasiexperimental, integrat en dues assignatures reals amb ABP, amb pretest, posttest, seguiment diferit i component qualitatiu. No pretén substituir la formació tècnica; pretén estudiar com complementar-la amb competències vinculades a requisits, usuaris, parts interessades, col·laboració i disseny responsable.</w:t>
+        <w:t xml:space="preserve">La tesi se situa en aquest espai mitjançant un disseny mixt i quasiexperimental, integrat en dues assignatures reals amb ABP, amb pretest, posttest, seguiment diferit i component qualitatiu. No pretén substituir la formació tècnica; pretén estudiar com complementar-la amb competències vinculades a requisits, usuaris, comunicació, col·laboració i disseny responsable.</w:t>
       </w:r>
     </w:p>
     <w:p>

</xml_diff>

<commit_message>
Insereix la diapositiva d'introducció al deck de trajectòria i renumera el guió
La portada queda només com a benvinguda (0:15) i la nova diapositiva 2
mostra el fil conductor des del 2004 i el recorregut de la presentació
(0:35). Renumera diapositives i referències del guió oral d'1-6 a 1-7
i regenera tots els materials derivats.
</commit_message>
<xml_diff>
--- a/doc/presentations/defensa-placa-permanent-dsi-ports-sortida-hexagonal/output/REMARKABLE_materials-orals-canonics-10-minuts-trajectoria.docx
+++ b/doc/presentations/defensa-placa-permanent-dsi-ports-sortida-hexagonal/output/REMARKABLE_materials-orals-canonics-10-minuts-trajectoria.docx
@@ -2,7 +2,7 @@
 <file path=word/document.xml><?xml version="1.0" encoding="utf-8"?>
 <w:document xmlns:w="http://schemas.openxmlformats.org/wordprocessingml/2006/main" xmlns:m="http://schemas.openxmlformats.org/officeDocument/2006/math" xmlns:r="http://schemas.openxmlformats.org/officeDocument/2006/relationships" xmlns:o="urn:schemas-microsoft-com:office:office" xmlns:v="urn:schemas-microsoft-com:vml" xmlns:w10="urn:schemas-microsoft-com:office:word" xmlns:a="http://schemas.openxmlformats.org/drawingml/2006/main" xmlns:pic="http://schemas.openxmlformats.org/drawingml/2006/picture" xmlns:wp="http://schemas.openxmlformats.org/drawingml/2006/wordprocessingDrawing">
   <w:body>
-    <w:bookmarkStart w:id="33" w:name="X0e91efcdfc21fc1542c629021a59166df219849"/>
+    <w:bookmarkStart w:id="35" w:name="X0e91efcdfc21fc1542c629021a59166df219849"/>
     <w:p>
       <w:pPr>
         <w:pStyle w:val="Ttulo1"/>
@@ -215,7 +215,7 @@
         <w:pStyle w:val="FirstParagraph"/>
       </w:pPr>
       <w:r>
-        <w:t xml:space="preserve">Nota de versió: aquests materials són independents de la classe magistral de 20 minuts. La seva funció és donar suport a la primera part de la defensa de la plaça: trajectòria professional, acadèmica i científica. La presentació està limitada a 6 diapositives i a una durada aproximada de 10 minuts. Després del tancament hi ha una diapositiva d’annex,</w:t>
+        <w:t xml:space="preserve">Nota de versió: aquests materials són independents de la classe magistral de 20 minuts. La seva funció és donar suport a la primera part de la defensa de la plaça: trajectòria professional, acadèmica i científica. La presentació està limitada a 7 diapositives (portada, introducció i cinc diapositives de contingut) i a una durada aproximada de 10 minuts. Després del tancament hi ha una diapositiva d’annex,</w:t>
       </w:r>
       <w:r>
         <w:t xml:space="preserve"> </w:t>
@@ -227,7 +227,7 @@
         <w:t xml:space="preserve">Annex A. Contrast d'orientació curricular</w:t>
       </w:r>
       <w:r>
-        <w:t xml:space="preserve">, que no forma part de la numeració 1-6 ni del temps principal: és material de reserva exclusiu per al torn de preguntes.</w:t>
+        <w:t xml:space="preserve">, que no forma part de la numeració 1-7 ni del temps principal: és material de reserva exclusiu per al torn de preguntes.</w:t>
       </w:r>
     </w:p>
     <w:p>
@@ -237,7 +237,7 @@
         </w:pict>
       </w:r>
     </w:p>
-    <w:bookmarkStart w:id="15" w:name="guió-oral-complet-imprimible"/>
+    <w:bookmarkStart w:id="16" w:name="guió-oral-complet-imprimible"/>
     <w:p>
       <w:pPr>
         <w:pStyle w:val="Ttulo2"/>
@@ -251,16 +251,16 @@
         <w:pStyle w:val="FirstParagraph"/>
       </w:pPr>
       <w:r>
-        <w:t xml:space="preserve">Temps total previst d’assaig: 9:00-9:20 aproximadament, amb pauses reals. Si l’assaig supera els 10:00, aplica la versió curta d’emergència de la diapositiva 4.</w:t>
-      </w:r>
-    </w:p>
-    <w:bookmarkStart w:id="9" w:name="X955f66c7fc938677aca3c0234d4f82c1654e8a5"/>
+        <w:t xml:space="preserve">Temps total previst d’assaig: 9:00-9:20 aproximadament, amb pauses reals. Si l’assaig supera els 10:00, aplica la versió curta d’emergència de la diapositiva 5.</w:t>
+      </w:r>
+    </w:p>
+    <w:bookmarkStart w:id="9" w:name="X9d7e647a5b35f0dbbe37334756438bdb2191356"/>
     <w:p>
       <w:pPr>
         <w:pStyle w:val="Ttulo3"/>
       </w:pPr>
       <w:r>
-        <w:t xml:space="preserve">Diapositiva 1. Trajectòria professional, acadèmica i científica - 0:50</w:t>
+        <w:t xml:space="preserve">Diapositiva 1. Portada. Trajectòria professional, acadèmica i científica - 0:15</w:t>
       </w:r>
     </w:p>
     <w:p>
@@ -268,7 +268,7 @@
         <w:pStyle w:val="FirstParagraph"/>
       </w:pPr>
       <w:r>
-        <w:t xml:space="preserve">Bon dia, membres del tribunal. Moltes gràcies per l’oportunitat de oferir aquesta presentació. [mirada al tribunal]</w:t>
+        <w:t xml:space="preserve">Bon dia, membres del tribunal. Moltes gràcies per l’oportunitat d’oferir aquesta presentació. [mirada al tribunal]</w:t>
       </w:r>
     </w:p>
     <w:p>
@@ -276,6 +276,24 @@
         <w:pStyle w:val="Textoindependiente"/>
       </w:pPr>
       <w:r>
+        <w:t xml:space="preserve">[avançar a la diapositiva 2]</w:t>
+      </w:r>
+    </w:p>
+    <w:bookmarkEnd w:id="9"/>
+    <w:bookmarkStart w:id="10" w:name="Xe99d554c4e8014a70d3a397e93d0e617ac93c0f"/>
+    <w:p>
+      <w:pPr>
+        <w:pStyle w:val="Ttulo3"/>
+      </w:pPr>
+      <w:r>
+        <w:t xml:space="preserve">Diapositiva 2. Un fil conductor: l’enginyeria del software - 0:35</w:t>
+      </w:r>
+    </w:p>
+    <w:p>
+      <w:pPr>
+        <w:pStyle w:val="FirstParagraph"/>
+      </w:pPr>
+      <w:r>
         <w:t xml:space="preserve">La meva trajectòria comença el 2004 i té un fil conductor: l’enginyeria del software. Primer, com a enginyer a la indústria. Després, com a professor. I avui, també com a investigador: faig recerca en Educació en Enginyeria del Software. [pausa breu]</w:t>
       </w:r>
     </w:p>
@@ -287,14 +305,14 @@
         <w:t xml:space="preserve">Aquest és el recorregut que presentaré: base professional, vocació docent, pas a la universitat, consolidació al TecnoCampus i projecte de futur.</w:t>
       </w:r>
     </w:p>
-    <w:bookmarkEnd w:id="9"/>
-    <w:bookmarkStart w:id="10" w:name="Xd14c9db4fc52b05d6bd387f4cf590104a51d41a"/>
+    <w:bookmarkEnd w:id="10"/>
+    <w:bookmarkStart w:id="11" w:name="Xbeba0af6875241f0ba8a717f4d7545ab7dd1ea1"/>
     <w:p>
       <w:pPr>
         <w:pStyle w:val="Ttulo3"/>
       </w:pPr>
       <w:r>
-        <w:t xml:space="preserve">Diapositiva 2. Primera etapa: enginyeria del software i consultoria - 1:30</w:t>
+        <w:t xml:space="preserve">Diapositiva 3. Primera etapa: enginyeria del software i consultoria - 1:30</w:t>
       </w:r>
     </w:p>
     <w:p>
@@ -337,14 +355,14 @@
         <w:t xml:space="preserve">La transició cap a la docència va ser, doncs, una evolució natural d’aquesta mateixa trajectòria professional.</w:t>
       </w:r>
     </w:p>
-    <w:bookmarkEnd w:id="10"/>
-    <w:bookmarkStart w:id="11" w:name="X8f1b53b5610d6a0c742d40bf35583d23a786a28"/>
+    <w:bookmarkEnd w:id="11"/>
+    <w:bookmarkStart w:id="12" w:name="X072fbed73d3c58631c1cd7a7ff84bcd514ca7a3"/>
     <w:p>
       <w:pPr>
         <w:pStyle w:val="Ttulo3"/>
       </w:pPr>
       <w:r>
-        <w:t xml:space="preserve">Diapositiva 3. Formació Professional: el descobriment clar de la vocació docent - 1:10</w:t>
+        <w:t xml:space="preserve">Diapositiva 4. Formació Professional: el descobriment clar de la vocació docent - 1:10</w:t>
       </w:r>
     </w:p>
     <w:p>
@@ -379,14 +397,14 @@
         <w:t xml:space="preserve">Amb el temps, volia portar a l’aula continguts més avançats: enginyeria del software, arquitectura de software i disseny de sistemes d’informació, recolzats en la meva experiència professional. El lloc natural d’aquests continguts és la universitat, i cap allà vaig orientar la mirada.</w:t>
       </w:r>
     </w:p>
-    <w:bookmarkEnd w:id="11"/>
-    <w:bookmarkStart w:id="12" w:name="X81009d6c26c5fdd77402dc2b49454f763e8952d"/>
+    <w:bookmarkEnd w:id="12"/>
+    <w:bookmarkStart w:id="13" w:name="X9852dbbc3aab6327bd63766b6c9df38c577075b"/>
     <w:p>
       <w:pPr>
         <w:pStyle w:val="Ttulo3"/>
       </w:pPr>
       <w:r>
-        <w:t xml:space="preserve">Diapositiva 4. De La Salle al TecnoCampus - 1:55</w:t>
+        <w:t xml:space="preserve">Diapositiva 5. De La Salle al TecnoCampus - 1:55</w:t>
       </w:r>
     </w:p>
     <w:p>
@@ -445,14 +463,14 @@
         <w:t xml:space="preserve">Vaig establir contacte acadèmic amb el TecnoCampus i vaig començar-hi com a professor associat.</w:t>
       </w:r>
     </w:p>
-    <w:bookmarkEnd w:id="12"/>
-    <w:bookmarkStart w:id="13" w:name="X5d41084c58d6ec1395fdad0ba13ce409d532c19"/>
+    <w:bookmarkEnd w:id="13"/>
+    <w:bookmarkStart w:id="14" w:name="X343e33e00c573bb3b1b586f64536dab76d15277"/>
     <w:p>
       <w:pPr>
         <w:pStyle w:val="Ttulo3"/>
       </w:pPr>
       <w:r>
-        <w:t xml:space="preserve">Diapositiva 5. TecnoCampus: docència, equip i arquitectura de software - 1:20</w:t>
+        <w:t xml:space="preserve">Diapositiva 6. TecnoCampus: docència, equip i arquitectura de software - 1:20</w:t>
       </w:r>
     </w:p>
     <w:p>
@@ -503,14 +521,14 @@
         <w:t xml:space="preserve">D’aquest punt de trobada neix precisament la classe magistral de la segona part.</w:t>
       </w:r>
     </w:p>
-    <w:bookmarkEnd w:id="13"/>
-    <w:bookmarkStart w:id="14" w:name="Xe694bcf830e70299140e7858bd4177d134c259a"/>
+    <w:bookmarkEnd w:id="14"/>
+    <w:bookmarkStart w:id="15" w:name="Xadd82b85712f303f802b55ba175714cc167edc7"/>
     <w:p>
       <w:pPr>
         <w:pStyle w:val="Ttulo3"/>
       </w:pPr>
       <w:r>
-        <w:t xml:space="preserve">Diapositiva 6. Consultoria i formació internacional, recerca doctoral i projecte de futur - 2:00</w:t>
+        <w:t xml:space="preserve">Diapositiva 7. Consultoria i formació internacional, recerca doctoral i projecte de futur - 2:00</w:t>
       </w:r>
     </w:p>
     <w:p>
@@ -584,9 +602,9 @@
         </w:pict>
       </w:r>
     </w:p>
-    <w:bookmarkEnd w:id="14"/>
     <w:bookmarkEnd w:id="15"/>
-    <w:bookmarkStart w:id="17" w:name="Xdd17a7567f75bc85227116ec496a3da3b46265c"/>
+    <w:bookmarkEnd w:id="16"/>
+    <w:bookmarkStart w:id="18" w:name="Xdd17a7567f75bc85227116ec496a3da3b46265c"/>
     <w:p>
       <w:pPr>
         <w:pStyle w:val="Ttulo2"/>
@@ -600,10 +618,10 @@
         <w:pStyle w:val="FirstParagraph"/>
       </w:pPr>
       <w:r>
-        <w:t xml:space="preserve">Aquest annex no forma part del cos principal de deu minuts ni de la numeració 1-6. Només s’ha de mostrar si el tribunal pregunta pel pas de La Salle al TecnoCampus, qüestiona l’encaix acadèmic o demana concretar la diferència d’orientació entre les titulacions. No s’ha de mostrar sense una pregunta o una necessitat clara, ni utilitzar-lo com a defensa preventiva.</w:t>
-      </w:r>
-    </w:p>
-    <w:bookmarkStart w:id="16" w:name="resposta-oral-de-reserva---30-45-segons"/>
+        <w:t xml:space="preserve">Aquest annex no forma part del cos principal de deu minuts ni de la numeració 1-7. Només s’ha de mostrar si el tribunal pregunta pel pas de La Salle al TecnoCampus, qüestiona l’encaix acadèmic o demana concretar la diferència d’orientació entre les titulacions. No s’ha de mostrar sense una pregunta o una necessitat clara, ni utilitzar-lo com a defensa preventiva.</w:t>
+      </w:r>
+    </w:p>
+    <w:bookmarkStart w:id="17" w:name="resposta-oral-de-reserva---30-45-segons"/>
     <w:p>
       <w:pPr>
         <w:pStyle w:val="Ttulo3"/>
@@ -651,9 +669,9 @@
         </w:pict>
       </w:r>
     </w:p>
-    <w:bookmarkEnd w:id="16"/>
     <w:bookmarkEnd w:id="17"/>
-    <w:bookmarkStart w:id="25" w:name="notes-del-presentador-per-diapositiva"/>
+    <w:bookmarkEnd w:id="18"/>
+    <w:bookmarkStart w:id="27" w:name="notes-del-presentador-per-diapositiva"/>
     <w:p>
       <w:pPr>
         <w:pStyle w:val="Ttulo2"/>
@@ -662,13 +680,13 @@
         <w:t xml:space="preserve">2. Notes del presentador per diapositiva</w:t>
       </w:r>
     </w:p>
-    <w:bookmarkStart w:id="18" w:name="trajectòria---050"/>
+    <w:bookmarkStart w:id="19" w:name="portada---015"/>
     <w:p>
       <w:pPr>
         <w:pStyle w:val="Ttulo3"/>
       </w:pPr>
       <w:r>
-        <w:t xml:space="preserve">1. Trajectòria - 0:50</w:t>
+        <w:t xml:space="preserve">1. Portada - 0:15</w:t>
       </w:r>
     </w:p>
     <w:p>
@@ -680,7 +698,7 @@
         </w:numPr>
       </w:pPr>
       <w:r>
-        <w:t xml:space="preserve">Obrir amb agraïment breu.</w:t>
+        <w:t xml:space="preserve">Obrir amb agraïment breu i salutació al tribunal.</w:t>
       </w:r>
     </w:p>
     <w:p>
@@ -692,6 +710,40 @@
         </w:numPr>
       </w:pPr>
       <w:r>
+        <w:t xml:space="preserve">Només benvinguda: la introducció s’explica amb la diapositiva 2.</w:t>
+      </w:r>
+    </w:p>
+    <w:p>
+      <w:pPr>
+        <w:pStyle w:val="Compact"/>
+        <w:numPr>
+          <w:ilvl w:val="0"/>
+          <w:numId w:val="1003"/>
+        </w:numPr>
+      </w:pPr>
+      <w:r>
+        <w:t xml:space="preserve">Transició: avançar a la diapositiva del fil conductor.</w:t>
+      </w:r>
+    </w:p>
+    <w:bookmarkEnd w:id="19"/>
+    <w:bookmarkStart w:id="20" w:name="fil-conductor-i-recorregut---035"/>
+    <w:p>
+      <w:pPr>
+        <w:pStyle w:val="Ttulo3"/>
+      </w:pPr>
+      <w:r>
+        <w:t xml:space="preserve">2. Fil conductor i recorregut - 0:35</w:t>
+      </w:r>
+    </w:p>
+    <w:p>
+      <w:pPr>
+        <w:pStyle w:val="Compact"/>
+        <w:numPr>
+          <w:ilvl w:val="0"/>
+          <w:numId w:val="1004"/>
+        </w:numPr>
+      </w:pPr>
+      <w:r>
         <w:t xml:space="preserve">No llegir CV: explicar fil conductor.</w:t>
       </w:r>
     </w:p>
@@ -700,7 +752,7 @@
         <w:pStyle w:val="Compact"/>
         <w:numPr>
           <w:ilvl w:val="0"/>
-          <w:numId w:val="1003"/>
+          <w:numId w:val="1004"/>
         </w:numPr>
       </w:pPr>
       <w:r>
@@ -712,7 +764,19 @@
         <w:pStyle w:val="Compact"/>
         <w:numPr>
           <w:ilvl w:val="0"/>
-          <w:numId w:val="1003"/>
+          <w:numId w:val="1004"/>
+        </w:numPr>
+      </w:pPr>
+      <w:r>
+        <w:t xml:space="preserve">Recorregut: base professional, vocació docent, pas a la universitat, consolidació al TecnoCampus i projecte de futur.</w:t>
+      </w:r>
+    </w:p>
+    <w:p>
+      <w:pPr>
+        <w:pStyle w:val="Compact"/>
+        <w:numPr>
+          <w:ilvl w:val="0"/>
+          <w:numId w:val="1004"/>
         </w:numPr>
       </w:pPr>
       <w:r>
@@ -724,29 +788,41 @@
         <w:pStyle w:val="Compact"/>
         <w:numPr>
           <w:ilvl w:val="0"/>
-          <w:numId w:val="1003"/>
+          <w:numId w:val="1004"/>
+        </w:numPr>
+      </w:pPr>
+      <w:r>
+        <w:t xml:space="preserve">És suport visual de la introducció, no un bloc nou: no allargar.</w:t>
+      </w:r>
+    </w:p>
+    <w:p>
+      <w:pPr>
+        <w:pStyle w:val="Compact"/>
+        <w:numPr>
+          <w:ilvl w:val="0"/>
+          <w:numId w:val="1004"/>
         </w:numPr>
       </w:pPr>
       <w:r>
         <w:t xml:space="preserve">Transició: base professional en indústria.</w:t>
       </w:r>
     </w:p>
-    <w:bookmarkEnd w:id="18"/>
-    <w:bookmarkStart w:id="19" w:name="indústria-i-consultoria---130"/>
+    <w:bookmarkEnd w:id="20"/>
+    <w:bookmarkStart w:id="21" w:name="indústria-i-consultoria---130"/>
     <w:p>
       <w:pPr>
         <w:pStyle w:val="Ttulo3"/>
       </w:pPr>
       <w:r>
-        <w:t xml:space="preserve">2. Indústria i consultoria - 1:30</w:t>
-      </w:r>
-    </w:p>
-    <w:p>
-      <w:pPr>
-        <w:pStyle w:val="Compact"/>
-        <w:numPr>
-          <w:ilvl w:val="0"/>
-          <w:numId w:val="1004"/>
+        <w:t xml:space="preserve">3. Indústria i consultoria - 1:30</w:t>
+      </w:r>
+    </w:p>
+    <w:p>
+      <w:pPr>
+        <w:pStyle w:val="Compact"/>
+        <w:numPr>
+          <w:ilvl w:val="0"/>
+          <w:numId w:val="1005"/>
         </w:numPr>
       </w:pPr>
       <w:r>
@@ -758,7 +834,7 @@
         <w:pStyle w:val="Compact"/>
         <w:numPr>
           <w:ilvl w:val="0"/>
-          <w:numId w:val="1004"/>
+          <w:numId w:val="1005"/>
         </w:numPr>
       </w:pPr>
       <w:r>
@@ -770,7 +846,7 @@
         <w:pStyle w:val="Compact"/>
         <w:numPr>
           <w:ilvl w:val="0"/>
-          <w:numId w:val="1004"/>
+          <w:numId w:val="1005"/>
         </w:numPr>
       </w:pPr>
       <w:r>
@@ -782,7 +858,7 @@
         <w:pStyle w:val="Compact"/>
         <w:numPr>
           <w:ilvl w:val="0"/>
-          <w:numId w:val="1004"/>
+          <w:numId w:val="1005"/>
         </w:numPr>
       </w:pPr>
       <w:r>
@@ -794,7 +870,7 @@
         <w:pStyle w:val="Compact"/>
         <w:numPr>
           <w:ilvl w:val="0"/>
-          <w:numId w:val="1004"/>
+          <w:numId w:val="1005"/>
         </w:numPr>
       </w:pPr>
       <w:r>
@@ -806,7 +882,7 @@
         <w:pStyle w:val="Compact"/>
         <w:numPr>
           <w:ilvl w:val="0"/>
-          <w:numId w:val="1004"/>
+          <w:numId w:val="1005"/>
         </w:numPr>
       </w:pPr>
       <w:r>
@@ -818,7 +894,7 @@
         <w:pStyle w:val="Compact"/>
         <w:numPr>
           <w:ilvl w:val="0"/>
-          <w:numId w:val="1004"/>
+          <w:numId w:val="1005"/>
         </w:numPr>
       </w:pPr>
       <w:r>
@@ -830,29 +906,29 @@
         <w:pStyle w:val="Compact"/>
         <w:numPr>
           <w:ilvl w:val="0"/>
-          <w:numId w:val="1004"/>
+          <w:numId w:val="1005"/>
         </w:numPr>
       </w:pPr>
       <w:r>
         <w:t xml:space="preserve">Transició: màster en Formació del Professorat i entrada a la Formació Professional.</w:t>
       </w:r>
     </w:p>
-    <w:bookmarkEnd w:id="19"/>
-    <w:bookmarkStart w:id="20" w:name="stucom---110"/>
+    <w:bookmarkEnd w:id="21"/>
+    <w:bookmarkStart w:id="22" w:name="stucom---110"/>
     <w:p>
       <w:pPr>
         <w:pStyle w:val="Ttulo3"/>
       </w:pPr>
       <w:r>
-        <w:t xml:space="preserve">3. Stucom - 1:10</w:t>
-      </w:r>
-    </w:p>
-    <w:p>
-      <w:pPr>
-        <w:pStyle w:val="Compact"/>
-        <w:numPr>
-          <w:ilvl w:val="0"/>
-          <w:numId w:val="1005"/>
+        <w:t xml:space="preserve">4. Stucom - 1:10</w:t>
+      </w:r>
+    </w:p>
+    <w:p>
+      <w:pPr>
+        <w:pStyle w:val="Compact"/>
+        <w:numPr>
+          <w:ilvl w:val="0"/>
+          <w:numId w:val="1006"/>
         </w:numPr>
       </w:pPr>
       <w:r>
@@ -864,7 +940,7 @@
         <w:pStyle w:val="Compact"/>
         <w:numPr>
           <w:ilvl w:val="0"/>
-          <w:numId w:val="1005"/>
+          <w:numId w:val="1006"/>
         </w:numPr>
       </w:pPr>
       <w:r>
@@ -876,7 +952,7 @@
         <w:pStyle w:val="Compact"/>
         <w:numPr>
           <w:ilvl w:val="0"/>
-          <w:numId w:val="1005"/>
+          <w:numId w:val="1006"/>
         </w:numPr>
       </w:pPr>
       <w:r>
@@ -888,7 +964,7 @@
         <w:pStyle w:val="Compact"/>
         <w:numPr>
           <w:ilvl w:val="0"/>
-          <w:numId w:val="1005"/>
+          <w:numId w:val="1006"/>
         </w:numPr>
       </w:pPr>
       <w:r>
@@ -900,29 +976,29 @@
         <w:pStyle w:val="Compact"/>
         <w:numPr>
           <w:ilvl w:val="0"/>
-          <w:numId w:val="1005"/>
+          <w:numId w:val="1006"/>
         </w:numPr>
       </w:pPr>
       <w:r>
         <w:t xml:space="preserve">Evolució cap a continguts tècnics universitaris més avançats.</w:t>
       </w:r>
     </w:p>
-    <w:bookmarkEnd w:id="20"/>
-    <w:bookmarkStart w:id="21" w:name="de-la-salle-al-tecnocampus---155"/>
+    <w:bookmarkEnd w:id="22"/>
+    <w:bookmarkStart w:id="23" w:name="de-la-salle-al-tecnocampus---155"/>
     <w:p>
       <w:pPr>
         <w:pStyle w:val="Ttulo3"/>
       </w:pPr>
       <w:r>
-        <w:t xml:space="preserve">4. De La Salle al TecnoCampus - 1:55</w:t>
-      </w:r>
-    </w:p>
-    <w:p>
-      <w:pPr>
-        <w:pStyle w:val="Compact"/>
-        <w:numPr>
-          <w:ilvl w:val="0"/>
-          <w:numId w:val="1006"/>
+        <w:t xml:space="preserve">5. De La Salle al TecnoCampus - 1:55</w:t>
+      </w:r>
+    </w:p>
+    <w:p>
+      <w:pPr>
+        <w:pStyle w:val="Compact"/>
+        <w:numPr>
+          <w:ilvl w:val="0"/>
+          <w:numId w:val="1007"/>
         </w:numPr>
       </w:pPr>
       <w:r>
@@ -934,7 +1010,7 @@
         <w:pStyle w:val="Compact"/>
         <w:numPr>
           <w:ilvl w:val="0"/>
-          <w:numId w:val="1006"/>
+          <w:numId w:val="1007"/>
         </w:numPr>
       </w:pPr>
       <w:r>
@@ -946,7 +1022,7 @@
         <w:pStyle w:val="Compact"/>
         <w:numPr>
           <w:ilvl w:val="0"/>
-          <w:numId w:val="1006"/>
+          <w:numId w:val="1007"/>
         </w:numPr>
       </w:pPr>
       <w:r>
@@ -958,7 +1034,7 @@
         <w:pStyle w:val="Compact"/>
         <w:numPr>
           <w:ilvl w:val="0"/>
-          <w:numId w:val="1006"/>
+          <w:numId w:val="1007"/>
         </w:numPr>
       </w:pPr>
       <w:r>
@@ -970,7 +1046,7 @@
         <w:pStyle w:val="Compact"/>
         <w:numPr>
           <w:ilvl w:val="0"/>
-          <w:numId w:val="1006"/>
+          <w:numId w:val="1007"/>
         </w:numPr>
       </w:pPr>
       <w:r>
@@ -982,7 +1058,7 @@
         <w:pStyle w:val="Compact"/>
         <w:numPr>
           <w:ilvl w:val="0"/>
-          <w:numId w:val="1006"/>
+          <w:numId w:val="1007"/>
         </w:numPr>
       </w:pPr>
       <w:r>
@@ -994,7 +1070,7 @@
         <w:pStyle w:val="Compact"/>
         <w:numPr>
           <w:ilvl w:val="0"/>
-          <w:numId w:val="1006"/>
+          <w:numId w:val="1007"/>
         </w:numPr>
       </w:pPr>
       <w:r>
@@ -1006,7 +1082,7 @@
         <w:pStyle w:val="Compact"/>
         <w:numPr>
           <w:ilvl w:val="0"/>
-          <w:numId w:val="1006"/>
+          <w:numId w:val="1007"/>
         </w:numPr>
       </w:pPr>
       <w:r>
@@ -1018,7 +1094,7 @@
         <w:pStyle w:val="Compact"/>
         <w:numPr>
           <w:ilvl w:val="0"/>
-          <w:numId w:val="1006"/>
+          <w:numId w:val="1007"/>
         </w:numPr>
       </w:pPr>
       <w:r>
@@ -1030,29 +1106,29 @@
         <w:pStyle w:val="Compact"/>
         <w:numPr>
           <w:ilvl w:val="0"/>
-          <w:numId w:val="1006"/>
+          <w:numId w:val="1007"/>
         </w:numPr>
       </w:pPr>
       <w:r>
         <w:t xml:space="preserve">TecnoCampus: docència universitària, software, sistemes d’informació, transferència i projecte sostenible.</w:t>
       </w:r>
     </w:p>
-    <w:bookmarkEnd w:id="21"/>
-    <w:bookmarkStart w:id="22" w:name="tecnocampus---120"/>
+    <w:bookmarkEnd w:id="23"/>
+    <w:bookmarkStart w:id="24" w:name="tecnocampus---120"/>
     <w:p>
       <w:pPr>
         <w:pStyle w:val="Ttulo3"/>
       </w:pPr>
       <w:r>
-        <w:t xml:space="preserve">5. TecnoCampus - 1:20</w:t>
-      </w:r>
-    </w:p>
-    <w:p>
-      <w:pPr>
-        <w:pStyle w:val="Compact"/>
-        <w:numPr>
-          <w:ilvl w:val="0"/>
-          <w:numId w:val="1007"/>
+        <w:t xml:space="preserve">6. TecnoCampus - 1:20</w:t>
+      </w:r>
+    </w:p>
+    <w:p>
+      <w:pPr>
+        <w:pStyle w:val="Compact"/>
+        <w:numPr>
+          <w:ilvl w:val="0"/>
+          <w:numId w:val="1008"/>
         </w:numPr>
       </w:pPr>
       <w:r>
@@ -1064,7 +1140,7 @@
         <w:pStyle w:val="Compact"/>
         <w:numPr>
           <w:ilvl w:val="0"/>
-          <w:numId w:val="1007"/>
+          <w:numId w:val="1008"/>
         </w:numPr>
       </w:pPr>
       <w:r>
@@ -1076,7 +1152,7 @@
         <w:pStyle w:val="Compact"/>
         <w:numPr>
           <w:ilvl w:val="0"/>
-          <w:numId w:val="1007"/>
+          <w:numId w:val="1008"/>
         </w:numPr>
       </w:pPr>
       <w:r>
@@ -1088,7 +1164,7 @@
         <w:pStyle w:val="Compact"/>
         <w:numPr>
           <w:ilvl w:val="0"/>
-          <w:numId w:val="1007"/>
+          <w:numId w:val="1008"/>
         </w:numPr>
       </w:pPr>
       <w:r>
@@ -1100,7 +1176,7 @@
         <w:pStyle w:val="Compact"/>
         <w:numPr>
           <w:ilvl w:val="0"/>
-          <w:numId w:val="1007"/>
+          <w:numId w:val="1008"/>
         </w:numPr>
       </w:pPr>
       <w:r>
@@ -1112,7 +1188,7 @@
         <w:pStyle w:val="Compact"/>
         <w:numPr>
           <w:ilvl w:val="0"/>
-          <w:numId w:val="1007"/>
+          <w:numId w:val="1008"/>
         </w:numPr>
       </w:pPr>
       <w:r>
@@ -1124,7 +1200,7 @@
         <w:pStyle w:val="Compact"/>
         <w:numPr>
           <w:ilvl w:val="0"/>
-          <w:numId w:val="1007"/>
+          <w:numId w:val="1008"/>
         </w:numPr>
       </w:pPr>
       <w:r>
@@ -1136,7 +1212,7 @@
         <w:pStyle w:val="Compact"/>
         <w:numPr>
           <w:ilvl w:val="0"/>
-          <w:numId w:val="1007"/>
+          <w:numId w:val="1008"/>
         </w:numPr>
       </w:pPr>
       <w:r>
@@ -1148,29 +1224,29 @@
         <w:pStyle w:val="Compact"/>
         <w:numPr>
           <w:ilvl w:val="0"/>
-          <w:numId w:val="1007"/>
+          <w:numId w:val="1008"/>
         </w:numPr>
       </w:pPr>
       <w:r>
         <w:t xml:space="preserve">Transició explícita a la classe magistral.</w:t>
       </w:r>
     </w:p>
-    <w:bookmarkEnd w:id="22"/>
-    <w:bookmarkStart w:id="23" w:name="neueda-doctorat-i-futur---200"/>
+    <w:bookmarkEnd w:id="24"/>
+    <w:bookmarkStart w:id="25" w:name="neueda-doctorat-i-futur---200"/>
     <w:p>
       <w:pPr>
         <w:pStyle w:val="Ttulo3"/>
       </w:pPr>
       <w:r>
-        <w:t xml:space="preserve">6. Neueda, doctorat i futur - 2:00</w:t>
-      </w:r>
-    </w:p>
-    <w:p>
-      <w:pPr>
-        <w:pStyle w:val="Compact"/>
-        <w:numPr>
-          <w:ilvl w:val="0"/>
-          <w:numId w:val="1008"/>
+        <w:t xml:space="preserve">7. Neueda, doctorat i futur - 2:00</w:t>
+      </w:r>
+    </w:p>
+    <w:p>
+      <w:pPr>
+        <w:pStyle w:val="Compact"/>
+        <w:numPr>
+          <w:ilvl w:val="0"/>
+          <w:numId w:val="1009"/>
         </w:numPr>
       </w:pPr>
       <w:r>
@@ -1182,7 +1258,7 @@
         <w:pStyle w:val="Compact"/>
         <w:numPr>
           <w:ilvl w:val="0"/>
-          <w:numId w:val="1008"/>
+          <w:numId w:val="1009"/>
         </w:numPr>
       </w:pPr>
       <w:r>
@@ -1194,7 +1270,7 @@
         <w:pStyle w:val="Compact"/>
         <w:numPr>
           <w:ilvl w:val="0"/>
-          <w:numId w:val="1008"/>
+          <w:numId w:val="1009"/>
         </w:numPr>
       </w:pPr>
       <w:r>
@@ -1206,7 +1282,7 @@
         <w:pStyle w:val="Compact"/>
         <w:numPr>
           <w:ilvl w:val="0"/>
-          <w:numId w:val="1008"/>
+          <w:numId w:val="1009"/>
         </w:numPr>
       </w:pPr>
       <w:r>
@@ -1218,7 +1294,7 @@
         <w:pStyle w:val="Compact"/>
         <w:numPr>
           <w:ilvl w:val="0"/>
-          <w:numId w:val="1008"/>
+          <w:numId w:val="1009"/>
         </w:numPr>
       </w:pPr>
       <w:r>
@@ -1230,7 +1306,7 @@
         <w:pStyle w:val="Compact"/>
         <w:numPr>
           <w:ilvl w:val="0"/>
-          <w:numId w:val="1008"/>
+          <w:numId w:val="1009"/>
         </w:numPr>
       </w:pPr>
       <w:r>
@@ -1242,7 +1318,7 @@
         <w:pStyle w:val="Compact"/>
         <w:numPr>
           <w:ilvl w:val="0"/>
-          <w:numId w:val="1008"/>
+          <w:numId w:val="1009"/>
         </w:numPr>
       </w:pPr>
       <w:r>
@@ -1254,7 +1330,7 @@
         <w:pStyle w:val="Compact"/>
         <w:numPr>
           <w:ilvl w:val="0"/>
-          <w:numId w:val="1008"/>
+          <w:numId w:val="1009"/>
         </w:numPr>
       </w:pPr>
       <w:r>
@@ -1266,7 +1342,7 @@
         <w:pStyle w:val="Compact"/>
         <w:numPr>
           <w:ilvl w:val="0"/>
-          <w:numId w:val="1008"/>
+          <w:numId w:val="1009"/>
         </w:numPr>
       </w:pPr>
       <w:r>
@@ -1278,7 +1354,7 @@
         <w:pStyle w:val="Compact"/>
         <w:numPr>
           <w:ilvl w:val="0"/>
-          <w:numId w:val="1008"/>
+          <w:numId w:val="1009"/>
         </w:numPr>
       </w:pPr>
       <w:r>
@@ -1290,15 +1366,15 @@
         <w:pStyle w:val="Compact"/>
         <w:numPr>
           <w:ilvl w:val="0"/>
-          <w:numId w:val="1008"/>
+          <w:numId w:val="1009"/>
         </w:numPr>
       </w:pPr>
       <w:r>
         <w:t xml:space="preserve">Enllaçar amb la classe magistral següent.</w:t>
       </w:r>
     </w:p>
-    <w:bookmarkEnd w:id="23"/>
-    <w:bookmarkStart w:id="24" w:name="Xed3256c23068a18527438c32113db4e0c20a1ed"/>
+    <w:bookmarkEnd w:id="25"/>
+    <w:bookmarkStart w:id="26" w:name="Xed3256c23068a18527438c32113db4e0c20a1ed"/>
     <w:p>
       <w:pPr>
         <w:pStyle w:val="Ttulo3"/>
@@ -1312,19 +1388,19 @@
         <w:pStyle w:val="Compact"/>
         <w:numPr>
           <w:ilvl w:val="0"/>
-          <w:numId w:val="1009"/>
-        </w:numPr>
-      </w:pPr>
-      <w:r>
-        <w:t xml:space="preserve">Fora dels deu minuts i de la numeració 1-6; no mostrar sense pregunta o necessitat clara.</w:t>
-      </w:r>
-    </w:p>
-    <w:p>
-      <w:pPr>
-        <w:pStyle w:val="Compact"/>
-        <w:numPr>
-          <w:ilvl w:val="0"/>
-          <w:numId w:val="1009"/>
+          <w:numId w:val="1010"/>
+        </w:numPr>
+      </w:pPr>
+      <w:r>
+        <w:t xml:space="preserve">Fora dels deu minuts i de la numeració 1-7; no mostrar sense pregunta o necessitat clara.</w:t>
+      </w:r>
+    </w:p>
+    <w:p>
+      <w:pPr>
+        <w:pStyle w:val="Compact"/>
+        <w:numPr>
+          <w:ilvl w:val="0"/>
+          <w:numId w:val="1010"/>
         </w:numPr>
       </w:pPr>
       <w:r>
@@ -1336,7 +1412,7 @@
         <w:pStyle w:val="Compact"/>
         <w:numPr>
           <w:ilvl w:val="0"/>
-          <w:numId w:val="1009"/>
+          <w:numId w:val="1010"/>
         </w:numPr>
       </w:pPr>
       <w:r>
@@ -1348,7 +1424,7 @@
         <w:pStyle w:val="Compact"/>
         <w:numPr>
           <w:ilvl w:val="0"/>
-          <w:numId w:val="1009"/>
+          <w:numId w:val="1010"/>
         </w:numPr>
       </w:pPr>
       <w:r>
@@ -1360,7 +1436,7 @@
         <w:pStyle w:val="Compact"/>
         <w:numPr>
           <w:ilvl w:val="0"/>
-          <w:numId w:val="1009"/>
+          <w:numId w:val="1010"/>
         </w:numPr>
       </w:pPr>
       <w:r>
@@ -1372,7 +1448,7 @@
         <w:pStyle w:val="Compact"/>
         <w:numPr>
           <w:ilvl w:val="0"/>
-          <w:numId w:val="1009"/>
+          <w:numId w:val="1010"/>
         </w:numPr>
       </w:pPr>
       <w:r>
@@ -1384,7 +1460,7 @@
         <w:pStyle w:val="Compact"/>
         <w:numPr>
           <w:ilvl w:val="0"/>
-          <w:numId w:val="1009"/>
+          <w:numId w:val="1010"/>
         </w:numPr>
       </w:pPr>
       <w:r>
@@ -1398,9 +1474,9 @@
         </w:pict>
       </w:r>
     </w:p>
-    <w:bookmarkEnd w:id="24"/>
-    <w:bookmarkEnd w:id="25"/>
-    <w:bookmarkStart w:id="26" w:name="esquema-de-memorització"/>
+    <w:bookmarkEnd w:id="26"/>
+    <w:bookmarkEnd w:id="27"/>
+    <w:bookmarkStart w:id="28" w:name="esquema-de-memorització"/>
     <w:p>
       <w:pPr>
         <w:pStyle w:val="Ttulo2"/>
@@ -1490,6 +1566,52 @@
               <w:pStyle w:val="Compact"/>
             </w:pPr>
             <w:r>
+              <w:t xml:space="preserve">Portada: benvinguda i agraïment al tribunal</w:t>
+            </w:r>
+          </w:p>
+        </w:tc>
+        <w:tc>
+          <w:tcPr/>
+          <w:p>
+            <w:pPr>
+              <w:pStyle w:val="Compact"/>
+            </w:pPr>
+            <w:r>
+              <w:t xml:space="preserve">salutació, tribunal</w:t>
+            </w:r>
+          </w:p>
+        </w:tc>
+        <w:tc>
+          <w:tcPr/>
+          <w:p>
+            <w:pPr>
+              <w:pStyle w:val="Compact"/>
+            </w:pPr>
+            <w:r>
+              <w:t xml:space="preserve">Fil conductor</w:t>
+            </w:r>
+          </w:p>
+        </w:tc>
+      </w:tr>
+      <w:tr>
+        <w:tc>
+          <w:tcPr/>
+          <w:p>
+            <w:pPr>
+              <w:pStyle w:val="Compact"/>
+            </w:pPr>
+            <w:r>
+              <w:t xml:space="preserve">2</w:t>
+            </w:r>
+          </w:p>
+        </w:tc>
+        <w:tc>
+          <w:tcPr/>
+          <w:p>
+            <w:pPr>
+              <w:pStyle w:val="Compact"/>
+            </w:pPr>
+            <w:r>
               <w:t xml:space="preserve">La trajectòria té un sol fil conductor</w:t>
             </w:r>
           </w:p>
@@ -1501,7 +1623,7 @@
               <w:pStyle w:val="Compact"/>
             </w:pPr>
             <w:r>
-              <w:t xml:space="preserve">2004, enginyer, professor, investigador</w:t>
+              <w:t xml:space="preserve">2004, enginyer, professor, investigador, recorregut</w:t>
             </w:r>
           </w:p>
         </w:tc>
@@ -1525,7 +1647,7 @@
               <w:pStyle w:val="Compact"/>
             </w:pPr>
             <w:r>
-              <w:t xml:space="preserve">2</w:t>
+              <w:t xml:space="preserve">3</w:t>
             </w:r>
           </w:p>
         </w:tc>
@@ -1571,7 +1693,7 @@
               <w:pStyle w:val="Compact"/>
             </w:pPr>
             <w:r>
-              <w:t xml:space="preserve">3</w:t>
+              <w:t xml:space="preserve">4</w:t>
             </w:r>
           </w:p>
         </w:tc>
@@ -1617,7 +1739,7 @@
               <w:pStyle w:val="Compact"/>
             </w:pPr>
             <w:r>
-              <w:t xml:space="preserve">4</w:t>
+              <w:t xml:space="preserve">5</w:t>
             </w:r>
           </w:p>
         </w:tc>
@@ -1663,7 +1785,7 @@
               <w:pStyle w:val="Compact"/>
             </w:pPr>
             <w:r>
-              <w:t xml:space="preserve">5</w:t>
+              <w:t xml:space="preserve">6</w:t>
             </w:r>
           </w:p>
         </w:tc>
@@ -1709,7 +1831,7 @@
               <w:pStyle w:val="Compact"/>
             </w:pPr>
             <w:r>
-              <w:t xml:space="preserve">6</w:t>
+              <w:t xml:space="preserve">7</w:t>
             </w:r>
           </w:p>
         </w:tc>
@@ -1837,8 +1959,8 @@
         </w:pict>
       </w:r>
     </w:p>
-    <w:bookmarkEnd w:id="26"/>
-    <w:bookmarkStart w:id="32" w:name="recomanacions-dassaig-ritme-veu-i-cos"/>
+    <w:bookmarkEnd w:id="28"/>
+    <w:bookmarkStart w:id="34" w:name="recomanacions-dassaig-ritme-veu-i-cos"/>
     <w:p>
       <w:pPr>
         <w:pStyle w:val="Ttulo2"/>
@@ -1847,7 +1969,7 @@
         <w:t xml:space="preserve">4. Recomanacions d’assaig, ritme, veu i cos</w:t>
       </w:r>
     </w:p>
-    <w:bookmarkStart w:id="27" w:name="ritme"/>
+    <w:bookmarkStart w:id="29" w:name="ritme"/>
     <w:p>
       <w:pPr>
         <w:pStyle w:val="Ttulo3"/>
@@ -1861,11 +1983,11 @@
         <w:pStyle w:val="FirstParagraph"/>
       </w:pPr>
       <w:r>
-        <w:t xml:space="preserve">La presentació està pensada per a 9:00-9:20 amb un ritme pausat i marge real. Les diapositives 5 i 6 són les més importants i poden ocupar una mica més de temps. Si cal retallar durant l’assaig, aplica la versió curta d’emergència; no retallis les xifres docents del TecnoCampus.</w:t>
-      </w:r>
-    </w:p>
-    <w:bookmarkEnd w:id="27"/>
-    <w:bookmarkStart w:id="28" w:name="veu"/>
+        <w:t xml:space="preserve">La presentació està pensada per a 9:00-9:20 amb un ritme pausat i marge real. Les diapositives 6 i 7 són les més importants i poden ocupar una mica més de temps. Si cal retallar durant l’assaig, aplica la versió curta d’emergència; no retallis les xifres docents del TecnoCampus.</w:t>
+      </w:r>
+    </w:p>
+    <w:bookmarkEnd w:id="29"/>
+    <w:bookmarkStart w:id="30" w:name="veu"/>
     <w:p>
       <w:pPr>
         <w:pStyle w:val="Ttulo3"/>
@@ -1894,8 +2016,8 @@
         <w:t xml:space="preserve">. No cal intensificar-les; la força està a dir-les amb calma i amb evidència.</w:t>
       </w:r>
     </w:p>
-    <w:bookmarkEnd w:id="28"/>
-    <w:bookmarkStart w:id="29" w:name="cos-i-mirada"/>
+    <w:bookmarkEnd w:id="30"/>
+    <w:bookmarkStart w:id="31" w:name="cos-i-mirada"/>
     <w:p>
       <w:pPr>
         <w:pStyle w:val="Ttulo3"/>
@@ -1909,11 +2031,11 @@
         <w:pStyle w:val="FirstParagraph"/>
       </w:pPr>
       <w:r>
-        <w:t xml:space="preserve">Mira el tribunal en tres moments: inici, explicació de l’alineació TecnoCampus i tancament final. Mira la pantalla només quan la diapositiva ajudi a ordenar una etapa o una transició. A la diapositiva 5, atura’t una mica abans de dir les xifres d’avaluació docent.</w:t>
-      </w:r>
-    </w:p>
-    <w:bookmarkEnd w:id="29"/>
-    <w:bookmarkStart w:id="30" w:name="control-del-temps"/>
+        <w:t xml:space="preserve">Mira el tribunal en tres moments: inici, explicació de l’alineació TecnoCampus i tancament final. Mira la pantalla només quan la diapositiva ajudi a ordenar una etapa o una transició. A la diapositiva 6, atura’t una mica abans de dir les xifres d’avaluació docent.</w:t>
+      </w:r>
+    </w:p>
+    <w:bookmarkEnd w:id="31"/>
+    <w:bookmarkStart w:id="32" w:name="control-del-temps"/>
     <w:p>
       <w:pPr>
         <w:pStyle w:val="Ttulo3"/>
@@ -1927,75 +2049,87 @@
         <w:pStyle w:val="Compact"/>
         <w:numPr>
           <w:ilvl w:val="0"/>
-          <w:numId w:val="1010"/>
-        </w:numPr>
-      </w:pPr>
-      <w:r>
-        <w:t xml:space="preserve">Diapositiva 1: no superar 0:55.</w:t>
-      </w:r>
-    </w:p>
-    <w:p>
-      <w:pPr>
-        <w:pStyle w:val="Compact"/>
-        <w:numPr>
-          <w:ilvl w:val="0"/>
-          <w:numId w:val="1010"/>
-        </w:numPr>
-      </w:pPr>
-      <w:r>
-        <w:t xml:space="preserve">Diapositiva 2: no explicar massa Vida Software; màxim 30 segons.</w:t>
-      </w:r>
-    </w:p>
-    <w:p>
-      <w:pPr>
-        <w:pStyle w:val="Compact"/>
-        <w:numPr>
-          <w:ilvl w:val="0"/>
-          <w:numId w:val="1010"/>
-        </w:numPr>
-      </w:pPr>
-      <w:r>
-        <w:t xml:space="preserve">Diapositiva 3: evitar convertir-la en una història llarga sobre FP.</w:t>
-      </w:r>
-    </w:p>
-    <w:p>
-      <w:pPr>
-        <w:pStyle w:val="Compact"/>
-        <w:numPr>
-          <w:ilvl w:val="0"/>
-          <w:numId w:val="1010"/>
-        </w:numPr>
-      </w:pPr>
-      <w:r>
-        <w:t xml:space="preserve">Diapositiva 4: encaix curricular com a motiu principal (fonaments a La Salle, tram següent al TecnoCampus); conciliació només com a sostenibilitat complementària; cap menció de persones concretes.</w:t>
-      </w:r>
-    </w:p>
-    <w:p>
-      <w:pPr>
-        <w:pStyle w:val="Compact"/>
-        <w:numPr>
-          <w:ilvl w:val="0"/>
-          <w:numId w:val="1010"/>
-        </w:numPr>
-      </w:pPr>
-      <w:r>
-        <w:t xml:space="preserve">Diapositiva 5: és el centre docent i institucional; donar-li aire.</w:t>
-      </w:r>
-    </w:p>
-    <w:p>
-      <w:pPr>
-        <w:pStyle w:val="Compact"/>
-        <w:numPr>
-          <w:ilvl w:val="0"/>
-          <w:numId w:val="1010"/>
-        </w:numPr>
-      </w:pPr>
-      <w:r>
-        <w:t xml:space="preserve">Diapositiva 6: recerca com a Educació en Enginyeria del Software; tancar amb seguretat i enllaçar amb la classe magistral.</w:t>
-      </w:r>
-    </w:p>
-    <w:bookmarkEnd w:id="30"/>
-    <w:bookmarkStart w:id="31" w:name="versió-curta-demergència"/>
+          <w:numId w:val="1011"/>
+        </w:numPr>
+      </w:pPr>
+      <w:r>
+        <w:t xml:space="preserve">Diapositiva 1: només salutació i agraïment; no superar 0:15.</w:t>
+      </w:r>
+    </w:p>
+    <w:p>
+      <w:pPr>
+        <w:pStyle w:val="Compact"/>
+        <w:numPr>
+          <w:ilvl w:val="0"/>
+          <w:numId w:val="1011"/>
+        </w:numPr>
+      </w:pPr>
+      <w:r>
+        <w:t xml:space="preserve">Diapositiva 2: fil conductor i recorregut; no superar 0:40. Entre les diapositives 1 i 2 no s’ha de superar el temps de l’antiga introducció (0:55).</w:t>
+      </w:r>
+    </w:p>
+    <w:p>
+      <w:pPr>
+        <w:pStyle w:val="Compact"/>
+        <w:numPr>
+          <w:ilvl w:val="0"/>
+          <w:numId w:val="1011"/>
+        </w:numPr>
+      </w:pPr>
+      <w:r>
+        <w:t xml:space="preserve">Diapositiva 3: no explicar massa Vida Software; màxim 30 segons.</w:t>
+      </w:r>
+    </w:p>
+    <w:p>
+      <w:pPr>
+        <w:pStyle w:val="Compact"/>
+        <w:numPr>
+          <w:ilvl w:val="0"/>
+          <w:numId w:val="1011"/>
+        </w:numPr>
+      </w:pPr>
+      <w:r>
+        <w:t xml:space="preserve">Diapositiva 4: evitar convertir-la en una història llarga sobre FP.</w:t>
+      </w:r>
+    </w:p>
+    <w:p>
+      <w:pPr>
+        <w:pStyle w:val="Compact"/>
+        <w:numPr>
+          <w:ilvl w:val="0"/>
+          <w:numId w:val="1011"/>
+        </w:numPr>
+      </w:pPr>
+      <w:r>
+        <w:t xml:space="preserve">Diapositiva 5: encaix curricular com a motiu principal (fonaments a La Salle, tram següent al TecnoCampus); conciliació només com a sostenibilitat complementària; cap menció de persones concretes.</w:t>
+      </w:r>
+    </w:p>
+    <w:p>
+      <w:pPr>
+        <w:pStyle w:val="Compact"/>
+        <w:numPr>
+          <w:ilvl w:val="0"/>
+          <w:numId w:val="1011"/>
+        </w:numPr>
+      </w:pPr>
+      <w:r>
+        <w:t xml:space="preserve">Diapositiva 6: és el centre docent i institucional; donar-li aire.</w:t>
+      </w:r>
+    </w:p>
+    <w:p>
+      <w:pPr>
+        <w:pStyle w:val="Compact"/>
+        <w:numPr>
+          <w:ilvl w:val="0"/>
+          <w:numId w:val="1011"/>
+        </w:numPr>
+      </w:pPr>
+      <w:r>
+        <w:t xml:space="preserve">Diapositiva 7: recerca com a Educació en Enginyeria del Software; tancar amb seguretat i enllaçar amb la classe magistral.</w:t>
+      </w:r>
+    </w:p>
+    <w:bookmarkEnd w:id="32"/>
+    <w:bookmarkStart w:id="33" w:name="versió-curta-demergència"/>
     <w:p>
       <w:pPr>
         <w:pStyle w:val="Ttulo3"/>
@@ -2017,11 +2151,11 @@
         <w:pStyle w:val="Compact"/>
         <w:numPr>
           <w:ilvl w:val="0"/>
-          <w:numId w:val="1011"/>
-        </w:numPr>
-      </w:pPr>
-      <w:r>
-        <w:t xml:space="preserve">A la diapositiva 2, digues només</w:t>
+          <w:numId w:val="1012"/>
+        </w:numPr>
+      </w:pPr>
+      <w:r>
+        <w:t xml:space="preserve">A la diapositiva 3, digues només</w:t>
       </w:r>
       <w:r>
         <w:t xml:space="preserve"> </w:t>
@@ -2041,23 +2175,23 @@
         <w:pStyle w:val="Compact"/>
         <w:numPr>
           <w:ilvl w:val="0"/>
-          <w:numId w:val="1011"/>
-        </w:numPr>
-      </w:pPr>
-      <w:r>
-        <w:t xml:space="preserve">A la diapositiva 3, redueix la reflexió sobre FP a una frase d’agraïment.</w:t>
-      </w:r>
-    </w:p>
-    <w:p>
-      <w:pPr>
-        <w:pStyle w:val="Compact"/>
-        <w:numPr>
-          <w:ilvl w:val="0"/>
-          <w:numId w:val="1011"/>
-        </w:numPr>
-      </w:pPr>
-      <w:r>
-        <w:t xml:space="preserve">A la diapositiva 4, resumeix la conciliació en</w:t>
+          <w:numId w:val="1012"/>
+        </w:numPr>
+      </w:pPr>
+      <w:r>
+        <w:t xml:space="preserve">A la diapositiva 4, redueix la reflexió sobre FP a una frase d’agraïment.</w:t>
+      </w:r>
+    </w:p>
+    <w:p>
+      <w:pPr>
+        <w:pStyle w:val="Compact"/>
+        <w:numPr>
+          <w:ilvl w:val="0"/>
+          <w:numId w:val="1012"/>
+        </w:numPr>
+      </w:pPr>
+      <w:r>
+        <w:t xml:space="preserve">A la diapositiva 5, resumeix la conciliació en</w:t>
       </w:r>
       <w:r>
         <w:t xml:space="preserve"> </w:t>
@@ -2077,11 +2211,11 @@
         <w:pStyle w:val="Compact"/>
         <w:numPr>
           <w:ilvl w:val="0"/>
-          <w:numId w:val="1011"/>
-        </w:numPr>
-      </w:pPr>
-      <w:r>
-        <w:t xml:space="preserve">A la diapositiva 4, si encara vas tard, redueix el bloc d’encaix a</w:t>
+          <w:numId w:val="1012"/>
+        </w:numPr>
+      </w:pPr>
+      <w:r>
+        <w:t xml:space="preserve">A la diapositiva 5, si encara vas tard, redueix el bloc d’encaix a</w:t>
       </w:r>
       <w:r>
         <w:t xml:space="preserve"> </w:t>
@@ -2116,11 +2250,11 @@
         <w:pStyle w:val="Compact"/>
         <w:numPr>
           <w:ilvl w:val="0"/>
-          <w:numId w:val="1011"/>
-        </w:numPr>
-      </w:pPr>
-      <w:r>
-        <w:t xml:space="preserve">A la diapositiva 6, si vas tard, elimina HUB4T i deixa només Cambridge, Neueda, AGAUR i doctorat.</w:t>
+          <w:numId w:val="1012"/>
+        </w:numPr>
+      </w:pPr>
+      <w:r>
+        <w:t xml:space="preserve">A la diapositiva 7, si vas tard, elimina HUB4T i deixa només Cambridge, Neueda, AGAUR i doctorat.</w:t>
       </w:r>
     </w:p>
     <w:p>
@@ -2131,9 +2265,9 @@
         <w:t xml:space="preserve">No eliminis la connexió final amb la classe magistral.</w:t>
       </w:r>
     </w:p>
-    <w:bookmarkEnd w:id="31"/>
-    <w:bookmarkEnd w:id="32"/>
     <w:bookmarkEnd w:id="33"/>
+    <w:bookmarkEnd w:id="34"/>
+    <w:bookmarkEnd w:id="35"/>
     <w:sectPr>
       <w:footnotePr>
         <w:numRestart w:val="eachSect"/>
@@ -2667,6 +2801,9 @@
     <w:abstractNumId w:val="991"/>
   </w:num>
   <w:num w:numId="1011">
+    <w:abstractNumId w:val="991"/>
+  </w:num>
+  <w:num w:numId="1012">
     <w:abstractNumId w:val="991"/>
   </w:num>
 </w:numbering>

</xml_diff>

<commit_message>
Revert "Insereix la diapositiva d'introducció al deck de trajectòria i renumera el guió"
This reverts commit 3e56ac70a2709e3653b0af28ee7a2525ff6a8569.
</commit_message>
<xml_diff>
--- a/doc/presentations/defensa-placa-permanent-dsi-ports-sortida-hexagonal/output/REMARKABLE_materials-orals-canonics-10-minuts-trajectoria.docx
+++ b/doc/presentations/defensa-placa-permanent-dsi-ports-sortida-hexagonal/output/REMARKABLE_materials-orals-canonics-10-minuts-trajectoria.docx
@@ -2,7 +2,7 @@
 <file path=word/document.xml><?xml version="1.0" encoding="utf-8"?>
 <w:document xmlns:w="http://schemas.openxmlformats.org/wordprocessingml/2006/main" xmlns:m="http://schemas.openxmlformats.org/officeDocument/2006/math" xmlns:r="http://schemas.openxmlformats.org/officeDocument/2006/relationships" xmlns:o="urn:schemas-microsoft-com:office:office" xmlns:v="urn:schemas-microsoft-com:vml" xmlns:w10="urn:schemas-microsoft-com:office:word" xmlns:a="http://schemas.openxmlformats.org/drawingml/2006/main" xmlns:pic="http://schemas.openxmlformats.org/drawingml/2006/picture" xmlns:wp="http://schemas.openxmlformats.org/drawingml/2006/wordprocessingDrawing">
   <w:body>
-    <w:bookmarkStart w:id="35" w:name="X0e91efcdfc21fc1542c629021a59166df219849"/>
+    <w:bookmarkStart w:id="33" w:name="X0e91efcdfc21fc1542c629021a59166df219849"/>
     <w:p>
       <w:pPr>
         <w:pStyle w:val="Ttulo1"/>
@@ -215,7 +215,7 @@
         <w:pStyle w:val="FirstParagraph"/>
       </w:pPr>
       <w:r>
-        <w:t xml:space="preserve">Nota de versió: aquests materials són independents de la classe magistral de 20 minuts. La seva funció és donar suport a la primera part de la defensa de la plaça: trajectòria professional, acadèmica i científica. La presentació està limitada a 7 diapositives (portada, introducció i cinc diapositives de contingut) i a una durada aproximada de 10 minuts. Després del tancament hi ha una diapositiva d’annex,</w:t>
+        <w:t xml:space="preserve">Nota de versió: aquests materials són independents de la classe magistral de 20 minuts. La seva funció és donar suport a la primera part de la defensa de la plaça: trajectòria professional, acadèmica i científica. La presentació està limitada a 6 diapositives i a una durada aproximada de 10 minuts. Després del tancament hi ha una diapositiva d’annex,</w:t>
       </w:r>
       <w:r>
         <w:t xml:space="preserve"> </w:t>
@@ -227,7 +227,7 @@
         <w:t xml:space="preserve">Annex A. Contrast d'orientació curricular</w:t>
       </w:r>
       <w:r>
-        <w:t xml:space="preserve">, que no forma part de la numeració 1-7 ni del temps principal: és material de reserva exclusiu per al torn de preguntes.</w:t>
+        <w:t xml:space="preserve">, que no forma part de la numeració 1-6 ni del temps principal: és material de reserva exclusiu per al torn de preguntes.</w:t>
       </w:r>
     </w:p>
     <w:p>
@@ -237,7 +237,7 @@
         </w:pict>
       </w:r>
     </w:p>
-    <w:bookmarkStart w:id="16" w:name="guió-oral-complet-imprimible"/>
+    <w:bookmarkStart w:id="15" w:name="guió-oral-complet-imprimible"/>
     <w:p>
       <w:pPr>
         <w:pStyle w:val="Ttulo2"/>
@@ -251,16 +251,16 @@
         <w:pStyle w:val="FirstParagraph"/>
       </w:pPr>
       <w:r>
-        <w:t xml:space="preserve">Temps total previst d’assaig: 9:00-9:20 aproximadament, amb pauses reals. Si l’assaig supera els 10:00, aplica la versió curta d’emergència de la diapositiva 5.</w:t>
-      </w:r>
-    </w:p>
-    <w:bookmarkStart w:id="9" w:name="X9d7e647a5b35f0dbbe37334756438bdb2191356"/>
+        <w:t xml:space="preserve">Temps total previst d’assaig: 9:00-9:20 aproximadament, amb pauses reals. Si l’assaig supera els 10:00, aplica la versió curta d’emergència de la diapositiva 4.</w:t>
+      </w:r>
+    </w:p>
+    <w:bookmarkStart w:id="9" w:name="X955f66c7fc938677aca3c0234d4f82c1654e8a5"/>
     <w:p>
       <w:pPr>
         <w:pStyle w:val="Ttulo3"/>
       </w:pPr>
       <w:r>
-        <w:t xml:space="preserve">Diapositiva 1. Portada. Trajectòria professional, acadèmica i científica - 0:15</w:t>
+        <w:t xml:space="preserve">Diapositiva 1. Trajectòria professional, acadèmica i científica - 0:50</w:t>
       </w:r>
     </w:p>
     <w:p>
@@ -268,7 +268,7 @@
         <w:pStyle w:val="FirstParagraph"/>
       </w:pPr>
       <w:r>
-        <w:t xml:space="preserve">Bon dia, membres del tribunal. Moltes gràcies per l’oportunitat d’oferir aquesta presentació. [mirada al tribunal]</w:t>
+        <w:t xml:space="preserve">Bon dia, membres del tribunal. Moltes gràcies per l’oportunitat de oferir aquesta presentació. [mirada al tribunal]</w:t>
       </w:r>
     </w:p>
     <w:p>
@@ -276,17 +276,25 @@
         <w:pStyle w:val="Textoindependiente"/>
       </w:pPr>
       <w:r>
-        <w:t xml:space="preserve">[avançar a la diapositiva 2]</w:t>
+        <w:t xml:space="preserve">La meva trajectòria comença el 2004 i té un fil conductor: l’enginyeria del software. Primer, com a enginyer a la indústria. Després, com a professor. I avui, també com a investigador: faig recerca en Educació en Enginyeria del Software. [pausa breu]</w:t>
+      </w:r>
+    </w:p>
+    <w:p>
+      <w:pPr>
+        <w:pStyle w:val="Textoindependiente"/>
+      </w:pPr>
+      <w:r>
+        <w:t xml:space="preserve">Aquest és el recorregut que presentaré: base professional, vocació docent, pas a la universitat, consolidació al TecnoCampus i projecte de futur.</w:t>
       </w:r>
     </w:p>
     <w:bookmarkEnd w:id="9"/>
-    <w:bookmarkStart w:id="10" w:name="Xe99d554c4e8014a70d3a397e93d0e617ac93c0f"/>
+    <w:bookmarkStart w:id="10" w:name="Xd14c9db4fc52b05d6bd387f4cf590104a51d41a"/>
     <w:p>
       <w:pPr>
         <w:pStyle w:val="Ttulo3"/>
       </w:pPr>
       <w:r>
-        <w:t xml:space="preserve">Diapositiva 2. Un fil conductor: l’enginyeria del software - 0:35</w:t>
+        <w:t xml:space="preserve">Diapositiva 2. Primera etapa: enginyeria del software i consultoria - 1:30</w:t>
       </w:r>
     </w:p>
     <w:p>
@@ -294,7 +302,7 @@
         <w:pStyle w:val="FirstParagraph"/>
       </w:pPr>
       <w:r>
-        <w:t xml:space="preserve">La meva trajectòria comença el 2004 i té un fil conductor: l’enginyeria del software. Primer, com a enginyer a la indústria. Després, com a professor. I avui, també com a investigador: faig recerca en Educació en Enginyeria del Software. [pausa breu]</w:t>
+        <w:t xml:space="preserve">La primera etapa transcorre en la indústria del software. [to calmat]</w:t>
       </w:r>
     </w:p>
     <w:p>
@@ -302,17 +310,41 @@
         <w:pStyle w:val="Textoindependiente"/>
       </w:pPr>
       <w:r>
-        <w:t xml:space="preserve">Aquest és el recorregut que presentaré: base professional, vocació docent, pas a la universitat, consolidació al TecnoCampus i projecte de futur.</w:t>
+        <w:t xml:space="preserve">A Vida Software vaig treballar en un component del sistema operatiu Symbian orientat a incorporar interacció per veu en aplicacions mòbils. Era una peça de plataforma desenvolupada a baix nivell en C++, amb restriccions fortes de memòria, CPU i xarxa. El component es va presentar en entorns com el 3GSM/Mobile World Congress i estava vinculat al context d’innovació d’una patent de Vida Software sobre interfícies d’usuari.</w:t>
+      </w:r>
+    </w:p>
+    <w:p>
+      <w:pPr>
+        <w:pStyle w:val="Textoindependiente"/>
+      </w:pPr>
+      <w:r>
+        <w:t xml:space="preserve">Va ser una etapa tècnicament molt exigent i estimulant, que em va donar una base sòlida en sistemes i comunicacions. Al mateix temps, em va ajudar a identificar una altra dimensió que volia desenvolupar: el treball amb les persones, la comunicació i la construcció compartida de coneixement.</w:t>
+      </w:r>
+    </w:p>
+    <w:p>
+      <w:pPr>
+        <w:pStyle w:val="Textoindependiente"/>
+      </w:pPr>
+      <w:r>
+        <w:t xml:space="preserve">Per això vaig fer el pas a la consultoria, a openTrends, on vaig ampliar aquesta base cap a Java, Linux, Spring, sistemes d’informació, clients i equips. Allà la comunicació tècnica va guanyar pes: entendre necessitats, explicar decisions i fer mentoria a enginyers júniors.</w:t>
+      </w:r>
+    </w:p>
+    <w:p>
+      <w:pPr>
+        <w:pStyle w:val="Textoindependiente"/>
+      </w:pPr>
+      <w:r>
+        <w:t xml:space="preserve">La transició cap a la docència va ser, doncs, una evolució natural d’aquesta mateixa trajectòria professional.</w:t>
       </w:r>
     </w:p>
     <w:bookmarkEnd w:id="10"/>
-    <w:bookmarkStart w:id="11" w:name="Xbeba0af6875241f0ba8a717f4d7545ab7dd1ea1"/>
+    <w:bookmarkStart w:id="11" w:name="X8f1b53b5610d6a0c742d40bf35583d23a786a28"/>
     <w:p>
       <w:pPr>
         <w:pStyle w:val="Ttulo3"/>
       </w:pPr>
       <w:r>
-        <w:t xml:space="preserve">Diapositiva 3. Primera etapa: enginyeria del software i consultoria - 1:30</w:t>
+        <w:t xml:space="preserve">Diapositiva 3. Formació Professional: el descobriment clar de la vocació docent - 1:10</w:t>
       </w:r>
     </w:p>
     <w:p>
@@ -320,7 +352,7 @@
         <w:pStyle w:val="FirstParagraph"/>
       </w:pPr>
       <w:r>
-        <w:t xml:space="preserve">La primera etapa transcorre en la indústria del software. [to calmat]</w:t>
+        <w:t xml:space="preserve">Per donar consistència a aquesta decisió vaig cursar el màster en Formació del Professorat i vaig iniciar una etapa docent en Formació Professional, en l’àmbit de DAW i DAM. [pausa breu]</w:t>
       </w:r>
     </w:p>
     <w:p>
@@ -328,7 +360,7 @@
         <w:pStyle w:val="Textoindependiente"/>
       </w:pPr>
       <w:r>
-        <w:t xml:space="preserve">A Vida Software vaig treballar en un component del sistema operatiu Symbian orientat a incorporar interacció per veu en aplicacions mòbils. Era una peça de plataforma desenvolupada a baix nivell en C++, amb restriccions fortes de memòria, CPU i xarxa. El component es va presentar en entorns com el 3GSM/Mobile World Congress i estava vinculat al context d’innovació d’una patent de Vida Software sobre interfícies d’usuari.</w:t>
+        <w:t xml:space="preserve">A la Formació Professional vaig trobar allò que buscava des de feia temps: l’aula, la relació directa amb l’alumnat i la responsabilitat d’acompanyar processos d’aprenentatge.</w:t>
       </w:r>
     </w:p>
     <w:p>
@@ -336,7 +368,7 @@
         <w:pStyle w:val="Textoindependiente"/>
       </w:pPr>
       <w:r>
-        <w:t xml:space="preserve">Va ser una etapa tècnicament molt exigent i estimulant, que em va donar una base sòlida en sistemes i comunicacions. Al mateix temps, em va ajudar a identificar una altra dimensió que volia desenvolupar: el treball amb les persones, la comunicació i la construcció compartida de coneixement.</w:t>
+        <w:t xml:space="preserve">Va ser una etapa molt valuosa. Em va ajudar a aprendre a ensenyar, a escoltar millor i a entendre que la docència no és només transmetre contingut tècnic. També és crear condicions perquè l’estudiant pugui avançar, equivocar-se, recuperar confiança i aprendre a treballar en equip.</w:t>
       </w:r>
     </w:p>
     <w:p>
@@ -344,7 +376,25 @@
         <w:pStyle w:val="Textoindependiente"/>
       </w:pPr>
       <w:r>
-        <w:t xml:space="preserve">Per això vaig fer el pas a la consultoria, a openTrends, on vaig ampliar aquesta base cap a Java, Linux, Spring, sistemes d’informació, clients i equips. Allà la comunicació tècnica va guanyar pes: entendre necessitats, explicar decisions i fer mentoria a enginyers júniors.</w:t>
+        <w:t xml:space="preserve">Amb el temps, volia portar a l’aula continguts més avançats: enginyeria del software, arquitectura de software i disseny de sistemes d’informació, recolzats en la meva experiència professional. El lloc natural d’aquests continguts és la universitat, i cap allà vaig orientar la mirada.</w:t>
+      </w:r>
+    </w:p>
+    <w:bookmarkEnd w:id="11"/>
+    <w:bookmarkStart w:id="12" w:name="X81009d6c26c5fdd77402dc2b49454f763e8952d"/>
+    <w:p>
+      <w:pPr>
+        <w:pStyle w:val="Ttulo3"/>
+      </w:pPr>
+      <w:r>
+        <w:t xml:space="preserve">Diapositiva 4. De La Salle al TecnoCampus - 1:55</w:t>
+      </w:r>
+    </w:p>
+    <w:p>
+      <w:pPr>
+        <w:pStyle w:val="FirstParagraph"/>
+      </w:pPr>
+      <w:r>
+        <w:t xml:space="preserve">Em vaig incorporar a La Salle, un entorn universitari d’alt nivell tècnic. [transició]</w:t>
       </w:r>
     </w:p>
     <w:p>
@@ -352,17 +402,57 @@
         <w:pStyle w:val="Textoindependiente"/>
       </w:pPr>
       <w:r>
-        <w:t xml:space="preserve">La transició cap a la docència va ser, doncs, una evolució natural d’aquesta mateixa trajectòria professional.</w:t>
-      </w:r>
-    </w:p>
-    <w:bookmarkEnd w:id="11"/>
-    <w:bookmarkStart w:id="12" w:name="X072fbed73d3c58631c1cd7a7ff84bcd514ca7a3"/>
+        <w:t xml:space="preserve">Allà vaig impartir assignatures de programació, sistemes operatius i vaig dissenyar una experiència ABP a Projectes de Programació II. És una etapa que valoro molt: em va obrir la docència universitària i em va permetre portar a l’aula coneixement tècnic avançat.</w:t>
+      </w:r>
+    </w:p>
+    <w:p>
+      <w:pPr>
+        <w:pStyle w:val="Textoindependiente"/>
+      </w:pPr>
+      <w:r>
+        <w:t xml:space="preserve">El pas cap al TecnoCampus va ser una decisió reflexionada, valorada amb la direcció i la coordinació acadèmica. [pausa breu]</w:t>
+      </w:r>
+    </w:p>
+    <w:p>
+      <w:pPr>
+        <w:pStyle w:val="Textoindependiente"/>
+      </w:pPr>
+      <w:r>
+        <w:t xml:space="preserve">La Salle té una tradició d’enginyeria sòlida, amb una identitat històrica molt forta en telecomunicacions i electrònica. La meva docència allà se centrava en els fonaments: el disseny i la programació orientats a objectes, i el desenvolupament d’aplicacions mòbils. Són la llavor de l’enginyeria del software, i em va agradar molt ensenyar-los. Però el meu territori professional és el tram següent d’aquest mateix camí: l’arquitectura de software, el backend empresarial i els sistemes d’informació. [mirada al tribunal]</w:t>
+      </w:r>
+    </w:p>
+    <w:p>
+      <w:pPr>
+        <w:pStyle w:val="Textoindependiente"/>
+      </w:pPr>
+      <w:r>
+        <w:t xml:space="preserve">I aquest tram tenia un encaix curricular directe al TecnoCampus: la gestió i els sistemes d’informació formen part de la mateixa denominació del grau, amb una línia completa d’enginyeria del software i de disseny de sistemes d’informació. És un entorn especialment alineat amb el desenvolupament de la meva especialització docent.</w:t>
+      </w:r>
+    </w:p>
+    <w:p>
+      <w:pPr>
+        <w:pStyle w:val="Textoindependiente"/>
+      </w:pPr>
+      <w:r>
+        <w:t xml:space="preserve">La proximitat geogràfica va reforçar la decisió, perquè feia la trajectòria acadèmica sostenible i compatible amb les responsabilitats familiars.</w:t>
+      </w:r>
+    </w:p>
+    <w:p>
+      <w:pPr>
+        <w:pStyle w:val="Textoindependiente"/>
+      </w:pPr>
+      <w:r>
+        <w:t xml:space="preserve">Vaig establir contacte acadèmic amb el TecnoCampus i vaig començar-hi com a professor associat.</w:t>
+      </w:r>
+    </w:p>
+    <w:bookmarkEnd w:id="12"/>
+    <w:bookmarkStart w:id="13" w:name="X5d41084c58d6ec1395fdad0ba13ce409d532c19"/>
     <w:p>
       <w:pPr>
         <w:pStyle w:val="Ttulo3"/>
       </w:pPr>
       <w:r>
-        <w:t xml:space="preserve">Diapositiva 4. Formació Professional: el descobriment clar de la vocació docent - 1:10</w:t>
+        <w:t xml:space="preserve">Diapositiva 5. TecnoCampus: docència, equip i arquitectura de software - 1:20</w:t>
       </w:r>
     </w:p>
     <w:p>
@@ -370,7 +460,7 @@
         <w:pStyle w:val="FirstParagraph"/>
       </w:pPr>
       <w:r>
-        <w:t xml:space="preserve">Per donar consistència a aquesta decisió vaig cursar el màster en Formació del Professorat i vaig iniciar una etapa docent en Formació Professional, en l’àmbit de DAW i DAM. [pausa breu]</w:t>
+        <w:t xml:space="preserve">El TecnoCampus ha estat el lloc on aquesta trajectòria ha trobat més coherència. [pausa breu]</w:t>
       </w:r>
     </w:p>
     <w:p>
@@ -378,7 +468,7 @@
         <w:pStyle w:val="Textoindependiente"/>
       </w:pPr>
       <w:r>
-        <w:t xml:space="preserve">A la Formació Professional vaig trobar allò que buscava des de feia temps: l’aula, la relació directa amb l’alumnat i la responsabilitat d’acompanyar processos d’aprenentatge.</w:t>
+        <w:t xml:space="preserve">Des de 2021 hi he desenvolupat docència universitària continuada en assignatures vinculades a programació, estructures de dades, aplicacions d’Internet i disseny de sistemes d’informació.</w:t>
       </w:r>
     </w:p>
     <w:p>
@@ -386,7 +476,7 @@
         <w:pStyle w:val="Textoindependiente"/>
       </w:pPr>
       <w:r>
-        <w:t xml:space="preserve">Va ser una etapa molt valuosa. Em va ajudar a aprendre a ensenyar, a escoltar millor i a entendre que la docència no és només transmetre contingut tècnic. També és crear condicions perquè l’estudiant pugui avançar, equivocar-se, recuperar confiança i aprendre a treballar en equip.</w:t>
+        <w:t xml:space="preserve">Aquesta continuïtat no és només temporal. El certificat institucional recull quinze registres oficials d’avaluació docent, entre els cursos 2021-2022 i 2025-2026, amb una mitjana aritmètica simple de 8,75 sobre 10. I els quatre registres dels dos darrers cursos presenten una mitjana aritmètica simple de 9,03 sobre 10.</w:t>
       </w:r>
     </w:p>
     <w:p>
@@ -394,141 +484,33 @@
         <w:pStyle w:val="Textoindependiente"/>
       </w:pPr>
       <w:r>
-        <w:t xml:space="preserve">Amb el temps, volia portar a l’aula continguts més avançats: enginyeria del software, arquitectura de software i disseny de sistemes d’informació, recolzats en la meva experiència professional. El lloc natural d’aquests continguts és la universitat, i cap allà vaig orientar la mirada.</w:t>
-      </w:r>
-    </w:p>
-    <w:bookmarkEnd w:id="12"/>
-    <w:bookmarkStart w:id="13" w:name="X9852dbbc3aab6327bd63766b6c9df38c577075b"/>
+        <w:t xml:space="preserve">També ha estat molt important el treball amb l’equip. Voldria destacar especialment el Dr. Josep Roure, amb qui he compartit docència i aprenentatge en arquitectura de software.</w:t>
+      </w:r>
+    </w:p>
+    <w:p>
+      <w:pPr>
+        <w:pStyle w:val="Textoindependiente"/>
+      </w:pPr>
+      <w:r>
+        <w:t xml:space="preserve">La participació acreditada en el projecte SQAI d’Aprenentatge Basat en Projectes a Laboratori d’Aplicacions Internet m’ha permès integrar docència, arquitectura de software i millora educativa.</w:t>
+      </w:r>
+    </w:p>
+    <w:p>
+      <w:pPr>
+        <w:pStyle w:val="Textoindependiente"/>
+      </w:pPr>
+      <w:r>
+        <w:t xml:space="preserve">D’aquest punt de trobada neix precisament la classe magistral de la segona part.</w:t>
+      </w:r>
+    </w:p>
+    <w:bookmarkEnd w:id="13"/>
+    <w:bookmarkStart w:id="14" w:name="Xe694bcf830e70299140e7858bd4177d134c259a"/>
     <w:p>
       <w:pPr>
         <w:pStyle w:val="Ttulo3"/>
       </w:pPr>
       <w:r>
-        <w:t xml:space="preserve">Diapositiva 5. De La Salle al TecnoCampus - 1:55</w:t>
-      </w:r>
-    </w:p>
-    <w:p>
-      <w:pPr>
-        <w:pStyle w:val="FirstParagraph"/>
-      </w:pPr>
-      <w:r>
-        <w:t xml:space="preserve">Em vaig incorporar a La Salle, un entorn universitari d’alt nivell tècnic. [transició]</w:t>
-      </w:r>
-    </w:p>
-    <w:p>
-      <w:pPr>
-        <w:pStyle w:val="Textoindependiente"/>
-      </w:pPr>
-      <w:r>
-        <w:t xml:space="preserve">Allà vaig impartir assignatures de programació, sistemes operatius i vaig dissenyar una experiència ABP a Projectes de Programació II. És una etapa que valoro molt: em va obrir la docència universitària i em va permetre portar a l’aula coneixement tècnic avançat.</w:t>
-      </w:r>
-    </w:p>
-    <w:p>
-      <w:pPr>
-        <w:pStyle w:val="Textoindependiente"/>
-      </w:pPr>
-      <w:r>
-        <w:t xml:space="preserve">El pas cap al TecnoCampus va ser una decisió reflexionada, valorada amb la direcció i la coordinació acadèmica. [pausa breu]</w:t>
-      </w:r>
-    </w:p>
-    <w:p>
-      <w:pPr>
-        <w:pStyle w:val="Textoindependiente"/>
-      </w:pPr>
-      <w:r>
-        <w:t xml:space="preserve">La Salle té una tradició d’enginyeria sòlida, amb una identitat històrica molt forta en telecomunicacions i electrònica. La meva docència allà se centrava en els fonaments: el disseny i la programació orientats a objectes, i el desenvolupament d’aplicacions mòbils. Són la llavor de l’enginyeria del software, i em va agradar molt ensenyar-los. Però el meu territori professional és el tram següent d’aquest mateix camí: l’arquitectura de software, el backend empresarial i els sistemes d’informació. [mirada al tribunal]</w:t>
-      </w:r>
-    </w:p>
-    <w:p>
-      <w:pPr>
-        <w:pStyle w:val="Textoindependiente"/>
-      </w:pPr>
-      <w:r>
-        <w:t xml:space="preserve">I aquest tram tenia un encaix curricular directe al TecnoCampus: la gestió i els sistemes d’informació formen part de la mateixa denominació del grau, amb una línia completa d’enginyeria del software i de disseny de sistemes d’informació. És un entorn especialment alineat amb el desenvolupament de la meva especialització docent.</w:t>
-      </w:r>
-    </w:p>
-    <w:p>
-      <w:pPr>
-        <w:pStyle w:val="Textoindependiente"/>
-      </w:pPr>
-      <w:r>
-        <w:t xml:space="preserve">La proximitat geogràfica va reforçar la decisió, perquè feia la trajectòria acadèmica sostenible i compatible amb les responsabilitats familiars.</w:t>
-      </w:r>
-    </w:p>
-    <w:p>
-      <w:pPr>
-        <w:pStyle w:val="Textoindependiente"/>
-      </w:pPr>
-      <w:r>
-        <w:t xml:space="preserve">Vaig establir contacte acadèmic amb el TecnoCampus i vaig començar-hi com a professor associat.</w:t>
-      </w:r>
-    </w:p>
-    <w:bookmarkEnd w:id="13"/>
-    <w:bookmarkStart w:id="14" w:name="X343e33e00c573bb3b1b586f64536dab76d15277"/>
-    <w:p>
-      <w:pPr>
-        <w:pStyle w:val="Ttulo3"/>
-      </w:pPr>
-      <w:r>
-        <w:t xml:space="preserve">Diapositiva 6. TecnoCampus: docència, equip i arquitectura de software - 1:20</w:t>
-      </w:r>
-    </w:p>
-    <w:p>
-      <w:pPr>
-        <w:pStyle w:val="FirstParagraph"/>
-      </w:pPr>
-      <w:r>
-        <w:t xml:space="preserve">El TecnoCampus ha estat el lloc on aquesta trajectòria ha trobat més coherència. [pausa breu]</w:t>
-      </w:r>
-    </w:p>
-    <w:p>
-      <w:pPr>
-        <w:pStyle w:val="Textoindependiente"/>
-      </w:pPr>
-      <w:r>
-        <w:t xml:space="preserve">Des de 2021 hi he desenvolupat docència universitària continuada en assignatures vinculades a programació, estructures de dades, aplicacions d’Internet i disseny de sistemes d’informació.</w:t>
-      </w:r>
-    </w:p>
-    <w:p>
-      <w:pPr>
-        <w:pStyle w:val="Textoindependiente"/>
-      </w:pPr>
-      <w:r>
-        <w:t xml:space="preserve">Aquesta continuïtat no és només temporal. El certificat institucional recull quinze registres oficials d’avaluació docent, entre els cursos 2021-2022 i 2025-2026, amb una mitjana aritmètica simple de 8,75 sobre 10. I els quatre registres dels dos darrers cursos presenten una mitjana aritmètica simple de 9,03 sobre 10.</w:t>
-      </w:r>
-    </w:p>
-    <w:p>
-      <w:pPr>
-        <w:pStyle w:val="Textoindependiente"/>
-      </w:pPr>
-      <w:r>
-        <w:t xml:space="preserve">També ha estat molt important el treball amb l’equip. Voldria destacar especialment el Dr. Josep Roure, amb qui he compartit docència i aprenentatge en arquitectura de software.</w:t>
-      </w:r>
-    </w:p>
-    <w:p>
-      <w:pPr>
-        <w:pStyle w:val="Textoindependiente"/>
-      </w:pPr>
-      <w:r>
-        <w:t xml:space="preserve">La participació acreditada en el projecte SQAI d’Aprenentatge Basat en Projectes a Laboratori d’Aplicacions Internet m’ha permès integrar docència, arquitectura de software i millora educativa.</w:t>
-      </w:r>
-    </w:p>
-    <w:p>
-      <w:pPr>
-        <w:pStyle w:val="Textoindependiente"/>
-      </w:pPr>
-      <w:r>
-        <w:t xml:space="preserve">D’aquest punt de trobada neix precisament la classe magistral de la segona part.</w:t>
-      </w:r>
-    </w:p>
-    <w:bookmarkEnd w:id="14"/>
-    <w:bookmarkStart w:id="15" w:name="Xadd82b85712f303f802b55ba175714cc167edc7"/>
-    <w:p>
-      <w:pPr>
-        <w:pStyle w:val="Ttulo3"/>
-      </w:pPr>
-      <w:r>
-        <w:t xml:space="preserve">Diapositiva 7. Consultoria i formació internacional, recerca doctoral i projecte de futur - 2:00</w:t>
+        <w:t xml:space="preserve">Diapositiva 6. Consultoria i formació internacional, recerca doctoral i projecte de futur - 2:00</w:t>
       </w:r>
     </w:p>
     <w:p>
@@ -602,9 +584,9 @@
         </w:pict>
       </w:r>
     </w:p>
+    <w:bookmarkEnd w:id="14"/>
     <w:bookmarkEnd w:id="15"/>
-    <w:bookmarkEnd w:id="16"/>
-    <w:bookmarkStart w:id="18" w:name="Xdd17a7567f75bc85227116ec496a3da3b46265c"/>
+    <w:bookmarkStart w:id="17" w:name="Xdd17a7567f75bc85227116ec496a3da3b46265c"/>
     <w:p>
       <w:pPr>
         <w:pStyle w:val="Ttulo2"/>
@@ -618,10 +600,10 @@
         <w:pStyle w:val="FirstParagraph"/>
       </w:pPr>
       <w:r>
-        <w:t xml:space="preserve">Aquest annex no forma part del cos principal de deu minuts ni de la numeració 1-7. Només s’ha de mostrar si el tribunal pregunta pel pas de La Salle al TecnoCampus, qüestiona l’encaix acadèmic o demana concretar la diferència d’orientació entre les titulacions. No s’ha de mostrar sense una pregunta o una necessitat clara, ni utilitzar-lo com a defensa preventiva.</w:t>
-      </w:r>
-    </w:p>
-    <w:bookmarkStart w:id="17" w:name="resposta-oral-de-reserva---30-45-segons"/>
+        <w:t xml:space="preserve">Aquest annex no forma part del cos principal de deu minuts ni de la numeració 1-6. Només s’ha de mostrar si el tribunal pregunta pel pas de La Salle al TecnoCampus, qüestiona l’encaix acadèmic o demana concretar la diferència d’orientació entre les titulacions. No s’ha de mostrar sense una pregunta o una necessitat clara, ni utilitzar-lo com a defensa preventiva.</w:t>
+      </w:r>
+    </w:p>
+    <w:bookmarkStart w:id="16" w:name="resposta-oral-de-reserva---30-45-segons"/>
     <w:p>
       <w:pPr>
         <w:pStyle w:val="Ttulo3"/>
@@ -669,576 +651,660 @@
         </w:pict>
       </w:r>
     </w:p>
+    <w:bookmarkEnd w:id="16"/>
     <w:bookmarkEnd w:id="17"/>
+    <w:bookmarkStart w:id="25" w:name="notes-del-presentador-per-diapositiva"/>
+    <w:p>
+      <w:pPr>
+        <w:pStyle w:val="Ttulo2"/>
+      </w:pPr>
+      <w:r>
+        <w:t xml:space="preserve">2. Notes del presentador per diapositiva</w:t>
+      </w:r>
+    </w:p>
+    <w:bookmarkStart w:id="18" w:name="trajectòria---050"/>
+    <w:p>
+      <w:pPr>
+        <w:pStyle w:val="Ttulo3"/>
+      </w:pPr>
+      <w:r>
+        <w:t xml:space="preserve">1. Trajectòria - 0:50</w:t>
+      </w:r>
+    </w:p>
+    <w:p>
+      <w:pPr>
+        <w:pStyle w:val="Compact"/>
+        <w:numPr>
+          <w:ilvl w:val="0"/>
+          <w:numId w:val="1003"/>
+        </w:numPr>
+      </w:pPr>
+      <w:r>
+        <w:t xml:space="preserve">Obrir amb agraïment breu.</w:t>
+      </w:r>
+    </w:p>
+    <w:p>
+      <w:pPr>
+        <w:pStyle w:val="Compact"/>
+        <w:numPr>
+          <w:ilvl w:val="0"/>
+          <w:numId w:val="1003"/>
+        </w:numPr>
+      </w:pPr>
+      <w:r>
+        <w:t xml:space="preserve">No llegir CV: explicar fil conductor.</w:t>
+      </w:r>
+    </w:p>
+    <w:p>
+      <w:pPr>
+        <w:pStyle w:val="Compact"/>
+        <w:numPr>
+          <w:ilvl w:val="0"/>
+          <w:numId w:val="1003"/>
+        </w:numPr>
+      </w:pPr>
+      <w:r>
+        <w:t xml:space="preserve">2004 -&gt; un sol fil conductor: enginyer a la indústria, professor universitari, investigador en com s’ensenya l’enginyeria del software.</w:t>
+      </w:r>
+    </w:p>
+    <w:p>
+      <w:pPr>
+        <w:pStyle w:val="Compact"/>
+        <w:numPr>
+          <w:ilvl w:val="0"/>
+          <w:numId w:val="1003"/>
+        </w:numPr>
+      </w:pPr>
+      <w:r>
+        <w:t xml:space="preserve">Missatge: trajectòria coherent amb la plaça.</w:t>
+      </w:r>
+    </w:p>
+    <w:p>
+      <w:pPr>
+        <w:pStyle w:val="Compact"/>
+        <w:numPr>
+          <w:ilvl w:val="0"/>
+          <w:numId w:val="1003"/>
+        </w:numPr>
+      </w:pPr>
+      <w:r>
+        <w:t xml:space="preserve">Transició: base professional en indústria.</w:t>
+      </w:r>
+    </w:p>
     <w:bookmarkEnd w:id="18"/>
-    <w:bookmarkStart w:id="27" w:name="notes-del-presentador-per-diapositiva"/>
-    <w:p>
-      <w:pPr>
-        <w:pStyle w:val="Ttulo2"/>
-      </w:pPr>
-      <w:r>
-        <w:t xml:space="preserve">2. Notes del presentador per diapositiva</w:t>
-      </w:r>
-    </w:p>
-    <w:bookmarkStart w:id="19" w:name="portada---015"/>
+    <w:bookmarkStart w:id="19" w:name="indústria-i-consultoria---130"/>
     <w:p>
       <w:pPr>
         <w:pStyle w:val="Ttulo3"/>
       </w:pPr>
       <w:r>
-        <w:t xml:space="preserve">1. Portada - 0:15</w:t>
-      </w:r>
-    </w:p>
-    <w:p>
-      <w:pPr>
-        <w:pStyle w:val="Compact"/>
-        <w:numPr>
-          <w:ilvl w:val="0"/>
-          <w:numId w:val="1003"/>
-        </w:numPr>
-      </w:pPr>
-      <w:r>
-        <w:t xml:space="preserve">Obrir amb agraïment breu i salutació al tribunal.</w:t>
-      </w:r>
-    </w:p>
-    <w:p>
-      <w:pPr>
-        <w:pStyle w:val="Compact"/>
-        <w:numPr>
-          <w:ilvl w:val="0"/>
-          <w:numId w:val="1003"/>
-        </w:numPr>
-      </w:pPr>
-      <w:r>
-        <w:t xml:space="preserve">Només benvinguda: la introducció s’explica amb la diapositiva 2.</w:t>
-      </w:r>
-    </w:p>
-    <w:p>
-      <w:pPr>
-        <w:pStyle w:val="Compact"/>
-        <w:numPr>
-          <w:ilvl w:val="0"/>
-          <w:numId w:val="1003"/>
-        </w:numPr>
-      </w:pPr>
-      <w:r>
-        <w:t xml:space="preserve">Transició: avançar a la diapositiva del fil conductor.</w:t>
+        <w:t xml:space="preserve">2. Indústria i consultoria - 1:30</w:t>
+      </w:r>
+    </w:p>
+    <w:p>
+      <w:pPr>
+        <w:pStyle w:val="Compact"/>
+        <w:numPr>
+          <w:ilvl w:val="0"/>
+          <w:numId w:val="1004"/>
+        </w:numPr>
+      </w:pPr>
+      <w:r>
+        <w:t xml:space="preserve">Vida Software: component del sistema operatiu Symbian per a interacció per veu.</w:t>
+      </w:r>
+    </w:p>
+    <w:p>
+      <w:pPr>
+        <w:pStyle w:val="Compact"/>
+        <w:numPr>
+          <w:ilvl w:val="0"/>
+          <w:numId w:val="1004"/>
+        </w:numPr>
+      </w:pPr>
+      <w:r>
+        <w:t xml:space="preserve">No era una app final: permetia que aplicacions Nokia/Symbian incorporessin veu.</w:t>
+      </w:r>
+    </w:p>
+    <w:p>
+      <w:pPr>
+        <w:pStyle w:val="Compact"/>
+        <w:numPr>
+          <w:ilvl w:val="0"/>
+          <w:numId w:val="1004"/>
+        </w:numPr>
+      </w:pPr>
+      <w:r>
+        <w:t xml:space="preserve">C/C++, rendiment, memòria i dispositiu com a senyals de profunditat tècnica.</w:t>
+      </w:r>
+    </w:p>
+    <w:p>
+      <w:pPr>
+        <w:pStyle w:val="Compact"/>
+        <w:numPr>
+          <w:ilvl w:val="0"/>
+          <w:numId w:val="1004"/>
+        </w:numPr>
+      </w:pPr>
+      <w:r>
+        <w:t xml:space="preserve">3GSM/Mobile World Congress i patent com a context d’innovació; no presentar la patent com a pròpia.</w:t>
+      </w:r>
+    </w:p>
+    <w:p>
+      <w:pPr>
+        <w:pStyle w:val="Compact"/>
+        <w:numPr>
+          <w:ilvl w:val="0"/>
+          <w:numId w:val="1004"/>
+        </w:numPr>
+      </w:pPr>
+      <w:r>
+        <w:t xml:space="preserve">openTrends: consultoria, clients, equips i sistemes d’informació.</w:t>
+      </w:r>
+    </w:p>
+    <w:p>
+      <w:pPr>
+        <w:pStyle w:val="Compact"/>
+        <w:numPr>
+          <w:ilvl w:val="0"/>
+          <w:numId w:val="1004"/>
+        </w:numPr>
+      </w:pPr>
+      <w:r>
+        <w:t xml:space="preserve">Punt clau: el que més gaudia era formar perfils més júniors.</w:t>
+      </w:r>
+    </w:p>
+    <w:p>
+      <w:pPr>
+        <w:pStyle w:val="Compact"/>
+        <w:numPr>
+          <w:ilvl w:val="0"/>
+          <w:numId w:val="1004"/>
+        </w:numPr>
+      </w:pPr>
+      <w:r>
+        <w:t xml:space="preserve">La comunicació passa de ser eina professional a pràctica docent.</w:t>
+      </w:r>
+    </w:p>
+    <w:p>
+      <w:pPr>
+        <w:pStyle w:val="Compact"/>
+        <w:numPr>
+          <w:ilvl w:val="0"/>
+          <w:numId w:val="1004"/>
+        </w:numPr>
+      </w:pPr>
+      <w:r>
+        <w:t xml:space="preserve">Transició: màster en Formació del Professorat i entrada a la Formació Professional.</w:t>
       </w:r>
     </w:p>
     <w:bookmarkEnd w:id="19"/>
-    <w:bookmarkStart w:id="20" w:name="fil-conductor-i-recorregut---035"/>
+    <w:bookmarkStart w:id="20" w:name="stucom---110"/>
     <w:p>
       <w:pPr>
         <w:pStyle w:val="Ttulo3"/>
       </w:pPr>
       <w:r>
-        <w:t xml:space="preserve">2. Fil conductor i recorregut - 0:35</w:t>
-      </w:r>
-    </w:p>
-    <w:p>
-      <w:pPr>
-        <w:pStyle w:val="Compact"/>
-        <w:numPr>
-          <w:ilvl w:val="0"/>
-          <w:numId w:val="1004"/>
-        </w:numPr>
-      </w:pPr>
-      <w:r>
-        <w:t xml:space="preserve">No llegir CV: explicar fil conductor.</w:t>
-      </w:r>
-    </w:p>
-    <w:p>
-      <w:pPr>
-        <w:pStyle w:val="Compact"/>
-        <w:numPr>
-          <w:ilvl w:val="0"/>
-          <w:numId w:val="1004"/>
-        </w:numPr>
-      </w:pPr>
-      <w:r>
-        <w:t xml:space="preserve">2004 -&gt; un sol fil conductor: enginyer a la indústria, professor universitari, investigador en com s’ensenya l’enginyeria del software.</w:t>
-      </w:r>
-    </w:p>
-    <w:p>
-      <w:pPr>
-        <w:pStyle w:val="Compact"/>
-        <w:numPr>
-          <w:ilvl w:val="0"/>
-          <w:numId w:val="1004"/>
-        </w:numPr>
-      </w:pPr>
-      <w:r>
-        <w:t xml:space="preserve">Recorregut: base professional, vocació docent, pas a la universitat, consolidació al TecnoCampus i projecte de futur.</w:t>
-      </w:r>
-    </w:p>
-    <w:p>
-      <w:pPr>
-        <w:pStyle w:val="Compact"/>
-        <w:numPr>
-          <w:ilvl w:val="0"/>
-          <w:numId w:val="1004"/>
-        </w:numPr>
-      </w:pPr>
-      <w:r>
-        <w:t xml:space="preserve">Missatge: trajectòria coherent amb la plaça.</w:t>
-      </w:r>
-    </w:p>
-    <w:p>
-      <w:pPr>
-        <w:pStyle w:val="Compact"/>
-        <w:numPr>
-          <w:ilvl w:val="0"/>
-          <w:numId w:val="1004"/>
-        </w:numPr>
-      </w:pPr>
-      <w:r>
-        <w:t xml:space="preserve">És suport visual de la introducció, no un bloc nou: no allargar.</w:t>
-      </w:r>
-    </w:p>
-    <w:p>
-      <w:pPr>
-        <w:pStyle w:val="Compact"/>
-        <w:numPr>
-          <w:ilvl w:val="0"/>
-          <w:numId w:val="1004"/>
-        </w:numPr>
-      </w:pPr>
-      <w:r>
-        <w:t xml:space="preserve">Transició: base professional en indústria.</w:t>
+        <w:t xml:space="preserve">3. Stucom - 1:10</w:t>
+      </w:r>
+    </w:p>
+    <w:p>
+      <w:pPr>
+        <w:pStyle w:val="Compact"/>
+        <w:numPr>
+          <w:ilvl w:val="0"/>
+          <w:numId w:val="1005"/>
+        </w:numPr>
+      </w:pPr>
+      <w:r>
+        <w:t xml:space="preserve">Decisió vocacional, no improvisació.</w:t>
+      </w:r>
+    </w:p>
+    <w:p>
+      <w:pPr>
+        <w:pStyle w:val="Compact"/>
+        <w:numPr>
+          <w:ilvl w:val="0"/>
+          <w:numId w:val="1005"/>
+        </w:numPr>
+      </w:pPr>
+      <w:r>
+        <w:t xml:space="preserve">Màster en Formació del Professorat + FP DAW/DAM.</w:t>
+      </w:r>
+    </w:p>
+    <w:p>
+      <w:pPr>
+        <w:pStyle w:val="Compact"/>
+        <w:numPr>
+          <w:ilvl w:val="0"/>
+          <w:numId w:val="1005"/>
+        </w:numPr>
+      </w:pPr>
+      <w:r>
+        <w:t xml:space="preserve">Aula, relació amb alumnat, escolta i acompanyament.</w:t>
+      </w:r>
+    </w:p>
+    <w:p>
+      <w:pPr>
+        <w:pStyle w:val="Compact"/>
+        <w:numPr>
+          <w:ilvl w:val="0"/>
+          <w:numId w:val="1005"/>
+        </w:numPr>
+      </w:pPr>
+      <w:r>
+        <w:t xml:space="preserve">Agraïment a l’FP; no menysvalorar-la.</w:t>
+      </w:r>
+    </w:p>
+    <w:p>
+      <w:pPr>
+        <w:pStyle w:val="Compact"/>
+        <w:numPr>
+          <w:ilvl w:val="0"/>
+          <w:numId w:val="1005"/>
+        </w:numPr>
+      </w:pPr>
+      <w:r>
+        <w:t xml:space="preserve">Evolució cap a continguts tècnics universitaris més avançats.</w:t>
       </w:r>
     </w:p>
     <w:bookmarkEnd w:id="20"/>
-    <w:bookmarkStart w:id="21" w:name="indústria-i-consultoria---130"/>
+    <w:bookmarkStart w:id="21" w:name="de-la-salle-al-tecnocampus---155"/>
     <w:p>
       <w:pPr>
         <w:pStyle w:val="Ttulo3"/>
       </w:pPr>
       <w:r>
-        <w:t xml:space="preserve">3. Indústria i consultoria - 1:30</w:t>
-      </w:r>
-    </w:p>
-    <w:p>
-      <w:pPr>
-        <w:pStyle w:val="Compact"/>
-        <w:numPr>
-          <w:ilvl w:val="0"/>
-          <w:numId w:val="1005"/>
-        </w:numPr>
-      </w:pPr>
-      <w:r>
-        <w:t xml:space="preserve">Vida Software: component del sistema operatiu Symbian per a interacció per veu.</w:t>
-      </w:r>
-    </w:p>
-    <w:p>
-      <w:pPr>
-        <w:pStyle w:val="Compact"/>
-        <w:numPr>
-          <w:ilvl w:val="0"/>
-          <w:numId w:val="1005"/>
-        </w:numPr>
-      </w:pPr>
-      <w:r>
-        <w:t xml:space="preserve">No era una app final: permetia que aplicacions Nokia/Symbian incorporessin veu.</w:t>
-      </w:r>
-    </w:p>
-    <w:p>
-      <w:pPr>
-        <w:pStyle w:val="Compact"/>
-        <w:numPr>
-          <w:ilvl w:val="0"/>
-          <w:numId w:val="1005"/>
-        </w:numPr>
-      </w:pPr>
-      <w:r>
-        <w:t xml:space="preserve">C/C++, rendiment, memòria i dispositiu com a senyals de profunditat tècnica.</w:t>
-      </w:r>
-    </w:p>
-    <w:p>
-      <w:pPr>
-        <w:pStyle w:val="Compact"/>
-        <w:numPr>
-          <w:ilvl w:val="0"/>
-          <w:numId w:val="1005"/>
-        </w:numPr>
-      </w:pPr>
-      <w:r>
-        <w:t xml:space="preserve">3GSM/Mobile World Congress i patent com a context d’innovació; no presentar la patent com a pròpia.</w:t>
-      </w:r>
-    </w:p>
-    <w:p>
-      <w:pPr>
-        <w:pStyle w:val="Compact"/>
-        <w:numPr>
-          <w:ilvl w:val="0"/>
-          <w:numId w:val="1005"/>
-        </w:numPr>
-      </w:pPr>
-      <w:r>
-        <w:t xml:space="preserve">openTrends: consultoria, clients, equips i sistemes d’informació.</w:t>
-      </w:r>
-    </w:p>
-    <w:p>
-      <w:pPr>
-        <w:pStyle w:val="Compact"/>
-        <w:numPr>
-          <w:ilvl w:val="0"/>
-          <w:numId w:val="1005"/>
-        </w:numPr>
-      </w:pPr>
-      <w:r>
-        <w:t xml:space="preserve">Punt clau: el que més gaudia era formar perfils més júniors.</w:t>
-      </w:r>
-    </w:p>
-    <w:p>
-      <w:pPr>
-        <w:pStyle w:val="Compact"/>
-        <w:numPr>
-          <w:ilvl w:val="0"/>
-          <w:numId w:val="1005"/>
-        </w:numPr>
-      </w:pPr>
-      <w:r>
-        <w:t xml:space="preserve">La comunicació passa de ser eina professional a pràctica docent.</w:t>
-      </w:r>
-    </w:p>
-    <w:p>
-      <w:pPr>
-        <w:pStyle w:val="Compact"/>
-        <w:numPr>
-          <w:ilvl w:val="0"/>
-          <w:numId w:val="1005"/>
-        </w:numPr>
-      </w:pPr>
-      <w:r>
-        <w:t xml:space="preserve">Transició: màster en Formació del Professorat i entrada a la Formació Professional.</w:t>
+        <w:t xml:space="preserve">4. De La Salle al TecnoCampus - 1:55</w:t>
+      </w:r>
+    </w:p>
+    <w:p>
+      <w:pPr>
+        <w:pStyle w:val="Compact"/>
+        <w:numPr>
+          <w:ilvl w:val="0"/>
+          <w:numId w:val="1006"/>
+        </w:numPr>
+      </w:pPr>
+      <w:r>
+        <w:t xml:space="preserve">La Salle: incorporació a un entorn universitari d’alt nivell tècnic.</w:t>
+      </w:r>
+    </w:p>
+    <w:p>
+      <w:pPr>
+        <w:pStyle w:val="Compact"/>
+        <w:numPr>
+          <w:ilvl w:val="0"/>
+          <w:numId w:val="1006"/>
+        </w:numPr>
+      </w:pPr>
+      <w:r>
+        <w:t xml:space="preserve">La Salle és etapa valuosa; evitar comparacions jeràrquiques.</w:t>
+      </w:r>
+    </w:p>
+    <w:p>
+      <w:pPr>
+        <w:pStyle w:val="Compact"/>
+        <w:numPr>
+          <w:ilvl w:val="0"/>
+          <w:numId w:val="1006"/>
+        </w:numPr>
+      </w:pPr>
+      <w:r>
+        <w:t xml:space="preserve">Motiu principal: encaix acadèmic més directe amb enginyeria del software i sistemes d’informació.</w:t>
+      </w:r>
+    </w:p>
+    <w:p>
+      <w:pPr>
+        <w:pStyle w:val="Compact"/>
+        <w:numPr>
+          <w:ilvl w:val="0"/>
+          <w:numId w:val="1006"/>
+        </w:numPr>
+      </w:pPr>
+      <w:r>
+        <w:t xml:space="preserve">Conciliació com a factor complementari de sostenibilitat.</w:t>
+      </w:r>
+    </w:p>
+    <w:p>
+      <w:pPr>
+        <w:pStyle w:val="Compact"/>
+        <w:numPr>
+          <w:ilvl w:val="0"/>
+          <w:numId w:val="1006"/>
+        </w:numPr>
+      </w:pPr>
+      <w:r>
+        <w:t xml:space="preserve">Conversa amb coordinador i director a La Salle.</w:t>
+      </w:r>
+    </w:p>
+    <w:p>
+      <w:pPr>
+        <w:pStyle w:val="Compact"/>
+        <w:numPr>
+          <w:ilvl w:val="0"/>
+          <w:numId w:val="1006"/>
+        </w:numPr>
+      </w:pPr>
+      <w:r>
+        <w:t xml:space="preserve">Fonaments a La Salle: disseny i programació orientats a objectes i aplicacions mòbils; la llavor de l’enginyeria del software.</w:t>
+      </w:r>
+    </w:p>
+    <w:p>
+      <w:pPr>
+        <w:pStyle w:val="Compact"/>
+        <w:numPr>
+          <w:ilvl w:val="0"/>
+          <w:numId w:val="1006"/>
+        </w:numPr>
+      </w:pPr>
+      <w:r>
+        <w:t xml:space="preserve">Territori professional propi: arquitectura de software, backend empresarial i sistemes d’informació; el tram següent del mateix camí.</w:t>
+      </w:r>
+    </w:p>
+    <w:p>
+      <w:pPr>
+        <w:pStyle w:val="Compact"/>
+        <w:numPr>
+          <w:ilvl w:val="0"/>
+          <w:numId w:val="1006"/>
+        </w:numPr>
+      </w:pPr>
+      <w:r>
+        <w:t xml:space="preserve">Encaix curricular al TecnoCampus: la gestió i els sistemes d’informació formen part de la mateixa denominació del grau.</w:t>
+      </w:r>
+    </w:p>
+    <w:p>
+      <w:pPr>
+        <w:pStyle w:val="Compact"/>
+        <w:numPr>
+          <w:ilvl w:val="0"/>
+          <w:numId w:val="1006"/>
+        </w:numPr>
+      </w:pPr>
+      <w:r>
+        <w:t xml:space="preserve">No esmentar persones concretes; el contacte acadèmic es formula en genèric.</w:t>
+      </w:r>
+    </w:p>
+    <w:p>
+      <w:pPr>
+        <w:pStyle w:val="Compact"/>
+        <w:numPr>
+          <w:ilvl w:val="0"/>
+          <w:numId w:val="1006"/>
+        </w:numPr>
+      </w:pPr>
+      <w:r>
+        <w:t xml:space="preserve">TecnoCampus: docència universitària, software, sistemes d’informació, transferència i projecte sostenible.</w:t>
       </w:r>
     </w:p>
     <w:bookmarkEnd w:id="21"/>
-    <w:bookmarkStart w:id="22" w:name="stucom---110"/>
+    <w:bookmarkStart w:id="22" w:name="tecnocampus---120"/>
     <w:p>
       <w:pPr>
         <w:pStyle w:val="Ttulo3"/>
       </w:pPr>
       <w:r>
-        <w:t xml:space="preserve">4. Stucom - 1:10</w:t>
-      </w:r>
-    </w:p>
-    <w:p>
-      <w:pPr>
-        <w:pStyle w:val="Compact"/>
-        <w:numPr>
-          <w:ilvl w:val="0"/>
-          <w:numId w:val="1006"/>
-        </w:numPr>
-      </w:pPr>
-      <w:r>
-        <w:t xml:space="preserve">Decisió vocacional, no improvisació.</w:t>
-      </w:r>
-    </w:p>
-    <w:p>
-      <w:pPr>
-        <w:pStyle w:val="Compact"/>
-        <w:numPr>
-          <w:ilvl w:val="0"/>
-          <w:numId w:val="1006"/>
-        </w:numPr>
-      </w:pPr>
-      <w:r>
-        <w:t xml:space="preserve">Màster en Formació del Professorat + FP DAW/DAM.</w:t>
-      </w:r>
-    </w:p>
-    <w:p>
-      <w:pPr>
-        <w:pStyle w:val="Compact"/>
-        <w:numPr>
-          <w:ilvl w:val="0"/>
-          <w:numId w:val="1006"/>
-        </w:numPr>
-      </w:pPr>
-      <w:r>
-        <w:t xml:space="preserve">Aula, relació amb alumnat, escolta i acompanyament.</w:t>
-      </w:r>
-    </w:p>
-    <w:p>
-      <w:pPr>
-        <w:pStyle w:val="Compact"/>
-        <w:numPr>
-          <w:ilvl w:val="0"/>
-          <w:numId w:val="1006"/>
-        </w:numPr>
-      </w:pPr>
-      <w:r>
-        <w:t xml:space="preserve">Agraïment a l’FP; no menysvalorar-la.</w:t>
-      </w:r>
-    </w:p>
-    <w:p>
-      <w:pPr>
-        <w:pStyle w:val="Compact"/>
-        <w:numPr>
-          <w:ilvl w:val="0"/>
-          <w:numId w:val="1006"/>
-        </w:numPr>
-      </w:pPr>
-      <w:r>
-        <w:t xml:space="preserve">Evolució cap a continguts tècnics universitaris més avançats.</w:t>
+        <w:t xml:space="preserve">5. TecnoCampus - 1:20</w:t>
+      </w:r>
+    </w:p>
+    <w:p>
+      <w:pPr>
+        <w:pStyle w:val="Compact"/>
+        <w:numPr>
+          <w:ilvl w:val="0"/>
+          <w:numId w:val="1007"/>
+        </w:numPr>
+      </w:pPr>
+      <w:r>
+        <w:t xml:space="preserve">Docència continuada des de 2021.</w:t>
+      </w:r>
+    </w:p>
+    <w:p>
+      <w:pPr>
+        <w:pStyle w:val="Compact"/>
+        <w:numPr>
+          <w:ilvl w:val="0"/>
+          <w:numId w:val="1007"/>
+        </w:numPr>
+      </w:pPr>
+      <w:r>
+        <w:t xml:space="preserve">Assignatures: programació, dades, Internet, enginyeria, DSI.</w:t>
+      </w:r>
+    </w:p>
+    <w:p>
+      <w:pPr>
+        <w:pStyle w:val="Compact"/>
+        <w:numPr>
+          <w:ilvl w:val="0"/>
+          <w:numId w:val="1007"/>
+        </w:numPr>
+      </w:pPr>
+      <w:r>
+        <w:t xml:space="preserve">15 registres oficials d’avaluació docent: mitjana aritmètica simple de 8,75/10.</w:t>
+      </w:r>
+    </w:p>
+    <w:p>
+      <w:pPr>
+        <w:pStyle w:val="Compact"/>
+        <w:numPr>
+          <w:ilvl w:val="0"/>
+          <w:numId w:val="1007"/>
+        </w:numPr>
+      </w:pPr>
+      <w:r>
+        <w:t xml:space="preserve">Quatre registres dels dos darrers cursos: mitjana aritmètica simple de 9,03/10.</w:t>
+      </w:r>
+    </w:p>
+    <w:p>
+      <w:pPr>
+        <w:pStyle w:val="Compact"/>
+        <w:numPr>
+          <w:ilvl w:val="0"/>
+          <w:numId w:val="1007"/>
+        </w:numPr>
+      </w:pPr>
+      <w:r>
+        <w:t xml:space="preserve">No dir mitjana ponderada ni percentatge de satisfacció.</w:t>
+      </w:r>
+    </w:p>
+    <w:p>
+      <w:pPr>
+        <w:pStyle w:val="Compact"/>
+        <w:numPr>
+          <w:ilvl w:val="0"/>
+          <w:numId w:val="1007"/>
+        </w:numPr>
+      </w:pPr>
+      <w:r>
+        <w:t xml:space="preserve">Josep Roure: arquitectura, DDD, Clean Architecture, hexagonal.</w:t>
+      </w:r>
+    </w:p>
+    <w:p>
+      <w:pPr>
+        <w:pStyle w:val="Compact"/>
+        <w:numPr>
+          <w:ilvl w:val="0"/>
+          <w:numId w:val="1007"/>
+        </w:numPr>
+      </w:pPr>
+      <w:r>
+        <w:t xml:space="preserve">Participació acreditada al projecte SQAI d’ABP a Laboratori d’Aplicacions Internet.</w:t>
+      </w:r>
+    </w:p>
+    <w:p>
+      <w:pPr>
+        <w:pStyle w:val="Compact"/>
+        <w:numPr>
+          <w:ilvl w:val="0"/>
+          <w:numId w:val="1007"/>
+        </w:numPr>
+      </w:pPr>
+      <w:r>
+        <w:t xml:space="preserve">HexaStock com a integració de docència, pràctica i transferència.</w:t>
+      </w:r>
+    </w:p>
+    <w:p>
+      <w:pPr>
+        <w:pStyle w:val="Compact"/>
+        <w:numPr>
+          <w:ilvl w:val="0"/>
+          <w:numId w:val="1007"/>
+        </w:numPr>
+      </w:pPr>
+      <w:r>
+        <w:t xml:space="preserve">Transició explícita a la classe magistral.</w:t>
       </w:r>
     </w:p>
     <w:bookmarkEnd w:id="22"/>
-    <w:bookmarkStart w:id="23" w:name="de-la-salle-al-tecnocampus---155"/>
+    <w:bookmarkStart w:id="23" w:name="neueda-doctorat-i-futur---200"/>
     <w:p>
       <w:pPr>
         <w:pStyle w:val="Ttulo3"/>
       </w:pPr>
       <w:r>
-        <w:t xml:space="preserve">5. De La Salle al TecnoCampus - 1:55</w:t>
-      </w:r>
-    </w:p>
-    <w:p>
-      <w:pPr>
-        <w:pStyle w:val="Compact"/>
-        <w:numPr>
-          <w:ilvl w:val="0"/>
-          <w:numId w:val="1007"/>
-        </w:numPr>
-      </w:pPr>
-      <w:r>
-        <w:t xml:space="preserve">La Salle: incorporació a un entorn universitari d’alt nivell tècnic.</w:t>
-      </w:r>
-    </w:p>
-    <w:p>
-      <w:pPr>
-        <w:pStyle w:val="Compact"/>
-        <w:numPr>
-          <w:ilvl w:val="0"/>
-          <w:numId w:val="1007"/>
-        </w:numPr>
-      </w:pPr>
-      <w:r>
-        <w:t xml:space="preserve">La Salle és etapa valuosa; evitar comparacions jeràrquiques.</w:t>
-      </w:r>
-    </w:p>
-    <w:p>
-      <w:pPr>
-        <w:pStyle w:val="Compact"/>
-        <w:numPr>
-          <w:ilvl w:val="0"/>
-          <w:numId w:val="1007"/>
-        </w:numPr>
-      </w:pPr>
-      <w:r>
-        <w:t xml:space="preserve">Motiu principal: encaix acadèmic més directe amb enginyeria del software i sistemes d’informació.</w:t>
-      </w:r>
-    </w:p>
-    <w:p>
-      <w:pPr>
-        <w:pStyle w:val="Compact"/>
-        <w:numPr>
-          <w:ilvl w:val="0"/>
-          <w:numId w:val="1007"/>
-        </w:numPr>
-      </w:pPr>
-      <w:r>
-        <w:t xml:space="preserve">Conciliació com a factor complementari de sostenibilitat.</w:t>
-      </w:r>
-    </w:p>
-    <w:p>
-      <w:pPr>
-        <w:pStyle w:val="Compact"/>
-        <w:numPr>
-          <w:ilvl w:val="0"/>
-          <w:numId w:val="1007"/>
-        </w:numPr>
-      </w:pPr>
-      <w:r>
-        <w:t xml:space="preserve">Conversa amb coordinador i director a La Salle.</w:t>
-      </w:r>
-    </w:p>
-    <w:p>
-      <w:pPr>
-        <w:pStyle w:val="Compact"/>
-        <w:numPr>
-          <w:ilvl w:val="0"/>
-          <w:numId w:val="1007"/>
-        </w:numPr>
-      </w:pPr>
-      <w:r>
-        <w:t xml:space="preserve">Fonaments a La Salle: disseny i programació orientats a objectes i aplicacions mòbils; la llavor de l’enginyeria del software.</w:t>
-      </w:r>
-    </w:p>
-    <w:p>
-      <w:pPr>
-        <w:pStyle w:val="Compact"/>
-        <w:numPr>
-          <w:ilvl w:val="0"/>
-          <w:numId w:val="1007"/>
-        </w:numPr>
-      </w:pPr>
-      <w:r>
-        <w:t xml:space="preserve">Territori professional propi: arquitectura de software, backend empresarial i sistemes d’informació; el tram següent del mateix camí.</w:t>
-      </w:r>
-    </w:p>
-    <w:p>
-      <w:pPr>
-        <w:pStyle w:val="Compact"/>
-        <w:numPr>
-          <w:ilvl w:val="0"/>
-          <w:numId w:val="1007"/>
-        </w:numPr>
-      </w:pPr>
-      <w:r>
-        <w:t xml:space="preserve">Encaix curricular al TecnoCampus: la gestió i els sistemes d’informació formen part de la mateixa denominació del grau.</w:t>
-      </w:r>
-    </w:p>
-    <w:p>
-      <w:pPr>
-        <w:pStyle w:val="Compact"/>
-        <w:numPr>
-          <w:ilvl w:val="0"/>
-          <w:numId w:val="1007"/>
-        </w:numPr>
-      </w:pPr>
-      <w:r>
-        <w:t xml:space="preserve">No esmentar persones concretes; el contacte acadèmic es formula en genèric.</w:t>
-      </w:r>
-    </w:p>
-    <w:p>
-      <w:pPr>
-        <w:pStyle w:val="Compact"/>
-        <w:numPr>
-          <w:ilvl w:val="0"/>
-          <w:numId w:val="1007"/>
-        </w:numPr>
-      </w:pPr>
-      <w:r>
-        <w:t xml:space="preserve">TecnoCampus: docència universitària, software, sistemes d’informació, transferència i projecte sostenible.</w:t>
+        <w:t xml:space="preserve">6. Neueda, doctorat i futur - 2:00</w:t>
+      </w:r>
+    </w:p>
+    <w:p>
+      <w:pPr>
+        <w:pStyle w:val="Compact"/>
+        <w:numPr>
+          <w:ilvl w:val="0"/>
+          <w:numId w:val="1008"/>
+        </w:numPr>
+      </w:pPr>
+      <w:r>
+        <w:t xml:space="preserve">Cambridge C1 Advanced: 185, Pass at Grade C, C1 MECR.</w:t>
+      </w:r>
+    </w:p>
+    <w:p>
+      <w:pPr>
+        <w:pStyle w:val="Compact"/>
+        <w:numPr>
+          <w:ilvl w:val="0"/>
+          <w:numId w:val="1008"/>
+        </w:numPr>
+      </w:pPr>
+      <w:r>
+        <w:t xml:space="preserve">Neueda: formació internacional en anglès en enginyeria del software.</w:t>
+      </w:r>
+    </w:p>
+    <w:p>
+      <w:pPr>
+        <w:pStyle w:val="Compact"/>
+        <w:numPr>
+          <w:ilvl w:val="0"/>
+          <w:numId w:val="1008"/>
+        </w:numPr>
+      </w:pPr>
+      <w:r>
+        <w:t xml:space="preserve">AGAUR: 60 hores de formació i consultoria especialitzada en REST, arquitectura hexagonal i sistemes d’informació.</w:t>
+      </w:r>
+    </w:p>
+    <w:p>
+      <w:pPr>
+        <w:pStyle w:val="Compact"/>
+        <w:numPr>
+          <w:ilvl w:val="0"/>
+          <w:numId w:val="1008"/>
+        </w:numPr>
+      </w:pPr>
+      <w:r>
+        <w:t xml:space="preserve">HUB4T: Java Backend Web Developer, 120 h per curs durant tres cursos acadèmics.</w:t>
+      </w:r>
+    </w:p>
+    <w:p>
+      <w:pPr>
+        <w:pStyle w:val="Compact"/>
+        <w:numPr>
+          <w:ilvl w:val="0"/>
+          <w:numId w:val="1008"/>
+        </w:numPr>
+      </w:pPr>
+      <w:r>
+        <w:t xml:space="preserve">Doctorat UDIMA: Educació en Enginyeria del Software.</w:t>
+      </w:r>
+    </w:p>
+    <w:p>
+      <w:pPr>
+        <w:pStyle w:val="Compact"/>
+        <w:numPr>
+          <w:ilvl w:val="0"/>
+          <w:numId w:val="1008"/>
+        </w:numPr>
+      </w:pPr>
+      <w:r>
+        <w:t xml:space="preserve">No presentar-lo com a psicologia genèrica ni com a resultats ja assolits.</w:t>
+      </w:r>
+    </w:p>
+    <w:p>
+      <w:pPr>
+        <w:pStyle w:val="Compact"/>
+        <w:numPr>
+          <w:ilvl w:val="0"/>
+          <w:numId w:val="1008"/>
+        </w:numPr>
+      </w:pPr>
+      <w:r>
+        <w:t xml:space="preserve">Tesi: problema obert identificat per la literatura recent; integració curricular, mesura i estudis longitudinals.</w:t>
+      </w:r>
+    </w:p>
+    <w:p>
+      <w:pPr>
+        <w:pStyle w:val="Compact"/>
+        <w:numPr>
+          <w:ilvl w:val="0"/>
+          <w:numId w:val="1008"/>
+        </w:numPr>
+      </w:pPr>
+      <w:r>
+        <w:t xml:space="preserve">Disseny mixt i quasiexperimental, dues assignatures reals amb ABP, pretest, posttest, seguiment diferit i component qualitatiu.</w:t>
+      </w:r>
+    </w:p>
+    <w:p>
+      <w:pPr>
+        <w:pStyle w:val="Compact"/>
+        <w:numPr>
+          <w:ilvl w:val="0"/>
+          <w:numId w:val="1008"/>
+        </w:numPr>
+      </w:pPr>
+      <w:r>
+        <w:t xml:space="preserve">Futur: docència, recerca, innovació, transferència i acompanyament.</w:t>
+      </w:r>
+    </w:p>
+    <w:p>
+      <w:pPr>
+        <w:pStyle w:val="Compact"/>
+        <w:numPr>
+          <w:ilvl w:val="0"/>
+          <w:numId w:val="1008"/>
+        </w:numPr>
+      </w:pPr>
+      <w:r>
+        <w:t xml:space="preserve">Tancar amb la plaça com a consolidació d’un projecte acadèmic.</w:t>
+      </w:r>
+    </w:p>
+    <w:p>
+      <w:pPr>
+        <w:pStyle w:val="Compact"/>
+        <w:numPr>
+          <w:ilvl w:val="0"/>
+          <w:numId w:val="1008"/>
+        </w:numPr>
+      </w:pPr>
+      <w:r>
+        <w:t xml:space="preserve">Enllaçar amb la classe magistral següent.</w:t>
       </w:r>
     </w:p>
     <w:bookmarkEnd w:id="23"/>
-    <w:bookmarkStart w:id="24" w:name="tecnocampus---120"/>
+    <w:bookmarkStart w:id="24" w:name="Xed3256c23068a18527438c32113db4e0c20a1ed"/>
     <w:p>
       <w:pPr>
         <w:pStyle w:val="Ttulo3"/>
       </w:pPr>
       <w:r>
-        <w:t xml:space="preserve">6. TecnoCampus - 1:20</w:t>
-      </w:r>
-    </w:p>
-    <w:p>
-      <w:pPr>
-        <w:pStyle w:val="Compact"/>
-        <w:numPr>
-          <w:ilvl w:val="0"/>
-          <w:numId w:val="1008"/>
-        </w:numPr>
-      </w:pPr>
-      <w:r>
-        <w:t xml:space="preserve">Docència continuada des de 2021.</w:t>
-      </w:r>
-    </w:p>
-    <w:p>
-      <w:pPr>
-        <w:pStyle w:val="Compact"/>
-        <w:numPr>
-          <w:ilvl w:val="0"/>
-          <w:numId w:val="1008"/>
-        </w:numPr>
-      </w:pPr>
-      <w:r>
-        <w:t xml:space="preserve">Assignatures: programació, dades, Internet, enginyeria, DSI.</w:t>
-      </w:r>
-    </w:p>
-    <w:p>
-      <w:pPr>
-        <w:pStyle w:val="Compact"/>
-        <w:numPr>
-          <w:ilvl w:val="0"/>
-          <w:numId w:val="1008"/>
-        </w:numPr>
-      </w:pPr>
-      <w:r>
-        <w:t xml:space="preserve">15 registres oficials d’avaluació docent: mitjana aritmètica simple de 8,75/10.</w:t>
-      </w:r>
-    </w:p>
-    <w:p>
-      <w:pPr>
-        <w:pStyle w:val="Compact"/>
-        <w:numPr>
-          <w:ilvl w:val="0"/>
-          <w:numId w:val="1008"/>
-        </w:numPr>
-      </w:pPr>
-      <w:r>
-        <w:t xml:space="preserve">Quatre registres dels dos darrers cursos: mitjana aritmètica simple de 9,03/10.</w:t>
-      </w:r>
-    </w:p>
-    <w:p>
-      <w:pPr>
-        <w:pStyle w:val="Compact"/>
-        <w:numPr>
-          <w:ilvl w:val="0"/>
-          <w:numId w:val="1008"/>
-        </w:numPr>
-      </w:pPr>
-      <w:r>
-        <w:t xml:space="preserve">No dir mitjana ponderada ni percentatge de satisfacció.</w:t>
-      </w:r>
-    </w:p>
-    <w:p>
-      <w:pPr>
-        <w:pStyle w:val="Compact"/>
-        <w:numPr>
-          <w:ilvl w:val="0"/>
-          <w:numId w:val="1008"/>
-        </w:numPr>
-      </w:pPr>
-      <w:r>
-        <w:t xml:space="preserve">Josep Roure: arquitectura, DDD, Clean Architecture, hexagonal.</w:t>
-      </w:r>
-    </w:p>
-    <w:p>
-      <w:pPr>
-        <w:pStyle w:val="Compact"/>
-        <w:numPr>
-          <w:ilvl w:val="0"/>
-          <w:numId w:val="1008"/>
-        </w:numPr>
-      </w:pPr>
-      <w:r>
-        <w:t xml:space="preserve">Participació acreditada al projecte SQAI d’ABP a Laboratori d’Aplicacions Internet.</w:t>
-      </w:r>
-    </w:p>
-    <w:p>
-      <w:pPr>
-        <w:pStyle w:val="Compact"/>
-        <w:numPr>
-          <w:ilvl w:val="0"/>
-          <w:numId w:val="1008"/>
-        </w:numPr>
-      </w:pPr>
-      <w:r>
-        <w:t xml:space="preserve">HexaStock com a integració de docència, pràctica i transferència.</w:t>
-      </w:r>
-    </w:p>
-    <w:p>
-      <w:pPr>
-        <w:pStyle w:val="Compact"/>
-        <w:numPr>
-          <w:ilvl w:val="0"/>
-          <w:numId w:val="1008"/>
-        </w:numPr>
-      </w:pPr>
-      <w:r>
-        <w:t xml:space="preserve">Transició explícita a la classe magistral.</w:t>
-      </w:r>
-    </w:p>
-    <w:bookmarkEnd w:id="24"/>
-    <w:bookmarkStart w:id="25" w:name="neueda-doctorat-i-futur---200"/>
-    <w:p>
-      <w:pPr>
-        <w:pStyle w:val="Ttulo3"/>
-      </w:pPr>
-      <w:r>
-        <w:t xml:space="preserve">7. Neueda, doctorat i futur - 2:00</w:t>
+        <w:t xml:space="preserve">Annex A. Contrast d’orientació curricular - només si el tribunal pregunta</w:t>
       </w:r>
     </w:p>
     <w:p>
@@ -1250,7 +1316,7 @@
         </w:numPr>
       </w:pPr>
       <w:r>
-        <w:t xml:space="preserve">Cambridge C1 Advanced: 185, Pass at Grade C, C1 MECR.</w:t>
+        <w:t xml:space="preserve">Fora dels deu minuts i de la numeració 1-6; no mostrar sense pregunta o necessitat clara.</w:t>
       </w:r>
     </w:p>
     <w:p>
@@ -1262,7 +1328,7 @@
         </w:numPr>
       </w:pPr>
       <w:r>
-        <w:t xml:space="preserve">Neueda: formació internacional en anglès en enginyeria del software.</w:t>
+        <w:t xml:space="preserve">Missatge: diferències d’èmfasi i d’orientació curricular, mai de qualitat ni de jerarquia entre institucions.</w:t>
       </w:r>
     </w:p>
     <w:p>
@@ -1274,7 +1340,7 @@
         </w:numPr>
       </w:pPr>
       <w:r>
-        <w:t xml:space="preserve">AGAUR: 60 hores de formació i consultoria especialitzada en REST, arquitectura hexagonal i sistemes d’informació.</w:t>
+        <w:t xml:space="preserve">Taula: Enginyeria del Software, Sistemes d’Informació i arquitectura, electrònica i hardware, xarxes i telecomunicacions, identitat del grau.</w:t>
       </w:r>
     </w:p>
     <w:p>
@@ -1286,7 +1352,7 @@
         </w:numPr>
       </w:pPr>
       <w:r>
-        <w:t xml:space="preserve">HUB4T: Java Backend Web Developer, 120 h per curs durant tres cursos acadèmics.</w:t>
+        <w:t xml:space="preserve">Sense noms de persones ni relacions personals; justificació estrictament acadèmica, curricular i institucional.</w:t>
       </w:r>
     </w:p>
     <w:p>
@@ -1298,7 +1364,7 @@
         </w:numPr>
       </w:pPr>
       <w:r>
-        <w:t xml:space="preserve">Doctorat UDIMA: Educació en Enginyeria del Software.</w:t>
+        <w:t xml:space="preserve">Fonts (consulta: 13 de juliol de 2026): pla d’estudis del Grau en Enginyeria Informàtica de La Salle URL (https://www.salleurl.edu/ca/estudis/grau-en-enginyeria-informatica/pla-estudis) i Grau en Enginyeria Informàtica de Gestió i Sistemes d’Informació del TecnoCampus (https://www.tecnocampus.cat/grau/grau-en-enginyeria-informatica-de-gestio-i-sistemes-dinformacio).</w:t>
       </w:r>
     </w:p>
     <w:p>
@@ -1310,7 +1376,7 @@
         </w:numPr>
       </w:pPr>
       <w:r>
-        <w:t xml:space="preserve">No presentar-lo com a psicologia genèrica ni com a resultats ja assolits.</w:t>
+        <w:t xml:space="preserve">Criteri: només assignatures amb nom verificat als plans vigents, amb obligatòries i optatives diferenciades; no es projecten sumes agregades d’ECTS perquè la classificació obligatòria/optativa de La Salle no va resultar estable entre consultes, i per això la diapositiva usa formulacions qualitatives.</w:t>
       </w:r>
     </w:p>
     <w:p>
@@ -1319,148 +1385,6 @@
         <w:numPr>
           <w:ilvl w:val="0"/>
           <w:numId w:val="1009"/>
-        </w:numPr>
-      </w:pPr>
-      <w:r>
-        <w:t xml:space="preserve">Tesi: problema obert identificat per la literatura recent; integració curricular, mesura i estudis longitudinals.</w:t>
-      </w:r>
-    </w:p>
-    <w:p>
-      <w:pPr>
-        <w:pStyle w:val="Compact"/>
-        <w:numPr>
-          <w:ilvl w:val="0"/>
-          <w:numId w:val="1009"/>
-        </w:numPr>
-      </w:pPr>
-      <w:r>
-        <w:t xml:space="preserve">Disseny mixt i quasiexperimental, dues assignatures reals amb ABP, pretest, posttest, seguiment diferit i component qualitatiu.</w:t>
-      </w:r>
-    </w:p>
-    <w:p>
-      <w:pPr>
-        <w:pStyle w:val="Compact"/>
-        <w:numPr>
-          <w:ilvl w:val="0"/>
-          <w:numId w:val="1009"/>
-        </w:numPr>
-      </w:pPr>
-      <w:r>
-        <w:t xml:space="preserve">Futur: docència, recerca, innovació, transferència i acompanyament.</w:t>
-      </w:r>
-    </w:p>
-    <w:p>
-      <w:pPr>
-        <w:pStyle w:val="Compact"/>
-        <w:numPr>
-          <w:ilvl w:val="0"/>
-          <w:numId w:val="1009"/>
-        </w:numPr>
-      </w:pPr>
-      <w:r>
-        <w:t xml:space="preserve">Tancar amb la plaça com a consolidació d’un projecte acadèmic.</w:t>
-      </w:r>
-    </w:p>
-    <w:p>
-      <w:pPr>
-        <w:pStyle w:val="Compact"/>
-        <w:numPr>
-          <w:ilvl w:val="0"/>
-          <w:numId w:val="1009"/>
-        </w:numPr>
-      </w:pPr>
-      <w:r>
-        <w:t xml:space="preserve">Enllaçar amb la classe magistral següent.</w:t>
-      </w:r>
-    </w:p>
-    <w:bookmarkEnd w:id="25"/>
-    <w:bookmarkStart w:id="26" w:name="Xed3256c23068a18527438c32113db4e0c20a1ed"/>
-    <w:p>
-      <w:pPr>
-        <w:pStyle w:val="Ttulo3"/>
-      </w:pPr>
-      <w:r>
-        <w:t xml:space="preserve">Annex A. Contrast d’orientació curricular - només si el tribunal pregunta</w:t>
-      </w:r>
-    </w:p>
-    <w:p>
-      <w:pPr>
-        <w:pStyle w:val="Compact"/>
-        <w:numPr>
-          <w:ilvl w:val="0"/>
-          <w:numId w:val="1010"/>
-        </w:numPr>
-      </w:pPr>
-      <w:r>
-        <w:t xml:space="preserve">Fora dels deu minuts i de la numeració 1-7; no mostrar sense pregunta o necessitat clara.</w:t>
-      </w:r>
-    </w:p>
-    <w:p>
-      <w:pPr>
-        <w:pStyle w:val="Compact"/>
-        <w:numPr>
-          <w:ilvl w:val="0"/>
-          <w:numId w:val="1010"/>
-        </w:numPr>
-      </w:pPr>
-      <w:r>
-        <w:t xml:space="preserve">Missatge: diferències d’èmfasi i d’orientació curricular, mai de qualitat ni de jerarquia entre institucions.</w:t>
-      </w:r>
-    </w:p>
-    <w:p>
-      <w:pPr>
-        <w:pStyle w:val="Compact"/>
-        <w:numPr>
-          <w:ilvl w:val="0"/>
-          <w:numId w:val="1010"/>
-        </w:numPr>
-      </w:pPr>
-      <w:r>
-        <w:t xml:space="preserve">Taula: Enginyeria del Software, Sistemes d’Informació i arquitectura, electrònica i hardware, xarxes i telecomunicacions, identitat del grau.</w:t>
-      </w:r>
-    </w:p>
-    <w:p>
-      <w:pPr>
-        <w:pStyle w:val="Compact"/>
-        <w:numPr>
-          <w:ilvl w:val="0"/>
-          <w:numId w:val="1010"/>
-        </w:numPr>
-      </w:pPr>
-      <w:r>
-        <w:t xml:space="preserve">Sense noms de persones ni relacions personals; justificació estrictament acadèmica, curricular i institucional.</w:t>
-      </w:r>
-    </w:p>
-    <w:p>
-      <w:pPr>
-        <w:pStyle w:val="Compact"/>
-        <w:numPr>
-          <w:ilvl w:val="0"/>
-          <w:numId w:val="1010"/>
-        </w:numPr>
-      </w:pPr>
-      <w:r>
-        <w:t xml:space="preserve">Fonts (consulta: 13 de juliol de 2026): pla d’estudis del Grau en Enginyeria Informàtica de La Salle URL (https://www.salleurl.edu/ca/estudis/grau-en-enginyeria-informatica/pla-estudis) i Grau en Enginyeria Informàtica de Gestió i Sistemes d’Informació del TecnoCampus (https://www.tecnocampus.cat/grau/grau-en-enginyeria-informatica-de-gestio-i-sistemes-dinformacio).</w:t>
-      </w:r>
-    </w:p>
-    <w:p>
-      <w:pPr>
-        <w:pStyle w:val="Compact"/>
-        <w:numPr>
-          <w:ilvl w:val="0"/>
-          <w:numId w:val="1010"/>
-        </w:numPr>
-      </w:pPr>
-      <w:r>
-        <w:t xml:space="preserve">Criteri: només assignatures amb nom verificat als plans vigents, amb obligatòries i optatives diferenciades; no es projecten sumes agregades d’ECTS perquè la classificació obligatòria/optativa de La Salle no va resultar estable entre consultes, i per això la diapositiva usa formulacions qualitatives.</w:t>
-      </w:r>
-    </w:p>
-    <w:p>
-      <w:pPr>
-        <w:pStyle w:val="Compact"/>
-        <w:numPr>
-          <w:ilvl w:val="0"/>
-          <w:numId w:val="1010"/>
         </w:numPr>
       </w:pPr>
       <w:r>
@@ -1474,9 +1398,9 @@
         </w:pict>
       </w:r>
     </w:p>
-    <w:bookmarkEnd w:id="26"/>
-    <w:bookmarkEnd w:id="27"/>
-    <w:bookmarkStart w:id="28" w:name="esquema-de-memorització"/>
+    <w:bookmarkEnd w:id="24"/>
+    <w:bookmarkEnd w:id="25"/>
+    <w:bookmarkStart w:id="26" w:name="esquema-de-memorització"/>
     <w:p>
       <w:pPr>
         <w:pStyle w:val="Ttulo2"/>
@@ -1566,52 +1490,6 @@
               <w:pStyle w:val="Compact"/>
             </w:pPr>
             <w:r>
-              <w:t xml:space="preserve">Portada: benvinguda i agraïment al tribunal</w:t>
-            </w:r>
-          </w:p>
-        </w:tc>
-        <w:tc>
-          <w:tcPr/>
-          <w:p>
-            <w:pPr>
-              <w:pStyle w:val="Compact"/>
-            </w:pPr>
-            <w:r>
-              <w:t xml:space="preserve">salutació, tribunal</w:t>
-            </w:r>
-          </w:p>
-        </w:tc>
-        <w:tc>
-          <w:tcPr/>
-          <w:p>
-            <w:pPr>
-              <w:pStyle w:val="Compact"/>
-            </w:pPr>
-            <w:r>
-              <w:t xml:space="preserve">Fil conductor</w:t>
-            </w:r>
-          </w:p>
-        </w:tc>
-      </w:tr>
-      <w:tr>
-        <w:tc>
-          <w:tcPr/>
-          <w:p>
-            <w:pPr>
-              <w:pStyle w:val="Compact"/>
-            </w:pPr>
-            <w:r>
-              <w:t xml:space="preserve">2</w:t>
-            </w:r>
-          </w:p>
-        </w:tc>
-        <w:tc>
-          <w:tcPr/>
-          <w:p>
-            <w:pPr>
-              <w:pStyle w:val="Compact"/>
-            </w:pPr>
-            <w:r>
               <w:t xml:space="preserve">La trajectòria té un sol fil conductor</w:t>
             </w:r>
           </w:p>
@@ -1623,7 +1501,7 @@
               <w:pStyle w:val="Compact"/>
             </w:pPr>
             <w:r>
-              <w:t xml:space="preserve">2004, enginyer, professor, investigador, recorregut</w:t>
+              <w:t xml:space="preserve">2004, enginyer, professor, investigador</w:t>
             </w:r>
           </w:p>
         </w:tc>
@@ -1647,7 +1525,7 @@
               <w:pStyle w:val="Compact"/>
             </w:pPr>
             <w:r>
-              <w:t xml:space="preserve">3</w:t>
+              <w:t xml:space="preserve">2</w:t>
             </w:r>
           </w:p>
         </w:tc>
@@ -1693,7 +1571,7 @@
               <w:pStyle w:val="Compact"/>
             </w:pPr>
             <w:r>
-              <w:t xml:space="preserve">4</w:t>
+              <w:t xml:space="preserve">3</w:t>
             </w:r>
           </w:p>
         </w:tc>
@@ -1739,7 +1617,7 @@
               <w:pStyle w:val="Compact"/>
             </w:pPr>
             <w:r>
-              <w:t xml:space="preserve">5</w:t>
+              <w:t xml:space="preserve">4</w:t>
             </w:r>
           </w:p>
         </w:tc>
@@ -1785,7 +1663,7 @@
               <w:pStyle w:val="Compact"/>
             </w:pPr>
             <w:r>
-              <w:t xml:space="preserve">6</w:t>
+              <w:t xml:space="preserve">5</w:t>
             </w:r>
           </w:p>
         </w:tc>
@@ -1831,7 +1709,7 @@
               <w:pStyle w:val="Compact"/>
             </w:pPr>
             <w:r>
-              <w:t xml:space="preserve">7</w:t>
+              <w:t xml:space="preserve">6</w:t>
             </w:r>
           </w:p>
         </w:tc>
@@ -1959,8 +1837,8 @@
         </w:pict>
       </w:r>
     </w:p>
-    <w:bookmarkEnd w:id="28"/>
-    <w:bookmarkStart w:id="34" w:name="recomanacions-dassaig-ritme-veu-i-cos"/>
+    <w:bookmarkEnd w:id="26"/>
+    <w:bookmarkStart w:id="32" w:name="recomanacions-dassaig-ritme-veu-i-cos"/>
     <w:p>
       <w:pPr>
         <w:pStyle w:val="Ttulo2"/>
@@ -1969,7 +1847,7 @@
         <w:t xml:space="preserve">4. Recomanacions d’assaig, ritme, veu i cos</w:t>
       </w:r>
     </w:p>
-    <w:bookmarkStart w:id="29" w:name="ritme"/>
+    <w:bookmarkStart w:id="27" w:name="ritme"/>
     <w:p>
       <w:pPr>
         <w:pStyle w:val="Ttulo3"/>
@@ -1983,11 +1861,11 @@
         <w:pStyle w:val="FirstParagraph"/>
       </w:pPr>
       <w:r>
-        <w:t xml:space="preserve">La presentació està pensada per a 9:00-9:20 amb un ritme pausat i marge real. Les diapositives 6 i 7 són les més importants i poden ocupar una mica més de temps. Si cal retallar durant l’assaig, aplica la versió curta d’emergència; no retallis les xifres docents del TecnoCampus.</w:t>
-      </w:r>
-    </w:p>
-    <w:bookmarkEnd w:id="29"/>
-    <w:bookmarkStart w:id="30" w:name="veu"/>
+        <w:t xml:space="preserve">La presentació està pensada per a 9:00-9:20 amb un ritme pausat i marge real. Les diapositives 5 i 6 són les més importants i poden ocupar una mica més de temps. Si cal retallar durant l’assaig, aplica la versió curta d’emergència; no retallis les xifres docents del TecnoCampus.</w:t>
+      </w:r>
+    </w:p>
+    <w:bookmarkEnd w:id="27"/>
+    <w:bookmarkStart w:id="28" w:name="veu"/>
     <w:p>
       <w:pPr>
         <w:pStyle w:val="Ttulo3"/>
@@ -2016,14 +1894,114 @@
         <w:t xml:space="preserve">. No cal intensificar-les; la força està a dir-les amb calma i amb evidència.</w:t>
       </w:r>
     </w:p>
+    <w:bookmarkEnd w:id="28"/>
+    <w:bookmarkStart w:id="29" w:name="cos-i-mirada"/>
+    <w:p>
+      <w:pPr>
+        <w:pStyle w:val="Ttulo3"/>
+      </w:pPr>
+      <w:r>
+        <w:t xml:space="preserve">Cos i mirada</w:t>
+      </w:r>
+    </w:p>
+    <w:p>
+      <w:pPr>
+        <w:pStyle w:val="FirstParagraph"/>
+      </w:pPr>
+      <w:r>
+        <w:t xml:space="preserve">Mira el tribunal en tres moments: inici, explicació de l’alineació TecnoCampus i tancament final. Mira la pantalla només quan la diapositiva ajudi a ordenar una etapa o una transició. A la diapositiva 5, atura’t una mica abans de dir les xifres d’avaluació docent.</w:t>
+      </w:r>
+    </w:p>
+    <w:bookmarkEnd w:id="29"/>
+    <w:bookmarkStart w:id="30" w:name="control-del-temps"/>
+    <w:p>
+      <w:pPr>
+        <w:pStyle w:val="Ttulo3"/>
+      </w:pPr>
+      <w:r>
+        <w:t xml:space="preserve">Control del temps</w:t>
+      </w:r>
+    </w:p>
+    <w:p>
+      <w:pPr>
+        <w:pStyle w:val="Compact"/>
+        <w:numPr>
+          <w:ilvl w:val="0"/>
+          <w:numId w:val="1010"/>
+        </w:numPr>
+      </w:pPr>
+      <w:r>
+        <w:t xml:space="preserve">Diapositiva 1: no superar 0:55.</w:t>
+      </w:r>
+    </w:p>
+    <w:p>
+      <w:pPr>
+        <w:pStyle w:val="Compact"/>
+        <w:numPr>
+          <w:ilvl w:val="0"/>
+          <w:numId w:val="1010"/>
+        </w:numPr>
+      </w:pPr>
+      <w:r>
+        <w:t xml:space="preserve">Diapositiva 2: no explicar massa Vida Software; màxim 30 segons.</w:t>
+      </w:r>
+    </w:p>
+    <w:p>
+      <w:pPr>
+        <w:pStyle w:val="Compact"/>
+        <w:numPr>
+          <w:ilvl w:val="0"/>
+          <w:numId w:val="1010"/>
+        </w:numPr>
+      </w:pPr>
+      <w:r>
+        <w:t xml:space="preserve">Diapositiva 3: evitar convertir-la en una història llarga sobre FP.</w:t>
+      </w:r>
+    </w:p>
+    <w:p>
+      <w:pPr>
+        <w:pStyle w:val="Compact"/>
+        <w:numPr>
+          <w:ilvl w:val="0"/>
+          <w:numId w:val="1010"/>
+        </w:numPr>
+      </w:pPr>
+      <w:r>
+        <w:t xml:space="preserve">Diapositiva 4: encaix curricular com a motiu principal (fonaments a La Salle, tram següent al TecnoCampus); conciliació només com a sostenibilitat complementària; cap menció de persones concretes.</w:t>
+      </w:r>
+    </w:p>
+    <w:p>
+      <w:pPr>
+        <w:pStyle w:val="Compact"/>
+        <w:numPr>
+          <w:ilvl w:val="0"/>
+          <w:numId w:val="1010"/>
+        </w:numPr>
+      </w:pPr>
+      <w:r>
+        <w:t xml:space="preserve">Diapositiva 5: és el centre docent i institucional; donar-li aire.</w:t>
+      </w:r>
+    </w:p>
+    <w:p>
+      <w:pPr>
+        <w:pStyle w:val="Compact"/>
+        <w:numPr>
+          <w:ilvl w:val="0"/>
+          <w:numId w:val="1010"/>
+        </w:numPr>
+      </w:pPr>
+      <w:r>
+        <w:t xml:space="preserve">Diapositiva 6: recerca com a Educació en Enginyeria del Software; tancar amb seguretat i enllaçar amb la classe magistral.</w:t>
+      </w:r>
+    </w:p>
     <w:bookmarkEnd w:id="30"/>
-    <w:bookmarkStart w:id="31" w:name="cos-i-mirada"/>
+    <w:bookmarkStart w:id="31" w:name="versió-curta-demergència"/>
     <w:p>
       <w:pPr>
         <w:pStyle w:val="Ttulo3"/>
       </w:pPr>
       <w:r>
-        <w:t xml:space="preserve">Cos i mirada</w:t>
+        <w:t xml:space="preserve">Versió curta d’emergència</w:t>
       </w:r>
     </w:p>
     <w:p>
@@ -2031,17 +2009,7 @@
         <w:pStyle w:val="FirstParagraph"/>
       </w:pPr>
       <w:r>
-        <w:t xml:space="preserve">Mira el tribunal en tres moments: inici, explicació de l’alineació TecnoCampus i tancament final. Mira la pantalla només quan la diapositiva ajudi a ordenar una etapa o una transició. A la diapositiva 6, atura’t una mica abans de dir les xifres d’avaluació docent.</w:t>
-      </w:r>
-    </w:p>
-    <w:bookmarkEnd w:id="31"/>
-    <w:bookmarkStart w:id="32" w:name="control-del-temps"/>
-    <w:p>
-      <w:pPr>
-        <w:pStyle w:val="Ttulo3"/>
-      </w:pPr>
-      <w:r>
-        <w:t xml:space="preserve">Control del temps</w:t>
+        <w:t xml:space="preserve">Si durant la defensa veus que falta temps, elimina aquestes frases:</w:t>
       </w:r>
     </w:p>
     <w:p>
@@ -2053,109 +2021,7 @@
         </w:numPr>
       </w:pPr>
       <w:r>
-        <w:t xml:space="preserve">Diapositiva 1: només salutació i agraïment; no superar 0:15.</w:t>
-      </w:r>
-    </w:p>
-    <w:p>
-      <w:pPr>
-        <w:pStyle w:val="Compact"/>
-        <w:numPr>
-          <w:ilvl w:val="0"/>
-          <w:numId w:val="1011"/>
-        </w:numPr>
-      </w:pPr>
-      <w:r>
-        <w:t xml:space="preserve">Diapositiva 2: fil conductor i recorregut; no superar 0:40. Entre les diapositives 1 i 2 no s’ha de superar el temps de l’antiga introducció (0:55).</w:t>
-      </w:r>
-    </w:p>
-    <w:p>
-      <w:pPr>
-        <w:pStyle w:val="Compact"/>
-        <w:numPr>
-          <w:ilvl w:val="0"/>
-          <w:numId w:val="1011"/>
-        </w:numPr>
-      </w:pPr>
-      <w:r>
-        <w:t xml:space="preserve">Diapositiva 3: no explicar massa Vida Software; màxim 30 segons.</w:t>
-      </w:r>
-    </w:p>
-    <w:p>
-      <w:pPr>
-        <w:pStyle w:val="Compact"/>
-        <w:numPr>
-          <w:ilvl w:val="0"/>
-          <w:numId w:val="1011"/>
-        </w:numPr>
-      </w:pPr>
-      <w:r>
-        <w:t xml:space="preserve">Diapositiva 4: evitar convertir-la en una història llarga sobre FP.</w:t>
-      </w:r>
-    </w:p>
-    <w:p>
-      <w:pPr>
-        <w:pStyle w:val="Compact"/>
-        <w:numPr>
-          <w:ilvl w:val="0"/>
-          <w:numId w:val="1011"/>
-        </w:numPr>
-      </w:pPr>
-      <w:r>
-        <w:t xml:space="preserve">Diapositiva 5: encaix curricular com a motiu principal (fonaments a La Salle, tram següent al TecnoCampus); conciliació només com a sostenibilitat complementària; cap menció de persones concretes.</w:t>
-      </w:r>
-    </w:p>
-    <w:p>
-      <w:pPr>
-        <w:pStyle w:val="Compact"/>
-        <w:numPr>
-          <w:ilvl w:val="0"/>
-          <w:numId w:val="1011"/>
-        </w:numPr>
-      </w:pPr>
-      <w:r>
-        <w:t xml:space="preserve">Diapositiva 6: és el centre docent i institucional; donar-li aire.</w:t>
-      </w:r>
-    </w:p>
-    <w:p>
-      <w:pPr>
-        <w:pStyle w:val="Compact"/>
-        <w:numPr>
-          <w:ilvl w:val="0"/>
-          <w:numId w:val="1011"/>
-        </w:numPr>
-      </w:pPr>
-      <w:r>
-        <w:t xml:space="preserve">Diapositiva 7: recerca com a Educació en Enginyeria del Software; tancar amb seguretat i enllaçar amb la classe magistral.</w:t>
-      </w:r>
-    </w:p>
-    <w:bookmarkEnd w:id="32"/>
-    <w:bookmarkStart w:id="33" w:name="versió-curta-demergència"/>
-    <w:p>
-      <w:pPr>
-        <w:pStyle w:val="Ttulo3"/>
-      </w:pPr>
-      <w:r>
-        <w:t xml:space="preserve">Versió curta d’emergència</w:t>
-      </w:r>
-    </w:p>
-    <w:p>
-      <w:pPr>
-        <w:pStyle w:val="FirstParagraph"/>
-      </w:pPr>
-      <w:r>
-        <w:t xml:space="preserve">Si durant la defensa veus que falta temps, elimina aquestes frases:</w:t>
-      </w:r>
-    </w:p>
-    <w:p>
-      <w:pPr>
-        <w:pStyle w:val="Compact"/>
-        <w:numPr>
-          <w:ilvl w:val="0"/>
-          <w:numId w:val="1012"/>
-        </w:numPr>
-      </w:pPr>
-      <w:r>
-        <w:t xml:space="preserve">A la diapositiva 3, digues només</w:t>
+        <w:t xml:space="preserve">A la diapositiva 2, digues només</w:t>
       </w:r>
       <w:r>
         <w:t xml:space="preserve"> </w:t>
@@ -2175,23 +2041,23 @@
         <w:pStyle w:val="Compact"/>
         <w:numPr>
           <w:ilvl w:val="0"/>
-          <w:numId w:val="1012"/>
-        </w:numPr>
-      </w:pPr>
-      <w:r>
-        <w:t xml:space="preserve">A la diapositiva 4, redueix la reflexió sobre FP a una frase d’agraïment.</w:t>
-      </w:r>
-    </w:p>
-    <w:p>
-      <w:pPr>
-        <w:pStyle w:val="Compact"/>
-        <w:numPr>
-          <w:ilvl w:val="0"/>
-          <w:numId w:val="1012"/>
-        </w:numPr>
-      </w:pPr>
-      <w:r>
-        <w:t xml:space="preserve">A la diapositiva 5, resumeix la conciliació en</w:t>
+          <w:numId w:val="1011"/>
+        </w:numPr>
+      </w:pPr>
+      <w:r>
+        <w:t xml:space="preserve">A la diapositiva 3, redueix la reflexió sobre FP a una frase d’agraïment.</w:t>
+      </w:r>
+    </w:p>
+    <w:p>
+      <w:pPr>
+        <w:pStyle w:val="Compact"/>
+        <w:numPr>
+          <w:ilvl w:val="0"/>
+          <w:numId w:val="1011"/>
+        </w:numPr>
+      </w:pPr>
+      <w:r>
+        <w:t xml:space="preserve">A la diapositiva 4, resumeix la conciliació en</w:t>
       </w:r>
       <w:r>
         <w:t xml:space="preserve"> </w:t>
@@ -2211,11 +2077,11 @@
         <w:pStyle w:val="Compact"/>
         <w:numPr>
           <w:ilvl w:val="0"/>
-          <w:numId w:val="1012"/>
-        </w:numPr>
-      </w:pPr>
-      <w:r>
-        <w:t xml:space="preserve">A la diapositiva 5, si encara vas tard, redueix el bloc d’encaix a</w:t>
+          <w:numId w:val="1011"/>
+        </w:numPr>
+      </w:pPr>
+      <w:r>
+        <w:t xml:space="preserve">A la diapositiva 4, si encara vas tard, redueix el bloc d’encaix a</w:t>
       </w:r>
       <w:r>
         <w:t xml:space="preserve"> </w:t>
@@ -2250,11 +2116,11 @@
         <w:pStyle w:val="Compact"/>
         <w:numPr>
           <w:ilvl w:val="0"/>
-          <w:numId w:val="1012"/>
-        </w:numPr>
-      </w:pPr>
-      <w:r>
-        <w:t xml:space="preserve">A la diapositiva 7, si vas tard, elimina HUB4T i deixa només Cambridge, Neueda, AGAUR i doctorat.</w:t>
+          <w:numId w:val="1011"/>
+        </w:numPr>
+      </w:pPr>
+      <w:r>
+        <w:t xml:space="preserve">A la diapositiva 6, si vas tard, elimina HUB4T i deixa només Cambridge, Neueda, AGAUR i doctorat.</w:t>
       </w:r>
     </w:p>
     <w:p>
@@ -2265,9 +2131,9 @@
         <w:t xml:space="preserve">No eliminis la connexió final amb la classe magistral.</w:t>
       </w:r>
     </w:p>
+    <w:bookmarkEnd w:id="31"/>
+    <w:bookmarkEnd w:id="32"/>
     <w:bookmarkEnd w:id="33"/>
-    <w:bookmarkEnd w:id="34"/>
-    <w:bookmarkEnd w:id="35"/>
     <w:sectPr>
       <w:footnotePr>
         <w:numRestart w:val="eachSect"/>
@@ -2801,9 +2667,6 @@
     <w:abstractNumId w:val="991"/>
   </w:num>
   <w:num w:numId="1011">
-    <w:abstractNumId w:val="991"/>
-  </w:num>
-  <w:num w:numId="1012">
     <w:abstractNumId w:val="991"/>
   </w:num>
 </w:numbering>

</xml_diff>

<commit_message>
Add senior software job study to defense
</commit_message>
<xml_diff>
--- a/doc/presentations/defensa-placa-permanent-dsi-ports-sortida-hexagonal/output/REMARKABLE_materials-orals-canonics-10-minuts-trajectoria.docx
+++ b/doc/presentations/defensa-placa-permanent-dsi-ports-sortida-hexagonal/output/REMARKABLE_materials-orals-canonics-10-minuts-trajectoria.docx
@@ -215,19 +215,7 @@
         <w:pStyle w:val="FirstParagraph"/>
       </w:pPr>
       <w:r>
-        <w:t xml:space="preserve">Nota de versió: aquests materials són independents de la classe magistral de 20 minuts. La seva funció és donar suport a la primera part de la defensa de la plaça: trajectòria professional, acadèmica i científica. La presentació està limitada a 6 diapositives i a una durada aproximada de 10 minuts. Després del tancament hi ha una diapositiva d’annex,</w:t>
-      </w:r>
-      <w:r>
-        <w:t xml:space="preserve"> </w:t>
-      </w:r>
-      <w:r>
-        <w:rPr>
-          <w:rStyle w:val="VerbatimChar"/>
-        </w:rPr>
-        <w:t xml:space="preserve">Annex A. Contrast d'orientació curricular</w:t>
-      </w:r>
-      <w:r>
-        <w:t xml:space="preserve">, que no forma part de la numeració 1-6 ni del temps principal: és material de reserva exclusiu per al torn de preguntes.</w:t>
+        <w:t xml:space="preserve">Nota de versió: aquests materials són independents de la classe magistral de 20 minuts. La seva funció és donar suport a la primera part de la defensa de la plaça: trajectòria professional, acadèmica i científica. La presentació principal està limitada a 6 diapositives i a una durada aproximada de 10 minuts. Després del tancament hi ha quatre diapositives d’annex —A, B, C i D— que no formen part de la numeració 1-6 ni del temps principal: són material de reserva exclusiu per al torn de preguntes.</w:t>
       </w:r>
     </w:p>
     <w:p>
@@ -2131,9 +2119,2346 @@
         <w:t xml:space="preserve">No eliminis la connexió final amb la classe magistral.</w:t>
       </w:r>
     </w:p>
+    <w:p>
+      <w:r>
+        <w:pict>
+          <v:rect style="width:0;height:1.5pt" o:hralign="center" o:hrstd="t" o:hr="t"/>
+        </w:pict>
+      </w:r>
+    </w:p>
     <w:bookmarkEnd w:id="31"/>
     <w:bookmarkEnd w:id="32"/>
     <w:bookmarkEnd w:id="33"/>
+    <w:bookmarkStart w:id="61" w:name="Xbeb3282bfe560e0e3a53826361a8f08e1e1a43b"/>
+    <w:p>
+      <w:pPr>
+        <w:pStyle w:val="Ttulo1"/>
+      </w:pPr>
+      <w:r>
+        <w:t xml:space="preserve">MATERIAL DE RESERVA PER A LA RONDA DE PREGUNTES</w:t>
+      </w:r>
+    </w:p>
+    <w:p>
+      <w:pPr>
+        <w:pStyle w:val="FirstParagraph"/>
+      </w:pPr>
+      <w:r>
+        <w:t xml:space="preserve">Aquest material queda completament fora del recorregut principal de deu minuts. Els annexos només s’han de mostrar quan una pregunta del tribunal ho faci pertinent. Les respostes estan pensades per adaptar-se al temps disponible: versió breu, versió desenvolupada i ampliació.</w:t>
+      </w:r>
+    </w:p>
+    <w:bookmarkStart w:id="34" w:name="taula-de-navegació-ràpida"/>
+    <w:p>
+      <w:pPr>
+        <w:pStyle w:val="Ttulo2"/>
+      </w:pPr>
+      <w:r>
+        <w:t xml:space="preserve">Taula de navegació ràpida</w:t>
+      </w:r>
+    </w:p>
+    <w:tbl>
+      <w:tblPr>
+        <w:tblStyle w:val="Table"/>
+        <w:tblW w:type="auto" w:w="0"/>
+        <w:tblLook w:firstRow="1" w:lastRow="0" w:firstColumn="0" w:lastColumn="0" w:noHBand="0" w:noVBand="0" w:val="0020"/>
+      </w:tblPr>
+      <w:tblGrid>
+        <w:gridCol w:w="3960"/>
+        <w:gridCol w:w="3960"/>
+      </w:tblGrid>
+      <w:tr>
+        <w:trPr>
+          <w:tblHeader w:val="on"/>
+        </w:trPr>
+        <w:tc>
+          <w:tcPr/>
+          <w:p>
+            <w:pPr>
+              <w:pStyle w:val="Compact"/>
+            </w:pPr>
+            <w:r>
+              <w:t xml:space="preserve">Pregunta del tribunal</w:t>
+            </w:r>
+          </w:p>
+        </w:tc>
+        <w:tc>
+          <w:tcPr/>
+          <w:p>
+            <w:pPr>
+              <w:pStyle w:val="Compact"/>
+            </w:pPr>
+            <w:r>
+              <w:t xml:space="preserve">Annex que cal mostrar</w:t>
+            </w:r>
+          </w:p>
+        </w:tc>
+      </w:tr>
+      <w:tr>
+        <w:tc>
+          <w:tcPr/>
+          <w:p>
+            <w:pPr>
+              <w:pStyle w:val="Compact"/>
+            </w:pPr>
+            <w:r>
+              <w:t xml:space="preserve">Originalitat de la tesi</w:t>
+            </w:r>
+          </w:p>
+        </w:tc>
+        <w:tc>
+          <w:tcPr/>
+          <w:p>
+            <w:pPr>
+              <w:pStyle w:val="Compact"/>
+            </w:pPr>
+            <w:r>
+              <w:t xml:space="preserve">Annex B</w:t>
+            </w:r>
+          </w:p>
+        </w:tc>
+      </w:tr>
+      <w:tr>
+        <w:tc>
+          <w:tcPr/>
+          <w:p>
+            <w:pPr>
+              <w:pStyle w:val="Compact"/>
+            </w:pPr>
+            <w:r>
+              <w:t xml:space="preserve">Buit de recerca</w:t>
+            </w:r>
+          </w:p>
+        </w:tc>
+        <w:tc>
+          <w:tcPr/>
+          <w:p>
+            <w:pPr>
+              <w:pStyle w:val="Compact"/>
+            </w:pPr>
+            <w:r>
+              <w:t xml:space="preserve">Annex B</w:t>
+            </w:r>
+          </w:p>
+        </w:tc>
+      </w:tr>
+      <w:tr>
+        <w:tc>
+          <w:tcPr/>
+          <w:p>
+            <w:pPr>
+              <w:pStyle w:val="Compact"/>
+            </w:pPr>
+            <w:r>
+              <w:t xml:space="preserve">Empatia, escolta activa o comunicació assertiva</w:t>
+            </w:r>
+          </w:p>
+        </w:tc>
+        <w:tc>
+          <w:tcPr/>
+          <w:p>
+            <w:pPr>
+              <w:pStyle w:val="Compact"/>
+            </w:pPr>
+            <w:r>
+              <w:t xml:space="preserve">Annex B</w:t>
+            </w:r>
+          </w:p>
+        </w:tc>
+      </w:tr>
+      <w:tr>
+        <w:tc>
+          <w:tcPr/>
+          <w:p>
+            <w:pPr>
+              <w:pStyle w:val="Compact"/>
+            </w:pPr>
+            <w:r>
+              <w:t xml:space="preserve">Integració curricular</w:t>
+            </w:r>
+          </w:p>
+        </w:tc>
+        <w:tc>
+          <w:tcPr/>
+          <w:p>
+            <w:pPr>
+              <w:pStyle w:val="Compact"/>
+            </w:pPr>
+            <w:r>
+              <w:t xml:space="preserve">Annex B</w:t>
+            </w:r>
+          </w:p>
+        </w:tc>
+      </w:tr>
+      <w:tr>
+        <w:tc>
+          <w:tcPr/>
+          <w:p>
+            <w:pPr>
+              <w:pStyle w:val="Compact"/>
+            </w:pPr>
+            <w:r>
+              <w:t xml:space="preserve">Metodologia mixta o quasiexperimental</w:t>
+            </w:r>
+          </w:p>
+        </w:tc>
+        <w:tc>
+          <w:tcPr/>
+          <w:p>
+            <w:pPr>
+              <w:pStyle w:val="Compact"/>
+            </w:pPr>
+            <w:r>
+              <w:t xml:space="preserve">Annex B</w:t>
+            </w:r>
+          </w:p>
+        </w:tc>
+      </w:tr>
+      <w:tr>
+        <w:tc>
+          <w:tcPr/>
+          <w:p>
+            <w:pPr>
+              <w:pStyle w:val="Compact"/>
+            </w:pPr>
+            <w:r>
+              <w:t xml:space="preserve">Dues assignatures o longitudinalitat</w:t>
+            </w:r>
+          </w:p>
+        </w:tc>
+        <w:tc>
+          <w:tcPr/>
+          <w:p>
+            <w:pPr>
+              <w:pStyle w:val="Compact"/>
+            </w:pPr>
+            <w:r>
+              <w:t xml:space="preserve">Annex B</w:t>
+            </w:r>
+          </w:p>
+        </w:tc>
+      </w:tr>
+      <w:tr>
+        <w:tc>
+          <w:tcPr/>
+          <w:p>
+            <w:pPr>
+              <w:pStyle w:val="Compact"/>
+            </w:pPr>
+            <w:r>
+              <w:t xml:space="preserve">Viabilitat en dos anys</w:t>
+            </w:r>
+          </w:p>
+        </w:tc>
+        <w:tc>
+          <w:tcPr/>
+          <w:p>
+            <w:pPr>
+              <w:pStyle w:val="Compact"/>
+            </w:pPr>
+            <w:r>
+              <w:t xml:space="preserve">Annex C</w:t>
+            </w:r>
+          </w:p>
+        </w:tc>
+      </w:tr>
+      <w:tr>
+        <w:tc>
+          <w:tcPr/>
+          <w:p>
+            <w:pPr>
+              <w:pStyle w:val="Compact"/>
+            </w:pPr>
+            <w:r>
+              <w:t xml:space="preserve">Nombre d’articles</w:t>
+            </w:r>
+          </w:p>
+        </w:tc>
+        <w:tc>
+          <w:tcPr/>
+          <w:p>
+            <w:pPr>
+              <w:pStyle w:val="Compact"/>
+            </w:pPr>
+            <w:r>
+              <w:t xml:space="preserve">Annex C</w:t>
+            </w:r>
+          </w:p>
+        </w:tc>
+      </w:tr>
+      <w:tr>
+        <w:tc>
+          <w:tcPr/>
+          <w:p>
+            <w:pPr>
+              <w:pStyle w:val="Compact"/>
+            </w:pPr>
+            <w:r>
+              <w:t xml:space="preserve">Compendi de publicacions</w:t>
+            </w:r>
+          </w:p>
+        </w:tc>
+        <w:tc>
+          <w:tcPr/>
+          <w:p>
+            <w:pPr>
+              <w:pStyle w:val="Compact"/>
+            </w:pPr>
+            <w:r>
+              <w:t xml:space="preserve">Annex C</w:t>
+            </w:r>
+          </w:p>
+        </w:tc>
+      </w:tr>
+      <w:tr>
+        <w:tc>
+          <w:tcPr/>
+          <w:p>
+            <w:pPr>
+              <w:pStyle w:val="Compact"/>
+            </w:pPr>
+            <w:r>
+              <w:t xml:space="preserve">Tesi monogràfica</w:t>
+            </w:r>
+          </w:p>
+        </w:tc>
+        <w:tc>
+          <w:tcPr/>
+          <w:p>
+            <w:pPr>
+              <w:pStyle w:val="Compact"/>
+            </w:pPr>
+            <w:r>
+              <w:t xml:space="preserve">Annex C</w:t>
+            </w:r>
+          </w:p>
+        </w:tc>
+      </w:tr>
+      <w:tr>
+        <w:tc>
+          <w:tcPr/>
+          <w:p>
+            <w:pPr>
+              <w:pStyle w:val="Compact"/>
+            </w:pPr>
+            <w:r>
+              <w:t xml:space="preserve">Rebuig o retard editorial</w:t>
+            </w:r>
+          </w:p>
+        </w:tc>
+        <w:tc>
+          <w:tcPr/>
+          <w:p>
+            <w:pPr>
+              <w:pStyle w:val="Compact"/>
+            </w:pPr>
+            <w:r>
+              <w:t xml:space="preserve">Annex C</w:t>
+            </w:r>
+          </w:p>
+        </w:tc>
+      </w:tr>
+      <w:tr>
+        <w:tc>
+          <w:tcPr/>
+          <w:p>
+            <w:pPr>
+              <w:pStyle w:val="Compact"/>
+            </w:pPr>
+            <w:r>
+              <w:t xml:space="preserve">Demanda de la indústria</w:t>
+            </w:r>
+          </w:p>
+        </w:tc>
+        <w:tc>
+          <w:tcPr/>
+          <w:p>
+            <w:pPr>
+              <w:pStyle w:val="Compact"/>
+            </w:pPr>
+            <w:r>
+              <w:t xml:space="preserve">Annex D</w:t>
+            </w:r>
+          </w:p>
+        </w:tc>
+      </w:tr>
+      <w:tr>
+        <w:tc>
+          <w:tcPr/>
+          <w:p>
+            <w:pPr>
+              <w:pStyle w:val="Compact"/>
+            </w:pPr>
+            <w:r>
+              <w:t xml:space="preserve">Soft skills en Enginyeria del Software</w:t>
+            </w:r>
+          </w:p>
+        </w:tc>
+        <w:tc>
+          <w:tcPr/>
+          <w:p>
+            <w:pPr>
+              <w:pStyle w:val="Compact"/>
+            </w:pPr>
+            <w:r>
+              <w:t xml:space="preserve">Annex D</w:t>
+            </w:r>
+          </w:p>
+        </w:tc>
+      </w:tr>
+      <w:tr>
+        <w:tc>
+          <w:tcPr/>
+          <w:p>
+            <w:pPr>
+              <w:pStyle w:val="Compact"/>
+            </w:pPr>
+            <w:r>
+              <w:t xml:space="preserve">Intel·ligència artificial i competències humanes</w:t>
+            </w:r>
+          </w:p>
+        </w:tc>
+        <w:tc>
+          <w:tcPr/>
+          <w:p>
+            <w:pPr>
+              <w:pStyle w:val="Compact"/>
+            </w:pPr>
+            <w:r>
+              <w:t xml:space="preserve">Annex D</w:t>
+            </w:r>
+          </w:p>
+        </w:tc>
+      </w:tr>
+      <w:tr>
+        <w:tc>
+          <w:tcPr/>
+          <w:p>
+            <w:pPr>
+              <w:pStyle w:val="Compact"/>
+            </w:pPr>
+            <w:r>
+              <w:t xml:space="preserve">Mostra, intervals i controls de sensibilitat</w:t>
+            </w:r>
+          </w:p>
+        </w:tc>
+        <w:tc>
+          <w:tcPr/>
+          <w:p>
+            <w:pPr>
+              <w:pStyle w:val="Compact"/>
+            </w:pPr>
+            <w:r>
+              <w:t xml:space="preserve">Annex D</w:t>
+            </w:r>
+          </w:p>
+        </w:tc>
+      </w:tr>
+      <w:tr>
+        <w:tc>
+          <w:tcPr/>
+          <w:p>
+            <w:pPr>
+              <w:pStyle w:val="Compact"/>
+            </w:pPr>
+            <w:r>
+              <w:t xml:space="preserve">Transició La Salle–TecnoCampus</w:t>
+            </w:r>
+          </w:p>
+        </w:tc>
+        <w:tc>
+          <w:tcPr/>
+          <w:p>
+            <w:pPr>
+              <w:pStyle w:val="Compact"/>
+            </w:pPr>
+            <w:r>
+              <w:t xml:space="preserve">Annex A</w:t>
+            </w:r>
+          </w:p>
+        </w:tc>
+      </w:tr>
+    </w:tbl>
+    <w:bookmarkEnd w:id="34"/>
+    <w:bookmarkStart w:id="35" w:name="annex-a.-contrast-dorientació-curricular"/>
+    <w:p>
+      <w:pPr>
+        <w:pStyle w:val="Ttulo2"/>
+      </w:pPr>
+      <w:r>
+        <w:t xml:space="preserve">1. ANNEX A. CONTRAST D’ORIENTACIÓ CURRICULAR</w:t>
+      </w:r>
+    </w:p>
+    <w:p>
+      <w:pPr>
+        <w:pStyle w:val="FirstParagraph"/>
+      </w:pPr>
+      <w:r>
+        <w:t xml:space="preserve">Es conserva sense modificacions l’Annex A de la presentació i la resposta oral de reserva que ja consta a l’apartat «Annex A. Contrast d’orientació curricular». No cal duplicar-la. Cal recordar que el contrast és d’orientació i d’encaix acadèmic, mai de qualitat o de jerarquia entre institucions.</w:t>
+      </w:r>
+    </w:p>
+    <w:bookmarkEnd w:id="35"/>
+    <w:bookmarkStart w:id="43" w:name="X1020c4d1e2498afb64a65193ac158f2d4f85b3e"/>
+    <w:p>
+      <w:pPr>
+        <w:pStyle w:val="Ttulo2"/>
+      </w:pPr>
+      <w:r>
+        <w:t xml:space="preserve">2. ANNEX B. APORTACIÓ CIENTÍFICA DE LA TESI DOCTORAL</w:t>
+      </w:r>
+    </w:p>
+    <w:bookmarkStart w:id="36" w:name="preguntes-probables"/>
+    <w:p>
+      <w:pPr>
+        <w:pStyle w:val="Ttulo3"/>
+      </w:pPr>
+      <w:r>
+        <w:t xml:space="preserve">Preguntes probables</w:t>
+      </w:r>
+    </w:p>
+    <w:p>
+      <w:pPr>
+        <w:pStyle w:val="Compact"/>
+        <w:numPr>
+          <w:ilvl w:val="0"/>
+          <w:numId w:val="1012"/>
+        </w:numPr>
+      </w:pPr>
+      <w:r>
+        <w:t xml:space="preserve">Quina és l’originalitat de la tesi?</w:t>
+      </w:r>
+    </w:p>
+    <w:p>
+      <w:pPr>
+        <w:pStyle w:val="Compact"/>
+        <w:numPr>
+          <w:ilvl w:val="0"/>
+          <w:numId w:val="1012"/>
+        </w:numPr>
+      </w:pPr>
+      <w:r>
+        <w:t xml:space="preserve">Quin buit de recerca pretén cobrir?</w:t>
+      </w:r>
+    </w:p>
+    <w:p>
+      <w:pPr>
+        <w:pStyle w:val="Compact"/>
+        <w:numPr>
+          <w:ilvl w:val="0"/>
+          <w:numId w:val="1012"/>
+        </w:numPr>
+      </w:pPr>
+      <w:r>
+        <w:t xml:space="preserve">Ja existeixen estudis sobre empatia o comunicació en enginyeria?</w:t>
+      </w:r>
+    </w:p>
+    <w:p>
+      <w:pPr>
+        <w:pStyle w:val="Compact"/>
+        <w:numPr>
+          <w:ilvl w:val="0"/>
+          <w:numId w:val="1012"/>
+        </w:numPr>
+      </w:pPr>
+      <w:r>
+        <w:t xml:space="preserve">Per què s’estudien tres competències i no una?</w:t>
+      </w:r>
+    </w:p>
+    <w:p>
+      <w:pPr>
+        <w:pStyle w:val="Compact"/>
+        <w:numPr>
+          <w:ilvl w:val="0"/>
+          <w:numId w:val="1012"/>
+        </w:numPr>
+      </w:pPr>
+      <w:r>
+        <w:t xml:space="preserve">Per què la intervenció s’integra en ABP?</w:t>
+      </w:r>
+    </w:p>
+    <w:p>
+      <w:pPr>
+        <w:pStyle w:val="Compact"/>
+        <w:numPr>
+          <w:ilvl w:val="0"/>
+          <w:numId w:val="1012"/>
+        </w:numPr>
+      </w:pPr>
+      <w:r>
+        <w:t xml:space="preserve">Per què es desenvolupa en dues assignatures consecutives?</w:t>
+      </w:r>
+    </w:p>
+    <w:p>
+      <w:pPr>
+        <w:pStyle w:val="Compact"/>
+        <w:numPr>
+          <w:ilvl w:val="0"/>
+          <w:numId w:val="1012"/>
+        </w:numPr>
+      </w:pPr>
+      <w:r>
+        <w:t xml:space="preserve">Què aporta el disseny mixt i quasiexperimental?</w:t>
+      </w:r>
+    </w:p>
+    <w:p>
+      <w:pPr>
+        <w:pStyle w:val="Compact"/>
+        <w:numPr>
+          <w:ilvl w:val="0"/>
+          <w:numId w:val="1012"/>
+        </w:numPr>
+      </w:pPr>
+      <w:r>
+        <w:t xml:space="preserve">Com s’evitarà dependre només d’autopercepcions?</w:t>
+      </w:r>
+    </w:p>
+    <w:p>
+      <w:pPr>
+        <w:pStyle w:val="Compact"/>
+        <w:numPr>
+          <w:ilvl w:val="0"/>
+          <w:numId w:val="1012"/>
+        </w:numPr>
+      </w:pPr>
+      <w:r>
+        <w:t xml:space="preserve">Quina transferibilitat pot tenir la proposta?</w:t>
+      </w:r>
+    </w:p>
+    <w:p>
+      <w:pPr>
+        <w:pStyle w:val="Compact"/>
+        <w:numPr>
+          <w:ilvl w:val="0"/>
+          <w:numId w:val="1012"/>
+        </w:numPr>
+      </w:pPr>
+      <w:r>
+        <w:t xml:space="preserve">Quina és la contribució específica a l’Enginyeria del Software?</w:t>
+      </w:r>
+    </w:p>
+    <w:bookmarkEnd w:id="36"/>
+    <w:bookmarkStart w:id="37" w:name="idea-central"/>
+    <w:p>
+      <w:pPr>
+        <w:pStyle w:val="Ttulo3"/>
+      </w:pPr>
+      <w:r>
+        <w:t xml:space="preserve">Idea central</w:t>
+      </w:r>
+    </w:p>
+    <w:p>
+      <w:pPr>
+        <w:pStyle w:val="FirstParagraph"/>
+      </w:pPr>
+      <w:r>
+        <w:t xml:space="preserve">La literatura ja ofereix antecedents rellevants sobre ABP, treball en equip, empatia, comunicació, competències socioemocionals i educació en enginyeria. L’aportació específica de la tesi se situa en la combinació d’aquests elements dins una intervenció curricular explícita en Enginyeria del Software, integrada en ABP, desenvolupada en dues assignatures consecutives i avaluada mitjançant un disseny mixt, quasiexperimental i longitudinal en un context docent real.</w:t>
+      </w:r>
+    </w:p>
+    <w:bookmarkEnd w:id="37"/>
+    <w:bookmarkStart w:id="38" w:name="resposta-de-reserva-breu-3040-segons"/>
+    <w:p>
+      <w:pPr>
+        <w:pStyle w:val="Ttulo3"/>
+      </w:pPr>
+      <w:r>
+        <w:t xml:space="preserve">Resposta de reserva — breu, 30–40 segons</w:t>
+      </w:r>
+    </w:p>
+    <w:p>
+      <w:pPr>
+        <w:pStyle w:val="FirstParagraph"/>
+      </w:pPr>
+      <w:r>
+        <w:t xml:space="preserve">No parteixo de la idea que no existeixi recerca prèvia. Hi ha literatura rellevant sobre ABP, treball en equip, empatia, comunicació i competències socioemocionals. El que mostra la recerca disponible és una integració encara fragmentada, sovint basada en activitats puntuals o en autopercepcions. La tesi pretén contribuir-hi combinant empatia, escolta activa i comunicació assertiva dins l’ABP ordinari d’Enginyeria del Software, en dues assignatures consecutives i amb un disseny mixt, quasiexperimental i longitudinal. El valor diferencial és construir i avaluar una intervenció curricular integrada, mesurable i potencialment transferible.</w:t>
+      </w:r>
+    </w:p>
+    <w:bookmarkEnd w:id="38"/>
+    <w:bookmarkStart w:id="39" w:name="X799fa4052beab7b00235ed6e032635fb6c56ba2"/>
+    <w:p>
+      <w:pPr>
+        <w:pStyle w:val="Ttulo3"/>
+      </w:pPr>
+      <w:r>
+        <w:t xml:space="preserve">Resposta de reserva — desenvolupada, 75–90 segons</w:t>
+      </w:r>
+    </w:p>
+    <w:p>
+      <w:pPr>
+        <w:pStyle w:val="FirstParagraph"/>
+      </w:pPr>
+      <w:r>
+        <w:t xml:space="preserve">No parteixo de la idea que no existeixi recerca prèvia. Hi ha treballs rellevants sobre ABP, treball en equip, empatia, comunicació i competències socioemocionals, tant en educació universitària com en educació en enginyeria.</w:t>
+      </w:r>
+    </w:p>
+    <w:p>
+      <w:pPr>
+        <w:pStyle w:val="Textoindependiente"/>
+      </w:pPr>
+      <w:r>
+        <w:t xml:space="preserve">El que la literatura mostra és una integració encara fragmentada, sovint vinculada a experiències puntuals, autopercepcions o competències transversals tractades de manera genèrica. Hi ha menys evidència situada específicament en assignatures ordinàries d’Enginyeria del Software, amb projectes reals i seguiment sostingut.</w:t>
+      </w:r>
+    </w:p>
+    <w:p>
+      <w:pPr>
+        <w:pStyle w:val="Textoindependiente"/>
+      </w:pPr>
+      <w:r>
+        <w:t xml:space="preserve">La tesi se situa en aquesta intersecció. Combina empatia, escolta activa i comunicació assertiva; les integra explícitament en una experiència d’ABP; i en planifica l’ensenyament, la pràctica, el feedback i l’avaluació. La intervenció es desenvolupa en dues assignatures consecutives, fet que permet estudiar l’evolució, la transferència i el possible manteniment dels aprenentatges. Metodològicament, es proposa un disseny mixt i quasiexperimental, amb seguiment longitudinal, comparació i triangulació d’evidències quantitatives i qualitatives dins un context docent real.</w:t>
+      </w:r>
+    </w:p>
+    <w:p>
+      <w:pPr>
+        <w:pStyle w:val="Textoindependiente"/>
+      </w:pPr>
+      <w:r>
+        <w:t xml:space="preserve">Per tant, la contribució no consisteix a afirmar que ningú no hagi estudiat abans aquestes competències, sinó a construir i avaluar una integració curricular específica, sostinguda i transferible per a l’Educació en Enginyeria del Software.</w:t>
+      </w:r>
+    </w:p>
+    <w:bookmarkEnd w:id="39"/>
+    <w:bookmarkStart w:id="40" w:name="X5238e5cb5a9fa448c368d3d84eb935fe31dfed2"/>
+    <w:p>
+      <w:pPr>
+        <w:pStyle w:val="Ttulo3"/>
+      </w:pPr>
+      <w:r>
+        <w:t xml:space="preserve">Resposta de reserva — ampliació, aproximadament 2 minuts</w:t>
+      </w:r>
+    </w:p>
+    <w:p>
+      <w:pPr>
+        <w:pStyle w:val="FirstParagraph"/>
+      </w:pPr>
+      <w:r>
+        <w:t xml:space="preserve">La diferència entre una activitat puntual i aquesta proposta és important. Una sessió o un taller poden sensibilitzar, però ofereixen poca base per estudiar si la competència es practica, evoluciona, es transfereix a situacions noves o es manté en el temps. Treballar en dues assignatures consecutives permet observar una trajectòria formativa més llarga i distingir millor entre una reacció immediata i una possible consolidació.</w:t>
+      </w:r>
+    </w:p>
+    <w:p>
+      <w:pPr>
+        <w:pStyle w:val="Textoindependiente"/>
+      </w:pPr>
+      <w:r>
+        <w:t xml:space="preserve">També cal diferenciar satisfacció i avaluació. Que l’estudiant consideri útil una activitat és una dada valuosa, però no equival per si sola a evidència d’evolució. Per això el disseny mixt combina indicadors quantitatius i evidències qualitatives, incorpora comparació i seguiment temporal i busca triangular els resultats. Aquesta triangulació permet contrastar perspectives i evitar que la interpretació depengui d’una única font o d’una enquesta final d’autopercepció.</w:t>
+      </w:r>
+    </w:p>
+    <w:p>
+      <w:pPr>
+        <w:pStyle w:val="Textoindependiente"/>
+      </w:pPr>
+      <w:r>
+        <w:t xml:space="preserve">El context també forma part de la contribució. La intervenció no es planteja en una situació artificial, sinó en assignatures reals, amb estudiants, equips, projectes i restriccions docents reals. Això reforça la validesa ecològica i permet estudiar una proposta que, si els resultats ho avalen, pugui adaptar-se a altres assignatures o contextos d’Educació en Enginyeria del Software.</w:t>
+      </w:r>
+    </w:p>
+    <w:p>
+      <w:pPr>
+        <w:pStyle w:val="Textoindependiente"/>
+      </w:pPr>
+      <w:r>
+        <w:t xml:space="preserve">Finalment, les tres competències no s’han triat com una suma arbitrària. L’empatia ajuda a comprendre necessitats i perspectives; l’escolta activa permet verificar aquesta comprensió; i la comunicació assertiva facilita expressar criteris, desacords i feedback amb claredat i respecte. En projectes de software, aquesta articulació és rellevant per a requisits, decisions d’arquitectura, revisions de codi, coordinació d’equips, gestió de conflictes i relació amb stakeholders. La tesi pretén avaluar aquesta proposta; no presenta com a demostrats uns resultats que encara s’han d’obtenir.</w:t>
+      </w:r>
+    </w:p>
+    <w:bookmarkEnd w:id="40"/>
+    <w:bookmarkStart w:id="41" w:name="possibles-repreguntes-i-respostes-breus"/>
+    <w:p>
+      <w:pPr>
+        <w:pStyle w:val="Ttulo3"/>
+      </w:pPr>
+      <w:r>
+        <w:t xml:space="preserve">Possibles repreguntes i respostes breus</w:t>
+      </w:r>
+    </w:p>
+    <w:p>
+      <w:pPr>
+        <w:pStyle w:val="FirstParagraph"/>
+      </w:pPr>
+      <w:r>
+        <w:rPr>
+          <w:b/>
+          <w:bCs/>
+        </w:rPr>
+        <w:t xml:space="preserve">Ja existeixen estudis sobre empatia?</w:t>
+      </w:r>
+      <w:r>
+        <w:br/>
+      </w:r>
+      <w:r>
+        <w:t xml:space="preserve">Sí. Hi ha literatura sobre empatia en educació, salut, enginyeria i altres àmbits. La contribució no és introduir el concepte, sinó integrar-lo amb escolta activa i comunicació assertiva dins una intervenció curricular sostinguda i avaluable en Enginyeria del Software.</w:t>
+      </w:r>
+    </w:p>
+    <w:p>
+      <w:pPr>
+        <w:pStyle w:val="Textoindependiente"/>
+      </w:pPr>
+      <w:r>
+        <w:rPr>
+          <w:b/>
+          <w:bCs/>
+        </w:rPr>
+        <w:t xml:space="preserve">Quin és exactament el buit?</w:t>
+      </w:r>
+      <w:r>
+        <w:br/>
+      </w:r>
+      <w:r>
+        <w:t xml:space="preserve">No és un buit total. És una combinació de limitacions: integració curricular encara fragmentada, menys evidència específica en Enginyeria del Software, predomini d’experiències puntuals o autopercepcions i manca de més estudis comparatius i longitudinals en contextos docents reals.</w:t>
+      </w:r>
+    </w:p>
+    <w:p>
+      <w:pPr>
+        <w:pStyle w:val="Textoindependiente"/>
+      </w:pPr>
+      <w:r>
+        <w:rPr>
+          <w:b/>
+          <w:bCs/>
+        </w:rPr>
+        <w:t xml:space="preserve">Per què tres competències i no una?</w:t>
+      </w:r>
+      <w:r>
+        <w:br/>
+      </w:r>
+      <w:r>
+        <w:t xml:space="preserve">Perquè operen de manera relacionada: comprendre perspectives, escoltar i verificar necessitats, i comunicar criteris o desacords amb claredat. Aquesta seqüència és especialment rellevant en el treball professional amb equips i stakeholders.</w:t>
+      </w:r>
+    </w:p>
+    <w:p>
+      <w:pPr>
+        <w:pStyle w:val="Textoindependiente"/>
+      </w:pPr>
+      <w:r>
+        <w:rPr>
+          <w:b/>
+          <w:bCs/>
+        </w:rPr>
+        <w:t xml:space="preserve">Per què dues assignatures?</w:t>
+      </w:r>
+      <w:r>
+        <w:br/>
+      </w:r>
+      <w:r>
+        <w:t xml:space="preserve">Per observar continuïtat, transferència i possible manteniment. Una única assignatura permetria estudiar una intervenció, però oferiria menys base temporal per analitzar-ne l’evolució.</w:t>
+      </w:r>
+    </w:p>
+    <w:p>
+      <w:pPr>
+        <w:pStyle w:val="Textoindependiente"/>
+      </w:pPr>
+      <w:r>
+        <w:rPr>
+          <w:b/>
+          <w:bCs/>
+        </w:rPr>
+        <w:t xml:space="preserve">Per què utilitzar ABP?</w:t>
+      </w:r>
+      <w:r>
+        <w:br/>
+      </w:r>
+      <w:r>
+        <w:t xml:space="preserve">Perquè situa l’estudiant davant problemes oberts, decisions, coordinació i interaccions pròximes a la pràctica professional. La literatura ofereix una base favorable per a projectes d’un semestre i equips petits, tot i que no estableix una regla universal.</w:t>
+      </w:r>
+    </w:p>
+    <w:p>
+      <w:pPr>
+        <w:pStyle w:val="Textoindependiente"/>
+      </w:pPr>
+      <w:r>
+        <w:rPr>
+          <w:b/>
+          <w:bCs/>
+        </w:rPr>
+        <w:t xml:space="preserve">Què aporta el disseny mixt?</w:t>
+      </w:r>
+      <w:r>
+        <w:br/>
+      </w:r>
+      <w:r>
+        <w:t xml:space="preserve">Permet combinar evolució mesurable i comprensió del procés. Les dades quantitatives faciliten la comparació; les qualitatives ajuden a interpretar com i per què es produeixen determinats canvis o dificultats.</w:t>
+      </w:r>
+    </w:p>
+    <w:p>
+      <w:pPr>
+        <w:pStyle w:val="Textoindependiente"/>
+      </w:pPr>
+      <w:r>
+        <w:rPr>
+          <w:b/>
+          <w:bCs/>
+        </w:rPr>
+        <w:t xml:space="preserve">Per què un disseny quasiexperimental?</w:t>
+      </w:r>
+      <w:r>
+        <w:br/>
+      </w:r>
+      <w:r>
+        <w:t xml:space="preserve">Perquè la recerca es desenvolupa en grups docents reals, on l’assignació aleatòria completa pot no ser viable. El disseny quasiexperimental permet introduir comparació i control metodològic respectant el context educatiu.</w:t>
+      </w:r>
+    </w:p>
+    <w:p>
+      <w:pPr>
+        <w:pStyle w:val="Textoindependiente"/>
+      </w:pPr>
+      <w:r>
+        <w:rPr>
+          <w:b/>
+          <w:bCs/>
+        </w:rPr>
+        <w:t xml:space="preserve">Com s’evitarà basar-se només en autopercepcions?</w:t>
+      </w:r>
+      <w:r>
+        <w:br/>
+      </w:r>
+      <w:r>
+        <w:t xml:space="preserve">Mitjançant diverses fonts d’evidència, seguiment temporal i triangulació. Els instruments concrets seran els aprovats en el disseny de recerca; no s’ha de donar per confirmat cap instrument que encara no ho estigui.</w:t>
+      </w:r>
+    </w:p>
+    <w:p>
+      <w:pPr>
+        <w:pStyle w:val="Textoindependiente"/>
+      </w:pPr>
+      <w:r>
+        <w:rPr>
+          <w:b/>
+          <w:bCs/>
+        </w:rPr>
+        <w:t xml:space="preserve">Quina transferibilitat pot tenir?</w:t>
+      </w:r>
+      <w:r>
+        <w:br/>
+      </w:r>
+      <w:r>
+        <w:t xml:space="preserve">La finalitat és formular criteris d’intervenció i una proposta curricular adaptable. La transferibilitat no s’ha de pressuposar: s’haurà d’argumentar a partir del disseny, el context i els resultats obtinguts.</w:t>
+      </w:r>
+    </w:p>
+    <w:p>
+      <w:pPr>
+        <w:pStyle w:val="Textoindependiente"/>
+      </w:pPr>
+      <w:r>
+        <w:rPr>
+          <w:b/>
+          <w:bCs/>
+        </w:rPr>
+        <w:t xml:space="preserve">Quina és la contribució real a l’Enginyeria del Software?</w:t>
+      </w:r>
+      <w:r>
+        <w:br/>
+      </w:r>
+      <w:r>
+        <w:t xml:space="preserve">Estudiar explícitament competències que intervenen en requisits, feedback, revisions, decisions tècniques, coordinació i relació amb stakeholders, dins les mateixes assignatures on s’aprèn a desenvolupar software.</w:t>
+      </w:r>
+    </w:p>
+    <w:bookmarkEnd w:id="41"/>
+    <w:bookmarkStart w:id="42" w:name="errors-que-cal-evitar"/>
+    <w:p>
+      <w:pPr>
+        <w:pStyle w:val="Ttulo3"/>
+      </w:pPr>
+      <w:r>
+        <w:t xml:space="preserve">Errors que cal evitar</w:t>
+      </w:r>
+    </w:p>
+    <w:p>
+      <w:pPr>
+        <w:pStyle w:val="Compact"/>
+        <w:numPr>
+          <w:ilvl w:val="0"/>
+          <w:numId w:val="1013"/>
+        </w:numPr>
+      </w:pPr>
+      <w:r>
+        <w:t xml:space="preserve">No dir que no existeix recerca prèvia ni que és la primera recerca sobre el tema.</w:t>
+      </w:r>
+    </w:p>
+    <w:p>
+      <w:pPr>
+        <w:pStyle w:val="Compact"/>
+        <w:numPr>
+          <w:ilvl w:val="0"/>
+          <w:numId w:val="1013"/>
+        </w:numPr>
+      </w:pPr>
+      <w:r>
+        <w:t xml:space="preserve">No presentar la literatura com un buit total ni com una absència absoluta.</w:t>
+      </w:r>
+    </w:p>
+    <w:p>
+      <w:pPr>
+        <w:pStyle w:val="Compact"/>
+        <w:numPr>
+          <w:ilvl w:val="0"/>
+          <w:numId w:val="1013"/>
+        </w:numPr>
+      </w:pPr>
+      <w:r>
+        <w:t xml:space="preserve">No confondre una combinació original amb la novetat absoluta de cada component.</w:t>
+      </w:r>
+    </w:p>
+    <w:p>
+      <w:pPr>
+        <w:pStyle w:val="Compact"/>
+        <w:numPr>
+          <w:ilvl w:val="0"/>
+          <w:numId w:val="1013"/>
+        </w:numPr>
+      </w:pPr>
+      <w:r>
+        <w:t xml:space="preserve">No prometre resultats: dir «la tesi pretén avaluar», no «la tesi ha demostrat».</w:t>
+      </w:r>
+    </w:p>
+    <w:p>
+      <w:pPr>
+        <w:pStyle w:val="Compact"/>
+        <w:numPr>
+          <w:ilvl w:val="0"/>
+          <w:numId w:val="1013"/>
+        </w:numPr>
+      </w:pPr>
+      <w:r>
+        <w:t xml:space="preserve">No reduir la contribució a la mida dels equips o a la durada dels projectes.</w:t>
+      </w:r>
+    </w:p>
+    <w:p>
+      <w:pPr>
+        <w:pStyle w:val="Compact"/>
+        <w:numPr>
+          <w:ilvl w:val="0"/>
+          <w:numId w:val="1013"/>
+        </w:numPr>
+      </w:pPr>
+      <w:r>
+        <w:t xml:space="preserve">No convertir cap instrument no confirmat en l’eix de la metodologia.</w:t>
+      </w:r>
+    </w:p>
+    <w:p>
+      <w:pPr>
+        <w:pStyle w:val="Compact"/>
+        <w:numPr>
+          <w:ilvl w:val="0"/>
+          <w:numId w:val="1013"/>
+        </w:numPr>
+      </w:pPr>
+      <w:r>
+        <w:t xml:space="preserve">No confondre satisfacció, autopercepció i evolució competencial.</w:t>
+      </w:r>
+    </w:p>
+    <w:p>
+      <w:pPr>
+        <w:pStyle w:val="Compact"/>
+        <w:numPr>
+          <w:ilvl w:val="0"/>
+          <w:numId w:val="1013"/>
+        </w:numPr>
+      </w:pPr>
+      <w:r>
+        <w:t xml:space="preserve">No afirmar transferibilitat automàtica; presentar-la com una possibilitat que caldrà fonamentar.</w:t>
+      </w:r>
+    </w:p>
+    <w:bookmarkEnd w:id="42"/>
+    <w:bookmarkEnd w:id="43"/>
+    <w:bookmarkStart w:id="51" w:name="X0a4ad13447e7fee41299eb4124236d67e508b18"/>
+    <w:p>
+      <w:pPr>
+        <w:pStyle w:val="Ttulo2"/>
+      </w:pPr>
+      <w:r>
+        <w:t xml:space="preserve">3. ANNEX C. ESTRATÈGIA DE DESENVOLUPAMENT I MODALITATS DE TESI</w:t>
+      </w:r>
+    </w:p>
+    <w:bookmarkStart w:id="44" w:name="preguntes-probables-1"/>
+    <w:p>
+      <w:pPr>
+        <w:pStyle w:val="Ttulo3"/>
+      </w:pPr>
+      <w:r>
+        <w:t xml:space="preserve">Preguntes probables</w:t>
+      </w:r>
+    </w:p>
+    <w:p>
+      <w:pPr>
+        <w:pStyle w:val="Compact"/>
+        <w:numPr>
+          <w:ilvl w:val="0"/>
+          <w:numId w:val="1014"/>
+        </w:numPr>
+      </w:pPr>
+      <w:r>
+        <w:t xml:space="preserve">És realista acabar el doctorat en dos anys?</w:t>
+      </w:r>
+    </w:p>
+    <w:p>
+      <w:pPr>
+        <w:pStyle w:val="Compact"/>
+        <w:numPr>
+          <w:ilvl w:val="0"/>
+          <w:numId w:val="1014"/>
+        </w:numPr>
+      </w:pPr>
+      <w:r>
+        <w:t xml:space="preserve">Quantes publicacions necessita una tesi per compendi?</w:t>
+      </w:r>
+    </w:p>
+    <w:p>
+      <w:pPr>
+        <w:pStyle w:val="Compact"/>
+        <w:numPr>
+          <w:ilvl w:val="0"/>
+          <w:numId w:val="1014"/>
+        </w:numPr>
+      </w:pPr>
+      <w:r>
+        <w:t xml:space="preserve">Els articles han d’estar publicats?</w:t>
+      </w:r>
+    </w:p>
+    <w:p>
+      <w:pPr>
+        <w:pStyle w:val="Compact"/>
+        <w:numPr>
+          <w:ilvl w:val="0"/>
+          <w:numId w:val="1014"/>
+        </w:numPr>
+      </w:pPr>
+      <w:r>
+        <w:t xml:space="preserve">Què passa si una revista rebutja un manuscrit?</w:t>
+      </w:r>
+    </w:p>
+    <w:p>
+      <w:pPr>
+        <w:pStyle w:val="Compact"/>
+        <w:numPr>
+          <w:ilvl w:val="0"/>
+          <w:numId w:val="1014"/>
+        </w:numPr>
+      </w:pPr>
+      <w:r>
+        <w:t xml:space="preserve">Què passa si una revisió editorial s’allarga?</w:t>
+      </w:r>
+    </w:p>
+    <w:p>
+      <w:pPr>
+        <w:pStyle w:val="Compact"/>
+        <w:numPr>
+          <w:ilvl w:val="0"/>
+          <w:numId w:val="1014"/>
+        </w:numPr>
+      </w:pPr>
+      <w:r>
+        <w:t xml:space="preserve">La finalització depèn exclusivament de tres articles?</w:t>
+      </w:r>
+    </w:p>
+    <w:p>
+      <w:pPr>
+        <w:pStyle w:val="Compact"/>
+        <w:numPr>
+          <w:ilvl w:val="0"/>
+          <w:numId w:val="1014"/>
+        </w:numPr>
+      </w:pPr>
+      <w:r>
+        <w:t xml:space="preserve">La tesi monogràfica és menys exigent?</w:t>
+      </w:r>
+    </w:p>
+    <w:p>
+      <w:pPr>
+        <w:pStyle w:val="Compact"/>
+        <w:numPr>
+          <w:ilvl w:val="0"/>
+          <w:numId w:val="1014"/>
+        </w:numPr>
+      </w:pPr>
+      <w:r>
+        <w:t xml:space="preserve">Qui decideix la modalitat final?</w:t>
+      </w:r>
+    </w:p>
+    <w:p>
+      <w:pPr>
+        <w:pStyle w:val="Compact"/>
+        <w:numPr>
+          <w:ilvl w:val="0"/>
+          <w:numId w:val="1014"/>
+        </w:numPr>
+      </w:pPr>
+      <w:r>
+        <w:t xml:space="preserve">Es pot canviar de modalitat?</w:t>
+      </w:r>
+    </w:p>
+    <w:p>
+      <w:pPr>
+        <w:pStyle w:val="Compact"/>
+        <w:numPr>
+          <w:ilvl w:val="0"/>
+          <w:numId w:val="1014"/>
+        </w:numPr>
+      </w:pPr>
+      <w:r>
+        <w:t xml:space="preserve">Quins controls de qualitat s’apliquen?</w:t>
+      </w:r>
+    </w:p>
+    <w:bookmarkEnd w:id="44"/>
+    <w:bookmarkStart w:id="45" w:name="idea-central-1"/>
+    <w:p>
+      <w:pPr>
+        <w:pStyle w:val="Ttulo3"/>
+      </w:pPr>
+      <w:r>
+        <w:t xml:space="preserve">Idea central</w:t>
+      </w:r>
+    </w:p>
+    <w:p>
+      <w:pPr>
+        <w:pStyle w:val="FirstParagraph"/>
+      </w:pPr>
+      <w:r>
+        <w:t xml:space="preserve">Hem fixat el compendi de publicacions com a objectiu preferent i de màxima ambició, d’acord amb la direcció de la tesi. La planificació està orientada a dos anys, però no garanteix calendaris editorials. El Reglament dels estudis de doctorat de la UDIMA, versió maig de 2026, preveu tant el compendi com la tesi monogràfica. Ambdues modalitats exigeixen una recerca doctoral original i de qualitat i han de superar els controls acadèmics generals.</w:t>
+      </w:r>
+    </w:p>
+    <w:bookmarkEnd w:id="45"/>
+    <w:bookmarkStart w:id="46" w:name="resposta-de-reserva-breu-3040-segons-1"/>
+    <w:p>
+      <w:pPr>
+        <w:pStyle w:val="Ttulo3"/>
+      </w:pPr>
+      <w:r>
+        <w:t xml:space="preserve">Resposta de reserva — breu, 30–40 segons</w:t>
+      </w:r>
+    </w:p>
+    <w:p>
+      <w:pPr>
+        <w:pStyle w:val="FirstParagraph"/>
+      </w:pPr>
+      <w:r>
+        <w:t xml:space="preserve">L’objectiu acordat amb la direcció de la tesi és treballar per un compendi de publicacions. L’article 33 del Reglament de la UDIMA exigeix un mínim de tres contribucions publicades o admeses per a publicació, amb les autoritzacions corresponents. És un objectiu ambiciós, però els calendaris editorials no depenen completament del doctorand. Per això la planificació manté la flexibilitat normativa de la tesi monogràfica, que continua exigint una recerca original completa, una contribució científica de qualitat per sol·licitar el dipòsit i els mateixos controls generals de qualitat.</w:t>
+      </w:r>
+    </w:p>
+    <w:bookmarkEnd w:id="46"/>
+    <w:bookmarkStart w:id="47" w:name="X2c65be1f6b7f7c2bc57dc197e1783393e2e3ed9"/>
+    <w:p>
+      <w:pPr>
+        <w:pStyle w:val="Ttulo3"/>
+      </w:pPr>
+      <w:r>
+        <w:t xml:space="preserve">Resposta de reserva — desenvolupada, 75–90 segons</w:t>
+      </w:r>
+    </w:p>
+    <w:p>
+      <w:pPr>
+        <w:pStyle w:val="FirstParagraph"/>
+      </w:pPr>
+      <w:r>
+        <w:t xml:space="preserve">L’objectiu que hem establert amb la direcció de la tesi és treballar per una tesi per compendi de publicacions. D’acord amb l’article 33 del Reglament de doctorat de la UDIMA, aquesta modalitat requereix un mínim de tres contribucions científiques publicades o admeses per a publicació, amb l’autorització explícita de la direcció de la tesi i de la Comissió Acadèmica. El doctorand ha de figurar com a primer autor en la majoria de les contribucions.</w:t>
+      </w:r>
+    </w:p>
+    <w:p>
+      <w:pPr>
+        <w:pStyle w:val="Textoindependiente"/>
+      </w:pPr>
+      <w:r>
+        <w:t xml:space="preserve">És un objectiu viable, però exigent, perquè els terminis de revisió, les peticions de canvis i els possibles rebutjos formen part del funcionament normal de la publicació científica. Per això, la planificació no fa dependre la finalització de la tesi exclusivament d’uns calendaris editorials que no controlo completament.</w:t>
+      </w:r>
+    </w:p>
+    <w:p>
+      <w:pPr>
+        <w:pStyle w:val="Textoindependiente"/>
+      </w:pPr>
+      <w:r>
+        <w:t xml:space="preserve">La normativa permet també desenvolupar una tesi monogràfica. Aquesta via no redueix l’exigència científica: cal una investigació doctoral original i unitària, acreditar una contribució científica de qualitat per poder sol·licitar el dipòsit i superar els procediments de seguiment, predefensa, informes de la direcció i la tutoria, valoració cega externa, autorització de dipòsit i defensa pública.</w:t>
+      </w:r>
+    </w:p>
+    <w:p>
+      <w:pPr>
+        <w:pStyle w:val="Textoindependiente"/>
+      </w:pPr>
+      <w:r>
+        <w:t xml:space="preserve">Per tant, hi ha una estratègia preferent, que és el compendi, i una flexibilitat normativa que protegeix la viabilitat temporal del projecte sense rebaixar-ne els estàndards científics.</w:t>
+      </w:r>
+    </w:p>
+    <w:bookmarkEnd w:id="47"/>
+    <w:bookmarkStart w:id="48" w:name="Xcbd7dd789e4c5668ca9921593a119750419fb18"/>
+    <w:p>
+      <w:pPr>
+        <w:pStyle w:val="Ttulo3"/>
+      </w:pPr>
+      <w:r>
+        <w:t xml:space="preserve">Resposta de reserva — ampliació, aproximadament 2 minuts</w:t>
+      </w:r>
+    </w:p>
+    <w:p>
+      <w:pPr>
+        <w:pStyle w:val="FirstParagraph"/>
+      </w:pPr>
+      <w:r>
+        <w:t xml:space="preserve">Convé distingir entre calendari científic i calendari editorial. El calendari científic inclou el treball de camp, l’anàlisi, la redacció i la producció de contribucions. És una part que es pot planificar i seguir amb la direcció de la tesi. El calendari editorial inclou l’assignació de revisors, les rondes de revisió, les peticions de canvis, l’acceptació o el rebuig i, eventualment, el reenviament a una altra revista. Aquesta segona part només es pot estimar; no es pot garantir.</w:t>
+      </w:r>
+    </w:p>
+    <w:p>
+      <w:pPr>
+        <w:pStyle w:val="Textoindependiente"/>
+      </w:pPr>
+      <w:r>
+        <w:t xml:space="preserve">Per al compendi, l’article 33 exigeix un mínim de tres contribucions publicades o admeses per a publicació, posteriors a la presentació de la proposta de tesi i anteriors a la sol·licitud de dipòsit. També cal l’autorització explícita de la direcció de la tesi i de la Comissió Acadèmica, i el doctorand ha de ser primer autor en la majoria de les publicacions.</w:t>
+      </w:r>
+    </w:p>
+    <w:p>
+      <w:pPr>
+        <w:pStyle w:val="Textoindependiente"/>
+      </w:pPr>
+      <w:r>
+        <w:t xml:space="preserve">La planificació orientada a dos anys s’ha d’entendre, doncs, com un horitzó de treball, no com una garantia. El progrés no s’ha de mesurar únicament pel nombre d’articles acceptats, sinó també per l’execució del pla de recerca, la qualitat de les dades, l’anàlisi, la redacció i la resposta a les revisions.</w:t>
+      </w:r>
+    </w:p>
+    <w:p>
+      <w:pPr>
+        <w:pStyle w:val="Textoindependiente"/>
+      </w:pPr>
+      <w:r>
+        <w:t xml:space="preserve">Si els calendaris editorials no permetessin complir a temps els requisits específics del compendi, la normativa manté la modalitat monogràfica. No és un pla de menor qualitat ni una tesi formada per un sol article. És una recerca doctoral original completa i amb estructura unitària. L’article 34 exigeix acreditar, per sol·licitar el dipòsit, una contribució científica de qualitat derivada de la tesi i publicada després de l’inici dels estudis. A més, la tesi ha de superar els informes favorables, la predefensa, la valoració cega per dues persones expertes externes, les revisions que corresponguin, l’autorització de dipòsit i la defensa pública.</w:t>
+      </w:r>
+    </w:p>
+    <w:p>
+      <w:pPr>
+        <w:pStyle w:val="Textoindependiente"/>
+      </w:pPr>
+      <w:r>
+        <w:t xml:space="preserve">La modalitat final s’haurà de decidir acadèmicament amb la direcció de la tesi i, quan correspongui, amb la Comissió Acadèmica. L’estratègia combina ambició científica i gestió responsable del risc.</w:t>
+      </w:r>
+    </w:p>
+    <w:bookmarkEnd w:id="48"/>
+    <w:bookmarkStart w:id="49" w:name="Xe4c58acb1605516871614afe0abc6fd9043a27e"/>
+    <w:p>
+      <w:pPr>
+        <w:pStyle w:val="Ttulo3"/>
+      </w:pPr>
+      <w:r>
+        <w:t xml:space="preserve">Possibles repreguntes i respostes breus</w:t>
+      </w:r>
+    </w:p>
+    <w:p>
+      <w:pPr>
+        <w:pStyle w:val="FirstParagraph"/>
+      </w:pPr>
+      <w:r>
+        <w:rPr>
+          <w:b/>
+          <w:bCs/>
+        </w:rPr>
+        <w:t xml:space="preserve">Quants articles necessita?</w:t>
+      </w:r>
+      <w:r>
+        <w:br/>
+      </w:r>
+      <w:r>
+        <w:t xml:space="preserve">Per a la modalitat de compendi, un mínim de tres contribucions científiques que compleixin els requisits específics del programa.</w:t>
+      </w:r>
+    </w:p>
+    <w:p>
+      <w:pPr>
+        <w:pStyle w:val="Textoindependiente"/>
+      </w:pPr>
+      <w:r>
+        <w:rPr>
+          <w:b/>
+          <w:bCs/>
+        </w:rPr>
+        <w:t xml:space="preserve">Han d’estar publicats?</w:t>
+      </w:r>
+      <w:r>
+        <w:br/>
+      </w:r>
+      <w:r>
+        <w:t xml:space="preserve">Han d’estar publicats o admesos per a publicació abans de la sol·licitud de dipòsit.</w:t>
+      </w:r>
+    </w:p>
+    <w:p>
+      <w:pPr>
+        <w:pStyle w:val="Textoindependiente"/>
+      </w:pPr>
+      <w:r>
+        <w:rPr>
+          <w:b/>
+          <w:bCs/>
+        </w:rPr>
+        <w:t xml:space="preserve">Què significa «admesos per a publicació»?</w:t>
+      </w:r>
+      <w:r>
+        <w:br/>
+      </w:r>
+      <w:r>
+        <w:t xml:space="preserve">Que el procés editorial ha conclòs amb una acceptació formal, encara que la publicació definitiva pugui aparèixer més endavant.</w:t>
+      </w:r>
+    </w:p>
+    <w:p>
+      <w:pPr>
+        <w:pStyle w:val="Textoindependiente"/>
+      </w:pPr>
+      <w:r>
+        <w:rPr>
+          <w:b/>
+          <w:bCs/>
+        </w:rPr>
+        <w:t xml:space="preserve">És possible publicar tres articles en dos anys?</w:t>
+      </w:r>
+      <w:r>
+        <w:br/>
+      </w:r>
+      <w:r>
+        <w:t xml:space="preserve">És un objectiu possible i exigent, però no es pot garantir. Depèn del progrés científic i també de processos editorials externs.</w:t>
+      </w:r>
+    </w:p>
+    <w:p>
+      <w:pPr>
+        <w:pStyle w:val="Textoindependiente"/>
+      </w:pPr>
+      <w:r>
+        <w:rPr>
+          <w:b/>
+          <w:bCs/>
+        </w:rPr>
+        <w:t xml:space="preserve">Què passa si una revista rebutja el manuscrit?</w:t>
+      </w:r>
+      <w:r>
+        <w:br/>
+      </w:r>
+      <w:r>
+        <w:t xml:space="preserve">El rebuig és un risc normal. Cal analitzar els informes, millorar el manuscrit i valorar amb la direcció si es reenvia a una altra revista o es reformula l’estratègia.</w:t>
+      </w:r>
+    </w:p>
+    <w:p>
+      <w:pPr>
+        <w:pStyle w:val="Textoindependiente"/>
+      </w:pPr>
+      <w:r>
+        <w:rPr>
+          <w:b/>
+          <w:bCs/>
+        </w:rPr>
+        <w:t xml:space="preserve">Què passa si una revisió dura molts mesos?</w:t>
+      </w:r>
+      <w:r>
+        <w:br/>
+      </w:r>
+      <w:r>
+        <w:t xml:space="preserve">Es continua avançant en la recerca i en altres contribucions. La planificació no pot quedar aturada ni dependre d’un únic procés editorial.</w:t>
+      </w:r>
+    </w:p>
+    <w:p>
+      <w:pPr>
+        <w:pStyle w:val="Textoindependiente"/>
+      </w:pPr>
+      <w:r>
+        <w:rPr>
+          <w:b/>
+          <w:bCs/>
+        </w:rPr>
+        <w:t xml:space="preserve">La monografia és menys exigent?</w:t>
+      </w:r>
+      <w:r>
+        <w:br/>
+      </w:r>
+      <w:r>
+        <w:t xml:space="preserve">No. Canvia la forma de presentar la recerca, no l’exigència d’originalitat, rigor i qualitat científica.</w:t>
+      </w:r>
+    </w:p>
+    <w:p>
+      <w:pPr>
+        <w:pStyle w:val="Textoindependiente"/>
+      </w:pPr>
+      <w:r>
+        <w:rPr>
+          <w:b/>
+          <w:bCs/>
+        </w:rPr>
+        <w:t xml:space="preserve">Qui decideix la modalitat final?</w:t>
+      </w:r>
+      <w:r>
+        <w:br/>
+      </w:r>
+      <w:r>
+        <w:t xml:space="preserve">És una decisió acadèmica treballada amb la direcció de la tesi. El compendi requereix, a més, l’autorització explícita de la direcció i de la Comissió Acadèmica.</w:t>
+      </w:r>
+    </w:p>
+    <w:p>
+      <w:pPr>
+        <w:pStyle w:val="Textoindependiente"/>
+      </w:pPr>
+      <w:r>
+        <w:rPr>
+          <w:b/>
+          <w:bCs/>
+        </w:rPr>
+        <w:t xml:space="preserve">Es pot canviar de modalitat?</w:t>
+      </w:r>
+      <w:r>
+        <w:br/>
+      </w:r>
+      <w:r>
+        <w:t xml:space="preserve">La normativa preveu les dues modalitats. Qualsevol ajust s’ha de valorar formalment amb la direcció de la tesi i d’acord amb els procediments del programa.</w:t>
+      </w:r>
+    </w:p>
+    <w:p>
+      <w:pPr>
+        <w:pStyle w:val="Textoindependiente"/>
+      </w:pPr>
+      <w:r>
+        <w:rPr>
+          <w:b/>
+          <w:bCs/>
+        </w:rPr>
+        <w:t xml:space="preserve">Quina contribució necessita una tesi monogràfica?</w:t>
+      </w:r>
+      <w:r>
+        <w:br/>
+      </w:r>
+      <w:r>
+        <w:t xml:space="preserve">Per sol·licitar el dipòsit, l’article 34 exigeix acreditar documentalment una contribució científica de qualitat derivada de la tesi i publicada després de l’inici dels estudis de doctorat.</w:t>
+      </w:r>
+    </w:p>
+    <w:p>
+      <w:pPr>
+        <w:pStyle w:val="Textoindependiente"/>
+      </w:pPr>
+      <w:r>
+        <w:rPr>
+          <w:b/>
+          <w:bCs/>
+        </w:rPr>
+        <w:t xml:space="preserve">Com es garanteix la qualitat?</w:t>
+      </w:r>
+      <w:r>
+        <w:br/>
+      </w:r>
+      <w:r>
+        <w:t xml:space="preserve">Mitjançant el seguiment acadèmic, els informes favorables de la direcció i la tutoria, la predefensa, la valoració cega externa, les possibles revisions, l’autorització de dipòsit i la defensa pública.</w:t>
+      </w:r>
+    </w:p>
+    <w:bookmarkEnd w:id="49"/>
+    <w:bookmarkStart w:id="50" w:name="errors-que-cal-evitar-1"/>
+    <w:p>
+      <w:pPr>
+        <w:pStyle w:val="Ttulo3"/>
+      </w:pPr>
+      <w:r>
+        <w:t xml:space="preserve">Errors que cal evitar</w:t>
+      </w:r>
+    </w:p>
+    <w:p>
+      <w:pPr>
+        <w:pStyle w:val="Compact"/>
+        <w:numPr>
+          <w:ilvl w:val="0"/>
+          <w:numId w:val="1015"/>
+        </w:numPr>
+      </w:pPr>
+      <w:r>
+        <w:t xml:space="preserve">No garantir que la tesi s’acabarà en dos anys.</w:t>
+      </w:r>
+    </w:p>
+    <w:p>
+      <w:pPr>
+        <w:pStyle w:val="Compact"/>
+        <w:numPr>
+          <w:ilvl w:val="0"/>
+          <w:numId w:val="1015"/>
+        </w:numPr>
+      </w:pPr>
+      <w:r>
+        <w:t xml:space="preserve">No afirmar que tres articles en dos anys estan assegurats.</w:t>
+      </w:r>
+    </w:p>
+    <w:p>
+      <w:pPr>
+        <w:pStyle w:val="Compact"/>
+        <w:numPr>
+          <w:ilvl w:val="0"/>
+          <w:numId w:val="1015"/>
+        </w:numPr>
+      </w:pPr>
+      <w:r>
+        <w:t xml:space="preserve">No presentar la tesi monogràfica com una reacció automàtica a un rebuig.</w:t>
+      </w:r>
+    </w:p>
+    <w:p>
+      <w:pPr>
+        <w:pStyle w:val="Compact"/>
+        <w:numPr>
+          <w:ilvl w:val="0"/>
+          <w:numId w:val="1015"/>
+        </w:numPr>
+      </w:pPr>
+      <w:r>
+        <w:t xml:space="preserve">No dir que una monografia consisteix en un únic article.</w:t>
+      </w:r>
+    </w:p>
+    <w:p>
+      <w:pPr>
+        <w:pStyle w:val="Compact"/>
+        <w:numPr>
+          <w:ilvl w:val="0"/>
+          <w:numId w:val="1015"/>
+        </w:numPr>
+      </w:pPr>
+      <w:r>
+        <w:t xml:space="preserve">No dir que la monografia és més fàcil o menys exigent.</w:t>
+      </w:r>
+    </w:p>
+    <w:p>
+      <w:pPr>
+        <w:pStyle w:val="Compact"/>
+        <w:numPr>
+          <w:ilvl w:val="0"/>
+          <w:numId w:val="1015"/>
+        </w:numPr>
+      </w:pPr>
+      <w:r>
+        <w:t xml:space="preserve">No afirmar que la modalitat depèn exclusivament del doctorand.</w:t>
+      </w:r>
+    </w:p>
+    <w:p>
+      <w:pPr>
+        <w:pStyle w:val="Compact"/>
+        <w:numPr>
+          <w:ilvl w:val="0"/>
+          <w:numId w:val="1015"/>
+        </w:numPr>
+      </w:pPr>
+      <w:r>
+        <w:t xml:space="preserve">No ometre les autoritzacions necessàries per al compendi.</w:t>
+      </w:r>
+    </w:p>
+    <w:p>
+      <w:pPr>
+        <w:pStyle w:val="Compact"/>
+        <w:numPr>
+          <w:ilvl w:val="0"/>
+          <w:numId w:val="1015"/>
+        </w:numPr>
+      </w:pPr>
+      <w:r>
+        <w:t xml:space="preserve">No confondre un manuscrit enviat o en revisió amb un article admès per a publicació.</w:t>
+      </w:r>
+    </w:p>
+    <w:bookmarkEnd w:id="50"/>
+    <w:bookmarkEnd w:id="51"/>
+    <w:bookmarkStart w:id="59" w:name="X7f98cded9a77bffd6f3a9b2673fedb429e9ed82"/>
+    <w:p>
+      <w:pPr>
+        <w:pStyle w:val="Ttulo2"/>
+      </w:pPr>
+      <w:r>
+        <w:t xml:space="preserve">4. ANNEX D. DEMANDA PROFESSIONAL DE COMPETÈNCIES SOCIOEMOCIONALS</w:t>
+      </w:r>
+    </w:p>
+    <w:bookmarkStart w:id="52" w:name="preguntes-probables-2"/>
+    <w:p>
+      <w:pPr>
+        <w:pStyle w:val="Ttulo3"/>
+      </w:pPr>
+      <w:r>
+        <w:t xml:space="preserve">Preguntes probables</w:t>
+      </w:r>
+    </w:p>
+    <w:p>
+      <w:pPr>
+        <w:pStyle w:val="Compact"/>
+        <w:numPr>
+          <w:ilvl w:val="0"/>
+          <w:numId w:val="1016"/>
+        </w:numPr>
+      </w:pPr>
+      <w:r>
+        <w:t xml:space="preserve">Quina mostra s’ha analitzat i de quines fonts prové?</w:t>
+      </w:r>
+    </w:p>
+    <w:p>
+      <w:pPr>
+        <w:pStyle w:val="Compact"/>
+        <w:numPr>
+          <w:ilvl w:val="0"/>
+          <w:numId w:val="1016"/>
+        </w:numPr>
+      </w:pPr>
+      <w:r>
+        <w:t xml:space="preserve">Com s’han definit i codificat les competències socioemocionals?</w:t>
+      </w:r>
+    </w:p>
+    <w:p>
+      <w:pPr>
+        <w:pStyle w:val="Compact"/>
+        <w:numPr>
+          <w:ilvl w:val="0"/>
+          <w:numId w:val="1016"/>
+        </w:numPr>
+      </w:pPr>
+      <w:r>
+        <w:t xml:space="preserve">El 84,7 % es pot generalitzar a tot el mercat?</w:t>
+      </w:r>
+    </w:p>
+    <w:p>
+      <w:pPr>
+        <w:pStyle w:val="Compact"/>
+        <w:numPr>
+          <w:ilvl w:val="0"/>
+          <w:numId w:val="1016"/>
+        </w:numPr>
+      </w:pPr>
+      <w:r>
+        <w:t xml:space="preserve">Com s’ha controlat la concentració de moltes ofertes en una mateixa empresa?</w:t>
+      </w:r>
+    </w:p>
+    <w:p>
+      <w:pPr>
+        <w:pStyle w:val="Compact"/>
+        <w:numPr>
+          <w:ilvl w:val="0"/>
+          <w:numId w:val="1016"/>
+        </w:numPr>
+      </w:pPr>
+      <w:r>
+        <w:t xml:space="preserve">Com s’ha validat el classificador lexical?</w:t>
+      </w:r>
+    </w:p>
+    <w:p>
+      <w:pPr>
+        <w:pStyle w:val="Compact"/>
+        <w:numPr>
+          <w:ilvl w:val="0"/>
+          <w:numId w:val="1016"/>
+        </w:numPr>
+      </w:pPr>
+      <w:r>
+        <w:t xml:space="preserve">Per què l’empatia i l’escolta activa apareixen poc de manera literal?</w:t>
+      </w:r>
+    </w:p>
+    <w:p>
+      <w:pPr>
+        <w:pStyle w:val="Compact"/>
+        <w:numPr>
+          <w:ilvl w:val="0"/>
+          <w:numId w:val="1016"/>
+        </w:numPr>
+      </w:pPr>
+      <w:r>
+        <w:t xml:space="preserve">Per què és rellevant la comunicació assertiva?</w:t>
+      </w:r>
+    </w:p>
+    <w:p>
+      <w:pPr>
+        <w:pStyle w:val="Compact"/>
+        <w:numPr>
+          <w:ilvl w:val="0"/>
+          <w:numId w:val="1016"/>
+        </w:numPr>
+      </w:pPr>
+      <w:r>
+        <w:t xml:space="preserve">La intel·ligència artificial farà menys necessàries aquestes competències?</w:t>
+      </w:r>
+    </w:p>
+    <w:p>
+      <w:pPr>
+        <w:pStyle w:val="Compact"/>
+        <w:numPr>
+          <w:ilvl w:val="0"/>
+          <w:numId w:val="1016"/>
+        </w:numPr>
+      </w:pPr>
+      <w:r>
+        <w:t xml:space="preserve">Les competències tècniques deixen de ser importants?</w:t>
+      </w:r>
+    </w:p>
+    <w:p>
+      <w:pPr>
+        <w:pStyle w:val="Compact"/>
+        <w:numPr>
+          <w:ilvl w:val="0"/>
+          <w:numId w:val="1016"/>
+        </w:numPr>
+      </w:pPr>
+      <w:r>
+        <w:t xml:space="preserve">Com es tradueix aquesta demanda en una intervenció educativa?</w:t>
+      </w:r>
+    </w:p>
+    <w:p>
+      <w:pPr>
+        <w:pStyle w:val="Compact"/>
+        <w:numPr>
+          <w:ilvl w:val="0"/>
+          <w:numId w:val="1016"/>
+        </w:numPr>
+      </w:pPr>
+      <w:r>
+        <w:t xml:space="preserve">Per què aquest cas és rellevant per a una tesi doctoral?</w:t>
+      </w:r>
+    </w:p>
+    <w:bookmarkEnd w:id="52"/>
+    <w:bookmarkStart w:id="53" w:name="idea-central-2"/>
+    <w:p>
+      <w:pPr>
+        <w:pStyle w:val="Ttulo3"/>
+      </w:pPr>
+      <w:r>
+        <w:t xml:space="preserve">Idea central</w:t>
+      </w:r>
+    </w:p>
+    <w:p>
+      <w:pPr>
+        <w:pStyle w:val="FirstParagraph"/>
+      </w:pPr>
+      <w:r>
+        <w:t xml:space="preserve">En una mostra observacional de 222 ofertes úniques de perfils sènior de desenvolupament de software, procedents de 102 empreses i sis fonts públiques, el 84,7 % explicita almenys una competència socioemocional nuclear i el 60,8 % n’explicita almenys dues. La conclusió es manté quan cada empresa rep el mateix pes. La base tècnica continua sent imprescindible; les dades mostren que l’excel·lència sènior incorpora també col·laboració, lideratge, comunicació i mentoria.</w:t>
+      </w:r>
+    </w:p>
+    <w:bookmarkEnd w:id="53"/>
+    <w:bookmarkStart w:id="54" w:name="resposta-de-reserva-breu-3040-segons-2"/>
+    <w:p>
+      <w:pPr>
+        <w:pStyle w:val="Ttulo3"/>
+      </w:pPr>
+      <w:r>
+        <w:t xml:space="preserve">Resposta de reserva — breu, 30–40 segons</w:t>
+      </w:r>
+    </w:p>
+    <w:p>
+      <w:pPr>
+        <w:pStyle w:val="FirstParagraph"/>
+      </w:pPr>
+      <w:r>
+        <w:t xml:space="preserve">He analitzat 222 ofertes úniques de perfils sènior de desenvolupament de software, publicades per 102 empreses en sis fonts durant els darrers noranta dies. El 84,7 % demana almenys una competència socioemocional nuclear i el 60,8 % en demana almenys dues. Les més freqüents són col·laboració, lideratge o influència, comunicació i mentoria. Donant el mateix pes a cada empresa, el resultat continua sent del 79,1 %. No és una mostra probabilística de tot el mercat, però sí una evidència multifuente, actual i molt més robusta que un cas individual.</w:t>
+      </w:r>
+    </w:p>
+    <w:bookmarkEnd w:id="54"/>
+    <w:bookmarkStart w:id="55" w:name="Xad83131723dafd6c1c489565069d99c0b2d0c3c"/>
+    <w:p>
+      <w:pPr>
+        <w:pStyle w:val="Ttulo3"/>
+      </w:pPr>
+      <w:r>
+        <w:t xml:space="preserve">Resposta de reserva — desenvolupada, 75–90 segons</w:t>
+      </w:r>
+    </w:p>
+    <w:p>
+      <w:pPr>
+        <w:pStyle w:val="FirstParagraph"/>
+      </w:pPr>
+      <w:r>
+        <w:t xml:space="preserve">L’estudi parteix de 2.610 anuncis de sis fonts públiques. Després d’aplicar una finestra de noranta dies, exigir desenvolupament de software i seniority verificable, excloure perfils adjacents i eliminar duplicats, la mostra final és de 222 ofertes de 102 empreses.</w:t>
+      </w:r>
+    </w:p>
+    <w:p>
+      <w:pPr>
+        <w:pStyle w:val="Textoindependiente"/>
+      </w:pPr>
+      <w:r>
+        <w:t xml:space="preserve">El 84,7 % explicita almenys una competència socioemocional nuclear, amb un interval de confiança del 95 % entre el 79,4 i el 88,8 %. Amb el criteri més exigent de dues competències, el resultat és del 60,8 %, amb un interval entre el 54,3 i el 67 %. Destaquen la col·laboració, amb un 64 %; el lideratge, la influència o l’ownership, amb un 39,2 %; la comunicació explícita, amb un 30,2 %; i la mentoria, amb un 28,8 %.</w:t>
+      </w:r>
+    </w:p>
+    <w:p>
+      <w:pPr>
+        <w:pStyle w:val="Textoindependiente"/>
+      </w:pPr>
+      <w:r>
+        <w:t xml:space="preserve">Per evitar que unes poques empreses amb moltes vacants dominin el resultat, he repetit el càlcul donant el mateix pes a cada empresa: el 79,1 % continua demanant almenys una competència. També he limitat la mostra a un màxim de tres anuncis per empresa i el resultat és del 83,3 %. Per prudència, el feedback i la revisió de codi no formen part de l’indicador principal.</w:t>
+      </w:r>
+    </w:p>
+    <w:p>
+      <w:pPr>
+        <w:pStyle w:val="Textoindependiente"/>
+      </w:pPr>
+      <w:r>
+        <w:t xml:space="preserve">No és una mostra probabilística de tot el mercat ni mesura hores de treball o importància relativa. Sí que mostra, de manera actual i multifuente, que una base tècnica exigent conviu de manera recurrent amb demandes de coordinació, comunicació, lideratge i acompanyament. Això reforça la pertinència professional d’investigar com cultivar aquestes competències dins la formació universitària en Enginyeria del Software.</w:t>
+      </w:r>
+    </w:p>
+    <w:bookmarkEnd w:id="55"/>
+    <w:bookmarkStart w:id="56" w:name="Xacbd0b5c635190e966fdca77df9b6b1780dc71d"/>
+    <w:p>
+      <w:pPr>
+        <w:pStyle w:val="Ttulo3"/>
+      </w:pPr>
+      <w:r>
+        <w:t xml:space="preserve">Resposta de reserva — ampliació, aproximadament 2 minuts</w:t>
+      </w:r>
+    </w:p>
+    <w:p>
+      <w:pPr>
+        <w:pStyle w:val="FirstParagraph"/>
+      </w:pPr>
+      <w:r>
+        <w:t xml:space="preserve">L’anàlisi es va dissenyar com un estudi observacional multifuente. La instantània és del 16 de juliol de 2026 i cobreix els noranta dies anteriors. Les fonts són The Muse, Himalayas, Arbeitnow, Jobicy, Remotive i Remote OK. La unitat d’anàlisi és una oferta única.</w:t>
+      </w:r>
+    </w:p>
+    <w:p>
+      <w:pPr>
+        <w:pStyle w:val="Textoindependiente"/>
+      </w:pPr>
+      <w:r>
+        <w:t xml:space="preserve">Els criteris d’inclusió són deliberadament conservadors. El títol ha d’identificar desenvolupament de software —software, backend, frontend, full stack, web, mòbil o aplicacions— i ha d’expressar seniority. Quan el portal només aporta una etiqueta sènior, la descripció ha de mostrar almenys quatre anys d’experiència. S’exclouen direcció, product management, dades o IA purs, DevOps, SRE, QA, sistemes, vendes, suport, maquinari i altres enginyeries.</w:t>
+      </w:r>
+    </w:p>
+    <w:p>
+      <w:pPr>
+        <w:pStyle w:val="Textoindependiente"/>
+      </w:pPr>
+      <w:r>
+        <w:t xml:space="preserve">La codificació és multietiqueta i reconeix formulacions explícites en anglès, alemany i castellà o català. Les categories nuclears són comunicació, col·laboració, alineament amb stakeholders, mentoria, lideratge o influència, aprenentatge o adaptabilitat, negociació o conflicte, i empatia o escolta. El feedback i la revisió de codi es reporten, però s’exclouen de l’indicador principal perquè tenen també un component tècnic clar.</w:t>
+      </w:r>
+    </w:p>
+    <w:p>
+      <w:pPr>
+        <w:pStyle w:val="Textoindependiente"/>
+      </w:pPr>
+      <w:r>
+        <w:t xml:space="preserve">El flux complet parteix de 2.610 anuncis i acaba en 222 ofertes úniques de 102 empreses. La revisió manual de seixanta ofertes va permetre detectar i corregir dos falsos positius de les regles inicials: un rol de radiofreqüència confós amb frontend i una expressió alemanya de nivell d’idioma confosa amb negociació. Després de corregir-ho, es va executar de nou tota l’anàlisi.</w:t>
+      </w:r>
+    </w:p>
+    <w:p>
+      <w:pPr>
+        <w:pStyle w:val="Textoindependiente"/>
+      </w:pPr>
+      <w:r>
+        <w:t xml:space="preserve">Els resultats principals són 84,7 % amb almenys una competència nuclear i 60,8 % amb almenys dues. Els límits inferiors dels intervals del 95 % són 79,4 % i 54,3 %, respectivament. Amb pes igual per empresa, els resultats són 79,1 % i 64,9 %. Amb un màxim de tres ofertes per empresa, són 83,3 % i 70,3 %. Per tant, la conclusió no depèn d’un gran ocupador concret.</w:t>
+      </w:r>
+    </w:p>
+    <w:p>
+      <w:pPr>
+        <w:pStyle w:val="Textoindependiente"/>
+      </w:pPr>
+      <w:r>
+        <w:t xml:space="preserve">Els nivells Lead, Staff i Principal mostren una pauta coherent amb la responsabilitat: el 93,5 % explicita almenys una competència nuclear, el 54,8 % lideratge o influència i el 37,1 % mentoria. És una comparació descriptiva, no causal.</w:t>
+      </w:r>
+    </w:p>
+    <w:p>
+      <w:pPr>
+        <w:pStyle w:val="Textoindependiente"/>
+      </w:pPr>
+      <w:r>
+        <w:t xml:space="preserve">La relació amb la tesi requereix matís. Empatia i escolta activa només apareixen literalment en l’1,8 % de les ofertes; la indústria sol formular la dimensió socioemocional amb verbs operacionals com col·laborar, comunicar, liderar, influir o mentoritzar. La intervenció educativa no s’ha de justificar afirmant que les empreses utilitzen el mateix vocabulari acadèmic, sinó mostrant que les situacions professionals exigeixen comprendre perspectives, coordinar-se, donar feedback i gestionar desacords.</w:t>
+      </w:r>
+    </w:p>
+    <w:p>
+      <w:pPr>
+        <w:pStyle w:val="Textoindependiente"/>
+      </w:pPr>
+      <w:r>
+        <w:t xml:space="preserve">La IA no és una variable causal d’aquest estudi. Es pot argumentar que l’automatització no elimina la responsabilitat, el criteri o la coordinació, però les dades presentades només demostren coexistència de demandes tècniques i humanes. La formulació prudent és que la competència tècnica continua sent imprescindible i que les competències socioemocionals formen part observable de l’excel·lència sènior.</w:t>
+      </w:r>
+    </w:p>
+    <w:bookmarkEnd w:id="56"/>
+    <w:bookmarkStart w:id="57" w:name="X60587c7a0298491ebeb6cdac76b1e1b7c8d1f01"/>
+    <w:p>
+      <w:pPr>
+        <w:pStyle w:val="Ttulo3"/>
+      </w:pPr>
+      <w:r>
+        <w:t xml:space="preserve">Possibles repreguntes i respostes breus</w:t>
+      </w:r>
+    </w:p>
+    <w:p>
+      <w:pPr>
+        <w:pStyle w:val="FirstParagraph"/>
+      </w:pPr>
+      <w:r>
+        <w:rPr>
+          <w:b/>
+          <w:bCs/>
+        </w:rPr>
+        <w:t xml:space="preserve">Quina és la mostra?</w:t>
+      </w:r>
+      <w:r>
+        <w:br/>
+      </w:r>
+      <w:r>
+        <w:t xml:space="preserve">222 ofertes úniques de desenvolupament de software sènior, publicades per 102 empreses en sis fonts públiques entre el 17 d’abril i el 16 de juliol de 2026.</w:t>
+      </w:r>
+    </w:p>
+    <w:p>
+      <w:pPr>
+        <w:pStyle w:val="Textoindependiente"/>
+      </w:pPr>
+      <w:r>
+        <w:rPr>
+          <w:b/>
+          <w:bCs/>
+        </w:rPr>
+        <w:t xml:space="preserve">El 84,7 % permet generalitzar a tot el mercat?</w:t>
+      </w:r>
+      <w:r>
+        <w:br/>
+      </w:r>
+      <w:r>
+        <w:t xml:space="preserve">No com una estimació probabilística. És una prevalença dins una mostra observacional multifuente. Els intervals i controls quantifiquen la robustesa interna, però no eliminen els biaixos de cobertura dels portals.</w:t>
+      </w:r>
+    </w:p>
+    <w:p>
+      <w:pPr>
+        <w:pStyle w:val="Textoindependiente"/>
+      </w:pPr>
+      <w:r>
+        <w:rPr>
+          <w:b/>
+          <w:bCs/>
+        </w:rPr>
+        <w:t xml:space="preserve">Què significa el 60,8 %?</w:t>
+      </w:r>
+      <w:r>
+        <w:br/>
+      </w:r>
+      <w:r>
+        <w:t xml:space="preserve">És la proporció d’ofertes que expliciten almenys dues competències socioemocionals nuclears. És un criteri més exigent que detectar-ne només una.</w:t>
+      </w:r>
+    </w:p>
+    <w:p>
+      <w:pPr>
+        <w:pStyle w:val="Textoindependiente"/>
+      </w:pPr>
+      <w:r>
+        <w:rPr>
+          <w:b/>
+          <w:bCs/>
+        </w:rPr>
+        <w:t xml:space="preserve">Com s’ha controlat la concentració per empresa?</w:t>
+      </w:r>
+      <w:r>
+        <w:br/>
+      </w:r>
+      <w:r>
+        <w:t xml:space="preserve">Amb dues sensibilitats: pes igual per a cadascuna de les 102 empreses i un màxim de tres anuncis per empresa. La conclusió es manté en tots dos casos.</w:t>
+      </w:r>
+    </w:p>
+    <w:p>
+      <w:pPr>
+        <w:pStyle w:val="Textoindependiente"/>
+      </w:pPr>
+      <w:r>
+        <w:rPr>
+          <w:b/>
+          <w:bCs/>
+        </w:rPr>
+        <w:t xml:space="preserve">Com s’ha validat la codificació?</w:t>
+      </w:r>
+      <w:r>
+        <w:br/>
+      </w:r>
+      <w:r>
+        <w:t xml:space="preserve">Amb un llibre de codis multilingüe, regles reproduïbles i una auditoria manual de seixanta ofertes. Els falsos positius detectats es van corregir abans d’executar de nou l’anàlisi final.</w:t>
+      </w:r>
+    </w:p>
+    <w:p>
+      <w:pPr>
+        <w:pStyle w:val="Textoindependiente"/>
+      </w:pPr>
+      <w:r>
+        <w:rPr>
+          <w:b/>
+          <w:bCs/>
+        </w:rPr>
+        <w:t xml:space="preserve">Com es relaciona amb l’empatia?</w:t>
+      </w:r>
+      <w:r>
+        <w:br/>
+      </w:r>
+      <w:r>
+        <w:t xml:space="preserve">L’empatia i l’escolta apareixen literalment en l’1,8 % de les ofertes. La indústria expressa més sovint aquestes situacions amb verbs com col·laborar, alinear, comunicar, liderar o mentoritzar. No s’ha de confondre l’absència de l’etiqueta amb l’absència de la situació relacional.</w:t>
+      </w:r>
+    </w:p>
+    <w:p>
+      <w:pPr>
+        <w:pStyle w:val="Textoindependiente"/>
+      </w:pPr>
+      <w:r>
+        <w:rPr>
+          <w:b/>
+          <w:bCs/>
+        </w:rPr>
+        <w:t xml:space="preserve">Com es relaciona amb l’escolta activa?</w:t>
+      </w:r>
+      <w:r>
+        <w:br/>
+      </w:r>
+      <w:r>
+        <w:t xml:space="preserve">L’alineament entre perfils tècnics i de negoci requereix escoltar, verificar interpretacions i detectar desacords o necessitats abans de prendre decisions, encara que l’anunci no utilitzi literalment l’expressió «escolta activa».</w:t>
+      </w:r>
+    </w:p>
+    <w:p>
+      <w:pPr>
+        <w:pStyle w:val="Textoindependiente"/>
+      </w:pPr>
+      <w:r>
+        <w:rPr>
+          <w:b/>
+          <w:bCs/>
+        </w:rPr>
+        <w:t xml:space="preserve">Per què és rellevant la comunicació assertiva?</w:t>
+      </w:r>
+      <w:r>
+        <w:br/>
+      </w:r>
+      <w:r>
+        <w:t xml:space="preserve">Per defensar criteris tècnics, qüestionar decisions, donar feedback i gestionar desacords amb claredat, respecte i responsabilitat professional.</w:t>
+      </w:r>
+    </w:p>
+    <w:p>
+      <w:pPr>
+        <w:pStyle w:val="Textoindependiente"/>
+      </w:pPr>
+      <w:r>
+        <w:rPr>
+          <w:b/>
+          <w:bCs/>
+        </w:rPr>
+        <w:t xml:space="preserve">La IA farà menys necessàries aquestes competències?</w:t>
+      </w:r>
+      <w:r>
+        <w:br/>
+      </w:r>
+      <w:r>
+        <w:t xml:space="preserve">Aquest estudi no analitza causalment l’efecte de la IA. Permet afirmar que les demandes tècniques i socioemocionals coexisteixen, no que la IA sigui la causa d’una necessitat més gran d’aquestes competències.</w:t>
+      </w:r>
+    </w:p>
+    <w:p>
+      <w:pPr>
+        <w:pStyle w:val="Textoindependiente"/>
+      </w:pPr>
+      <w:r>
+        <w:rPr>
+          <w:b/>
+          <w:bCs/>
+        </w:rPr>
+        <w:t xml:space="preserve">Les competències tècniques deixen de ser importants?</w:t>
+      </w:r>
+      <w:r>
+        <w:br/>
+      </w:r>
+      <w:r>
+        <w:t xml:space="preserve">No. Són imprescindibles i constitueixen la base d’accés al lloc. Les dades indiquen que l’excel·lència sènior afegeix, de manera recurrent, coordinació, comunicació, lideratge i mentoria.</w:t>
+      </w:r>
+    </w:p>
+    <w:p>
+      <w:pPr>
+        <w:pStyle w:val="Textoindependiente"/>
+      </w:pPr>
+      <w:r>
+        <w:rPr>
+          <w:b/>
+          <w:bCs/>
+        </w:rPr>
+        <w:t xml:space="preserve">Com es tradueix aquesta demanda en una intervenció educativa?</w:t>
+      </w:r>
+      <w:r>
+        <w:br/>
+      </w:r>
+      <w:r>
+        <w:t xml:space="preserve">Integrant situacions reals de feedback, presa de decisions, relació amb stakeholders, coordinació i gestió de desacords dins els projectes de software, amb ensenyament i seguiment explícits.</w:t>
+      </w:r>
+    </w:p>
+    <w:p>
+      <w:pPr>
+        <w:pStyle w:val="Textoindependiente"/>
+      </w:pPr>
+      <w:r>
+        <w:rPr>
+          <w:b/>
+          <w:bCs/>
+        </w:rPr>
+        <w:t xml:space="preserve">Per què és rellevant per a una tesi doctoral?</w:t>
+      </w:r>
+      <w:r>
+        <w:br/>
+      </w:r>
+      <w:r>
+        <w:t xml:space="preserve">Perquè connecta el problema educatiu amb l’exercici professional i ajuda a justificar la pertinència d’avaluar una intervenció curricular. L’estudi de mercat no substitueix la revisió de literatura ni l’evidència empírica de la tesi.</w:t>
+      </w:r>
+    </w:p>
+    <w:bookmarkEnd w:id="57"/>
+    <w:bookmarkStart w:id="58" w:name="errors-que-cal-evitar-2"/>
+    <w:p>
+      <w:pPr>
+        <w:pStyle w:val="Ttulo3"/>
+      </w:pPr>
+      <w:r>
+        <w:t xml:space="preserve">Errors que cal evitar</w:t>
+      </w:r>
+    </w:p>
+    <w:p>
+      <w:pPr>
+        <w:pStyle w:val="Compact"/>
+        <w:numPr>
+          <w:ilvl w:val="0"/>
+          <w:numId w:val="1017"/>
+        </w:numPr>
+      </w:pPr>
+      <w:r>
+        <w:t xml:space="preserve">No presentar el 84,7 % com una estimació probabilística de tot el mercat o d’Espanya.</w:t>
+      </w:r>
+    </w:p>
+    <w:p>
+      <w:pPr>
+        <w:pStyle w:val="Compact"/>
+        <w:numPr>
+          <w:ilvl w:val="0"/>
+          <w:numId w:val="1017"/>
+        </w:numPr>
+      </w:pPr>
+      <w:r>
+        <w:t xml:space="preserve">No interpretar els percentatges com a temps de treball, salari o importància relativa.</w:t>
+      </w:r>
+    </w:p>
+    <w:p>
+      <w:pPr>
+        <w:pStyle w:val="Compact"/>
+        <w:numPr>
+          <w:ilvl w:val="0"/>
+          <w:numId w:val="1017"/>
+        </w:numPr>
+      </w:pPr>
+      <w:r>
+        <w:t xml:space="preserve">No confondre intervals de confiança interns amb representativitat del mercat.</w:t>
+      </w:r>
+    </w:p>
+    <w:p>
+      <w:pPr>
+        <w:pStyle w:val="Compact"/>
+        <w:numPr>
+          <w:ilvl w:val="0"/>
+          <w:numId w:val="1017"/>
+        </w:numPr>
+      </w:pPr>
+      <w:r>
+        <w:t xml:space="preserve">No afirmar que empatia o escolta activa apareixen literalment de manera freqüent: el resultat és de l’1,8 %.</w:t>
+      </w:r>
+    </w:p>
+    <w:p>
+      <w:pPr>
+        <w:pStyle w:val="Compact"/>
+        <w:numPr>
+          <w:ilvl w:val="0"/>
+          <w:numId w:val="1017"/>
+        </w:numPr>
+      </w:pPr>
+      <w:r>
+        <w:t xml:space="preserve">No concloure que les competències tècniques són secundàries.</w:t>
+      </w:r>
+    </w:p>
+    <w:p>
+      <w:pPr>
+        <w:pStyle w:val="Compact"/>
+        <w:numPr>
+          <w:ilvl w:val="0"/>
+          <w:numId w:val="1017"/>
+        </w:numPr>
+      </w:pPr>
+      <w:r>
+        <w:t xml:space="preserve">No afirmar que la IA substitueix el coneixement tècnic.</w:t>
+      </w:r>
+    </w:p>
+    <w:p>
+      <w:pPr>
+        <w:pStyle w:val="Compact"/>
+        <w:numPr>
+          <w:ilvl w:val="0"/>
+          <w:numId w:val="1017"/>
+        </w:numPr>
+      </w:pPr>
+      <w:r>
+        <w:t xml:space="preserve">No afirmar una relació causal entre IA i una necessitat automàticament més gran d’empatia.</w:t>
+      </w:r>
+    </w:p>
+    <w:p>
+      <w:pPr>
+        <w:pStyle w:val="Compact"/>
+        <w:numPr>
+          <w:ilvl w:val="0"/>
+          <w:numId w:val="1017"/>
+        </w:numPr>
+      </w:pPr>
+      <w:r>
+        <w:t xml:space="preserve">No ocultar els biaixos de cobertura, la concentració per empresa o el caràcter lexical de la codificació.</w:t>
+      </w:r>
+    </w:p>
+    <w:p>
+      <w:pPr>
+        <w:pStyle w:val="Compact"/>
+        <w:numPr>
+          <w:ilvl w:val="0"/>
+          <w:numId w:val="1017"/>
+        </w:numPr>
+      </w:pPr>
+      <w:r>
+        <w:t xml:space="preserve">No presentar l’estudi com a longitudinal: és una instantània de noranta dies.</w:t>
+      </w:r>
+    </w:p>
+    <w:bookmarkEnd w:id="58"/>
+    <w:bookmarkEnd w:id="59"/>
+    <w:bookmarkStart w:id="60" w:name="fonts-específiques-dels-annexos-b-c-i-d"/>
+    <w:p>
+      <w:pPr>
+        <w:pStyle w:val="Ttulo2"/>
+      </w:pPr>
+      <w:r>
+        <w:t xml:space="preserve">Fonts específiques dels annexos B, C i D</w:t>
+      </w:r>
+    </w:p>
+    <w:p>
+      <w:pPr>
+        <w:pStyle w:val="Compact"/>
+        <w:numPr>
+          <w:ilvl w:val="0"/>
+          <w:numId w:val="1018"/>
+        </w:numPr>
+      </w:pPr>
+      <w:r>
+        <w:rPr>
+          <w:rStyle w:val="VerbatimChar"/>
+        </w:rPr>
+        <w:t xml:space="preserve">Evidence on Project Based Learning Team Size and Duration in University Engineering and Software Engineering.pdf</w:t>
+      </w:r>
+      <w:r>
+        <w:t xml:space="preserve">: síntesi de la literatura sobre ABP, mida dels equips, durada i limitacions metodològiques. S’utilitza com a fonamentació del disseny, no com a prova d’un òptim universal ni com a buit científic central.</w:t>
+      </w:r>
+    </w:p>
+    <w:p>
+      <w:pPr>
+        <w:pStyle w:val="Compact"/>
+        <w:numPr>
+          <w:ilvl w:val="0"/>
+          <w:numId w:val="1018"/>
+        </w:numPr>
+      </w:pPr>
+      <w:r>
+        <w:rPr>
+          <w:rStyle w:val="VerbatimChar"/>
+        </w:rPr>
+        <w:t xml:space="preserve">Reglamento de los estudios de doctorado.pdf</w:t>
+      </w:r>
+      <w:r>
+        <w:t xml:space="preserve">: Reglament dels estudis de doctorat de la UDIMA, versió maig de 2026, especialment els articles 33 i 34.</w:t>
+      </w:r>
+    </w:p>
+    <w:p>
+      <w:pPr>
+        <w:pStyle w:val="Compact"/>
+        <w:numPr>
+          <w:ilvl w:val="0"/>
+          <w:numId w:val="1018"/>
+        </w:numPr>
+      </w:pPr>
+      <w:r>
+        <w:rPr>
+          <w:rStyle w:val="VerbatimChar"/>
+        </w:rPr>
+        <w:t xml:space="preserve">analysis/senior-software-jobs-2026-07/informe-competencies-socioemocionals-ofertes-senior-software-2026-07.md</w:t>
+      </w:r>
+      <w:r>
+        <w:t xml:space="preserve">: informe complet de l’estudi observacional de 222 ofertes, amb protocol, resultats, controls, limitacions i fitxers reproduïbles.</w:t>
+      </w:r>
+    </w:p>
+    <w:p>
+      <w:pPr>
+        <w:pStyle w:val="Compact"/>
+        <w:numPr>
+          <w:ilvl w:val="0"/>
+          <w:numId w:val="1018"/>
+        </w:numPr>
+      </w:pPr>
+      <w:r>
+        <w:t xml:space="preserve">Documentació pública de les fonts de l’Annex D: The Muse, Himalayas, Arbeitnow, Jobicy, Remotive i Remote OK; context metodològic de Skills-OVATE, Eurostat i el Joint Research Centre.</w:t>
+      </w:r>
+    </w:p>
+    <w:bookmarkEnd w:id="60"/>
+    <w:bookmarkEnd w:id="61"/>
     <w:sectPr>
       <w:footnotePr>
         <w:numRestart w:val="eachSect"/>
@@ -2667,6 +4992,27 @@
     <w:abstractNumId w:val="991"/>
   </w:num>
   <w:num w:numId="1011">
+    <w:abstractNumId w:val="991"/>
+  </w:num>
+  <w:num w:numId="1012">
+    <w:abstractNumId w:val="991"/>
+  </w:num>
+  <w:num w:numId="1013">
+    <w:abstractNumId w:val="991"/>
+  </w:num>
+  <w:num w:numId="1014">
+    <w:abstractNumId w:val="991"/>
+  </w:num>
+  <w:num w:numId="1015">
+    <w:abstractNumId w:val="991"/>
+  </w:num>
+  <w:num w:numId="1016">
+    <w:abstractNumId w:val="991"/>
+  </w:num>
+  <w:num w:numId="1017">
+    <w:abstractNumId w:val="991"/>
+  </w:num>
+  <w:num w:numId="1018">
     <w:abstractNumId w:val="991"/>
   </w:num>
 </w:numbering>

</xml_diff>